<commit_message>
git testing push for doxs
</commit_message>
<xml_diff>
--- a/Assignment 1 Report - Adam Merhi.docx
+++ b/Assignment 1 Report - Adam Merhi.docx
@@ -2,7 +2,11 @@
 <file path=word/document.xml><?xml version="1.0" encoding="utf-8"?>
 <w:document xmlns:wpc="http://schemas.microsoft.com/office/word/2010/wordprocessingCanvas" xmlns:cx="http://schemas.microsoft.com/office/drawing/2014/chartex" xmlns:cx1="http://schemas.microsoft.com/office/drawing/2015/9/8/chartex" xmlns:cx2="http://schemas.microsoft.com/office/drawing/2015/10/21/chartex" xmlns:cx3="http://schemas.microsoft.com/office/drawing/2016/5/9/chartex" xmlns:cx4="http://schemas.microsoft.com/office/drawing/2016/5/10/chartex" xmlns:cx5="http://schemas.microsoft.com/office/drawing/2016/5/11/chartex" xmlns:cx6="http://schemas.microsoft.com/office/drawing/2016/5/12/chartex" xmlns:cx7="http://schemas.microsoft.com/office/drawing/2016/5/13/chartex" xmlns:cx8="http://schemas.microsoft.com/office/drawing/2016/5/14/chartex" xmlns:mc="http://schemas.openxmlformats.org/markup-compatibility/2006" xmlns:aink="http://schemas.microsoft.com/office/drawing/2016/ink" xmlns:am3d="http://schemas.microsoft.com/office/drawing/2017/model3d" xmlns:o="urn:schemas-microsoft-com:office:office" xmlns:oel="http://schemas.microsoft.com/office/2019/extlst" xmlns:r="http://schemas.openxmlformats.org/officeDocument/2006/relationships" xmlns:m="http://schemas.openxmlformats.org/officeDocument/2006/math" xmlns:v="urn:schemas-microsoft-com:vml" xmlns:wp14="http://schemas.microsoft.com/office/word/2010/wordprocessingDrawing" xmlns:wp="http://schemas.openxmlformats.org/drawingml/2006/wordprocessingDrawing" xmlns:w10="urn:schemas-microsoft-com:office:word" xmlns:w="http://schemas.openxmlformats.org/wordprocessingml/2006/main" xmlns:w14="http://schemas.microsoft.com/office/word/2010/wordml" xmlns:w15="http://schemas.microsoft.com/office/word/2012/wordml" xmlns:w16cex="http://schemas.microsoft.com/office/word/2018/wordml/cex" xmlns:w16cid="http://schemas.microsoft.com/office/word/2016/wordml/cid" xmlns:w16="http://schemas.microsoft.com/office/word/2018/wordml" xmlns:w16du="http://schemas.microsoft.com/office/word/2023/wordml/word16du" xmlns:w16sdtdh="http://schemas.microsoft.com/office/word/2020/wordml/sdtdatahash" xmlns:w16sdtfl="http://schemas.microsoft.com/office/word/2024/wordml/sdtformatlock" xmlns:w16se="http://schemas.microsoft.com/office/word/2015/wordml/symex" xmlns:wpg="http://schemas.microsoft.com/office/word/2010/wordprocessingGroup" xmlns:wpi="http://schemas.microsoft.com/office/word/2010/wordprocessingInk" xmlns:wne="http://schemas.microsoft.com/office/word/2006/wordml" xmlns:wps="http://schemas.microsoft.com/office/word/2010/wordprocessingShape" mc:Ignorable="w14 w15 w16se w16cid w16 w16cex w16sdtdh w16sdtfl w16du wp14">
   <w:body>
-    <w:p/>
+    <w:p>
+      <w:r>
+        <w:t>Test git push</w:t>
+      </w:r>
+    </w:p>
     <w:sectPr>
       <w:pgSz w:w="11906" w:h="16838"/>
       <w:pgMar w:top="1440" w:right="1440" w:bottom="1440" w:left="1440" w:header="708" w:footer="708" w:gutter="0"/>

</xml_diff>

<commit_message>
included updates to report and have created a new test case to ensure the searching method is working when the pattern is empty and not crashing at runtime
</commit_message>
<xml_diff>
--- a/Assignment 1 Report - Adam Merhi.docx
+++ b/Assignment 1 Report - Adam Merhi.docx
@@ -3,11 +3,2783 @@
 <w:document xmlns:wpc="http://schemas.microsoft.com/office/word/2010/wordprocessingCanvas" xmlns:cx="http://schemas.microsoft.com/office/drawing/2014/chartex" xmlns:cx1="http://schemas.microsoft.com/office/drawing/2015/9/8/chartex" xmlns:cx2="http://schemas.microsoft.com/office/drawing/2015/10/21/chartex" xmlns:cx3="http://schemas.microsoft.com/office/drawing/2016/5/9/chartex" xmlns:cx4="http://schemas.microsoft.com/office/drawing/2016/5/10/chartex" xmlns:cx5="http://schemas.microsoft.com/office/drawing/2016/5/11/chartex" xmlns:cx6="http://schemas.microsoft.com/office/drawing/2016/5/12/chartex" xmlns:cx7="http://schemas.microsoft.com/office/drawing/2016/5/13/chartex" xmlns:cx8="http://schemas.microsoft.com/office/drawing/2016/5/14/chartex" xmlns:mc="http://schemas.openxmlformats.org/markup-compatibility/2006" xmlns:aink="http://schemas.microsoft.com/office/drawing/2016/ink" xmlns:am3d="http://schemas.microsoft.com/office/drawing/2017/model3d" xmlns:o="urn:schemas-microsoft-com:office:office" xmlns:oel="http://schemas.microsoft.com/office/2019/extlst" xmlns:r="http://schemas.openxmlformats.org/officeDocument/2006/relationships" xmlns:m="http://schemas.openxmlformats.org/officeDocument/2006/math" xmlns:v="urn:schemas-microsoft-com:vml" xmlns:wp14="http://schemas.microsoft.com/office/word/2010/wordprocessingDrawing" xmlns:wp="http://schemas.openxmlformats.org/drawingml/2006/wordprocessingDrawing" xmlns:w10="urn:schemas-microsoft-com:office:word" xmlns:w="http://schemas.openxmlformats.org/wordprocessingml/2006/main" xmlns:w14="http://schemas.microsoft.com/office/word/2010/wordml" xmlns:w15="http://schemas.microsoft.com/office/word/2012/wordml" xmlns:w16cex="http://schemas.microsoft.com/office/word/2018/wordml/cex" xmlns:w16cid="http://schemas.microsoft.com/office/word/2016/wordml/cid" xmlns:w16="http://schemas.microsoft.com/office/word/2018/wordml" xmlns:w16du="http://schemas.microsoft.com/office/word/2023/wordml/word16du" xmlns:w16sdtdh="http://schemas.microsoft.com/office/word/2020/wordml/sdtdatahash" xmlns:w16sdtfl="http://schemas.microsoft.com/office/word/2024/wordml/sdtformatlock" xmlns:w16se="http://schemas.microsoft.com/office/word/2015/wordml/symex" xmlns:wpg="http://schemas.microsoft.com/office/word/2010/wordprocessingGroup" xmlns:wpi="http://schemas.microsoft.com/office/word/2010/wordprocessingInk" xmlns:wne="http://schemas.microsoft.com/office/word/2006/wordml" xmlns:wps="http://schemas.microsoft.com/office/word/2010/wordprocessingShape" mc:Ignorable="w14 w15 w16se w16cid w16 w16cex w16sdtdh w16sdtfl w16du wp14">
   <w:body>
     <w:p>
-      <w:r>
-        <w:t>Test git push</w:t>
+      <w:pPr>
+        <w:pStyle w:val="Title"/>
+      </w:pPr>
+      <w:r>
+        <w:t>Knuth-Morris-Pratt Algorithm for Pattern Matching – Assignment 1 – Adam Merhi</w:t>
       </w:r>
     </w:p>
+    <w:p/>
+    <w:p>
+      <w:pPr>
+        <w:rPr>
+          <w:rFonts w:asciiTheme="majorHAnsi" w:eastAsiaTheme="majorEastAsia" w:hAnsiTheme="majorHAnsi" w:cstheme="majorBidi"/>
+          <w:color w:val="0F4761" w:themeColor="accent1" w:themeShade="BF"/>
+          <w:kern w:val="0"/>
+          <w:sz w:val="32"/>
+          <w:szCs w:val="32"/>
+          <w:lang w:val="en-GB" w:eastAsia="en-AU"/>
+          <w14:ligatures w14:val="none"/>
+        </w:rPr>
+      </w:pPr>
+      <w:r>
+        <w:rPr>
+          <w:lang w:val="en-GB"/>
+        </w:rPr>
+        <w:br w:type="page"/>
+      </w:r>
+    </w:p>
+    <w:sdt>
+      <w:sdtPr>
+        <w:rPr>
+          <w:lang w:val="en-GB"/>
+        </w:rPr>
+        <w:id w:val="-1470130234"/>
+        <w:docPartObj>
+          <w:docPartGallery w:val="Table of Contents"/>
+          <w:docPartUnique/>
+        </w:docPartObj>
+      </w:sdtPr>
+      <w:sdtEndPr>
+        <w:rPr>
+          <w:rFonts w:asciiTheme="minorHAnsi" w:eastAsiaTheme="minorHAnsi" w:hAnsiTheme="minorHAnsi" w:cstheme="minorBidi"/>
+          <w:b/>
+          <w:bCs/>
+          <w:color w:val="auto"/>
+          <w:kern w:val="2"/>
+          <w:sz w:val="22"/>
+          <w:szCs w:val="22"/>
+          <w:lang w:eastAsia="en-US"/>
+          <w14:ligatures w14:val="standardContextual"/>
+        </w:rPr>
+      </w:sdtEndPr>
+      <w:sdtContent>
+        <w:p>
+          <w:pPr>
+            <w:pStyle w:val="TOCHeading"/>
+          </w:pPr>
+          <w:r>
+            <w:rPr>
+              <w:lang w:val="en-GB"/>
+            </w:rPr>
+            <w:t>Table of Contents</w:t>
+          </w:r>
+        </w:p>
+        <w:p>
+          <w:pPr>
+            <w:pStyle w:val="TOC1"/>
+            <w:tabs>
+              <w:tab w:val="right" w:leader="dot" w:pos="9016"/>
+            </w:tabs>
+            <w:rPr>
+              <w:rFonts w:eastAsiaTheme="minorEastAsia"/>
+              <w:noProof/>
+              <w:sz w:val="24"/>
+              <w:szCs w:val="24"/>
+              <w:lang w:eastAsia="en-AU"/>
+            </w:rPr>
+          </w:pPr>
+          <w:r>
+            <w:fldChar w:fldCharType="begin"/>
+          </w:r>
+          <w:r>
+            <w:instrText xml:space="preserve"> TOC \o "1-3" \h \z \u </w:instrText>
+          </w:r>
+          <w:r>
+            <w:fldChar w:fldCharType="separate"/>
+          </w:r>
+          <w:hyperlink w:anchor="_Toc209806782" w:history="1">
+            <w:r>
+              <w:rPr>
+                <w:rStyle w:val="Hyperlink"/>
+                <w:noProof/>
+              </w:rPr>
+              <w:t>1. A high-level outline of the algorithm</w:t>
+            </w:r>
+            <w:r>
+              <w:rPr>
+                <w:noProof/>
+                <w:webHidden/>
+              </w:rPr>
+              <w:tab/>
+            </w:r>
+            <w:r>
+              <w:rPr>
+                <w:noProof/>
+                <w:webHidden/>
+              </w:rPr>
+              <w:fldChar w:fldCharType="begin"/>
+            </w:r>
+            <w:r>
+              <w:rPr>
+                <w:noProof/>
+                <w:webHidden/>
+              </w:rPr>
+              <w:instrText xml:space="preserve"> PAGEREF _Toc209806782 \h </w:instrText>
+            </w:r>
+            <w:r>
+              <w:rPr>
+                <w:noProof/>
+                <w:webHidden/>
+              </w:rPr>
+            </w:r>
+            <w:r>
+              <w:rPr>
+                <w:noProof/>
+                <w:webHidden/>
+              </w:rPr>
+              <w:fldChar w:fldCharType="separate"/>
+            </w:r>
+            <w:r>
+              <w:rPr>
+                <w:noProof/>
+                <w:webHidden/>
+              </w:rPr>
+              <w:t>4</w:t>
+            </w:r>
+            <w:r>
+              <w:rPr>
+                <w:noProof/>
+                <w:webHidden/>
+              </w:rPr>
+              <w:fldChar w:fldCharType="end"/>
+            </w:r>
+          </w:hyperlink>
+        </w:p>
+        <w:p>
+          <w:pPr>
+            <w:pStyle w:val="TOC2"/>
+            <w:tabs>
+              <w:tab w:val="right" w:leader="dot" w:pos="9016"/>
+            </w:tabs>
+            <w:rPr>
+              <w:rFonts w:eastAsiaTheme="minorEastAsia"/>
+              <w:noProof/>
+              <w:sz w:val="24"/>
+              <w:szCs w:val="24"/>
+              <w:lang w:eastAsia="en-AU"/>
+            </w:rPr>
+          </w:pPr>
+          <w:hyperlink w:anchor="_Toc209806783" w:history="1">
+            <w:r>
+              <w:rPr>
+                <w:rStyle w:val="Hyperlink"/>
+                <w:noProof/>
+              </w:rPr>
+              <w:t>1.1 Preprocessing</w:t>
+            </w:r>
+            <w:r>
+              <w:rPr>
+                <w:noProof/>
+                <w:webHidden/>
+              </w:rPr>
+              <w:tab/>
+            </w:r>
+            <w:r>
+              <w:rPr>
+                <w:noProof/>
+                <w:webHidden/>
+              </w:rPr>
+              <w:fldChar w:fldCharType="begin"/>
+            </w:r>
+            <w:r>
+              <w:rPr>
+                <w:noProof/>
+                <w:webHidden/>
+              </w:rPr>
+              <w:instrText xml:space="preserve"> PAGEREF _Toc209806783 \h </w:instrText>
+            </w:r>
+            <w:r>
+              <w:rPr>
+                <w:noProof/>
+                <w:webHidden/>
+              </w:rPr>
+            </w:r>
+            <w:r>
+              <w:rPr>
+                <w:noProof/>
+                <w:webHidden/>
+              </w:rPr>
+              <w:fldChar w:fldCharType="separate"/>
+            </w:r>
+            <w:r>
+              <w:rPr>
+                <w:noProof/>
+                <w:webHidden/>
+              </w:rPr>
+              <w:t>4</w:t>
+            </w:r>
+            <w:r>
+              <w:rPr>
+                <w:noProof/>
+                <w:webHidden/>
+              </w:rPr>
+              <w:fldChar w:fldCharType="end"/>
+            </w:r>
+          </w:hyperlink>
+        </w:p>
+        <w:p>
+          <w:pPr>
+            <w:pStyle w:val="TOC2"/>
+            <w:tabs>
+              <w:tab w:val="right" w:leader="dot" w:pos="9016"/>
+            </w:tabs>
+            <w:rPr>
+              <w:rFonts w:eastAsiaTheme="minorEastAsia"/>
+              <w:noProof/>
+              <w:sz w:val="24"/>
+              <w:szCs w:val="24"/>
+              <w:lang w:eastAsia="en-AU"/>
+            </w:rPr>
+          </w:pPr>
+          <w:hyperlink w:anchor="_Toc209806784" w:history="1">
+            <w:r>
+              <w:rPr>
+                <w:rStyle w:val="Hyperlink"/>
+                <w:noProof/>
+              </w:rPr>
+              <w:t>1.2 Searching and Implementing</w:t>
+            </w:r>
+            <w:r>
+              <w:rPr>
+                <w:noProof/>
+                <w:webHidden/>
+              </w:rPr>
+              <w:tab/>
+            </w:r>
+            <w:r>
+              <w:rPr>
+                <w:noProof/>
+                <w:webHidden/>
+              </w:rPr>
+              <w:fldChar w:fldCharType="begin"/>
+            </w:r>
+            <w:r>
+              <w:rPr>
+                <w:noProof/>
+                <w:webHidden/>
+              </w:rPr>
+              <w:instrText xml:space="preserve"> PAGEREF _Toc209806784 \h </w:instrText>
+            </w:r>
+            <w:r>
+              <w:rPr>
+                <w:noProof/>
+                <w:webHidden/>
+              </w:rPr>
+            </w:r>
+            <w:r>
+              <w:rPr>
+                <w:noProof/>
+                <w:webHidden/>
+              </w:rPr>
+              <w:fldChar w:fldCharType="separate"/>
+            </w:r>
+            <w:r>
+              <w:rPr>
+                <w:noProof/>
+                <w:webHidden/>
+              </w:rPr>
+              <w:t>4</w:t>
+            </w:r>
+            <w:r>
+              <w:rPr>
+                <w:noProof/>
+                <w:webHidden/>
+              </w:rPr>
+              <w:fldChar w:fldCharType="end"/>
+            </w:r>
+          </w:hyperlink>
+        </w:p>
+        <w:p>
+          <w:pPr>
+            <w:pStyle w:val="TOC1"/>
+            <w:tabs>
+              <w:tab w:val="right" w:leader="dot" w:pos="9016"/>
+            </w:tabs>
+            <w:rPr>
+              <w:rFonts w:eastAsiaTheme="minorEastAsia"/>
+              <w:noProof/>
+              <w:sz w:val="24"/>
+              <w:szCs w:val="24"/>
+              <w:lang w:eastAsia="en-AU"/>
+            </w:rPr>
+          </w:pPr>
+          <w:hyperlink w:anchor="_Toc209806785" w:history="1">
+            <w:r>
+              <w:rPr>
+                <w:rStyle w:val="Hyperlink"/>
+                <w:noProof/>
+              </w:rPr>
+              <w:t>2. The application domain(s) of the algorithm, and its effectiveness therein.</w:t>
+            </w:r>
+            <w:r>
+              <w:rPr>
+                <w:noProof/>
+                <w:webHidden/>
+              </w:rPr>
+              <w:tab/>
+            </w:r>
+            <w:r>
+              <w:rPr>
+                <w:noProof/>
+                <w:webHidden/>
+              </w:rPr>
+              <w:fldChar w:fldCharType="begin"/>
+            </w:r>
+            <w:r>
+              <w:rPr>
+                <w:noProof/>
+                <w:webHidden/>
+              </w:rPr>
+              <w:instrText xml:space="preserve"> PAGEREF _Toc209806785 \h </w:instrText>
+            </w:r>
+            <w:r>
+              <w:rPr>
+                <w:noProof/>
+                <w:webHidden/>
+              </w:rPr>
+            </w:r>
+            <w:r>
+              <w:rPr>
+                <w:noProof/>
+                <w:webHidden/>
+              </w:rPr>
+              <w:fldChar w:fldCharType="separate"/>
+            </w:r>
+            <w:r>
+              <w:rPr>
+                <w:noProof/>
+                <w:webHidden/>
+              </w:rPr>
+              <w:t>4</w:t>
+            </w:r>
+            <w:r>
+              <w:rPr>
+                <w:noProof/>
+                <w:webHidden/>
+              </w:rPr>
+              <w:fldChar w:fldCharType="end"/>
+            </w:r>
+          </w:hyperlink>
+        </w:p>
+        <w:p>
+          <w:pPr>
+            <w:pStyle w:val="TOC2"/>
+            <w:tabs>
+              <w:tab w:val="right" w:leader="dot" w:pos="9016"/>
+            </w:tabs>
+            <w:rPr>
+              <w:rFonts w:eastAsiaTheme="minorEastAsia"/>
+              <w:noProof/>
+              <w:sz w:val="24"/>
+              <w:szCs w:val="24"/>
+              <w:lang w:eastAsia="en-AU"/>
+            </w:rPr>
+          </w:pPr>
+          <w:hyperlink w:anchor="_Toc209806786" w:history="1">
+            <w:r>
+              <w:rPr>
+                <w:rStyle w:val="Hyperlink"/>
+                <w:noProof/>
+              </w:rPr>
+              <w:t>2.1 Use Case of KMP</w:t>
+            </w:r>
+            <w:r>
+              <w:rPr>
+                <w:noProof/>
+                <w:webHidden/>
+              </w:rPr>
+              <w:tab/>
+            </w:r>
+            <w:r>
+              <w:rPr>
+                <w:noProof/>
+                <w:webHidden/>
+              </w:rPr>
+              <w:fldChar w:fldCharType="begin"/>
+            </w:r>
+            <w:r>
+              <w:rPr>
+                <w:noProof/>
+                <w:webHidden/>
+              </w:rPr>
+              <w:instrText xml:space="preserve"> PAGEREF _Toc209806786 \h </w:instrText>
+            </w:r>
+            <w:r>
+              <w:rPr>
+                <w:noProof/>
+                <w:webHidden/>
+              </w:rPr>
+            </w:r>
+            <w:r>
+              <w:rPr>
+                <w:noProof/>
+                <w:webHidden/>
+              </w:rPr>
+              <w:fldChar w:fldCharType="separate"/>
+            </w:r>
+            <w:r>
+              <w:rPr>
+                <w:noProof/>
+                <w:webHidden/>
+              </w:rPr>
+              <w:t>4</w:t>
+            </w:r>
+            <w:r>
+              <w:rPr>
+                <w:noProof/>
+                <w:webHidden/>
+              </w:rPr>
+              <w:fldChar w:fldCharType="end"/>
+            </w:r>
+          </w:hyperlink>
+        </w:p>
+        <w:p>
+          <w:pPr>
+            <w:pStyle w:val="TOC3"/>
+            <w:tabs>
+              <w:tab w:val="right" w:leader="dot" w:pos="9016"/>
+            </w:tabs>
+            <w:rPr>
+              <w:rFonts w:eastAsiaTheme="minorEastAsia"/>
+              <w:noProof/>
+              <w:sz w:val="24"/>
+              <w:szCs w:val="24"/>
+              <w:lang w:eastAsia="en-AU"/>
+            </w:rPr>
+          </w:pPr>
+          <w:hyperlink w:anchor="_Toc209806787" w:history="1">
+            <w:r>
+              <w:rPr>
+                <w:rStyle w:val="Hyperlink"/>
+                <w:noProof/>
+              </w:rPr>
+              <w:t>2.1.1 Text and Data Processing</w:t>
+            </w:r>
+            <w:r>
+              <w:rPr>
+                <w:noProof/>
+                <w:webHidden/>
+              </w:rPr>
+              <w:tab/>
+            </w:r>
+            <w:r>
+              <w:rPr>
+                <w:noProof/>
+                <w:webHidden/>
+              </w:rPr>
+              <w:fldChar w:fldCharType="begin"/>
+            </w:r>
+            <w:r>
+              <w:rPr>
+                <w:noProof/>
+                <w:webHidden/>
+              </w:rPr>
+              <w:instrText xml:space="preserve"> PAGEREF _Toc209806787 \h </w:instrText>
+            </w:r>
+            <w:r>
+              <w:rPr>
+                <w:noProof/>
+                <w:webHidden/>
+              </w:rPr>
+            </w:r>
+            <w:r>
+              <w:rPr>
+                <w:noProof/>
+                <w:webHidden/>
+              </w:rPr>
+              <w:fldChar w:fldCharType="separate"/>
+            </w:r>
+            <w:r>
+              <w:rPr>
+                <w:noProof/>
+                <w:webHidden/>
+              </w:rPr>
+              <w:t>4</w:t>
+            </w:r>
+            <w:r>
+              <w:rPr>
+                <w:noProof/>
+                <w:webHidden/>
+              </w:rPr>
+              <w:fldChar w:fldCharType="end"/>
+            </w:r>
+          </w:hyperlink>
+        </w:p>
+        <w:p>
+          <w:pPr>
+            <w:pStyle w:val="TOC3"/>
+            <w:tabs>
+              <w:tab w:val="right" w:leader="dot" w:pos="9016"/>
+            </w:tabs>
+            <w:rPr>
+              <w:rFonts w:eastAsiaTheme="minorEastAsia"/>
+              <w:noProof/>
+              <w:sz w:val="24"/>
+              <w:szCs w:val="24"/>
+              <w:lang w:eastAsia="en-AU"/>
+            </w:rPr>
+          </w:pPr>
+          <w:hyperlink w:anchor="_Toc209806788" w:history="1">
+            <w:r>
+              <w:rPr>
+                <w:rStyle w:val="Hyperlink"/>
+                <w:noProof/>
+              </w:rPr>
+              <w:t>2.1.2 Machine Learning &amp; AI</w:t>
+            </w:r>
+            <w:r>
+              <w:rPr>
+                <w:noProof/>
+                <w:webHidden/>
+              </w:rPr>
+              <w:tab/>
+            </w:r>
+            <w:r>
+              <w:rPr>
+                <w:noProof/>
+                <w:webHidden/>
+              </w:rPr>
+              <w:fldChar w:fldCharType="begin"/>
+            </w:r>
+            <w:r>
+              <w:rPr>
+                <w:noProof/>
+                <w:webHidden/>
+              </w:rPr>
+              <w:instrText xml:space="preserve"> PAGEREF _Toc209806788 \h </w:instrText>
+            </w:r>
+            <w:r>
+              <w:rPr>
+                <w:noProof/>
+                <w:webHidden/>
+              </w:rPr>
+            </w:r>
+            <w:r>
+              <w:rPr>
+                <w:noProof/>
+                <w:webHidden/>
+              </w:rPr>
+              <w:fldChar w:fldCharType="separate"/>
+            </w:r>
+            <w:r>
+              <w:rPr>
+                <w:noProof/>
+                <w:webHidden/>
+              </w:rPr>
+              <w:t>5</w:t>
+            </w:r>
+            <w:r>
+              <w:rPr>
+                <w:noProof/>
+                <w:webHidden/>
+              </w:rPr>
+              <w:fldChar w:fldCharType="end"/>
+            </w:r>
+          </w:hyperlink>
+        </w:p>
+        <w:p>
+          <w:pPr>
+            <w:pStyle w:val="TOC3"/>
+            <w:tabs>
+              <w:tab w:val="right" w:leader="dot" w:pos="9016"/>
+            </w:tabs>
+            <w:rPr>
+              <w:rFonts w:eastAsiaTheme="minorEastAsia"/>
+              <w:noProof/>
+              <w:sz w:val="24"/>
+              <w:szCs w:val="24"/>
+              <w:lang w:eastAsia="en-AU"/>
+            </w:rPr>
+          </w:pPr>
+          <w:hyperlink w:anchor="_Toc209806789" w:history="1">
+            <w:r>
+              <w:rPr>
+                <w:rStyle w:val="Hyperlink"/>
+                <w:noProof/>
+              </w:rPr>
+              <w:t>2.1.3 Bioinformation</w:t>
+            </w:r>
+            <w:r>
+              <w:rPr>
+                <w:noProof/>
+                <w:webHidden/>
+              </w:rPr>
+              <w:tab/>
+            </w:r>
+            <w:r>
+              <w:rPr>
+                <w:noProof/>
+                <w:webHidden/>
+              </w:rPr>
+              <w:fldChar w:fldCharType="begin"/>
+            </w:r>
+            <w:r>
+              <w:rPr>
+                <w:noProof/>
+                <w:webHidden/>
+              </w:rPr>
+              <w:instrText xml:space="preserve"> PAGEREF _Toc209806789 \h </w:instrText>
+            </w:r>
+            <w:r>
+              <w:rPr>
+                <w:noProof/>
+                <w:webHidden/>
+              </w:rPr>
+            </w:r>
+            <w:r>
+              <w:rPr>
+                <w:noProof/>
+                <w:webHidden/>
+              </w:rPr>
+              <w:fldChar w:fldCharType="separate"/>
+            </w:r>
+            <w:r>
+              <w:rPr>
+                <w:noProof/>
+                <w:webHidden/>
+              </w:rPr>
+              <w:t>5</w:t>
+            </w:r>
+            <w:r>
+              <w:rPr>
+                <w:noProof/>
+                <w:webHidden/>
+              </w:rPr>
+              <w:fldChar w:fldCharType="end"/>
+            </w:r>
+          </w:hyperlink>
+        </w:p>
+        <w:p>
+          <w:pPr>
+            <w:pStyle w:val="TOC3"/>
+            <w:tabs>
+              <w:tab w:val="right" w:leader="dot" w:pos="9016"/>
+            </w:tabs>
+            <w:rPr>
+              <w:rFonts w:eastAsiaTheme="minorEastAsia"/>
+              <w:noProof/>
+              <w:sz w:val="24"/>
+              <w:szCs w:val="24"/>
+              <w:lang w:eastAsia="en-AU"/>
+            </w:rPr>
+          </w:pPr>
+          <w:hyperlink w:anchor="_Toc209806790" w:history="1">
+            <w:r>
+              <w:rPr>
+                <w:rStyle w:val="Hyperlink"/>
+                <w:noProof/>
+              </w:rPr>
+              <w:t>2.1.4 Graph Databases</w:t>
+            </w:r>
+            <w:r>
+              <w:rPr>
+                <w:noProof/>
+                <w:webHidden/>
+              </w:rPr>
+              <w:tab/>
+            </w:r>
+            <w:r>
+              <w:rPr>
+                <w:noProof/>
+                <w:webHidden/>
+              </w:rPr>
+              <w:fldChar w:fldCharType="begin"/>
+            </w:r>
+            <w:r>
+              <w:rPr>
+                <w:noProof/>
+                <w:webHidden/>
+              </w:rPr>
+              <w:instrText xml:space="preserve"> PAGEREF _Toc209806790 \h </w:instrText>
+            </w:r>
+            <w:r>
+              <w:rPr>
+                <w:noProof/>
+                <w:webHidden/>
+              </w:rPr>
+            </w:r>
+            <w:r>
+              <w:rPr>
+                <w:noProof/>
+                <w:webHidden/>
+              </w:rPr>
+              <w:fldChar w:fldCharType="separate"/>
+            </w:r>
+            <w:r>
+              <w:rPr>
+                <w:noProof/>
+                <w:webHidden/>
+              </w:rPr>
+              <w:t>5</w:t>
+            </w:r>
+            <w:r>
+              <w:rPr>
+                <w:noProof/>
+                <w:webHidden/>
+              </w:rPr>
+              <w:fldChar w:fldCharType="end"/>
+            </w:r>
+          </w:hyperlink>
+        </w:p>
+        <w:p>
+          <w:pPr>
+            <w:pStyle w:val="TOC3"/>
+            <w:tabs>
+              <w:tab w:val="right" w:leader="dot" w:pos="9016"/>
+            </w:tabs>
+            <w:rPr>
+              <w:rFonts w:eastAsiaTheme="minorEastAsia"/>
+              <w:noProof/>
+              <w:sz w:val="24"/>
+              <w:szCs w:val="24"/>
+              <w:lang w:eastAsia="en-AU"/>
+            </w:rPr>
+          </w:pPr>
+          <w:hyperlink w:anchor="_Toc209806791" w:history="1">
+            <w:r>
+              <w:rPr>
+                <w:rStyle w:val="Hyperlink"/>
+                <w:noProof/>
+              </w:rPr>
+              <w:t>2.2 Benefits and Effectiveness of KMP</w:t>
+            </w:r>
+            <w:r>
+              <w:rPr>
+                <w:noProof/>
+                <w:webHidden/>
+              </w:rPr>
+              <w:tab/>
+            </w:r>
+            <w:r>
+              <w:rPr>
+                <w:noProof/>
+                <w:webHidden/>
+              </w:rPr>
+              <w:fldChar w:fldCharType="begin"/>
+            </w:r>
+            <w:r>
+              <w:rPr>
+                <w:noProof/>
+                <w:webHidden/>
+              </w:rPr>
+              <w:instrText xml:space="preserve"> PAGEREF _Toc209806791 \h </w:instrText>
+            </w:r>
+            <w:r>
+              <w:rPr>
+                <w:noProof/>
+                <w:webHidden/>
+              </w:rPr>
+            </w:r>
+            <w:r>
+              <w:rPr>
+                <w:noProof/>
+                <w:webHidden/>
+              </w:rPr>
+              <w:fldChar w:fldCharType="separate"/>
+            </w:r>
+            <w:r>
+              <w:rPr>
+                <w:noProof/>
+                <w:webHidden/>
+              </w:rPr>
+              <w:t>5</w:t>
+            </w:r>
+            <w:r>
+              <w:rPr>
+                <w:noProof/>
+                <w:webHidden/>
+              </w:rPr>
+              <w:fldChar w:fldCharType="end"/>
+            </w:r>
+          </w:hyperlink>
+        </w:p>
+        <w:p>
+          <w:pPr>
+            <w:pStyle w:val="TOC1"/>
+            <w:tabs>
+              <w:tab w:val="right" w:leader="dot" w:pos="9016"/>
+            </w:tabs>
+            <w:rPr>
+              <w:rFonts w:eastAsiaTheme="minorEastAsia"/>
+              <w:noProof/>
+              <w:sz w:val="24"/>
+              <w:szCs w:val="24"/>
+              <w:lang w:eastAsia="en-AU"/>
+            </w:rPr>
+          </w:pPr>
+          <w:hyperlink w:anchor="_Toc209806792" w:history="1">
+            <w:r>
+              <w:rPr>
+                <w:rStyle w:val="Hyperlink"/>
+                <w:noProof/>
+              </w:rPr>
+              <w:t>3. The theoretical complexity of the algorithm.</w:t>
+            </w:r>
+            <w:r>
+              <w:rPr>
+                <w:noProof/>
+                <w:webHidden/>
+              </w:rPr>
+              <w:tab/>
+            </w:r>
+            <w:r>
+              <w:rPr>
+                <w:noProof/>
+                <w:webHidden/>
+              </w:rPr>
+              <w:fldChar w:fldCharType="begin"/>
+            </w:r>
+            <w:r>
+              <w:rPr>
+                <w:noProof/>
+                <w:webHidden/>
+              </w:rPr>
+              <w:instrText xml:space="preserve"> PAGEREF _Toc209806792 \h </w:instrText>
+            </w:r>
+            <w:r>
+              <w:rPr>
+                <w:noProof/>
+                <w:webHidden/>
+              </w:rPr>
+            </w:r>
+            <w:r>
+              <w:rPr>
+                <w:noProof/>
+                <w:webHidden/>
+              </w:rPr>
+              <w:fldChar w:fldCharType="separate"/>
+            </w:r>
+            <w:r>
+              <w:rPr>
+                <w:noProof/>
+                <w:webHidden/>
+              </w:rPr>
+              <w:t>5</w:t>
+            </w:r>
+            <w:r>
+              <w:rPr>
+                <w:noProof/>
+                <w:webHidden/>
+              </w:rPr>
+              <w:fldChar w:fldCharType="end"/>
+            </w:r>
+          </w:hyperlink>
+        </w:p>
+        <w:p>
+          <w:pPr>
+            <w:pStyle w:val="TOC2"/>
+            <w:tabs>
+              <w:tab w:val="right" w:leader="dot" w:pos="9016"/>
+            </w:tabs>
+            <w:rPr>
+              <w:rFonts w:eastAsiaTheme="minorEastAsia"/>
+              <w:noProof/>
+              <w:sz w:val="24"/>
+              <w:szCs w:val="24"/>
+              <w:lang w:eastAsia="en-AU"/>
+            </w:rPr>
+          </w:pPr>
+          <w:hyperlink w:anchor="_Toc209806793" w:history="1">
+            <w:r>
+              <w:rPr>
+                <w:rStyle w:val="Hyperlink"/>
+                <w:noProof/>
+              </w:rPr>
+              <w:t>3.1 Processing Steps</w:t>
+            </w:r>
+            <w:r>
+              <w:rPr>
+                <w:noProof/>
+                <w:webHidden/>
+              </w:rPr>
+              <w:tab/>
+            </w:r>
+            <w:r>
+              <w:rPr>
+                <w:noProof/>
+                <w:webHidden/>
+              </w:rPr>
+              <w:fldChar w:fldCharType="begin"/>
+            </w:r>
+            <w:r>
+              <w:rPr>
+                <w:noProof/>
+                <w:webHidden/>
+              </w:rPr>
+              <w:instrText xml:space="preserve"> PAGEREF _Toc209806793 \h </w:instrText>
+            </w:r>
+            <w:r>
+              <w:rPr>
+                <w:noProof/>
+                <w:webHidden/>
+              </w:rPr>
+            </w:r>
+            <w:r>
+              <w:rPr>
+                <w:noProof/>
+                <w:webHidden/>
+              </w:rPr>
+              <w:fldChar w:fldCharType="separate"/>
+            </w:r>
+            <w:r>
+              <w:rPr>
+                <w:noProof/>
+                <w:webHidden/>
+              </w:rPr>
+              <w:t>5</w:t>
+            </w:r>
+            <w:r>
+              <w:rPr>
+                <w:noProof/>
+                <w:webHidden/>
+              </w:rPr>
+              <w:fldChar w:fldCharType="end"/>
+            </w:r>
+          </w:hyperlink>
+        </w:p>
+        <w:p>
+          <w:pPr>
+            <w:pStyle w:val="TOC2"/>
+            <w:tabs>
+              <w:tab w:val="right" w:leader="dot" w:pos="9016"/>
+            </w:tabs>
+            <w:rPr>
+              <w:rFonts w:eastAsiaTheme="minorEastAsia"/>
+              <w:noProof/>
+              <w:sz w:val="24"/>
+              <w:szCs w:val="24"/>
+              <w:lang w:eastAsia="en-AU"/>
+            </w:rPr>
+          </w:pPr>
+          <w:hyperlink w:anchor="_Toc209806794" w:history="1">
+            <w:r>
+              <w:rPr>
+                <w:rStyle w:val="Hyperlink"/>
+                <w:noProof/>
+              </w:rPr>
+              <w:t>3.2 Search Phase</w:t>
+            </w:r>
+            <w:r>
+              <w:rPr>
+                <w:noProof/>
+                <w:webHidden/>
+              </w:rPr>
+              <w:tab/>
+            </w:r>
+            <w:r>
+              <w:rPr>
+                <w:noProof/>
+                <w:webHidden/>
+              </w:rPr>
+              <w:fldChar w:fldCharType="begin"/>
+            </w:r>
+            <w:r>
+              <w:rPr>
+                <w:noProof/>
+                <w:webHidden/>
+              </w:rPr>
+              <w:instrText xml:space="preserve"> PAGEREF _Toc209806794 \h </w:instrText>
+            </w:r>
+            <w:r>
+              <w:rPr>
+                <w:noProof/>
+                <w:webHidden/>
+              </w:rPr>
+            </w:r>
+            <w:r>
+              <w:rPr>
+                <w:noProof/>
+                <w:webHidden/>
+              </w:rPr>
+              <w:fldChar w:fldCharType="separate"/>
+            </w:r>
+            <w:r>
+              <w:rPr>
+                <w:noProof/>
+                <w:webHidden/>
+              </w:rPr>
+              <w:t>5</w:t>
+            </w:r>
+            <w:r>
+              <w:rPr>
+                <w:noProof/>
+                <w:webHidden/>
+              </w:rPr>
+              <w:fldChar w:fldCharType="end"/>
+            </w:r>
+          </w:hyperlink>
+        </w:p>
+        <w:p>
+          <w:pPr>
+            <w:pStyle w:val="TOC1"/>
+            <w:tabs>
+              <w:tab w:val="right" w:leader="dot" w:pos="9016"/>
+            </w:tabs>
+            <w:rPr>
+              <w:rFonts w:eastAsiaTheme="minorEastAsia"/>
+              <w:noProof/>
+              <w:sz w:val="24"/>
+              <w:szCs w:val="24"/>
+              <w:lang w:eastAsia="en-AU"/>
+            </w:rPr>
+          </w:pPr>
+          <w:hyperlink w:anchor="_Toc209806795" w:history="1">
+            <w:r>
+              <w:rPr>
+                <w:rStyle w:val="Hyperlink"/>
+                <w:noProof/>
+              </w:rPr>
+              <w:t>4. The complexity of your implementation (indicating the level of confidence in any external components used as applicable and necessary).</w:t>
+            </w:r>
+            <w:r>
+              <w:rPr>
+                <w:noProof/>
+                <w:webHidden/>
+              </w:rPr>
+              <w:tab/>
+            </w:r>
+            <w:r>
+              <w:rPr>
+                <w:noProof/>
+                <w:webHidden/>
+              </w:rPr>
+              <w:fldChar w:fldCharType="begin"/>
+            </w:r>
+            <w:r>
+              <w:rPr>
+                <w:noProof/>
+                <w:webHidden/>
+              </w:rPr>
+              <w:instrText xml:space="preserve"> PAGEREF _Toc209806795 \h </w:instrText>
+            </w:r>
+            <w:r>
+              <w:rPr>
+                <w:noProof/>
+                <w:webHidden/>
+              </w:rPr>
+            </w:r>
+            <w:r>
+              <w:rPr>
+                <w:noProof/>
+                <w:webHidden/>
+              </w:rPr>
+              <w:fldChar w:fldCharType="separate"/>
+            </w:r>
+            <w:r>
+              <w:rPr>
+                <w:noProof/>
+                <w:webHidden/>
+              </w:rPr>
+              <w:t>5</w:t>
+            </w:r>
+            <w:r>
+              <w:rPr>
+                <w:noProof/>
+                <w:webHidden/>
+              </w:rPr>
+              <w:fldChar w:fldCharType="end"/>
+            </w:r>
+          </w:hyperlink>
+        </w:p>
+        <w:p>
+          <w:pPr>
+            <w:pStyle w:val="TOC2"/>
+            <w:tabs>
+              <w:tab w:val="right" w:leader="dot" w:pos="9016"/>
+            </w:tabs>
+            <w:rPr>
+              <w:rFonts w:eastAsiaTheme="minorEastAsia"/>
+              <w:noProof/>
+              <w:sz w:val="24"/>
+              <w:szCs w:val="24"/>
+              <w:lang w:eastAsia="en-AU"/>
+            </w:rPr>
+          </w:pPr>
+          <w:hyperlink w:anchor="_Toc209806796" w:history="1">
+            <w:r>
+              <w:rPr>
+                <w:rStyle w:val="Hyperlink"/>
+                <w:noProof/>
+              </w:rPr>
+              <w:t>4.1 Code Breakdown</w:t>
+            </w:r>
+            <w:r>
+              <w:rPr>
+                <w:noProof/>
+                <w:webHidden/>
+              </w:rPr>
+              <w:tab/>
+            </w:r>
+            <w:r>
+              <w:rPr>
+                <w:noProof/>
+                <w:webHidden/>
+              </w:rPr>
+              <w:fldChar w:fldCharType="begin"/>
+            </w:r>
+            <w:r>
+              <w:rPr>
+                <w:noProof/>
+                <w:webHidden/>
+              </w:rPr>
+              <w:instrText xml:space="preserve"> PAGEREF _Toc209806796 \h </w:instrText>
+            </w:r>
+            <w:r>
+              <w:rPr>
+                <w:noProof/>
+                <w:webHidden/>
+              </w:rPr>
+            </w:r>
+            <w:r>
+              <w:rPr>
+                <w:noProof/>
+                <w:webHidden/>
+              </w:rPr>
+              <w:fldChar w:fldCharType="separate"/>
+            </w:r>
+            <w:r>
+              <w:rPr>
+                <w:noProof/>
+                <w:webHidden/>
+              </w:rPr>
+              <w:t>5</w:t>
+            </w:r>
+            <w:r>
+              <w:rPr>
+                <w:noProof/>
+                <w:webHidden/>
+              </w:rPr>
+              <w:fldChar w:fldCharType="end"/>
+            </w:r>
+          </w:hyperlink>
+        </w:p>
+        <w:p>
+          <w:pPr>
+            <w:pStyle w:val="TOC1"/>
+            <w:tabs>
+              <w:tab w:val="right" w:leader="dot" w:pos="9016"/>
+            </w:tabs>
+            <w:rPr>
+              <w:rFonts w:eastAsiaTheme="minorEastAsia"/>
+              <w:noProof/>
+              <w:sz w:val="24"/>
+              <w:szCs w:val="24"/>
+              <w:lang w:eastAsia="en-AU"/>
+            </w:rPr>
+          </w:pPr>
+          <w:hyperlink w:anchor="_Toc209806797" w:history="1">
+            <w:r>
+              <w:rPr>
+                <w:rStyle w:val="Hyperlink"/>
+                <w:noProof/>
+              </w:rPr>
+              <w:t>5. Any compromises, assumptions or changes you made to the algorithm to allow implementation.</w:t>
+            </w:r>
+            <w:r>
+              <w:rPr>
+                <w:noProof/>
+                <w:webHidden/>
+              </w:rPr>
+              <w:tab/>
+            </w:r>
+            <w:r>
+              <w:rPr>
+                <w:noProof/>
+                <w:webHidden/>
+              </w:rPr>
+              <w:fldChar w:fldCharType="begin"/>
+            </w:r>
+            <w:r>
+              <w:rPr>
+                <w:noProof/>
+                <w:webHidden/>
+              </w:rPr>
+              <w:instrText xml:space="preserve"> PAGEREF _Toc209806797 \h </w:instrText>
+            </w:r>
+            <w:r>
+              <w:rPr>
+                <w:noProof/>
+                <w:webHidden/>
+              </w:rPr>
+            </w:r>
+            <w:r>
+              <w:rPr>
+                <w:noProof/>
+                <w:webHidden/>
+              </w:rPr>
+              <w:fldChar w:fldCharType="separate"/>
+            </w:r>
+            <w:r>
+              <w:rPr>
+                <w:noProof/>
+                <w:webHidden/>
+              </w:rPr>
+              <w:t>6</w:t>
+            </w:r>
+            <w:r>
+              <w:rPr>
+                <w:noProof/>
+                <w:webHidden/>
+              </w:rPr>
+              <w:fldChar w:fldCharType="end"/>
+            </w:r>
+          </w:hyperlink>
+        </w:p>
+        <w:p>
+          <w:pPr>
+            <w:pStyle w:val="TOC2"/>
+            <w:tabs>
+              <w:tab w:val="right" w:leader="dot" w:pos="9016"/>
+            </w:tabs>
+            <w:rPr>
+              <w:rFonts w:eastAsiaTheme="minorEastAsia"/>
+              <w:noProof/>
+              <w:sz w:val="24"/>
+              <w:szCs w:val="24"/>
+              <w:lang w:eastAsia="en-AU"/>
+            </w:rPr>
+          </w:pPr>
+          <w:hyperlink w:anchor="_Toc209806798" w:history="1">
+            <w:r>
+              <w:rPr>
+                <w:rStyle w:val="Hyperlink"/>
+                <w:noProof/>
+              </w:rPr>
+              <w:t>5.1 Assumptions</w:t>
+            </w:r>
+            <w:r>
+              <w:rPr>
+                <w:noProof/>
+                <w:webHidden/>
+              </w:rPr>
+              <w:tab/>
+            </w:r>
+            <w:r>
+              <w:rPr>
+                <w:noProof/>
+                <w:webHidden/>
+              </w:rPr>
+              <w:fldChar w:fldCharType="begin"/>
+            </w:r>
+            <w:r>
+              <w:rPr>
+                <w:noProof/>
+                <w:webHidden/>
+              </w:rPr>
+              <w:instrText xml:space="preserve"> PAGEREF _Toc209806798 \h </w:instrText>
+            </w:r>
+            <w:r>
+              <w:rPr>
+                <w:noProof/>
+                <w:webHidden/>
+              </w:rPr>
+            </w:r>
+            <w:r>
+              <w:rPr>
+                <w:noProof/>
+                <w:webHidden/>
+              </w:rPr>
+              <w:fldChar w:fldCharType="separate"/>
+            </w:r>
+            <w:r>
+              <w:rPr>
+                <w:noProof/>
+                <w:webHidden/>
+              </w:rPr>
+              <w:t>6</w:t>
+            </w:r>
+            <w:r>
+              <w:rPr>
+                <w:noProof/>
+                <w:webHidden/>
+              </w:rPr>
+              <w:fldChar w:fldCharType="end"/>
+            </w:r>
+          </w:hyperlink>
+        </w:p>
+        <w:p>
+          <w:pPr>
+            <w:pStyle w:val="TOC2"/>
+            <w:tabs>
+              <w:tab w:val="right" w:leader="dot" w:pos="9016"/>
+            </w:tabs>
+            <w:rPr>
+              <w:rFonts w:eastAsiaTheme="minorEastAsia"/>
+              <w:noProof/>
+              <w:sz w:val="24"/>
+              <w:szCs w:val="24"/>
+              <w:lang w:eastAsia="en-AU"/>
+            </w:rPr>
+          </w:pPr>
+          <w:hyperlink w:anchor="_Toc209806799" w:history="1">
+            <w:r>
+              <w:rPr>
+                <w:rStyle w:val="Hyperlink"/>
+                <w:noProof/>
+              </w:rPr>
+              <w:t>5.2 Compromissions and Changes</w:t>
+            </w:r>
+            <w:r>
+              <w:rPr>
+                <w:noProof/>
+                <w:webHidden/>
+              </w:rPr>
+              <w:tab/>
+            </w:r>
+            <w:r>
+              <w:rPr>
+                <w:noProof/>
+                <w:webHidden/>
+              </w:rPr>
+              <w:fldChar w:fldCharType="begin"/>
+            </w:r>
+            <w:r>
+              <w:rPr>
+                <w:noProof/>
+                <w:webHidden/>
+              </w:rPr>
+              <w:instrText xml:space="preserve"> PAGEREF _Toc209806799 \h </w:instrText>
+            </w:r>
+            <w:r>
+              <w:rPr>
+                <w:noProof/>
+                <w:webHidden/>
+              </w:rPr>
+            </w:r>
+            <w:r>
+              <w:rPr>
+                <w:noProof/>
+                <w:webHidden/>
+              </w:rPr>
+              <w:fldChar w:fldCharType="separate"/>
+            </w:r>
+            <w:r>
+              <w:rPr>
+                <w:noProof/>
+                <w:webHidden/>
+              </w:rPr>
+              <w:t>6</w:t>
+            </w:r>
+            <w:r>
+              <w:rPr>
+                <w:noProof/>
+                <w:webHidden/>
+              </w:rPr>
+              <w:fldChar w:fldCharType="end"/>
+            </w:r>
+          </w:hyperlink>
+        </w:p>
+        <w:p>
+          <w:pPr>
+            <w:pStyle w:val="TOC1"/>
+            <w:tabs>
+              <w:tab w:val="right" w:leader="dot" w:pos="9016"/>
+            </w:tabs>
+            <w:rPr>
+              <w:rFonts w:eastAsiaTheme="minorEastAsia"/>
+              <w:noProof/>
+              <w:sz w:val="24"/>
+              <w:szCs w:val="24"/>
+              <w:lang w:eastAsia="en-AU"/>
+            </w:rPr>
+          </w:pPr>
+          <w:hyperlink w:anchor="_Toc209806800" w:history="1">
+            <w:r>
+              <w:rPr>
+                <w:rStyle w:val="Hyperlink"/>
+                <w:noProof/>
+              </w:rPr>
+              <w:t>6. An explanation and justification of the effectiveness of the tests provided in assuring algorithmic correctness.</w:t>
+            </w:r>
+            <w:r>
+              <w:rPr>
+                <w:noProof/>
+                <w:webHidden/>
+              </w:rPr>
+              <w:tab/>
+            </w:r>
+            <w:r>
+              <w:rPr>
+                <w:noProof/>
+                <w:webHidden/>
+              </w:rPr>
+              <w:fldChar w:fldCharType="begin"/>
+            </w:r>
+            <w:r>
+              <w:rPr>
+                <w:noProof/>
+                <w:webHidden/>
+              </w:rPr>
+              <w:instrText xml:space="preserve"> PAGEREF _Toc209806800 \h </w:instrText>
+            </w:r>
+            <w:r>
+              <w:rPr>
+                <w:noProof/>
+                <w:webHidden/>
+              </w:rPr>
+            </w:r>
+            <w:r>
+              <w:rPr>
+                <w:noProof/>
+                <w:webHidden/>
+              </w:rPr>
+              <w:fldChar w:fldCharType="separate"/>
+            </w:r>
+            <w:r>
+              <w:rPr>
+                <w:noProof/>
+                <w:webHidden/>
+              </w:rPr>
+              <w:t>6</w:t>
+            </w:r>
+            <w:r>
+              <w:rPr>
+                <w:noProof/>
+                <w:webHidden/>
+              </w:rPr>
+              <w:fldChar w:fldCharType="end"/>
+            </w:r>
+          </w:hyperlink>
+        </w:p>
+        <w:p>
+          <w:pPr>
+            <w:pStyle w:val="TOC2"/>
+            <w:tabs>
+              <w:tab w:val="right" w:leader="dot" w:pos="9016"/>
+            </w:tabs>
+            <w:rPr>
+              <w:rFonts w:eastAsiaTheme="minorEastAsia"/>
+              <w:noProof/>
+              <w:sz w:val="24"/>
+              <w:szCs w:val="24"/>
+              <w:lang w:eastAsia="en-AU"/>
+            </w:rPr>
+          </w:pPr>
+          <w:hyperlink w:anchor="_Toc209806801" w:history="1">
+            <w:r>
+              <w:rPr>
+                <w:rStyle w:val="Hyperlink"/>
+                <w:noProof/>
+              </w:rPr>
+              <w:t>6.1 Unit Test Demonstration</w:t>
+            </w:r>
+            <w:r>
+              <w:rPr>
+                <w:noProof/>
+                <w:webHidden/>
+              </w:rPr>
+              <w:tab/>
+            </w:r>
+            <w:r>
+              <w:rPr>
+                <w:noProof/>
+                <w:webHidden/>
+              </w:rPr>
+              <w:fldChar w:fldCharType="begin"/>
+            </w:r>
+            <w:r>
+              <w:rPr>
+                <w:noProof/>
+                <w:webHidden/>
+              </w:rPr>
+              <w:instrText xml:space="preserve"> PAGEREF _Toc209806801 \h </w:instrText>
+            </w:r>
+            <w:r>
+              <w:rPr>
+                <w:noProof/>
+                <w:webHidden/>
+              </w:rPr>
+            </w:r>
+            <w:r>
+              <w:rPr>
+                <w:noProof/>
+                <w:webHidden/>
+              </w:rPr>
+              <w:fldChar w:fldCharType="separate"/>
+            </w:r>
+            <w:r>
+              <w:rPr>
+                <w:noProof/>
+                <w:webHidden/>
+              </w:rPr>
+              <w:t>6</w:t>
+            </w:r>
+            <w:r>
+              <w:rPr>
+                <w:noProof/>
+                <w:webHidden/>
+              </w:rPr>
+              <w:fldChar w:fldCharType="end"/>
+            </w:r>
+          </w:hyperlink>
+        </w:p>
+        <w:p>
+          <w:pPr>
+            <w:pStyle w:val="TOC2"/>
+            <w:tabs>
+              <w:tab w:val="right" w:leader="dot" w:pos="9016"/>
+            </w:tabs>
+            <w:rPr>
+              <w:rFonts w:eastAsiaTheme="minorEastAsia"/>
+              <w:noProof/>
+              <w:sz w:val="24"/>
+              <w:szCs w:val="24"/>
+              <w:lang w:eastAsia="en-AU"/>
+            </w:rPr>
+          </w:pPr>
+          <w:hyperlink w:anchor="_Toc209806802" w:history="1">
+            <w:r>
+              <w:rPr>
+                <w:rStyle w:val="Hyperlink"/>
+                <w:noProof/>
+              </w:rPr>
+              <w:t>6.2 Unit Test Effectiveness</w:t>
+            </w:r>
+            <w:r>
+              <w:rPr>
+                <w:noProof/>
+                <w:webHidden/>
+              </w:rPr>
+              <w:tab/>
+            </w:r>
+            <w:r>
+              <w:rPr>
+                <w:noProof/>
+                <w:webHidden/>
+              </w:rPr>
+              <w:fldChar w:fldCharType="begin"/>
+            </w:r>
+            <w:r>
+              <w:rPr>
+                <w:noProof/>
+                <w:webHidden/>
+              </w:rPr>
+              <w:instrText xml:space="preserve"> PAGEREF _Toc209806802 \h </w:instrText>
+            </w:r>
+            <w:r>
+              <w:rPr>
+                <w:noProof/>
+                <w:webHidden/>
+              </w:rPr>
+            </w:r>
+            <w:r>
+              <w:rPr>
+                <w:noProof/>
+                <w:webHidden/>
+              </w:rPr>
+              <w:fldChar w:fldCharType="separate"/>
+            </w:r>
+            <w:r>
+              <w:rPr>
+                <w:noProof/>
+                <w:webHidden/>
+              </w:rPr>
+              <w:t>6</w:t>
+            </w:r>
+            <w:r>
+              <w:rPr>
+                <w:noProof/>
+                <w:webHidden/>
+              </w:rPr>
+              <w:fldChar w:fldCharType="end"/>
+            </w:r>
+          </w:hyperlink>
+        </w:p>
+        <w:p>
+          <w:pPr>
+            <w:pStyle w:val="TOC1"/>
+            <w:tabs>
+              <w:tab w:val="right" w:leader="dot" w:pos="9016"/>
+            </w:tabs>
+            <w:rPr>
+              <w:rFonts w:eastAsiaTheme="minorEastAsia"/>
+              <w:noProof/>
+              <w:sz w:val="24"/>
+              <w:szCs w:val="24"/>
+              <w:lang w:eastAsia="en-AU"/>
+            </w:rPr>
+          </w:pPr>
+          <w:hyperlink w:anchor="_Toc209806803" w:history="1">
+            <w:r>
+              <w:rPr>
+                <w:rStyle w:val="Hyperlink"/>
+                <w:noProof/>
+              </w:rPr>
+              <w:t>7. Any insights or observations that would help someone else implement the same algorithm.</w:t>
+            </w:r>
+            <w:r>
+              <w:rPr>
+                <w:noProof/>
+                <w:webHidden/>
+              </w:rPr>
+              <w:tab/>
+            </w:r>
+            <w:r>
+              <w:rPr>
+                <w:noProof/>
+                <w:webHidden/>
+              </w:rPr>
+              <w:fldChar w:fldCharType="begin"/>
+            </w:r>
+            <w:r>
+              <w:rPr>
+                <w:noProof/>
+                <w:webHidden/>
+              </w:rPr>
+              <w:instrText xml:space="preserve"> PAGEREF _Toc209806803 \h </w:instrText>
+            </w:r>
+            <w:r>
+              <w:rPr>
+                <w:noProof/>
+                <w:webHidden/>
+              </w:rPr>
+            </w:r>
+            <w:r>
+              <w:rPr>
+                <w:noProof/>
+                <w:webHidden/>
+              </w:rPr>
+              <w:fldChar w:fldCharType="separate"/>
+            </w:r>
+            <w:r>
+              <w:rPr>
+                <w:noProof/>
+                <w:webHidden/>
+              </w:rPr>
+              <w:t>6</w:t>
+            </w:r>
+            <w:r>
+              <w:rPr>
+                <w:noProof/>
+                <w:webHidden/>
+              </w:rPr>
+              <w:fldChar w:fldCharType="end"/>
+            </w:r>
+          </w:hyperlink>
+        </w:p>
+        <w:p>
+          <w:pPr>
+            <w:pStyle w:val="TOC1"/>
+            <w:tabs>
+              <w:tab w:val="right" w:leader="dot" w:pos="9016"/>
+            </w:tabs>
+            <w:rPr>
+              <w:rFonts w:eastAsiaTheme="minorEastAsia"/>
+              <w:noProof/>
+              <w:sz w:val="24"/>
+              <w:szCs w:val="24"/>
+              <w:lang w:eastAsia="en-AU"/>
+            </w:rPr>
+          </w:pPr>
+          <w:hyperlink w:anchor="_Toc209806804" w:history="1">
+            <w:r>
+              <w:rPr>
+                <w:rStyle w:val="Hyperlink"/>
+                <w:noProof/>
+              </w:rPr>
+              <w:t>References</w:t>
+            </w:r>
+            <w:r>
+              <w:rPr>
+                <w:noProof/>
+                <w:webHidden/>
+              </w:rPr>
+              <w:tab/>
+            </w:r>
+            <w:r>
+              <w:rPr>
+                <w:noProof/>
+                <w:webHidden/>
+              </w:rPr>
+              <w:fldChar w:fldCharType="begin"/>
+            </w:r>
+            <w:r>
+              <w:rPr>
+                <w:noProof/>
+                <w:webHidden/>
+              </w:rPr>
+              <w:instrText xml:space="preserve"> PAGEREF _Toc209806804 \h </w:instrText>
+            </w:r>
+            <w:r>
+              <w:rPr>
+                <w:noProof/>
+                <w:webHidden/>
+              </w:rPr>
+            </w:r>
+            <w:r>
+              <w:rPr>
+                <w:noProof/>
+                <w:webHidden/>
+              </w:rPr>
+              <w:fldChar w:fldCharType="separate"/>
+            </w:r>
+            <w:r>
+              <w:rPr>
+                <w:noProof/>
+                <w:webHidden/>
+              </w:rPr>
+              <w:t>6</w:t>
+            </w:r>
+            <w:r>
+              <w:rPr>
+                <w:noProof/>
+                <w:webHidden/>
+              </w:rPr>
+              <w:fldChar w:fldCharType="end"/>
+            </w:r>
+          </w:hyperlink>
+        </w:p>
+        <w:p>
+          <w:r>
+            <w:rPr>
+              <w:b/>
+              <w:bCs/>
+              <w:lang w:val="en-GB"/>
+            </w:rPr>
+            <w:fldChar w:fldCharType="end"/>
+          </w:r>
+        </w:p>
+      </w:sdtContent>
+    </w:sdt>
+    <w:p>
+      <w:r>
+        <w:br w:type="page"/>
+      </w:r>
+    </w:p>
+    <w:p>
+      <w:pPr>
+        <w:pStyle w:val="Subtitle"/>
+      </w:pPr>
+      <w:r>
+        <w:lastRenderedPageBreak/>
+        <w:t>Abstract</w:t>
+      </w:r>
+    </w:p>
+    <w:p>
+      <w:pPr>
+        <w:pStyle w:val="Subtitle"/>
+        <w:rPr>
+          <w:rFonts w:ascii="Times New Roman" w:hAnsi="Times New Roman" w:cs="Times New Roman"/>
+          <w:sz w:val="24"/>
+          <w:szCs w:val="24"/>
+        </w:rPr>
+      </w:pPr>
+      <w:r>
+        <w:rPr>
+          <w:rFonts w:ascii="Times New Roman" w:hAnsi="Times New Roman" w:cs="Times New Roman"/>
+          <w:sz w:val="24"/>
+          <w:szCs w:val="24"/>
+        </w:rPr>
+        <w:t xml:space="preserve">This report is an outline of project 1 for Advanced Algorithms. We explore the solution proposed for </w:t>
+      </w:r>
+      <w:r>
+        <w:rPr>
+          <w:rFonts w:ascii="Times New Roman" w:hAnsi="Times New Roman" w:cs="Times New Roman"/>
+          <w:sz w:val="24"/>
+          <w:szCs w:val="24"/>
+        </w:rPr>
+        <w:t>Knuth-Morris-Pratt Algorithm</w:t>
+      </w:r>
+      <w:r>
+        <w:rPr>
+          <w:rFonts w:ascii="Times New Roman" w:hAnsi="Times New Roman" w:cs="Times New Roman"/>
+          <w:sz w:val="24"/>
+          <w:szCs w:val="24"/>
+        </w:rPr>
+        <w:t xml:space="preserve"> (KMP). The exploration is segmented into different stages which follows the same logic of the proposed solution computes. We first understand all the preprocessing</w:t>
+      </w:r>
+      <w:r>
+        <w:rPr>
+          <w:rFonts w:ascii="Times New Roman" w:hAnsi="Times New Roman" w:cs="Times New Roman"/>
+          <w:sz w:val="24"/>
+          <w:szCs w:val="24"/>
+        </w:rPr>
+        <w:t xml:space="preserve"> phase where we construct the prefix table</w:t>
+      </w:r>
+      <w:r>
+        <w:rPr>
+          <w:rFonts w:ascii="Times New Roman" w:hAnsi="Times New Roman" w:cs="Times New Roman"/>
+          <w:sz w:val="24"/>
+          <w:szCs w:val="24"/>
+        </w:rPr>
+        <w:t xml:space="preserve"> before we build the algorithm. We understand how the algorithm works and its significance</w:t>
+      </w:r>
+      <w:r>
+        <w:rPr>
+          <w:rFonts w:ascii="Times New Roman" w:hAnsi="Times New Roman" w:cs="Times New Roman"/>
+          <w:sz w:val="24"/>
+          <w:szCs w:val="24"/>
+        </w:rPr>
+        <w:t xml:space="preserve"> and superiority over a naïve algorithm which directly correlate with its time complexity. We follow this by justifying my method and how I tested this method to prove the significance of KMP algorithm is present.</w:t>
+      </w:r>
+    </w:p>
+    <w:p>
+      <w:pPr>
+        <w:pStyle w:val="Subtitle"/>
+        <w:rPr>
+          <w:rFonts w:asciiTheme="majorHAnsi" w:hAnsiTheme="majorHAnsi"/>
+          <w:color w:val="0F4761" w:themeColor="accent1" w:themeShade="BF"/>
+          <w:sz w:val="40"/>
+          <w:szCs w:val="40"/>
+        </w:rPr>
+      </w:pPr>
+      <w:r>
+        <w:rPr>
+          <w:rFonts w:ascii="Times New Roman" w:hAnsi="Times New Roman" w:cs="Times New Roman"/>
+          <w:sz w:val="24"/>
+          <w:szCs w:val="24"/>
+        </w:rPr>
+        <w:t>The algorithm is proved to provide an effective and linear solution for string pattern matching.</w:t>
+      </w:r>
+      <w:r>
+        <w:br w:type="page"/>
+      </w:r>
+    </w:p>
+    <w:p>
+      <w:pPr>
+        <w:pStyle w:val="Heading1"/>
+      </w:pPr>
+      <w:bookmarkStart w:id="0" w:name="_Toc209806782"/>
+      <w:r>
+        <w:lastRenderedPageBreak/>
+        <w:t xml:space="preserve">1. </w:t>
+      </w:r>
+      <w:r>
+        <w:t xml:space="preserve">A </w:t>
+      </w:r>
+      <w:r>
+        <w:t>high-level</w:t>
+      </w:r>
+      <w:r>
+        <w:t xml:space="preserve"> outline of the algorithm</w:t>
+      </w:r>
+      <w:bookmarkEnd w:id="0"/>
+    </w:p>
+    <w:p>
+      <w:pPr>
+        <w:pStyle w:val="Heading2"/>
+      </w:pPr>
+      <w:bookmarkStart w:id="1" w:name="_Toc209806783"/>
+      <w:r>
+        <w:t>1.1</w:t>
+      </w:r>
+      <w:r>
+        <w:t xml:space="preserve"> </w:t>
+      </w:r>
+      <w:r>
+        <w:t>Preprocessing</w:t>
+      </w:r>
+      <w:bookmarkEnd w:id="1"/>
+    </w:p>
+    <w:p>
+      <w:pPr>
+        <w:rPr>
+          <w:rFonts w:ascii="Times New Roman" w:hAnsi="Times New Roman" w:cs="Times New Roman"/>
+          <w:sz w:val="24"/>
+          <w:szCs w:val="24"/>
+        </w:rPr>
+      </w:pPr>
+      <w:r>
+        <w:rPr>
+          <w:rFonts w:ascii="Times New Roman" w:hAnsi="Times New Roman" w:cs="Times New Roman"/>
+          <w:sz w:val="24"/>
+          <w:szCs w:val="24"/>
+        </w:rPr>
+        <w:t>KMP Algorithm works by creating a pi table (also known as a prefix table) to hold values of recurrence within the pattern. This represents the longest sub-patterns or prefixes within the pattern. It ensures that when we search for patterns, we can reuse these sub-prefixes instead of restarting from the beginning each time. If a sub-prefix is not found, rather than restarting the search at the next character, we use the last matching sub-prefix as a starting point. This is why the pi table is so important and why it is constructed before the algorithm runs.</w:t>
+      </w:r>
+    </w:p>
+    <w:p>
+      <w:pPr>
+        <w:pStyle w:val="Heading2"/>
+      </w:pPr>
+      <w:bookmarkStart w:id="2" w:name="_Toc209806784"/>
+      <w:r>
+        <w:t xml:space="preserve">1.2 </w:t>
+      </w:r>
+      <w:r>
+        <w:t>Searching and Implementing</w:t>
+      </w:r>
+      <w:bookmarkEnd w:id="2"/>
+    </w:p>
+    <w:p>
+      <w:pPr>
+        <w:rPr>
+          <w:rFonts w:ascii="Times New Roman" w:hAnsi="Times New Roman" w:cs="Times New Roman"/>
+          <w:sz w:val="24"/>
+          <w:szCs w:val="24"/>
+        </w:rPr>
+      </w:pPr>
+      <w:r>
+        <w:rPr>
+          <w:rFonts w:ascii="Times New Roman" w:hAnsi="Times New Roman" w:cs="Times New Roman"/>
+          <w:sz w:val="24"/>
+          <w:szCs w:val="24"/>
+        </w:rPr>
+        <w:t xml:space="preserve">In a naïve approach, we check if the first letter of the pattern matches the first letter of the </w:t>
+      </w:r>
+      <w:r>
+        <w:rPr>
+          <w:rFonts w:ascii="Times New Roman" w:hAnsi="Times New Roman" w:cs="Times New Roman"/>
+          <w:sz w:val="24"/>
+          <w:szCs w:val="24"/>
+        </w:rPr>
+        <w:t>string. If not, we move forward</w:t>
+      </w:r>
+      <w:r>
+        <w:rPr>
+          <w:rFonts w:ascii="Times New Roman" w:hAnsi="Times New Roman" w:cs="Times New Roman"/>
+          <w:sz w:val="24"/>
+          <w:szCs w:val="24"/>
+        </w:rPr>
+        <w:t xml:space="preserve"> in the string, keeping the pattern index at 0</w:t>
+      </w:r>
+      <w:r>
+        <w:rPr>
+          <w:rFonts w:ascii="Times New Roman" w:hAnsi="Times New Roman" w:cs="Times New Roman"/>
+          <w:sz w:val="24"/>
+          <w:szCs w:val="24"/>
+        </w:rPr>
+        <w:t xml:space="preserve">. We track this by index i. </w:t>
+      </w:r>
+      <w:r>
+        <w:rPr>
+          <w:rFonts w:ascii="Times New Roman" w:hAnsi="Times New Roman" w:cs="Times New Roman"/>
+          <w:sz w:val="24"/>
+          <w:szCs w:val="24"/>
+        </w:rPr>
+        <w:t xml:space="preserve">We then </w:t>
+      </w:r>
+      <w:r>
+        <w:rPr>
+          <w:rFonts w:ascii="Times New Roman" w:hAnsi="Times New Roman" w:cs="Times New Roman"/>
+          <w:sz w:val="24"/>
+          <w:szCs w:val="24"/>
+        </w:rPr>
+        <w:t xml:space="preserve">test again until we find a match or the string finishes. If we find a match, followed by a mismatch, the index of the pattern variable is then set to 0 and the index of the string variable is set to where we found the first match plus 1. </w:t>
+      </w:r>
+    </w:p>
+    <w:p>
+      <w:pPr>
+        <w:rPr>
+          <w:rFonts w:ascii="Times New Roman" w:hAnsi="Times New Roman" w:cs="Times New Roman"/>
+          <w:sz w:val="24"/>
+          <w:szCs w:val="24"/>
+        </w:rPr>
+      </w:pPr>
+      <w:r>
+        <w:rPr>
+          <w:rFonts w:ascii="Times New Roman" w:hAnsi="Times New Roman" w:cs="Times New Roman"/>
+          <w:sz w:val="24"/>
+          <w:szCs w:val="24"/>
+        </w:rPr>
+        <w:t>In KMP, we look at sub prefixes instead. If we find a match while iterating through the string, which is followed by a mismatch, instead of jumping to where the first match was found, we instead look for where the last matching prefix was found. From there we test if the next index matches the next sub prefix. If it does, great, we avoided jumping to the start, if not, we push back once again until either we have a match or have gone to the end of the pattern were. This however now means we do not need to jump to he first match as we tested all the matches between the first mismatch and all the sub prefixes and means we can continue searching for the next matching index in the string from the current index and only reset the pattern index.</w:t>
+      </w:r>
+    </w:p>
+    <w:p>
+      <w:pPr>
+        <w:pStyle w:val="Heading1"/>
+      </w:pPr>
+      <w:bookmarkStart w:id="3" w:name="_Toc209806785"/>
+      <w:r>
+        <w:t xml:space="preserve">2. </w:t>
+      </w:r>
+      <w:r>
+        <w:t>The application domain(s) of the algorithm, and its effectiveness therein.</w:t>
+      </w:r>
+      <w:bookmarkEnd w:id="3"/>
+    </w:p>
+    <w:p>
+      <w:pPr>
+        <w:pStyle w:val="Heading2"/>
+      </w:pPr>
+      <w:bookmarkStart w:id="4" w:name="_Toc209806786"/>
+      <w:r>
+        <w:t xml:space="preserve">2.1 </w:t>
+      </w:r>
+      <w:r>
+        <w:t>Use Case of KMP</w:t>
+      </w:r>
+      <w:bookmarkEnd w:id="4"/>
+    </w:p>
+    <w:p>
+      <w:pPr>
+        <w:rPr>
+          <w:rFonts w:ascii="Times New Roman" w:hAnsi="Times New Roman" w:cs="Times New Roman"/>
+          <w:sz w:val="24"/>
+          <w:szCs w:val="24"/>
+        </w:rPr>
+      </w:pPr>
+      <w:r>
+        <w:rPr>
+          <w:rFonts w:ascii="Times New Roman" w:hAnsi="Times New Roman" w:cs="Times New Roman"/>
+          <w:sz w:val="24"/>
+          <w:szCs w:val="24"/>
+        </w:rPr>
+        <w:t xml:space="preserve">KMP is used to find patterns in strings. Searching strings </w:t>
+      </w:r>
+      <w:r>
+        <w:rPr>
+          <w:rFonts w:ascii="Times New Roman" w:hAnsi="Times New Roman" w:cs="Times New Roman"/>
+          <w:sz w:val="24"/>
+          <w:szCs w:val="24"/>
+        </w:rPr>
+        <w:t xml:space="preserve">is </w:t>
+      </w:r>
+      <w:r>
+        <w:rPr>
+          <w:rFonts w:ascii="Times New Roman" w:hAnsi="Times New Roman" w:cs="Times New Roman"/>
+          <w:sz w:val="24"/>
+          <w:szCs w:val="24"/>
+        </w:rPr>
+        <w:t>an</w:t>
+      </w:r>
+      <w:r>
+        <w:rPr>
+          <w:rFonts w:ascii="Times New Roman" w:hAnsi="Times New Roman" w:cs="Times New Roman"/>
+          <w:sz w:val="24"/>
+          <w:szCs w:val="24"/>
+        </w:rPr>
+        <w:t xml:space="preserve"> intense computation going manually through every single index of a string at worst iterating pattern.size </w:t>
+      </w:r>
+      <w:r>
+        <w:rPr>
+          <w:rFonts w:ascii="Times New Roman" w:hAnsi="Times New Roman" w:cs="Times New Roman"/>
+          <w:sz w:val="24"/>
+          <w:szCs w:val="24"/>
+        </w:rPr>
+        <w:t>times</w:t>
+      </w:r>
+      <w:r>
+        <w:rPr>
+          <w:rFonts w:ascii="Times New Roman" w:hAnsi="Times New Roman" w:cs="Times New Roman"/>
+          <w:sz w:val="24"/>
+          <w:szCs w:val="24"/>
+        </w:rPr>
+        <w:t xml:space="preserve">. This means for a string at size n, it will </w:t>
+      </w:r>
+      <w:r>
+        <w:rPr>
+          <w:rFonts w:ascii="Times New Roman" w:hAnsi="Times New Roman" w:cs="Times New Roman"/>
+          <w:sz w:val="24"/>
+          <w:szCs w:val="24"/>
+        </w:rPr>
+        <w:t xml:space="preserve">at worst case </w:t>
+      </w:r>
+      <w:r>
+        <w:rPr>
+          <w:rFonts w:ascii="Times New Roman" w:hAnsi="Times New Roman" w:cs="Times New Roman"/>
+          <w:sz w:val="24"/>
+          <w:szCs w:val="24"/>
+        </w:rPr>
+        <w:t>have to go through every single index m times.</w:t>
+      </w:r>
+    </w:p>
+    <w:p>
+      <w:pPr>
+        <w:pStyle w:val="Heading3"/>
+      </w:pPr>
+      <w:bookmarkStart w:id="5" w:name="_Toc209806787"/>
+      <w:r>
+        <w:t>2.1.1 Text and Data Processing</w:t>
+      </w:r>
+      <w:bookmarkEnd w:id="5"/>
+    </w:p>
+    <w:p>
+      <w:pPr>
+        <w:rPr>
+          <w:rFonts w:ascii="Times New Roman" w:hAnsi="Times New Roman" w:cs="Times New Roman"/>
+          <w:sz w:val="24"/>
+          <w:szCs w:val="24"/>
+        </w:rPr>
+      </w:pPr>
+      <w:r>
+        <w:rPr>
+          <w:rFonts w:ascii="Times New Roman" w:hAnsi="Times New Roman" w:cs="Times New Roman"/>
+          <w:sz w:val="24"/>
+          <w:szCs w:val="24"/>
+        </w:rPr>
+        <w:t xml:space="preserve">Pattern matching is used for specific keyword or phrase searching in a large set of strings or dataset. This can be used within search engines, data validation, parsing, information retrieval and text processing (Bot Penguin, n.d.). </w:t>
+      </w:r>
+    </w:p>
+    <w:p>
+      <w:pPr>
+        <w:rPr>
+          <w:rFonts w:ascii="Times New Roman" w:hAnsi="Times New Roman" w:cs="Times New Roman"/>
+          <w:sz w:val="24"/>
+          <w:szCs w:val="24"/>
+        </w:rPr>
+      </w:pPr>
+      <w:r>
+        <w:rPr>
+          <w:rFonts w:ascii="Times New Roman" w:hAnsi="Times New Roman" w:cs="Times New Roman"/>
+          <w:sz w:val="24"/>
+          <w:szCs w:val="24"/>
+        </w:rPr>
+        <w:t>We can also use pattern matching for data validation for phone numbers and emails as to ensure data integrity. This can include tokenization.</w:t>
+      </w:r>
+    </w:p>
+    <w:p>
+      <w:pPr>
+        <w:pStyle w:val="Heading3"/>
+      </w:pPr>
+      <w:bookmarkStart w:id="6" w:name="_Toc209806788"/>
+      <w:r>
+        <w:lastRenderedPageBreak/>
+        <w:t>2.1.2 Machine Learning &amp; AI</w:t>
+      </w:r>
+      <w:bookmarkEnd w:id="6"/>
+    </w:p>
+    <w:p>
+      <w:pPr>
+        <w:rPr>
+          <w:rFonts w:ascii="Times New Roman" w:hAnsi="Times New Roman" w:cs="Times New Roman"/>
+          <w:sz w:val="24"/>
+          <w:szCs w:val="24"/>
+        </w:rPr>
+      </w:pPr>
+      <w:r>
+        <w:rPr>
+          <w:rFonts w:ascii="Times New Roman" w:hAnsi="Times New Roman" w:cs="Times New Roman"/>
+          <w:sz w:val="24"/>
+          <w:szCs w:val="24"/>
+        </w:rPr>
+        <w:t xml:space="preserve">AI takes advantage of pattern recognition to optimize the way computers interpret data. This ultimately </w:t>
+      </w:r>
+      <w:r>
+        <w:rPr>
+          <w:rFonts w:ascii="Times New Roman" w:hAnsi="Times New Roman" w:cs="Times New Roman"/>
+          <w:sz w:val="24"/>
+          <w:szCs w:val="24"/>
+        </w:rPr>
+        <w:t>“</w:t>
+      </w:r>
+      <w:r>
+        <w:rPr>
+          <w:rFonts w:ascii="Times New Roman" w:hAnsi="Times New Roman" w:cs="Times New Roman"/>
+          <w:i/>
+          <w:iCs/>
+          <w:sz w:val="24"/>
+          <w:szCs w:val="24"/>
+        </w:rPr>
+        <w:t>helps</w:t>
+      </w:r>
+      <w:r>
+        <w:rPr>
+          <w:rFonts w:ascii="Times New Roman" w:hAnsi="Times New Roman" w:cs="Times New Roman"/>
+          <w:sz w:val="24"/>
+          <w:szCs w:val="24"/>
+        </w:rPr>
+        <w:t xml:space="preserve"> </w:t>
+      </w:r>
+      <w:r>
+        <w:rPr>
+          <w:rFonts w:ascii="Times New Roman" w:hAnsi="Times New Roman" w:cs="Times New Roman"/>
+          <w:i/>
+          <w:iCs/>
+          <w:sz w:val="24"/>
+          <w:szCs w:val="24"/>
+        </w:rPr>
+        <w:t>systems to classify, cluster and interpret complex datasets, making it useful in fields like computer vision, healthcare, security and automation</w:t>
+      </w:r>
+      <w:r>
+        <w:rPr>
+          <w:rFonts w:ascii="Times New Roman" w:hAnsi="Times New Roman" w:cs="Times New Roman"/>
+          <w:sz w:val="24"/>
+          <w:szCs w:val="24"/>
+        </w:rPr>
+        <w:t xml:space="preserve">” (Geeks for Geeks, 2025). </w:t>
+      </w:r>
+    </w:p>
+    <w:p>
+      <w:pPr>
+        <w:rPr>
+          <w:rFonts w:ascii="Times New Roman" w:hAnsi="Times New Roman" w:cs="Times New Roman"/>
+          <w:sz w:val="24"/>
+          <w:szCs w:val="24"/>
+        </w:rPr>
+      </w:pPr>
+      <w:r>
+        <w:rPr>
+          <w:rFonts w:ascii="Times New Roman" w:hAnsi="Times New Roman" w:cs="Times New Roman"/>
+          <w:sz w:val="24"/>
+          <w:szCs w:val="24"/>
+        </w:rPr>
+        <w:t xml:space="preserve">Through CNN, Computer vision also utilizes pattern matching and pattern recognition to function. First patterns are put into ‘Sparse’ and then used for image classification. This is seen in a study by Wright, et.al, </w:t>
+      </w:r>
+      <w:r>
+        <w:rPr>
+          <w:rFonts w:ascii="Times New Roman" w:hAnsi="Times New Roman" w:cs="Times New Roman"/>
+          <w:sz w:val="24"/>
+          <w:szCs w:val="24"/>
+        </w:rPr>
+        <w:t>"</w:t>
+      </w:r>
+      <w:r>
+        <w:rPr>
+          <w:rFonts w:ascii="Times New Roman" w:hAnsi="Times New Roman" w:cs="Times New Roman"/>
+          <w:i/>
+          <w:iCs/>
+          <w:sz w:val="24"/>
+          <w:szCs w:val="24"/>
+        </w:rPr>
+        <w:t>While image representation and reconstruction has been the most popular goal of sparse modeling and dictionary learning, other important image science applications are starting to be addressed by this framework, in particular, classification and detection.</w:t>
+      </w:r>
+      <w:r>
+        <w:rPr>
+          <w:rFonts w:ascii="Times New Roman" w:hAnsi="Times New Roman" w:cs="Times New Roman"/>
+          <w:sz w:val="24"/>
+          <w:szCs w:val="24"/>
+        </w:rPr>
+        <w:t>"</w:t>
+      </w:r>
+      <w:r>
+        <w:rPr>
+          <w:rFonts w:ascii="Times New Roman" w:hAnsi="Times New Roman" w:cs="Times New Roman"/>
+          <w:sz w:val="24"/>
+          <w:szCs w:val="24"/>
+        </w:rPr>
+        <w:t xml:space="preserve"> </w:t>
+      </w:r>
+      <w:r>
+        <w:rPr>
+          <w:rFonts w:ascii="Times New Roman" w:hAnsi="Times New Roman" w:cs="Times New Roman"/>
+          <w:sz w:val="24"/>
+          <w:szCs w:val="24"/>
+        </w:rPr>
+        <w:t>(</w:t>
+      </w:r>
+      <w:r>
+        <w:rPr>
+          <w:rFonts w:ascii="Times New Roman" w:hAnsi="Times New Roman" w:cs="Times New Roman"/>
+          <w:sz w:val="24"/>
+          <w:szCs w:val="24"/>
+        </w:rPr>
+        <w:t>Wright et al., 2010</w:t>
+      </w:r>
+      <w:r>
+        <w:rPr>
+          <w:rFonts w:ascii="Times New Roman" w:hAnsi="Times New Roman" w:cs="Times New Roman"/>
+          <w:sz w:val="24"/>
+          <w:szCs w:val="24"/>
+        </w:rPr>
+        <w:t>)</w:t>
+      </w:r>
+      <w:r>
+        <w:rPr>
+          <w:rFonts w:ascii="Times New Roman" w:hAnsi="Times New Roman" w:cs="Times New Roman"/>
+          <w:sz w:val="24"/>
+          <w:szCs w:val="24"/>
+        </w:rPr>
+        <w:t>.</w:t>
+      </w:r>
+    </w:p>
+    <w:p>
+      <w:pPr>
+        <w:pStyle w:val="Heading3"/>
+      </w:pPr>
+      <w:bookmarkStart w:id="7" w:name="_Toc209806789"/>
+      <w:r>
+        <w:t>2.1.3 Bioinformation</w:t>
+      </w:r>
+      <w:bookmarkEnd w:id="7"/>
+    </w:p>
+    <w:p>
+      <w:pPr>
+        <w:rPr>
+          <w:rFonts w:ascii="Times New Roman" w:hAnsi="Times New Roman" w:cs="Times New Roman"/>
+          <w:sz w:val="24"/>
+          <w:szCs w:val="24"/>
+        </w:rPr>
+      </w:pPr>
+      <w:r>
+        <w:rPr>
+          <w:rFonts w:ascii="Times New Roman" w:hAnsi="Times New Roman" w:cs="Times New Roman"/>
+          <w:sz w:val="24"/>
+          <w:szCs w:val="24"/>
+        </w:rPr>
+        <w:t xml:space="preserve">Pattern matching is used in bioinformatics to find sequences like DNA, RNA, and proteins. It is vital to detect mutations align sequences and assemble genomes. This can be seen in this quote from </w:t>
+      </w:r>
+      <w:r>
+        <w:rPr>
+          <w:rFonts w:ascii="Times New Roman" w:hAnsi="Times New Roman" w:cs="Times New Roman"/>
+          <w:sz w:val="24"/>
+          <w:szCs w:val="24"/>
+        </w:rPr>
+        <w:t>a published research paper around pattern matching methods for DNA Sequencing in internet of Medical Things, “</w:t>
+      </w:r>
+      <w:r>
+        <w:rPr>
+          <w:rFonts w:ascii="Times New Roman" w:hAnsi="Times New Roman" w:cs="Times New Roman"/>
+          <w:i/>
+          <w:iCs/>
+          <w:sz w:val="24"/>
+          <w:szCs w:val="24"/>
+        </w:rPr>
+        <w:t>Read alignment is affected by some sequencing technology parameters, including the read length and error rate.</w:t>
+      </w:r>
+      <w:r>
+        <w:rPr>
+          <w:rFonts w:ascii="Times New Roman" w:hAnsi="Times New Roman" w:cs="Times New Roman"/>
+          <w:i/>
+          <w:iCs/>
+          <w:sz w:val="24"/>
+          <w:szCs w:val="24"/>
+        </w:rPr>
+        <w:t xml:space="preserve"> </w:t>
+      </w:r>
+      <w:r>
+        <w:rPr>
+          <w:rFonts w:ascii="Times New Roman" w:hAnsi="Times New Roman" w:cs="Times New Roman"/>
+          <w:i/>
+          <w:iCs/>
+          <w:sz w:val="24"/>
+          <w:szCs w:val="24"/>
+        </w:rPr>
+        <w:t>It is essential to determine the actual location of each read,</w:t>
+      </w:r>
+      <w:r>
+        <w:rPr>
+          <w:rFonts w:ascii="Times New Roman" w:hAnsi="Times New Roman" w:cs="Times New Roman"/>
+          <w:i/>
+          <w:iCs/>
+          <w:sz w:val="24"/>
+          <w:szCs w:val="24"/>
+        </w:rPr>
+        <w:t xml:space="preserve"> </w:t>
+      </w:r>
+      <w:r>
+        <w:rPr>
+          <w:rFonts w:ascii="Times New Roman" w:hAnsi="Times New Roman" w:cs="Times New Roman"/>
+          <w:i/>
+          <w:iCs/>
+          <w:sz w:val="24"/>
+          <w:szCs w:val="24"/>
+        </w:rPr>
+        <w:t xml:space="preserve">according to the reference. </w:t>
+      </w:r>
+      <w:r>
+        <w:rPr>
+          <w:rFonts w:ascii="Times New Roman" w:hAnsi="Times New Roman" w:cs="Times New Roman"/>
+          <w:i/>
+          <w:iCs/>
+          <w:sz w:val="24"/>
+          <w:szCs w:val="24"/>
+        </w:rPr>
+        <w:t>Th</w:t>
+      </w:r>
+      <w:r>
+        <w:rPr>
+          <w:rFonts w:ascii="Times New Roman" w:hAnsi="Times New Roman" w:cs="Times New Roman"/>
+          <w:i/>
+          <w:iCs/>
+          <w:sz w:val="24"/>
+          <w:szCs w:val="24"/>
+        </w:rPr>
+        <w:t>e exact location cannot be</w:t>
+      </w:r>
+      <w:r>
+        <w:rPr>
+          <w:rFonts w:ascii="Times New Roman" w:hAnsi="Times New Roman" w:cs="Times New Roman"/>
+          <w:i/>
+          <w:iCs/>
+          <w:sz w:val="24"/>
+          <w:szCs w:val="24"/>
+        </w:rPr>
+        <w:t xml:space="preserve"> </w:t>
+      </w:r>
+      <w:r>
+        <w:rPr>
+          <w:rFonts w:ascii="Times New Roman" w:hAnsi="Times New Roman" w:cs="Times New Roman"/>
+          <w:i/>
+          <w:iCs/>
+          <w:sz w:val="24"/>
+          <w:szCs w:val="24"/>
+        </w:rPr>
+        <w:t xml:space="preserve">determined in advance, so the matching has to be </w:t>
+      </w:r>
+      <w:r>
+        <w:rPr>
+          <w:rFonts w:ascii="Times New Roman" w:hAnsi="Times New Roman" w:cs="Times New Roman"/>
+          <w:i/>
+          <w:iCs/>
+          <w:sz w:val="24"/>
+          <w:szCs w:val="24"/>
+        </w:rPr>
+        <w:t>done approximately</w:t>
+      </w:r>
+      <w:r>
+        <w:rPr>
+          <w:rFonts w:ascii="Times New Roman" w:hAnsi="Times New Roman" w:cs="Times New Roman"/>
+          <w:sz w:val="24"/>
+          <w:szCs w:val="24"/>
+        </w:rPr>
+        <w:t>” (Rexie, J. A. M, 2022)</w:t>
+      </w:r>
+    </w:p>
+    <w:p>
+      <w:pPr>
+        <w:pStyle w:val="Heading3"/>
+      </w:pPr>
+      <w:bookmarkStart w:id="8" w:name="_Toc209806791"/>
+      <w:r>
+        <w:t xml:space="preserve">2.2 </w:t>
+      </w:r>
+      <w:r>
+        <w:t>Benefits and Effectiveness of KMP</w:t>
+      </w:r>
+      <w:bookmarkEnd w:id="8"/>
+    </w:p>
+    <w:p>
+      <w:r>
+        <w:t>The benefits of KMP are directly due to the pi table the algorithm creates. This is understood to be a space complexity loss, however, due to the performance of the algorithm compared to naïve approaches, it is a more optimal solution.</w:t>
+      </w:r>
+    </w:p>
+    <w:p>
+      <w:r>
+        <w:t xml:space="preserve">When we look at large data structures, KMP shines as it can at runtime compute overlapping patterns which is crucial in large strings. All of the above use cases mentioned deal with strings with well over one million characters, to find a pattern within these strings would almost not be possible using the naïve method due to how long it would take. KMP makes all that possible. </w:t>
+      </w:r>
+    </w:p>
+    <w:p>
+      <w:pPr>
+        <w:pStyle w:val="Heading1"/>
+      </w:pPr>
+      <w:bookmarkStart w:id="9" w:name="_Toc209806792"/>
+      <w:r>
+        <w:t xml:space="preserve">3. </w:t>
+      </w:r>
+      <w:r>
+        <w:t>The theoretical complexity of the algorithm.</w:t>
+      </w:r>
+      <w:bookmarkEnd w:id="9"/>
+    </w:p>
+    <w:p>
+      <w:r>
+        <w:t>The time complexity for a naïve approach is O(mn). This is due to the fact that at worst case, we need to test every single character within the patter against every single character within the string.</w:t>
+      </w:r>
+    </w:p>
+    <w:p>
+      <w:r>
+        <w:t>Due to the optimisation of the KMP algorithm, we only need to need to iterate through the pattern once and iterate through the string once. Therefore, this solution completes at a time complexity of O(m+n).</w:t>
+      </w:r>
+    </w:p>
+    <w:p>
+      <w:pPr>
+        <w:pStyle w:val="Heading2"/>
+      </w:pPr>
+      <w:bookmarkStart w:id="10" w:name="_Toc209806793"/>
+      <w:r>
+        <w:t>3.1 Processing Steps</w:t>
+      </w:r>
+      <w:bookmarkEnd w:id="10"/>
+    </w:p>
+    <w:p>
+      <w:r>
+        <w:t xml:space="preserve">To use KMP, we must have a Pi table to refer to, this is the soul of the algorithm. Therefore, we must begin with some preprocessing before we implement KMPs solution. </w:t>
+      </w:r>
+    </w:p>
+    <w:p>
+      <w:r>
+        <w:t xml:space="preserve">In this step, we iterate through the pattern we are looking for and try find sub patterns/prefixes. This is what we use to fall back on when we step backwards. We search the current index </w:t>
+      </w:r>
+      <w:r>
+        <w:lastRenderedPageBreak/>
+        <w:t xml:space="preserve">matches the longest pattern we have previously found, if so, we </w:t>
+      </w:r>
+      <w:r>
+        <w:t>increment</w:t>
+      </w:r>
+      <w:r>
+        <w:t xml:space="preserve"> the longest found sub pattern, otherwise we </w:t>
+      </w:r>
+      <w:r>
+        <w:t>decrement</w:t>
+      </w:r>
+      <w:r>
+        <w:t xml:space="preserve"> the longest </w:t>
+      </w:r>
+      <w:r>
+        <w:t>found sub pattern</w:t>
+      </w:r>
+      <w:r>
+        <w:t xml:space="preserve">. </w:t>
+      </w:r>
+    </w:p>
+    <w:p>
+      <w:r>
+        <w:t>As this interaction only looks through the pattern once, the time complexity of this step is O(m).</w:t>
+      </w:r>
+    </w:p>
+    <w:p>
+      <w:pPr>
+        <w:pStyle w:val="Heading2"/>
+      </w:pPr>
+      <w:bookmarkStart w:id="11" w:name="_Toc209806794"/>
+      <w:r>
+        <w:t>3.2 Search Phase</w:t>
+      </w:r>
+      <w:bookmarkEnd w:id="11"/>
+    </w:p>
+    <w:p>
+      <w:r>
+        <w:t>In this stage, we have already created the pi table which we can refer to and now we begin searching the string using the pi table as reference. As one of the benefits of KMP is that it can look at overlapping patterns, this indicates that KMP does NOT need to look backwards after a mismatch is found. Therefore, we only need to test each character within the string once against the pi table.</w:t>
+      </w:r>
+    </w:p>
+    <w:p>
+      <w:r>
+        <w:t>Due to the fact we iterate through the string at most only once, the time complexity for the search step is O(N)</w:t>
+      </w:r>
+    </w:p>
+    <w:p>
+      <w:pPr>
+        <w:pStyle w:val="Heading1"/>
+      </w:pPr>
+      <w:bookmarkStart w:id="12" w:name="_Toc209806795"/>
+      <w:r>
+        <w:t xml:space="preserve">4. </w:t>
+      </w:r>
+      <w:r>
+        <w:t>The complexity of your implementation (indicating the level of confidence in any external components used as applicable and necessary).</w:t>
+      </w:r>
+      <w:bookmarkEnd w:id="12"/>
+    </w:p>
+    <w:p>
+      <w:pPr>
+        <w:pStyle w:val="Heading2"/>
+      </w:pPr>
+      <w:bookmarkStart w:id="13" w:name="_Toc209806796"/>
+      <w:r>
+        <w:t>4.1 Code Breakdown</w:t>
+      </w:r>
+      <w:bookmarkEnd w:id="13"/>
+    </w:p>
+    <w:p>
+      <w:r>
+        <w:t xml:space="preserve">For my implementation, I have </w:t>
+      </w:r>
+      <w:r>
+        <w:t>created</w:t>
+      </w:r>
+      <w:r>
+        <w:t xml:space="preserve"> a vector to hold the pi table, this vector is built by iterating through the pattern pattern.size times, and while j, the length of the longest sub prefix found so far, is larger than 0, we test if the pattern at the index does not match the pattern at the longest sub prefix. If it does not match the previous longest prefix  we know, we jump back to the previous sub longest prefix we previously found. </w:t>
+      </w:r>
+      <w:r>
+        <w:t>E</w:t>
+      </w:r>
+      <w:r>
+        <w:t>nsuring we are only jumping back the last longest sub prefix instead of reiterating through the entire pattern. If the indexes do match, we then increment j and save the current longest prefix in pi to recall later when we find a mismatch. Lastly, we return the pi table.</w:t>
+      </w:r>
+      <w:r>
+        <w:t xml:space="preserve"> </w:t>
+      </w:r>
+    </w:p>
+    <w:p>
+      <w:r>
+        <w:t xml:space="preserve">Once the pi table is complete, it will return a set of numbers which recognise the longest sub pattern at this index within the pattern as a reference for the KMP algorithm. Now we can begin searching the string. </w:t>
+      </w:r>
+    </w:p>
+    <w:p>
+      <w:r>
+        <w:t xml:space="preserve">We now create another vector called patterns found to hold the index of the first character of the pattern found within the index. This is because, the return of this algorithm is looking for not just the total of times the pattern was found within the string, but which index there were found on. This does take a high space complexity compared to and int which jus returns the number of times the pattern was found, but it is required to build on this algorithm. We then test if the pattern is empty. If it is empty and it is an empty case, we return the patterns found vector which will return empty and the execution is complete. </w:t>
+      </w:r>
+    </w:p>
+    <w:p/>
+    <w:p>
+      <w:pPr>
+        <w:pStyle w:val="Heading1"/>
+      </w:pPr>
+      <w:bookmarkStart w:id="14" w:name="_Toc209806797"/>
+      <w:r>
+        <w:lastRenderedPageBreak/>
+        <w:t xml:space="preserve">5. </w:t>
+      </w:r>
+      <w:r>
+        <w:t>Any compromises, assumptions or changes you made to the algorithm to allow implementation.</w:t>
+      </w:r>
+      <w:bookmarkEnd w:id="14"/>
+    </w:p>
+    <w:p>
+      <w:pPr>
+        <w:pStyle w:val="Heading2"/>
+      </w:pPr>
+      <w:bookmarkStart w:id="15" w:name="_Toc209806798"/>
+      <w:r>
+        <w:t>5.1 Assumptions</w:t>
+      </w:r>
+      <w:bookmarkEnd w:id="15"/>
+    </w:p>
+    <w:p/>
+    <w:p>
+      <w:pPr>
+        <w:pStyle w:val="Heading2"/>
+      </w:pPr>
+      <w:bookmarkStart w:id="16" w:name="_Toc209806799"/>
+      <w:r>
+        <w:t>5.2 Compromissions and Changes</w:t>
+      </w:r>
+      <w:bookmarkEnd w:id="16"/>
+    </w:p>
+    <w:p>
+      <w:pPr>
+        <w:pStyle w:val="Heading1"/>
+      </w:pPr>
+      <w:bookmarkStart w:id="17" w:name="_Toc209806800"/>
+      <w:r>
+        <w:t xml:space="preserve">6. </w:t>
+      </w:r>
+      <w:r>
+        <w:t>An explanation and justification of the effectiveness of the tests provided in assuring algorithmic correctness.</w:t>
+      </w:r>
+      <w:bookmarkEnd w:id="17"/>
+    </w:p>
+    <w:p>
+      <w:pPr>
+        <w:pStyle w:val="Heading2"/>
+      </w:pPr>
+      <w:bookmarkStart w:id="18" w:name="_Toc209806801"/>
+      <w:r>
+        <w:t>6.1 Unit Test Demonstration</w:t>
+      </w:r>
+      <w:bookmarkEnd w:id="18"/>
+    </w:p>
+    <w:p>
+      <w:pPr>
+        <w:pStyle w:val="Heading2"/>
+      </w:pPr>
+      <w:bookmarkStart w:id="19" w:name="_Toc209806802"/>
+      <w:r>
+        <w:t>6.2 Unit Test Effectiveness</w:t>
+      </w:r>
+      <w:bookmarkEnd w:id="19"/>
+    </w:p>
+    <w:p>
+      <w:pPr>
+        <w:pStyle w:val="Heading1"/>
+      </w:pPr>
+      <w:bookmarkStart w:id="20" w:name="_Toc209806803"/>
+      <w:r>
+        <w:t xml:space="preserve">7. </w:t>
+      </w:r>
+      <w:r>
+        <w:t>Any insights or observations that would help someone else implement the same algorithm.</w:t>
+      </w:r>
+      <w:bookmarkEnd w:id="20"/>
+    </w:p>
+    <w:p/>
+    <w:p>
+      <w:pPr>
+        <w:pStyle w:val="Heading1"/>
+        <w:jc w:val="center"/>
+      </w:pPr>
+      <w:bookmarkStart w:id="21" w:name="_Toc209806804"/>
+      <w:r>
+        <w:t>References</w:t>
+      </w:r>
+      <w:bookmarkEnd w:id="21"/>
+    </w:p>
+    <w:p>
+      <w:r>
+        <w:t xml:space="preserve">Bot Penguin. (n.d.). </w:t>
+      </w:r>
+      <w:r>
+        <w:t>Pattern Matching</w:t>
+      </w:r>
+      <w:r>
+        <w:t xml:space="preserve">. Bot Penguin. </w:t>
+      </w:r>
+      <w:r>
+        <w:br/>
+      </w:r>
+      <w:hyperlink r:id="rId8" w:history="1">
+        <w:r>
+          <w:rPr>
+            <w:rStyle w:val="Hyperlink"/>
+          </w:rPr>
+          <w:t>https://botpenguin.com/glossary/pattern-matching?utm_source=chatgpt.com</w:t>
+        </w:r>
+      </w:hyperlink>
+    </w:p>
+    <w:p>
+      <w:r>
+        <w:t xml:space="preserve">Geeks for Geeks. (2025, July 12). </w:t>
+      </w:r>
+      <w:r>
+        <w:t>Applications of Pattern Recognition</w:t>
+      </w:r>
+      <w:r>
+        <w:t xml:space="preserve">. </w:t>
+      </w:r>
+      <w:r>
+        <w:t>Geeks for Geeks</w:t>
+      </w:r>
+      <w:r>
+        <w:t>.</w:t>
+      </w:r>
+      <w:r>
+        <w:br/>
+      </w:r>
+      <w:hyperlink r:id="rId9" w:history="1">
+        <w:r>
+          <w:rPr>
+            <w:rStyle w:val="Hyperlink"/>
+          </w:rPr>
+          <w:t>https://www.geeksforgeeks.org/machine-learning/applications-of-pattern-recognition/?utm_source=chatgpt.com</w:t>
+        </w:r>
+      </w:hyperlink>
+    </w:p>
+    <w:p>
+      <w:r>
+        <w:t>Wright, John, et al. "Sparse representation for computer vision and pattern recognition." Proceedings of the IEEE 98.6 (2010): 1031-1044.</w:t>
+      </w:r>
+      <w:r>
+        <w:br/>
+      </w:r>
+      <w:hyperlink r:id="rId10" w:history="1">
+        <w:r>
+          <w:rPr>
+            <w:rStyle w:val="Hyperlink"/>
+          </w:rPr>
+          <w:t>https://ieeexplore.ieee.org/abstract/document/5456194/</w:t>
+        </w:r>
+      </w:hyperlink>
+    </w:p>
+    <w:p>
+      <w:r>
+        <w:t>Rexie, J. A. M., Raimond, K., Murugaaboopathy, M., Brindha, D., &amp; Mulugeta, H. (2022). Lightweight Pattern Matching Method for DNA Sequencing in Internet of Medical Things. </w:t>
+      </w:r>
+      <w:r>
+        <w:rPr>
+          <w:i/>
+          <w:iCs/>
+        </w:rPr>
+        <w:t>Computational intelligence and neuroscience</w:t>
+      </w:r>
+      <w:r>
+        <w:t>, </w:t>
+      </w:r>
+      <w:r>
+        <w:rPr>
+          <w:i/>
+          <w:iCs/>
+        </w:rPr>
+        <w:t>2022</w:t>
+      </w:r>
+      <w:r>
+        <w:t xml:space="preserve">, 6980335. </w:t>
+      </w:r>
+      <w:hyperlink r:id="rId11" w:history="1">
+        <w:r>
+          <w:rPr>
+            <w:rStyle w:val="Hyperlink"/>
+          </w:rPr>
+          <w:t>https://doi.org/10.1155/2022/6980335</w:t>
+        </w:r>
+      </w:hyperlink>
+    </w:p>
+    <w:p/>
     <w:sectPr>
+      <w:footerReference w:type="default" r:id="rId12"/>
       <w:pgSz w:w="11906" w:h="16838"/>
       <w:pgMar w:top="1440" w:right="1440" w:bottom="1440" w:left="1440" w:header="708" w:footer="708" w:gutter="0"/>
       <w:cols w:space="708"/>
@@ -15,6 +2787,1533 @@
     </w:sectPr>
   </w:body>
 </w:document>
+</file>
+
+<file path=word/endnotes.xml><?xml version="1.0" encoding="utf-8"?>
+<w:endnotes xmlns:wpc="http://schemas.microsoft.com/office/word/2010/wordprocessingCanvas" xmlns:cx="http://schemas.microsoft.com/office/drawing/2014/chartex" xmlns:cx1="http://schemas.microsoft.com/office/drawing/2015/9/8/chartex" xmlns:cx2="http://schemas.microsoft.com/office/drawing/2015/10/21/chartex" xmlns:cx3="http://schemas.microsoft.com/office/drawing/2016/5/9/chartex" xmlns:cx4="http://schemas.microsoft.com/office/drawing/2016/5/10/chartex" xmlns:cx5="http://schemas.microsoft.com/office/drawing/2016/5/11/chartex" xmlns:cx6="http://schemas.microsoft.com/office/drawing/2016/5/12/chartex" xmlns:cx7="http://schemas.microsoft.com/office/drawing/2016/5/13/chartex" xmlns:cx8="http://schemas.microsoft.com/office/drawing/2016/5/14/chartex" xmlns:mc="http://schemas.openxmlformats.org/markup-compatibility/2006" xmlns:aink="http://schemas.microsoft.com/office/drawing/2016/ink" xmlns:am3d="http://schemas.microsoft.com/office/drawing/2017/model3d" xmlns:o="urn:schemas-microsoft-com:office:office" xmlns:oel="http://schemas.microsoft.com/office/2019/extlst" xmlns:r="http://schemas.openxmlformats.org/officeDocument/2006/relationships" xmlns:m="http://schemas.openxmlformats.org/officeDocument/2006/math" xmlns:v="urn:schemas-microsoft-com:vml" xmlns:wp14="http://schemas.microsoft.com/office/word/2010/wordprocessingDrawing" xmlns:wp="http://schemas.openxmlformats.org/drawingml/2006/wordprocessingDrawing" xmlns:w10="urn:schemas-microsoft-com:office:word" xmlns:w="http://schemas.openxmlformats.org/wordprocessingml/2006/main" xmlns:w14="http://schemas.microsoft.com/office/word/2010/wordml" xmlns:w15="http://schemas.microsoft.com/office/word/2012/wordml" xmlns:w16cex="http://schemas.microsoft.com/office/word/2018/wordml/cex" xmlns:w16cid="http://schemas.microsoft.com/office/word/2016/wordml/cid" xmlns:w16="http://schemas.microsoft.com/office/word/2018/wordml" xmlns:w16du="http://schemas.microsoft.com/office/word/2023/wordml/word16du" xmlns:w16sdtdh="http://schemas.microsoft.com/office/word/2020/wordml/sdtdatahash" xmlns:w16sdtfl="http://schemas.microsoft.com/office/word/2024/wordml/sdtformatlock" xmlns:w16se="http://schemas.microsoft.com/office/word/2015/wordml/symex" xmlns:wpg="http://schemas.microsoft.com/office/word/2010/wordprocessingGroup" xmlns:wpi="http://schemas.microsoft.com/office/word/2010/wordprocessingInk" xmlns:wne="http://schemas.microsoft.com/office/word/2006/wordml" xmlns:wps="http://schemas.microsoft.com/office/word/2010/wordprocessingShape" mc:Ignorable="w14 w15 w16se w16cid w16 w16cex w16sdtdh w16sdtfl w16du wp14">
+  <w:endnote w:type="separator" w:id="-1">
+    <w:p>
+      <w:pPr>
+        <w:spacing w:after="0" w:line="240" w:lineRule="auto"/>
+      </w:pPr>
+      <w:r>
+        <w:separator/>
+      </w:r>
+    </w:p>
+  </w:endnote>
+  <w:endnote w:type="continuationSeparator" w:id="0">
+    <w:p>
+      <w:pPr>
+        <w:spacing w:after="0" w:line="240" w:lineRule="auto"/>
+      </w:pPr>
+      <w:r>
+        <w:continuationSeparator/>
+      </w:r>
+    </w:p>
+  </w:endnote>
+</w:endnotes>
+</file>
+
+<file path=word/footer1.xml><?xml version="1.0" encoding="utf-8"?>
+<w:ftr xmlns:wpc="http://schemas.microsoft.com/office/word/2010/wordprocessingCanvas" xmlns:cx="http://schemas.microsoft.com/office/drawing/2014/chartex" xmlns:cx1="http://schemas.microsoft.com/office/drawing/2015/9/8/chartex" xmlns:cx2="http://schemas.microsoft.com/office/drawing/2015/10/21/chartex" xmlns:cx3="http://schemas.microsoft.com/office/drawing/2016/5/9/chartex" xmlns:cx4="http://schemas.microsoft.com/office/drawing/2016/5/10/chartex" xmlns:cx5="http://schemas.microsoft.com/office/drawing/2016/5/11/chartex" xmlns:cx6="http://schemas.microsoft.com/office/drawing/2016/5/12/chartex" xmlns:cx7="http://schemas.microsoft.com/office/drawing/2016/5/13/chartex" xmlns:cx8="http://schemas.microsoft.com/office/drawing/2016/5/14/chartex" xmlns:mc="http://schemas.openxmlformats.org/markup-compatibility/2006" xmlns:aink="http://schemas.microsoft.com/office/drawing/2016/ink" xmlns:am3d="http://schemas.microsoft.com/office/drawing/2017/model3d" xmlns:o="urn:schemas-microsoft-com:office:office" xmlns:oel="http://schemas.microsoft.com/office/2019/extlst" xmlns:r="http://schemas.openxmlformats.org/officeDocument/2006/relationships" xmlns:m="http://schemas.openxmlformats.org/officeDocument/2006/math" xmlns:v="urn:schemas-microsoft-com:vml" xmlns:wp14="http://schemas.microsoft.com/office/word/2010/wordprocessingDrawing" xmlns:wp="http://schemas.openxmlformats.org/drawingml/2006/wordprocessingDrawing" xmlns:w10="urn:schemas-microsoft-com:office:word" xmlns:w="http://schemas.openxmlformats.org/wordprocessingml/2006/main" xmlns:w14="http://schemas.microsoft.com/office/word/2010/wordml" xmlns:w15="http://schemas.microsoft.com/office/word/2012/wordml" xmlns:w16cex="http://schemas.microsoft.com/office/word/2018/wordml/cex" xmlns:w16cid="http://schemas.microsoft.com/office/word/2016/wordml/cid" xmlns:w16="http://schemas.microsoft.com/office/word/2018/wordml" xmlns:w16du="http://schemas.microsoft.com/office/word/2023/wordml/word16du" xmlns:w16sdtdh="http://schemas.microsoft.com/office/word/2020/wordml/sdtdatahash" xmlns:w16sdtfl="http://schemas.microsoft.com/office/word/2024/wordml/sdtformatlock" xmlns:w16se="http://schemas.microsoft.com/office/word/2015/wordml/symex" xmlns:wpg="http://schemas.microsoft.com/office/word/2010/wordprocessingGroup" xmlns:wpi="http://schemas.microsoft.com/office/word/2010/wordprocessingInk" xmlns:wne="http://schemas.microsoft.com/office/word/2006/wordml" xmlns:wps="http://schemas.microsoft.com/office/word/2010/wordprocessingShape" mc:Ignorable="w14 w15 w16se w16cid w16 w16cex w16sdtdh w16sdtfl w16du wp14">
+  <w:sdt>
+    <w:sdtPr>
+      <w:rPr>
+        <w:lang w:val="en-GB"/>
+      </w:rPr>
+      <w:id w:val="-1448531924"/>
+      <w:docPartObj>
+        <w:docPartGallery w:val="Page Numbers (Bottom of Page)"/>
+        <w:docPartUnique/>
+      </w:docPartObj>
+    </w:sdtPr>
+    <w:sdtContent>
+      <w:p>
+        <w:pPr>
+          <w:pStyle w:val="Footer"/>
+          <w:jc w:val="right"/>
+        </w:pPr>
+        <w:r>
+          <w:rPr>
+            <w:lang w:val="en-GB"/>
+          </w:rPr>
+          <w:t xml:space="preserve">Page | </w:t>
+        </w:r>
+        <w:r>
+          <w:fldChar w:fldCharType="begin"/>
+        </w:r>
+        <w:r>
+          <w:instrText>PAGE   \* MERGEFORMAT</w:instrText>
+        </w:r>
+        <w:r>
+          <w:fldChar w:fldCharType="separate"/>
+        </w:r>
+        <w:r>
+          <w:rPr>
+            <w:lang w:val="en-GB"/>
+          </w:rPr>
+          <w:t>2</w:t>
+        </w:r>
+        <w:r>
+          <w:fldChar w:fldCharType="end"/>
+        </w:r>
+        <w:r>
+          <w:rPr>
+            <w:lang w:val="en-GB"/>
+          </w:rPr>
+          <w:t xml:space="preserve"> </w:t>
+        </w:r>
+      </w:p>
+    </w:sdtContent>
+  </w:sdt>
+  <w:p>
+    <w:pPr>
+      <w:pStyle w:val="Footer"/>
+    </w:pPr>
+  </w:p>
+</w:ftr>
+</file>
+
+<file path=word/footnotes.xml><?xml version="1.0" encoding="utf-8"?>
+<w:footnotes xmlns:wpc="http://schemas.microsoft.com/office/word/2010/wordprocessingCanvas" xmlns:cx="http://schemas.microsoft.com/office/drawing/2014/chartex" xmlns:cx1="http://schemas.microsoft.com/office/drawing/2015/9/8/chartex" xmlns:cx2="http://schemas.microsoft.com/office/drawing/2015/10/21/chartex" xmlns:cx3="http://schemas.microsoft.com/office/drawing/2016/5/9/chartex" xmlns:cx4="http://schemas.microsoft.com/office/drawing/2016/5/10/chartex" xmlns:cx5="http://schemas.microsoft.com/office/drawing/2016/5/11/chartex" xmlns:cx6="http://schemas.microsoft.com/office/drawing/2016/5/12/chartex" xmlns:cx7="http://schemas.microsoft.com/office/drawing/2016/5/13/chartex" xmlns:cx8="http://schemas.microsoft.com/office/drawing/2016/5/14/chartex" xmlns:mc="http://schemas.openxmlformats.org/markup-compatibility/2006" xmlns:aink="http://schemas.microsoft.com/office/drawing/2016/ink" xmlns:am3d="http://schemas.microsoft.com/office/drawing/2017/model3d" xmlns:o="urn:schemas-microsoft-com:office:office" xmlns:oel="http://schemas.microsoft.com/office/2019/extlst" xmlns:r="http://schemas.openxmlformats.org/officeDocument/2006/relationships" xmlns:m="http://schemas.openxmlformats.org/officeDocument/2006/math" xmlns:v="urn:schemas-microsoft-com:vml" xmlns:wp14="http://schemas.microsoft.com/office/word/2010/wordprocessingDrawing" xmlns:wp="http://schemas.openxmlformats.org/drawingml/2006/wordprocessingDrawing" xmlns:w10="urn:schemas-microsoft-com:office:word" xmlns:w="http://schemas.openxmlformats.org/wordprocessingml/2006/main" xmlns:w14="http://schemas.microsoft.com/office/word/2010/wordml" xmlns:w15="http://schemas.microsoft.com/office/word/2012/wordml" xmlns:w16cex="http://schemas.microsoft.com/office/word/2018/wordml/cex" xmlns:w16cid="http://schemas.microsoft.com/office/word/2016/wordml/cid" xmlns:w16="http://schemas.microsoft.com/office/word/2018/wordml" xmlns:w16du="http://schemas.microsoft.com/office/word/2023/wordml/word16du" xmlns:w16sdtdh="http://schemas.microsoft.com/office/word/2020/wordml/sdtdatahash" xmlns:w16sdtfl="http://schemas.microsoft.com/office/word/2024/wordml/sdtformatlock" xmlns:w16se="http://schemas.microsoft.com/office/word/2015/wordml/symex" xmlns:wpg="http://schemas.microsoft.com/office/word/2010/wordprocessingGroup" xmlns:wpi="http://schemas.microsoft.com/office/word/2010/wordprocessingInk" xmlns:wne="http://schemas.microsoft.com/office/word/2006/wordml" xmlns:wps="http://schemas.microsoft.com/office/word/2010/wordprocessingShape" mc:Ignorable="w14 w15 w16se w16cid w16 w16cex w16sdtdh w16sdtfl w16du wp14">
+  <w:footnote w:type="separator" w:id="-1">
+    <w:p>
+      <w:pPr>
+        <w:spacing w:after="0" w:line="240" w:lineRule="auto"/>
+      </w:pPr>
+      <w:r>
+        <w:separator/>
+      </w:r>
+    </w:p>
+  </w:footnote>
+  <w:footnote w:type="continuationSeparator" w:id="0">
+    <w:p>
+      <w:pPr>
+        <w:spacing w:after="0" w:line="240" w:lineRule="auto"/>
+      </w:pPr>
+      <w:r>
+        <w:continuationSeparator/>
+      </w:r>
+    </w:p>
+  </w:footnote>
+</w:footnotes>
+</file>
+
+<file path=word/numbering.xml><?xml version="1.0" encoding="utf-8"?>
+<w:numbering xmlns:wpc="http://schemas.microsoft.com/office/word/2010/wordprocessingCanvas" xmlns:cx="http://schemas.microsoft.com/office/drawing/2014/chartex" xmlns:cx1="http://schemas.microsoft.com/office/drawing/2015/9/8/chartex" xmlns:cx2="http://schemas.microsoft.com/office/drawing/2015/10/21/chartex" xmlns:cx3="http://schemas.microsoft.com/office/drawing/2016/5/9/chartex" xmlns:cx4="http://schemas.microsoft.com/office/drawing/2016/5/10/chartex" xmlns:cx5="http://schemas.microsoft.com/office/drawing/2016/5/11/chartex" xmlns:cx6="http://schemas.microsoft.com/office/drawing/2016/5/12/chartex" xmlns:cx7="http://schemas.microsoft.com/office/drawing/2016/5/13/chartex" xmlns:cx8="http://schemas.microsoft.com/office/drawing/2016/5/14/chartex" xmlns:mc="http://schemas.openxmlformats.org/markup-compatibility/2006" xmlns:aink="http://schemas.microsoft.com/office/drawing/2016/ink" xmlns:am3d="http://schemas.microsoft.com/office/drawing/2017/model3d" xmlns:o="urn:schemas-microsoft-com:office:office" xmlns:oel="http://schemas.microsoft.com/office/2019/extlst" xmlns:r="http://schemas.openxmlformats.org/officeDocument/2006/relationships" xmlns:m="http://schemas.openxmlformats.org/officeDocument/2006/math" xmlns:v="urn:schemas-microsoft-com:vml" xmlns:wp14="http://schemas.microsoft.com/office/word/2010/wordprocessingDrawing" xmlns:wp="http://schemas.openxmlformats.org/drawingml/2006/wordprocessingDrawing" xmlns:w10="urn:schemas-microsoft-com:office:word" xmlns:w="http://schemas.openxmlformats.org/wordprocessingml/2006/main" xmlns:w14="http://schemas.microsoft.com/office/word/2010/wordml" xmlns:w15="http://schemas.microsoft.com/office/word/2012/wordml" xmlns:w16cex="http://schemas.microsoft.com/office/word/2018/wordml/cex" xmlns:w16cid="http://schemas.microsoft.com/office/word/2016/wordml/cid" xmlns:w16="http://schemas.microsoft.com/office/word/2018/wordml" xmlns:w16du="http://schemas.microsoft.com/office/word/2023/wordml/word16du" xmlns:w16sdtdh="http://schemas.microsoft.com/office/word/2020/wordml/sdtdatahash" xmlns:w16sdtfl="http://schemas.microsoft.com/office/word/2024/wordml/sdtformatlock" xmlns:w16se="http://schemas.microsoft.com/office/word/2015/wordml/symex" xmlns:wpg="http://schemas.microsoft.com/office/word/2010/wordprocessingGroup" xmlns:wpi="http://schemas.microsoft.com/office/word/2010/wordprocessingInk" xmlns:wne="http://schemas.microsoft.com/office/word/2006/wordml" xmlns:wps="http://schemas.microsoft.com/office/word/2010/wordprocessingShape" mc:Ignorable="w14 w15 w16se w16cid w16 w16cex w16sdtdh w16sdtfl w16du wp14">
+  <w:abstractNum w:abstractNumId="0" w15:restartNumberingAfterBreak="0">
+    <w:nsid w:val="000E3BB8"/>
+    <w:multiLevelType w:val="multilevel"/>
+    <w:tmpl w:val="99248B28"/>
+    <w:lvl w:ilvl="0">
+      <w:start w:val="1"/>
+      <w:numFmt w:val="decimal"/>
+      <w:lvlText w:val="%1"/>
+      <w:lvlJc w:val="left"/>
+      <w:pPr>
+        <w:ind w:left="405" w:hanging="405"/>
+      </w:pPr>
+      <w:rPr>
+        <w:rFonts w:hint="default"/>
+      </w:rPr>
+    </w:lvl>
+    <w:lvl w:ilvl="1">
+      <w:start w:val="1"/>
+      <w:numFmt w:val="decimal"/>
+      <w:lvlText w:val="%1.%2"/>
+      <w:lvlJc w:val="left"/>
+      <w:pPr>
+        <w:ind w:left="720" w:hanging="720"/>
+      </w:pPr>
+      <w:rPr>
+        <w:rFonts w:hint="default"/>
+      </w:rPr>
+    </w:lvl>
+    <w:lvl w:ilvl="2">
+      <w:start w:val="1"/>
+      <w:numFmt w:val="decimal"/>
+      <w:lvlText w:val="%1.%2.%3"/>
+      <w:lvlJc w:val="left"/>
+      <w:pPr>
+        <w:ind w:left="720" w:hanging="720"/>
+      </w:pPr>
+      <w:rPr>
+        <w:rFonts w:hint="default"/>
+      </w:rPr>
+    </w:lvl>
+    <w:lvl w:ilvl="3">
+      <w:start w:val="1"/>
+      <w:numFmt w:val="decimal"/>
+      <w:lvlText w:val="%1.%2.%3.%4"/>
+      <w:lvlJc w:val="left"/>
+      <w:pPr>
+        <w:ind w:left="1080" w:hanging="1080"/>
+      </w:pPr>
+      <w:rPr>
+        <w:rFonts w:hint="default"/>
+      </w:rPr>
+    </w:lvl>
+    <w:lvl w:ilvl="4">
+      <w:start w:val="1"/>
+      <w:numFmt w:val="decimal"/>
+      <w:lvlText w:val="%1.%2.%3.%4.%5"/>
+      <w:lvlJc w:val="left"/>
+      <w:pPr>
+        <w:ind w:left="1440" w:hanging="1440"/>
+      </w:pPr>
+      <w:rPr>
+        <w:rFonts w:hint="default"/>
+      </w:rPr>
+    </w:lvl>
+    <w:lvl w:ilvl="5">
+      <w:start w:val="1"/>
+      <w:numFmt w:val="decimal"/>
+      <w:lvlText w:val="%1.%2.%3.%4.%5.%6"/>
+      <w:lvlJc w:val="left"/>
+      <w:pPr>
+        <w:ind w:left="1440" w:hanging="1440"/>
+      </w:pPr>
+      <w:rPr>
+        <w:rFonts w:hint="default"/>
+      </w:rPr>
+    </w:lvl>
+    <w:lvl w:ilvl="6">
+      <w:start w:val="1"/>
+      <w:numFmt w:val="decimal"/>
+      <w:lvlText w:val="%1.%2.%3.%4.%5.%6.%7"/>
+      <w:lvlJc w:val="left"/>
+      <w:pPr>
+        <w:ind w:left="1800" w:hanging="1800"/>
+      </w:pPr>
+      <w:rPr>
+        <w:rFonts w:hint="default"/>
+      </w:rPr>
+    </w:lvl>
+    <w:lvl w:ilvl="7">
+      <w:start w:val="1"/>
+      <w:numFmt w:val="decimal"/>
+      <w:lvlText w:val="%1.%2.%3.%4.%5.%6.%7.%8"/>
+      <w:lvlJc w:val="left"/>
+      <w:pPr>
+        <w:ind w:left="2160" w:hanging="2160"/>
+      </w:pPr>
+      <w:rPr>
+        <w:rFonts w:hint="default"/>
+      </w:rPr>
+    </w:lvl>
+    <w:lvl w:ilvl="8">
+      <w:start w:val="1"/>
+      <w:numFmt w:val="decimal"/>
+      <w:lvlText w:val="%1.%2.%3.%4.%5.%6.%7.%8.%9"/>
+      <w:lvlJc w:val="left"/>
+      <w:pPr>
+        <w:ind w:left="2160" w:hanging="2160"/>
+      </w:pPr>
+      <w:rPr>
+        <w:rFonts w:hint="default"/>
+      </w:rPr>
+    </w:lvl>
+  </w:abstractNum>
+  <w:abstractNum w:abstractNumId="1" w15:restartNumberingAfterBreak="0">
+    <w:nsid w:val="021B6E76"/>
+    <w:multiLevelType w:val="multilevel"/>
+    <w:tmpl w:val="DE445586"/>
+    <w:lvl w:ilvl="0">
+      <w:start w:val="1"/>
+      <w:numFmt w:val="bullet"/>
+      <w:lvlText w:val=""/>
+      <w:lvlJc w:val="left"/>
+      <w:pPr>
+        <w:tabs>
+          <w:tab w:val="num" w:pos="720"/>
+        </w:tabs>
+        <w:ind w:left="720" w:hanging="360"/>
+      </w:pPr>
+      <w:rPr>
+        <w:rFonts w:ascii="Symbol" w:hAnsi="Symbol" w:hint="default"/>
+        <w:sz w:val="20"/>
+      </w:rPr>
+    </w:lvl>
+    <w:lvl w:ilvl="1" w:tentative="1">
+      <w:start w:val="1"/>
+      <w:numFmt w:val="bullet"/>
+      <w:lvlText w:val="o"/>
+      <w:lvlJc w:val="left"/>
+      <w:pPr>
+        <w:tabs>
+          <w:tab w:val="num" w:pos="1440"/>
+        </w:tabs>
+        <w:ind w:left="1440" w:hanging="360"/>
+      </w:pPr>
+      <w:rPr>
+        <w:rFonts w:ascii="Courier New" w:hAnsi="Courier New" w:hint="default"/>
+        <w:sz w:val="20"/>
+      </w:rPr>
+    </w:lvl>
+    <w:lvl w:ilvl="2" w:tentative="1">
+      <w:start w:val="1"/>
+      <w:numFmt w:val="bullet"/>
+      <w:lvlText w:val=""/>
+      <w:lvlJc w:val="left"/>
+      <w:pPr>
+        <w:tabs>
+          <w:tab w:val="num" w:pos="2160"/>
+        </w:tabs>
+        <w:ind w:left="2160" w:hanging="360"/>
+      </w:pPr>
+      <w:rPr>
+        <w:rFonts w:ascii="Wingdings" w:hAnsi="Wingdings" w:hint="default"/>
+        <w:sz w:val="20"/>
+      </w:rPr>
+    </w:lvl>
+    <w:lvl w:ilvl="3" w:tentative="1">
+      <w:start w:val="1"/>
+      <w:numFmt w:val="bullet"/>
+      <w:lvlText w:val=""/>
+      <w:lvlJc w:val="left"/>
+      <w:pPr>
+        <w:tabs>
+          <w:tab w:val="num" w:pos="2880"/>
+        </w:tabs>
+        <w:ind w:left="2880" w:hanging="360"/>
+      </w:pPr>
+      <w:rPr>
+        <w:rFonts w:ascii="Wingdings" w:hAnsi="Wingdings" w:hint="default"/>
+        <w:sz w:val="20"/>
+      </w:rPr>
+    </w:lvl>
+    <w:lvl w:ilvl="4" w:tentative="1">
+      <w:start w:val="1"/>
+      <w:numFmt w:val="bullet"/>
+      <w:lvlText w:val=""/>
+      <w:lvlJc w:val="left"/>
+      <w:pPr>
+        <w:tabs>
+          <w:tab w:val="num" w:pos="3600"/>
+        </w:tabs>
+        <w:ind w:left="3600" w:hanging="360"/>
+      </w:pPr>
+      <w:rPr>
+        <w:rFonts w:ascii="Wingdings" w:hAnsi="Wingdings" w:hint="default"/>
+        <w:sz w:val="20"/>
+      </w:rPr>
+    </w:lvl>
+    <w:lvl w:ilvl="5" w:tentative="1">
+      <w:start w:val="1"/>
+      <w:numFmt w:val="bullet"/>
+      <w:lvlText w:val=""/>
+      <w:lvlJc w:val="left"/>
+      <w:pPr>
+        <w:tabs>
+          <w:tab w:val="num" w:pos="4320"/>
+        </w:tabs>
+        <w:ind w:left="4320" w:hanging="360"/>
+      </w:pPr>
+      <w:rPr>
+        <w:rFonts w:ascii="Wingdings" w:hAnsi="Wingdings" w:hint="default"/>
+        <w:sz w:val="20"/>
+      </w:rPr>
+    </w:lvl>
+    <w:lvl w:ilvl="6" w:tentative="1">
+      <w:start w:val="1"/>
+      <w:numFmt w:val="bullet"/>
+      <w:lvlText w:val=""/>
+      <w:lvlJc w:val="left"/>
+      <w:pPr>
+        <w:tabs>
+          <w:tab w:val="num" w:pos="5040"/>
+        </w:tabs>
+        <w:ind w:left="5040" w:hanging="360"/>
+      </w:pPr>
+      <w:rPr>
+        <w:rFonts w:ascii="Wingdings" w:hAnsi="Wingdings" w:hint="default"/>
+        <w:sz w:val="20"/>
+      </w:rPr>
+    </w:lvl>
+    <w:lvl w:ilvl="7" w:tentative="1">
+      <w:start w:val="1"/>
+      <w:numFmt w:val="bullet"/>
+      <w:lvlText w:val=""/>
+      <w:lvlJc w:val="left"/>
+      <w:pPr>
+        <w:tabs>
+          <w:tab w:val="num" w:pos="5760"/>
+        </w:tabs>
+        <w:ind w:left="5760" w:hanging="360"/>
+      </w:pPr>
+      <w:rPr>
+        <w:rFonts w:ascii="Wingdings" w:hAnsi="Wingdings" w:hint="default"/>
+        <w:sz w:val="20"/>
+      </w:rPr>
+    </w:lvl>
+    <w:lvl w:ilvl="8" w:tentative="1">
+      <w:start w:val="1"/>
+      <w:numFmt w:val="bullet"/>
+      <w:lvlText w:val=""/>
+      <w:lvlJc w:val="left"/>
+      <w:pPr>
+        <w:tabs>
+          <w:tab w:val="num" w:pos="6480"/>
+        </w:tabs>
+        <w:ind w:left="6480" w:hanging="360"/>
+      </w:pPr>
+      <w:rPr>
+        <w:rFonts w:ascii="Wingdings" w:hAnsi="Wingdings" w:hint="default"/>
+        <w:sz w:val="20"/>
+      </w:rPr>
+    </w:lvl>
+  </w:abstractNum>
+  <w:abstractNum w:abstractNumId="2" w15:restartNumberingAfterBreak="0">
+    <w:nsid w:val="0FF96DBF"/>
+    <w:multiLevelType w:val="multilevel"/>
+    <w:tmpl w:val="F10E4C4C"/>
+    <w:lvl w:ilvl="0">
+      <w:start w:val="1"/>
+      <w:numFmt w:val="bullet"/>
+      <w:lvlText w:val=""/>
+      <w:lvlJc w:val="left"/>
+      <w:pPr>
+        <w:tabs>
+          <w:tab w:val="num" w:pos="720"/>
+        </w:tabs>
+        <w:ind w:left="720" w:hanging="360"/>
+      </w:pPr>
+      <w:rPr>
+        <w:rFonts w:ascii="Symbol" w:hAnsi="Symbol" w:hint="default"/>
+        <w:sz w:val="20"/>
+      </w:rPr>
+    </w:lvl>
+    <w:lvl w:ilvl="1" w:tentative="1">
+      <w:start w:val="1"/>
+      <w:numFmt w:val="bullet"/>
+      <w:lvlText w:val="o"/>
+      <w:lvlJc w:val="left"/>
+      <w:pPr>
+        <w:tabs>
+          <w:tab w:val="num" w:pos="1440"/>
+        </w:tabs>
+        <w:ind w:left="1440" w:hanging="360"/>
+      </w:pPr>
+      <w:rPr>
+        <w:rFonts w:ascii="Courier New" w:hAnsi="Courier New" w:hint="default"/>
+        <w:sz w:val="20"/>
+      </w:rPr>
+    </w:lvl>
+    <w:lvl w:ilvl="2" w:tentative="1">
+      <w:start w:val="1"/>
+      <w:numFmt w:val="bullet"/>
+      <w:lvlText w:val=""/>
+      <w:lvlJc w:val="left"/>
+      <w:pPr>
+        <w:tabs>
+          <w:tab w:val="num" w:pos="2160"/>
+        </w:tabs>
+        <w:ind w:left="2160" w:hanging="360"/>
+      </w:pPr>
+      <w:rPr>
+        <w:rFonts w:ascii="Wingdings" w:hAnsi="Wingdings" w:hint="default"/>
+        <w:sz w:val="20"/>
+      </w:rPr>
+    </w:lvl>
+    <w:lvl w:ilvl="3" w:tentative="1">
+      <w:start w:val="1"/>
+      <w:numFmt w:val="bullet"/>
+      <w:lvlText w:val=""/>
+      <w:lvlJc w:val="left"/>
+      <w:pPr>
+        <w:tabs>
+          <w:tab w:val="num" w:pos="2880"/>
+        </w:tabs>
+        <w:ind w:left="2880" w:hanging="360"/>
+      </w:pPr>
+      <w:rPr>
+        <w:rFonts w:ascii="Wingdings" w:hAnsi="Wingdings" w:hint="default"/>
+        <w:sz w:val="20"/>
+      </w:rPr>
+    </w:lvl>
+    <w:lvl w:ilvl="4" w:tentative="1">
+      <w:start w:val="1"/>
+      <w:numFmt w:val="bullet"/>
+      <w:lvlText w:val=""/>
+      <w:lvlJc w:val="left"/>
+      <w:pPr>
+        <w:tabs>
+          <w:tab w:val="num" w:pos="3600"/>
+        </w:tabs>
+        <w:ind w:left="3600" w:hanging="360"/>
+      </w:pPr>
+      <w:rPr>
+        <w:rFonts w:ascii="Wingdings" w:hAnsi="Wingdings" w:hint="default"/>
+        <w:sz w:val="20"/>
+      </w:rPr>
+    </w:lvl>
+    <w:lvl w:ilvl="5" w:tentative="1">
+      <w:start w:val="1"/>
+      <w:numFmt w:val="bullet"/>
+      <w:lvlText w:val=""/>
+      <w:lvlJc w:val="left"/>
+      <w:pPr>
+        <w:tabs>
+          <w:tab w:val="num" w:pos="4320"/>
+        </w:tabs>
+        <w:ind w:left="4320" w:hanging="360"/>
+      </w:pPr>
+      <w:rPr>
+        <w:rFonts w:ascii="Wingdings" w:hAnsi="Wingdings" w:hint="default"/>
+        <w:sz w:val="20"/>
+      </w:rPr>
+    </w:lvl>
+    <w:lvl w:ilvl="6" w:tentative="1">
+      <w:start w:val="1"/>
+      <w:numFmt w:val="bullet"/>
+      <w:lvlText w:val=""/>
+      <w:lvlJc w:val="left"/>
+      <w:pPr>
+        <w:tabs>
+          <w:tab w:val="num" w:pos="5040"/>
+        </w:tabs>
+        <w:ind w:left="5040" w:hanging="360"/>
+      </w:pPr>
+      <w:rPr>
+        <w:rFonts w:ascii="Wingdings" w:hAnsi="Wingdings" w:hint="default"/>
+        <w:sz w:val="20"/>
+      </w:rPr>
+    </w:lvl>
+    <w:lvl w:ilvl="7" w:tentative="1">
+      <w:start w:val="1"/>
+      <w:numFmt w:val="bullet"/>
+      <w:lvlText w:val=""/>
+      <w:lvlJc w:val="left"/>
+      <w:pPr>
+        <w:tabs>
+          <w:tab w:val="num" w:pos="5760"/>
+        </w:tabs>
+        <w:ind w:left="5760" w:hanging="360"/>
+      </w:pPr>
+      <w:rPr>
+        <w:rFonts w:ascii="Wingdings" w:hAnsi="Wingdings" w:hint="default"/>
+        <w:sz w:val="20"/>
+      </w:rPr>
+    </w:lvl>
+    <w:lvl w:ilvl="8" w:tentative="1">
+      <w:start w:val="1"/>
+      <w:numFmt w:val="bullet"/>
+      <w:lvlText w:val=""/>
+      <w:lvlJc w:val="left"/>
+      <w:pPr>
+        <w:tabs>
+          <w:tab w:val="num" w:pos="6480"/>
+        </w:tabs>
+        <w:ind w:left="6480" w:hanging="360"/>
+      </w:pPr>
+      <w:rPr>
+        <w:rFonts w:ascii="Wingdings" w:hAnsi="Wingdings" w:hint="default"/>
+        <w:sz w:val="20"/>
+      </w:rPr>
+    </w:lvl>
+  </w:abstractNum>
+  <w:abstractNum w:abstractNumId="3" w15:restartNumberingAfterBreak="0">
+    <w:nsid w:val="11F47C6A"/>
+    <w:multiLevelType w:val="multilevel"/>
+    <w:tmpl w:val="95D8F476"/>
+    <w:lvl w:ilvl="0">
+      <w:start w:val="1"/>
+      <w:numFmt w:val="bullet"/>
+      <w:lvlText w:val=""/>
+      <w:lvlJc w:val="left"/>
+      <w:pPr>
+        <w:tabs>
+          <w:tab w:val="num" w:pos="720"/>
+        </w:tabs>
+        <w:ind w:left="720" w:hanging="360"/>
+      </w:pPr>
+      <w:rPr>
+        <w:rFonts w:ascii="Symbol" w:hAnsi="Symbol" w:hint="default"/>
+        <w:sz w:val="20"/>
+      </w:rPr>
+    </w:lvl>
+    <w:lvl w:ilvl="1" w:tentative="1">
+      <w:start w:val="1"/>
+      <w:numFmt w:val="bullet"/>
+      <w:lvlText w:val="o"/>
+      <w:lvlJc w:val="left"/>
+      <w:pPr>
+        <w:tabs>
+          <w:tab w:val="num" w:pos="1440"/>
+        </w:tabs>
+        <w:ind w:left="1440" w:hanging="360"/>
+      </w:pPr>
+      <w:rPr>
+        <w:rFonts w:ascii="Courier New" w:hAnsi="Courier New" w:hint="default"/>
+        <w:sz w:val="20"/>
+      </w:rPr>
+    </w:lvl>
+    <w:lvl w:ilvl="2" w:tentative="1">
+      <w:start w:val="1"/>
+      <w:numFmt w:val="bullet"/>
+      <w:lvlText w:val=""/>
+      <w:lvlJc w:val="left"/>
+      <w:pPr>
+        <w:tabs>
+          <w:tab w:val="num" w:pos="2160"/>
+        </w:tabs>
+        <w:ind w:left="2160" w:hanging="360"/>
+      </w:pPr>
+      <w:rPr>
+        <w:rFonts w:ascii="Wingdings" w:hAnsi="Wingdings" w:hint="default"/>
+        <w:sz w:val="20"/>
+      </w:rPr>
+    </w:lvl>
+    <w:lvl w:ilvl="3" w:tentative="1">
+      <w:start w:val="1"/>
+      <w:numFmt w:val="bullet"/>
+      <w:lvlText w:val=""/>
+      <w:lvlJc w:val="left"/>
+      <w:pPr>
+        <w:tabs>
+          <w:tab w:val="num" w:pos="2880"/>
+        </w:tabs>
+        <w:ind w:left="2880" w:hanging="360"/>
+      </w:pPr>
+      <w:rPr>
+        <w:rFonts w:ascii="Wingdings" w:hAnsi="Wingdings" w:hint="default"/>
+        <w:sz w:val="20"/>
+      </w:rPr>
+    </w:lvl>
+    <w:lvl w:ilvl="4" w:tentative="1">
+      <w:start w:val="1"/>
+      <w:numFmt w:val="bullet"/>
+      <w:lvlText w:val=""/>
+      <w:lvlJc w:val="left"/>
+      <w:pPr>
+        <w:tabs>
+          <w:tab w:val="num" w:pos="3600"/>
+        </w:tabs>
+        <w:ind w:left="3600" w:hanging="360"/>
+      </w:pPr>
+      <w:rPr>
+        <w:rFonts w:ascii="Wingdings" w:hAnsi="Wingdings" w:hint="default"/>
+        <w:sz w:val="20"/>
+      </w:rPr>
+    </w:lvl>
+    <w:lvl w:ilvl="5" w:tentative="1">
+      <w:start w:val="1"/>
+      <w:numFmt w:val="bullet"/>
+      <w:lvlText w:val=""/>
+      <w:lvlJc w:val="left"/>
+      <w:pPr>
+        <w:tabs>
+          <w:tab w:val="num" w:pos="4320"/>
+        </w:tabs>
+        <w:ind w:left="4320" w:hanging="360"/>
+      </w:pPr>
+      <w:rPr>
+        <w:rFonts w:ascii="Wingdings" w:hAnsi="Wingdings" w:hint="default"/>
+        <w:sz w:val="20"/>
+      </w:rPr>
+    </w:lvl>
+    <w:lvl w:ilvl="6" w:tentative="1">
+      <w:start w:val="1"/>
+      <w:numFmt w:val="bullet"/>
+      <w:lvlText w:val=""/>
+      <w:lvlJc w:val="left"/>
+      <w:pPr>
+        <w:tabs>
+          <w:tab w:val="num" w:pos="5040"/>
+        </w:tabs>
+        <w:ind w:left="5040" w:hanging="360"/>
+      </w:pPr>
+      <w:rPr>
+        <w:rFonts w:ascii="Wingdings" w:hAnsi="Wingdings" w:hint="default"/>
+        <w:sz w:val="20"/>
+      </w:rPr>
+    </w:lvl>
+    <w:lvl w:ilvl="7" w:tentative="1">
+      <w:start w:val="1"/>
+      <w:numFmt w:val="bullet"/>
+      <w:lvlText w:val=""/>
+      <w:lvlJc w:val="left"/>
+      <w:pPr>
+        <w:tabs>
+          <w:tab w:val="num" w:pos="5760"/>
+        </w:tabs>
+        <w:ind w:left="5760" w:hanging="360"/>
+      </w:pPr>
+      <w:rPr>
+        <w:rFonts w:ascii="Wingdings" w:hAnsi="Wingdings" w:hint="default"/>
+        <w:sz w:val="20"/>
+      </w:rPr>
+    </w:lvl>
+    <w:lvl w:ilvl="8" w:tentative="1">
+      <w:start w:val="1"/>
+      <w:numFmt w:val="bullet"/>
+      <w:lvlText w:val=""/>
+      <w:lvlJc w:val="left"/>
+      <w:pPr>
+        <w:tabs>
+          <w:tab w:val="num" w:pos="6480"/>
+        </w:tabs>
+        <w:ind w:left="6480" w:hanging="360"/>
+      </w:pPr>
+      <w:rPr>
+        <w:rFonts w:ascii="Wingdings" w:hAnsi="Wingdings" w:hint="default"/>
+        <w:sz w:val="20"/>
+      </w:rPr>
+    </w:lvl>
+  </w:abstractNum>
+  <w:abstractNum w:abstractNumId="4" w15:restartNumberingAfterBreak="0">
+    <w:nsid w:val="12DC329A"/>
+    <w:multiLevelType w:val="hybridMultilevel"/>
+    <w:tmpl w:val="ECF86514"/>
+    <w:lvl w:ilvl="0" w:tplc="0C090001">
+      <w:start w:val="1"/>
+      <w:numFmt w:val="bullet"/>
+      <w:lvlText w:val=""/>
+      <w:lvlJc w:val="left"/>
+      <w:pPr>
+        <w:ind w:left="720" w:hanging="360"/>
+      </w:pPr>
+      <w:rPr>
+        <w:rFonts w:ascii="Symbol" w:hAnsi="Symbol" w:hint="default"/>
+      </w:rPr>
+    </w:lvl>
+    <w:lvl w:ilvl="1" w:tplc="0C090003" w:tentative="1">
+      <w:start w:val="1"/>
+      <w:numFmt w:val="bullet"/>
+      <w:lvlText w:val="o"/>
+      <w:lvlJc w:val="left"/>
+      <w:pPr>
+        <w:ind w:left="1440" w:hanging="360"/>
+      </w:pPr>
+      <w:rPr>
+        <w:rFonts w:ascii="Courier New" w:hAnsi="Courier New" w:cs="Courier New" w:hint="default"/>
+      </w:rPr>
+    </w:lvl>
+    <w:lvl w:ilvl="2" w:tplc="0C090005" w:tentative="1">
+      <w:start w:val="1"/>
+      <w:numFmt w:val="bullet"/>
+      <w:lvlText w:val=""/>
+      <w:lvlJc w:val="left"/>
+      <w:pPr>
+        <w:ind w:left="2160" w:hanging="360"/>
+      </w:pPr>
+      <w:rPr>
+        <w:rFonts w:ascii="Wingdings" w:hAnsi="Wingdings" w:hint="default"/>
+      </w:rPr>
+    </w:lvl>
+    <w:lvl w:ilvl="3" w:tplc="0C090001" w:tentative="1">
+      <w:start w:val="1"/>
+      <w:numFmt w:val="bullet"/>
+      <w:lvlText w:val=""/>
+      <w:lvlJc w:val="left"/>
+      <w:pPr>
+        <w:ind w:left="2880" w:hanging="360"/>
+      </w:pPr>
+      <w:rPr>
+        <w:rFonts w:ascii="Symbol" w:hAnsi="Symbol" w:hint="default"/>
+      </w:rPr>
+    </w:lvl>
+    <w:lvl w:ilvl="4" w:tplc="0C090003" w:tentative="1">
+      <w:start w:val="1"/>
+      <w:numFmt w:val="bullet"/>
+      <w:lvlText w:val="o"/>
+      <w:lvlJc w:val="left"/>
+      <w:pPr>
+        <w:ind w:left="3600" w:hanging="360"/>
+      </w:pPr>
+      <w:rPr>
+        <w:rFonts w:ascii="Courier New" w:hAnsi="Courier New" w:cs="Courier New" w:hint="default"/>
+      </w:rPr>
+    </w:lvl>
+    <w:lvl w:ilvl="5" w:tplc="0C090005" w:tentative="1">
+      <w:start w:val="1"/>
+      <w:numFmt w:val="bullet"/>
+      <w:lvlText w:val=""/>
+      <w:lvlJc w:val="left"/>
+      <w:pPr>
+        <w:ind w:left="4320" w:hanging="360"/>
+      </w:pPr>
+      <w:rPr>
+        <w:rFonts w:ascii="Wingdings" w:hAnsi="Wingdings" w:hint="default"/>
+      </w:rPr>
+    </w:lvl>
+    <w:lvl w:ilvl="6" w:tplc="0C090001" w:tentative="1">
+      <w:start w:val="1"/>
+      <w:numFmt w:val="bullet"/>
+      <w:lvlText w:val=""/>
+      <w:lvlJc w:val="left"/>
+      <w:pPr>
+        <w:ind w:left="5040" w:hanging="360"/>
+      </w:pPr>
+      <w:rPr>
+        <w:rFonts w:ascii="Symbol" w:hAnsi="Symbol" w:hint="default"/>
+      </w:rPr>
+    </w:lvl>
+    <w:lvl w:ilvl="7" w:tplc="0C090003" w:tentative="1">
+      <w:start w:val="1"/>
+      <w:numFmt w:val="bullet"/>
+      <w:lvlText w:val="o"/>
+      <w:lvlJc w:val="left"/>
+      <w:pPr>
+        <w:ind w:left="5760" w:hanging="360"/>
+      </w:pPr>
+      <w:rPr>
+        <w:rFonts w:ascii="Courier New" w:hAnsi="Courier New" w:cs="Courier New" w:hint="default"/>
+      </w:rPr>
+    </w:lvl>
+    <w:lvl w:ilvl="8" w:tplc="0C090005" w:tentative="1">
+      <w:start w:val="1"/>
+      <w:numFmt w:val="bullet"/>
+      <w:lvlText w:val=""/>
+      <w:lvlJc w:val="left"/>
+      <w:pPr>
+        <w:ind w:left="6480" w:hanging="360"/>
+      </w:pPr>
+      <w:rPr>
+        <w:rFonts w:ascii="Wingdings" w:hAnsi="Wingdings" w:hint="default"/>
+      </w:rPr>
+    </w:lvl>
+  </w:abstractNum>
+  <w:abstractNum w:abstractNumId="5" w15:restartNumberingAfterBreak="0">
+    <w:nsid w:val="28352D49"/>
+    <w:multiLevelType w:val="multilevel"/>
+    <w:tmpl w:val="266EC50A"/>
+    <w:lvl w:ilvl="0">
+      <w:start w:val="1"/>
+      <w:numFmt w:val="bullet"/>
+      <w:lvlText w:val=""/>
+      <w:lvlJc w:val="left"/>
+      <w:pPr>
+        <w:tabs>
+          <w:tab w:val="num" w:pos="720"/>
+        </w:tabs>
+        <w:ind w:left="720" w:hanging="360"/>
+      </w:pPr>
+      <w:rPr>
+        <w:rFonts w:ascii="Symbol" w:hAnsi="Symbol" w:hint="default"/>
+        <w:sz w:val="20"/>
+      </w:rPr>
+    </w:lvl>
+    <w:lvl w:ilvl="1" w:tentative="1">
+      <w:start w:val="1"/>
+      <w:numFmt w:val="bullet"/>
+      <w:lvlText w:val="o"/>
+      <w:lvlJc w:val="left"/>
+      <w:pPr>
+        <w:tabs>
+          <w:tab w:val="num" w:pos="1440"/>
+        </w:tabs>
+        <w:ind w:left="1440" w:hanging="360"/>
+      </w:pPr>
+      <w:rPr>
+        <w:rFonts w:ascii="Courier New" w:hAnsi="Courier New" w:hint="default"/>
+        <w:sz w:val="20"/>
+      </w:rPr>
+    </w:lvl>
+    <w:lvl w:ilvl="2" w:tentative="1">
+      <w:start w:val="1"/>
+      <w:numFmt w:val="bullet"/>
+      <w:lvlText w:val=""/>
+      <w:lvlJc w:val="left"/>
+      <w:pPr>
+        <w:tabs>
+          <w:tab w:val="num" w:pos="2160"/>
+        </w:tabs>
+        <w:ind w:left="2160" w:hanging="360"/>
+      </w:pPr>
+      <w:rPr>
+        <w:rFonts w:ascii="Wingdings" w:hAnsi="Wingdings" w:hint="default"/>
+        <w:sz w:val="20"/>
+      </w:rPr>
+    </w:lvl>
+    <w:lvl w:ilvl="3" w:tentative="1">
+      <w:start w:val="1"/>
+      <w:numFmt w:val="bullet"/>
+      <w:lvlText w:val=""/>
+      <w:lvlJc w:val="left"/>
+      <w:pPr>
+        <w:tabs>
+          <w:tab w:val="num" w:pos="2880"/>
+        </w:tabs>
+        <w:ind w:left="2880" w:hanging="360"/>
+      </w:pPr>
+      <w:rPr>
+        <w:rFonts w:ascii="Wingdings" w:hAnsi="Wingdings" w:hint="default"/>
+        <w:sz w:val="20"/>
+      </w:rPr>
+    </w:lvl>
+    <w:lvl w:ilvl="4" w:tentative="1">
+      <w:start w:val="1"/>
+      <w:numFmt w:val="bullet"/>
+      <w:lvlText w:val=""/>
+      <w:lvlJc w:val="left"/>
+      <w:pPr>
+        <w:tabs>
+          <w:tab w:val="num" w:pos="3600"/>
+        </w:tabs>
+        <w:ind w:left="3600" w:hanging="360"/>
+      </w:pPr>
+      <w:rPr>
+        <w:rFonts w:ascii="Wingdings" w:hAnsi="Wingdings" w:hint="default"/>
+        <w:sz w:val="20"/>
+      </w:rPr>
+    </w:lvl>
+    <w:lvl w:ilvl="5" w:tentative="1">
+      <w:start w:val="1"/>
+      <w:numFmt w:val="bullet"/>
+      <w:lvlText w:val=""/>
+      <w:lvlJc w:val="left"/>
+      <w:pPr>
+        <w:tabs>
+          <w:tab w:val="num" w:pos="4320"/>
+        </w:tabs>
+        <w:ind w:left="4320" w:hanging="360"/>
+      </w:pPr>
+      <w:rPr>
+        <w:rFonts w:ascii="Wingdings" w:hAnsi="Wingdings" w:hint="default"/>
+        <w:sz w:val="20"/>
+      </w:rPr>
+    </w:lvl>
+    <w:lvl w:ilvl="6" w:tentative="1">
+      <w:start w:val="1"/>
+      <w:numFmt w:val="bullet"/>
+      <w:lvlText w:val=""/>
+      <w:lvlJc w:val="left"/>
+      <w:pPr>
+        <w:tabs>
+          <w:tab w:val="num" w:pos="5040"/>
+        </w:tabs>
+        <w:ind w:left="5040" w:hanging="360"/>
+      </w:pPr>
+      <w:rPr>
+        <w:rFonts w:ascii="Wingdings" w:hAnsi="Wingdings" w:hint="default"/>
+        <w:sz w:val="20"/>
+      </w:rPr>
+    </w:lvl>
+    <w:lvl w:ilvl="7" w:tentative="1">
+      <w:start w:val="1"/>
+      <w:numFmt w:val="bullet"/>
+      <w:lvlText w:val=""/>
+      <w:lvlJc w:val="left"/>
+      <w:pPr>
+        <w:tabs>
+          <w:tab w:val="num" w:pos="5760"/>
+        </w:tabs>
+        <w:ind w:left="5760" w:hanging="360"/>
+      </w:pPr>
+      <w:rPr>
+        <w:rFonts w:ascii="Wingdings" w:hAnsi="Wingdings" w:hint="default"/>
+        <w:sz w:val="20"/>
+      </w:rPr>
+    </w:lvl>
+    <w:lvl w:ilvl="8" w:tentative="1">
+      <w:start w:val="1"/>
+      <w:numFmt w:val="bullet"/>
+      <w:lvlText w:val=""/>
+      <w:lvlJc w:val="left"/>
+      <w:pPr>
+        <w:tabs>
+          <w:tab w:val="num" w:pos="6480"/>
+        </w:tabs>
+        <w:ind w:left="6480" w:hanging="360"/>
+      </w:pPr>
+      <w:rPr>
+        <w:rFonts w:ascii="Wingdings" w:hAnsi="Wingdings" w:hint="default"/>
+        <w:sz w:val="20"/>
+      </w:rPr>
+    </w:lvl>
+  </w:abstractNum>
+  <w:abstractNum w:abstractNumId="6" w15:restartNumberingAfterBreak="0">
+    <w:nsid w:val="2B824ED3"/>
+    <w:multiLevelType w:val="multilevel"/>
+    <w:tmpl w:val="6EB46DF4"/>
+    <w:lvl w:ilvl="0">
+      <w:start w:val="1"/>
+      <w:numFmt w:val="bullet"/>
+      <w:lvlText w:val=""/>
+      <w:lvlJc w:val="left"/>
+      <w:pPr>
+        <w:tabs>
+          <w:tab w:val="num" w:pos="720"/>
+        </w:tabs>
+        <w:ind w:left="720" w:hanging="360"/>
+      </w:pPr>
+      <w:rPr>
+        <w:rFonts w:ascii="Symbol" w:hAnsi="Symbol" w:hint="default"/>
+        <w:sz w:val="20"/>
+      </w:rPr>
+    </w:lvl>
+    <w:lvl w:ilvl="1" w:tentative="1">
+      <w:start w:val="1"/>
+      <w:numFmt w:val="bullet"/>
+      <w:lvlText w:val="o"/>
+      <w:lvlJc w:val="left"/>
+      <w:pPr>
+        <w:tabs>
+          <w:tab w:val="num" w:pos="1440"/>
+        </w:tabs>
+        <w:ind w:left="1440" w:hanging="360"/>
+      </w:pPr>
+      <w:rPr>
+        <w:rFonts w:ascii="Courier New" w:hAnsi="Courier New" w:hint="default"/>
+        <w:sz w:val="20"/>
+      </w:rPr>
+    </w:lvl>
+    <w:lvl w:ilvl="2" w:tentative="1">
+      <w:start w:val="1"/>
+      <w:numFmt w:val="bullet"/>
+      <w:lvlText w:val=""/>
+      <w:lvlJc w:val="left"/>
+      <w:pPr>
+        <w:tabs>
+          <w:tab w:val="num" w:pos="2160"/>
+        </w:tabs>
+        <w:ind w:left="2160" w:hanging="360"/>
+      </w:pPr>
+      <w:rPr>
+        <w:rFonts w:ascii="Wingdings" w:hAnsi="Wingdings" w:hint="default"/>
+        <w:sz w:val="20"/>
+      </w:rPr>
+    </w:lvl>
+    <w:lvl w:ilvl="3" w:tentative="1">
+      <w:start w:val="1"/>
+      <w:numFmt w:val="bullet"/>
+      <w:lvlText w:val=""/>
+      <w:lvlJc w:val="left"/>
+      <w:pPr>
+        <w:tabs>
+          <w:tab w:val="num" w:pos="2880"/>
+        </w:tabs>
+        <w:ind w:left="2880" w:hanging="360"/>
+      </w:pPr>
+      <w:rPr>
+        <w:rFonts w:ascii="Wingdings" w:hAnsi="Wingdings" w:hint="default"/>
+        <w:sz w:val="20"/>
+      </w:rPr>
+    </w:lvl>
+    <w:lvl w:ilvl="4" w:tentative="1">
+      <w:start w:val="1"/>
+      <w:numFmt w:val="bullet"/>
+      <w:lvlText w:val=""/>
+      <w:lvlJc w:val="left"/>
+      <w:pPr>
+        <w:tabs>
+          <w:tab w:val="num" w:pos="3600"/>
+        </w:tabs>
+        <w:ind w:left="3600" w:hanging="360"/>
+      </w:pPr>
+      <w:rPr>
+        <w:rFonts w:ascii="Wingdings" w:hAnsi="Wingdings" w:hint="default"/>
+        <w:sz w:val="20"/>
+      </w:rPr>
+    </w:lvl>
+    <w:lvl w:ilvl="5" w:tentative="1">
+      <w:start w:val="1"/>
+      <w:numFmt w:val="bullet"/>
+      <w:lvlText w:val=""/>
+      <w:lvlJc w:val="left"/>
+      <w:pPr>
+        <w:tabs>
+          <w:tab w:val="num" w:pos="4320"/>
+        </w:tabs>
+        <w:ind w:left="4320" w:hanging="360"/>
+      </w:pPr>
+      <w:rPr>
+        <w:rFonts w:ascii="Wingdings" w:hAnsi="Wingdings" w:hint="default"/>
+        <w:sz w:val="20"/>
+      </w:rPr>
+    </w:lvl>
+    <w:lvl w:ilvl="6" w:tentative="1">
+      <w:start w:val="1"/>
+      <w:numFmt w:val="bullet"/>
+      <w:lvlText w:val=""/>
+      <w:lvlJc w:val="left"/>
+      <w:pPr>
+        <w:tabs>
+          <w:tab w:val="num" w:pos="5040"/>
+        </w:tabs>
+        <w:ind w:left="5040" w:hanging="360"/>
+      </w:pPr>
+      <w:rPr>
+        <w:rFonts w:ascii="Wingdings" w:hAnsi="Wingdings" w:hint="default"/>
+        <w:sz w:val="20"/>
+      </w:rPr>
+    </w:lvl>
+    <w:lvl w:ilvl="7" w:tentative="1">
+      <w:start w:val="1"/>
+      <w:numFmt w:val="bullet"/>
+      <w:lvlText w:val=""/>
+      <w:lvlJc w:val="left"/>
+      <w:pPr>
+        <w:tabs>
+          <w:tab w:val="num" w:pos="5760"/>
+        </w:tabs>
+        <w:ind w:left="5760" w:hanging="360"/>
+      </w:pPr>
+      <w:rPr>
+        <w:rFonts w:ascii="Wingdings" w:hAnsi="Wingdings" w:hint="default"/>
+        <w:sz w:val="20"/>
+      </w:rPr>
+    </w:lvl>
+    <w:lvl w:ilvl="8" w:tentative="1">
+      <w:start w:val="1"/>
+      <w:numFmt w:val="bullet"/>
+      <w:lvlText w:val=""/>
+      <w:lvlJc w:val="left"/>
+      <w:pPr>
+        <w:tabs>
+          <w:tab w:val="num" w:pos="6480"/>
+        </w:tabs>
+        <w:ind w:left="6480" w:hanging="360"/>
+      </w:pPr>
+      <w:rPr>
+        <w:rFonts w:ascii="Wingdings" w:hAnsi="Wingdings" w:hint="default"/>
+        <w:sz w:val="20"/>
+      </w:rPr>
+    </w:lvl>
+  </w:abstractNum>
+  <w:abstractNum w:abstractNumId="7" w15:restartNumberingAfterBreak="0">
+    <w:nsid w:val="32CE3D8F"/>
+    <w:multiLevelType w:val="multilevel"/>
+    <w:tmpl w:val="9AA8A328"/>
+    <w:lvl w:ilvl="0">
+      <w:start w:val="1"/>
+      <w:numFmt w:val="bullet"/>
+      <w:lvlText w:val=""/>
+      <w:lvlJc w:val="left"/>
+      <w:pPr>
+        <w:tabs>
+          <w:tab w:val="num" w:pos="720"/>
+        </w:tabs>
+        <w:ind w:left="720" w:hanging="360"/>
+      </w:pPr>
+      <w:rPr>
+        <w:rFonts w:ascii="Symbol" w:hAnsi="Symbol" w:hint="default"/>
+        <w:sz w:val="20"/>
+      </w:rPr>
+    </w:lvl>
+    <w:lvl w:ilvl="1" w:tentative="1">
+      <w:start w:val="1"/>
+      <w:numFmt w:val="bullet"/>
+      <w:lvlText w:val="o"/>
+      <w:lvlJc w:val="left"/>
+      <w:pPr>
+        <w:tabs>
+          <w:tab w:val="num" w:pos="1440"/>
+        </w:tabs>
+        <w:ind w:left="1440" w:hanging="360"/>
+      </w:pPr>
+      <w:rPr>
+        <w:rFonts w:ascii="Courier New" w:hAnsi="Courier New" w:hint="default"/>
+        <w:sz w:val="20"/>
+      </w:rPr>
+    </w:lvl>
+    <w:lvl w:ilvl="2" w:tentative="1">
+      <w:start w:val="1"/>
+      <w:numFmt w:val="bullet"/>
+      <w:lvlText w:val=""/>
+      <w:lvlJc w:val="left"/>
+      <w:pPr>
+        <w:tabs>
+          <w:tab w:val="num" w:pos="2160"/>
+        </w:tabs>
+        <w:ind w:left="2160" w:hanging="360"/>
+      </w:pPr>
+      <w:rPr>
+        <w:rFonts w:ascii="Wingdings" w:hAnsi="Wingdings" w:hint="default"/>
+        <w:sz w:val="20"/>
+      </w:rPr>
+    </w:lvl>
+    <w:lvl w:ilvl="3" w:tentative="1">
+      <w:start w:val="1"/>
+      <w:numFmt w:val="bullet"/>
+      <w:lvlText w:val=""/>
+      <w:lvlJc w:val="left"/>
+      <w:pPr>
+        <w:tabs>
+          <w:tab w:val="num" w:pos="2880"/>
+        </w:tabs>
+        <w:ind w:left="2880" w:hanging="360"/>
+      </w:pPr>
+      <w:rPr>
+        <w:rFonts w:ascii="Wingdings" w:hAnsi="Wingdings" w:hint="default"/>
+        <w:sz w:val="20"/>
+      </w:rPr>
+    </w:lvl>
+    <w:lvl w:ilvl="4" w:tentative="1">
+      <w:start w:val="1"/>
+      <w:numFmt w:val="bullet"/>
+      <w:lvlText w:val=""/>
+      <w:lvlJc w:val="left"/>
+      <w:pPr>
+        <w:tabs>
+          <w:tab w:val="num" w:pos="3600"/>
+        </w:tabs>
+        <w:ind w:left="3600" w:hanging="360"/>
+      </w:pPr>
+      <w:rPr>
+        <w:rFonts w:ascii="Wingdings" w:hAnsi="Wingdings" w:hint="default"/>
+        <w:sz w:val="20"/>
+      </w:rPr>
+    </w:lvl>
+    <w:lvl w:ilvl="5" w:tentative="1">
+      <w:start w:val="1"/>
+      <w:numFmt w:val="bullet"/>
+      <w:lvlText w:val=""/>
+      <w:lvlJc w:val="left"/>
+      <w:pPr>
+        <w:tabs>
+          <w:tab w:val="num" w:pos="4320"/>
+        </w:tabs>
+        <w:ind w:left="4320" w:hanging="360"/>
+      </w:pPr>
+      <w:rPr>
+        <w:rFonts w:ascii="Wingdings" w:hAnsi="Wingdings" w:hint="default"/>
+        <w:sz w:val="20"/>
+      </w:rPr>
+    </w:lvl>
+    <w:lvl w:ilvl="6" w:tentative="1">
+      <w:start w:val="1"/>
+      <w:numFmt w:val="bullet"/>
+      <w:lvlText w:val=""/>
+      <w:lvlJc w:val="left"/>
+      <w:pPr>
+        <w:tabs>
+          <w:tab w:val="num" w:pos="5040"/>
+        </w:tabs>
+        <w:ind w:left="5040" w:hanging="360"/>
+      </w:pPr>
+      <w:rPr>
+        <w:rFonts w:ascii="Wingdings" w:hAnsi="Wingdings" w:hint="default"/>
+        <w:sz w:val="20"/>
+      </w:rPr>
+    </w:lvl>
+    <w:lvl w:ilvl="7" w:tentative="1">
+      <w:start w:val="1"/>
+      <w:numFmt w:val="bullet"/>
+      <w:lvlText w:val=""/>
+      <w:lvlJc w:val="left"/>
+      <w:pPr>
+        <w:tabs>
+          <w:tab w:val="num" w:pos="5760"/>
+        </w:tabs>
+        <w:ind w:left="5760" w:hanging="360"/>
+      </w:pPr>
+      <w:rPr>
+        <w:rFonts w:ascii="Wingdings" w:hAnsi="Wingdings" w:hint="default"/>
+        <w:sz w:val="20"/>
+      </w:rPr>
+    </w:lvl>
+    <w:lvl w:ilvl="8" w:tentative="1">
+      <w:start w:val="1"/>
+      <w:numFmt w:val="bullet"/>
+      <w:lvlText w:val=""/>
+      <w:lvlJc w:val="left"/>
+      <w:pPr>
+        <w:tabs>
+          <w:tab w:val="num" w:pos="6480"/>
+        </w:tabs>
+        <w:ind w:left="6480" w:hanging="360"/>
+      </w:pPr>
+      <w:rPr>
+        <w:rFonts w:ascii="Wingdings" w:hAnsi="Wingdings" w:hint="default"/>
+        <w:sz w:val="20"/>
+      </w:rPr>
+    </w:lvl>
+  </w:abstractNum>
+  <w:abstractNum w:abstractNumId="8" w15:restartNumberingAfterBreak="0">
+    <w:nsid w:val="5FD375C3"/>
+    <w:multiLevelType w:val="multilevel"/>
+    <w:tmpl w:val="1E505C80"/>
+    <w:lvl w:ilvl="0">
+      <w:start w:val="1"/>
+      <w:numFmt w:val="decimal"/>
+      <w:lvlText w:val="%1"/>
+      <w:lvlJc w:val="left"/>
+      <w:pPr>
+        <w:ind w:left="480" w:hanging="480"/>
+      </w:pPr>
+      <w:rPr>
+        <w:rFonts w:hint="default"/>
+      </w:rPr>
+    </w:lvl>
+    <w:lvl w:ilvl="1">
+      <w:start w:val="1"/>
+      <w:numFmt w:val="decimal"/>
+      <w:lvlText w:val="%1.%2"/>
+      <w:lvlJc w:val="left"/>
+      <w:pPr>
+        <w:ind w:left="480" w:hanging="480"/>
+      </w:pPr>
+      <w:rPr>
+        <w:rFonts w:hint="default"/>
+      </w:rPr>
+    </w:lvl>
+    <w:lvl w:ilvl="2">
+      <w:start w:val="1"/>
+      <w:numFmt w:val="decimal"/>
+      <w:lvlText w:val="%1.%2.%3"/>
+      <w:lvlJc w:val="left"/>
+      <w:pPr>
+        <w:ind w:left="720" w:hanging="720"/>
+      </w:pPr>
+      <w:rPr>
+        <w:rFonts w:hint="default"/>
+      </w:rPr>
+    </w:lvl>
+    <w:lvl w:ilvl="3">
+      <w:start w:val="1"/>
+      <w:numFmt w:val="decimal"/>
+      <w:lvlText w:val="%1.%2.%3.%4"/>
+      <w:lvlJc w:val="left"/>
+      <w:pPr>
+        <w:ind w:left="720" w:hanging="720"/>
+      </w:pPr>
+      <w:rPr>
+        <w:rFonts w:hint="default"/>
+      </w:rPr>
+    </w:lvl>
+    <w:lvl w:ilvl="4">
+      <w:start w:val="1"/>
+      <w:numFmt w:val="decimal"/>
+      <w:lvlText w:val="%1.%2.%3.%4.%5"/>
+      <w:lvlJc w:val="left"/>
+      <w:pPr>
+        <w:ind w:left="1080" w:hanging="1080"/>
+      </w:pPr>
+      <w:rPr>
+        <w:rFonts w:hint="default"/>
+      </w:rPr>
+    </w:lvl>
+    <w:lvl w:ilvl="5">
+      <w:start w:val="1"/>
+      <w:numFmt w:val="decimal"/>
+      <w:lvlText w:val="%1.%2.%3.%4.%5.%6"/>
+      <w:lvlJc w:val="left"/>
+      <w:pPr>
+        <w:ind w:left="1080" w:hanging="1080"/>
+      </w:pPr>
+      <w:rPr>
+        <w:rFonts w:hint="default"/>
+      </w:rPr>
+    </w:lvl>
+    <w:lvl w:ilvl="6">
+      <w:start w:val="1"/>
+      <w:numFmt w:val="decimal"/>
+      <w:lvlText w:val="%1.%2.%3.%4.%5.%6.%7"/>
+      <w:lvlJc w:val="left"/>
+      <w:pPr>
+        <w:ind w:left="1440" w:hanging="1440"/>
+      </w:pPr>
+      <w:rPr>
+        <w:rFonts w:hint="default"/>
+      </w:rPr>
+    </w:lvl>
+    <w:lvl w:ilvl="7">
+      <w:start w:val="1"/>
+      <w:numFmt w:val="decimal"/>
+      <w:lvlText w:val="%1.%2.%3.%4.%5.%6.%7.%8"/>
+      <w:lvlJc w:val="left"/>
+      <w:pPr>
+        <w:ind w:left="1440" w:hanging="1440"/>
+      </w:pPr>
+      <w:rPr>
+        <w:rFonts w:hint="default"/>
+      </w:rPr>
+    </w:lvl>
+    <w:lvl w:ilvl="8">
+      <w:start w:val="1"/>
+      <w:numFmt w:val="decimal"/>
+      <w:lvlText w:val="%1.%2.%3.%4.%5.%6.%7.%8.%9"/>
+      <w:lvlJc w:val="left"/>
+      <w:pPr>
+        <w:ind w:left="1800" w:hanging="1800"/>
+      </w:pPr>
+      <w:rPr>
+        <w:rFonts w:hint="default"/>
+      </w:rPr>
+    </w:lvl>
+  </w:abstractNum>
+  <w:abstractNum w:abstractNumId="9" w15:restartNumberingAfterBreak="0">
+    <w:nsid w:val="72CB32D9"/>
+    <w:multiLevelType w:val="multilevel"/>
+    <w:tmpl w:val="D75C8316"/>
+    <w:lvl w:ilvl="0">
+      <w:start w:val="1"/>
+      <w:numFmt w:val="bullet"/>
+      <w:lvlText w:val=""/>
+      <w:lvlJc w:val="left"/>
+      <w:pPr>
+        <w:tabs>
+          <w:tab w:val="num" w:pos="720"/>
+        </w:tabs>
+        <w:ind w:left="720" w:hanging="360"/>
+      </w:pPr>
+      <w:rPr>
+        <w:rFonts w:ascii="Symbol" w:hAnsi="Symbol" w:hint="default"/>
+        <w:sz w:val="20"/>
+      </w:rPr>
+    </w:lvl>
+    <w:lvl w:ilvl="1" w:tentative="1">
+      <w:start w:val="1"/>
+      <w:numFmt w:val="bullet"/>
+      <w:lvlText w:val="o"/>
+      <w:lvlJc w:val="left"/>
+      <w:pPr>
+        <w:tabs>
+          <w:tab w:val="num" w:pos="1440"/>
+        </w:tabs>
+        <w:ind w:left="1440" w:hanging="360"/>
+      </w:pPr>
+      <w:rPr>
+        <w:rFonts w:ascii="Courier New" w:hAnsi="Courier New" w:hint="default"/>
+        <w:sz w:val="20"/>
+      </w:rPr>
+    </w:lvl>
+    <w:lvl w:ilvl="2" w:tentative="1">
+      <w:start w:val="1"/>
+      <w:numFmt w:val="bullet"/>
+      <w:lvlText w:val=""/>
+      <w:lvlJc w:val="left"/>
+      <w:pPr>
+        <w:tabs>
+          <w:tab w:val="num" w:pos="2160"/>
+        </w:tabs>
+        <w:ind w:left="2160" w:hanging="360"/>
+      </w:pPr>
+      <w:rPr>
+        <w:rFonts w:ascii="Wingdings" w:hAnsi="Wingdings" w:hint="default"/>
+        <w:sz w:val="20"/>
+      </w:rPr>
+    </w:lvl>
+    <w:lvl w:ilvl="3" w:tentative="1">
+      <w:start w:val="1"/>
+      <w:numFmt w:val="bullet"/>
+      <w:lvlText w:val=""/>
+      <w:lvlJc w:val="left"/>
+      <w:pPr>
+        <w:tabs>
+          <w:tab w:val="num" w:pos="2880"/>
+        </w:tabs>
+        <w:ind w:left="2880" w:hanging="360"/>
+      </w:pPr>
+      <w:rPr>
+        <w:rFonts w:ascii="Wingdings" w:hAnsi="Wingdings" w:hint="default"/>
+        <w:sz w:val="20"/>
+      </w:rPr>
+    </w:lvl>
+    <w:lvl w:ilvl="4" w:tentative="1">
+      <w:start w:val="1"/>
+      <w:numFmt w:val="bullet"/>
+      <w:lvlText w:val=""/>
+      <w:lvlJc w:val="left"/>
+      <w:pPr>
+        <w:tabs>
+          <w:tab w:val="num" w:pos="3600"/>
+        </w:tabs>
+        <w:ind w:left="3600" w:hanging="360"/>
+      </w:pPr>
+      <w:rPr>
+        <w:rFonts w:ascii="Wingdings" w:hAnsi="Wingdings" w:hint="default"/>
+        <w:sz w:val="20"/>
+      </w:rPr>
+    </w:lvl>
+    <w:lvl w:ilvl="5" w:tentative="1">
+      <w:start w:val="1"/>
+      <w:numFmt w:val="bullet"/>
+      <w:lvlText w:val=""/>
+      <w:lvlJc w:val="left"/>
+      <w:pPr>
+        <w:tabs>
+          <w:tab w:val="num" w:pos="4320"/>
+        </w:tabs>
+        <w:ind w:left="4320" w:hanging="360"/>
+      </w:pPr>
+      <w:rPr>
+        <w:rFonts w:ascii="Wingdings" w:hAnsi="Wingdings" w:hint="default"/>
+        <w:sz w:val="20"/>
+      </w:rPr>
+    </w:lvl>
+    <w:lvl w:ilvl="6" w:tentative="1">
+      <w:start w:val="1"/>
+      <w:numFmt w:val="bullet"/>
+      <w:lvlText w:val=""/>
+      <w:lvlJc w:val="left"/>
+      <w:pPr>
+        <w:tabs>
+          <w:tab w:val="num" w:pos="5040"/>
+        </w:tabs>
+        <w:ind w:left="5040" w:hanging="360"/>
+      </w:pPr>
+      <w:rPr>
+        <w:rFonts w:ascii="Wingdings" w:hAnsi="Wingdings" w:hint="default"/>
+        <w:sz w:val="20"/>
+      </w:rPr>
+    </w:lvl>
+    <w:lvl w:ilvl="7" w:tentative="1">
+      <w:start w:val="1"/>
+      <w:numFmt w:val="bullet"/>
+      <w:lvlText w:val=""/>
+      <w:lvlJc w:val="left"/>
+      <w:pPr>
+        <w:tabs>
+          <w:tab w:val="num" w:pos="5760"/>
+        </w:tabs>
+        <w:ind w:left="5760" w:hanging="360"/>
+      </w:pPr>
+      <w:rPr>
+        <w:rFonts w:ascii="Wingdings" w:hAnsi="Wingdings" w:hint="default"/>
+        <w:sz w:val="20"/>
+      </w:rPr>
+    </w:lvl>
+    <w:lvl w:ilvl="8" w:tentative="1">
+      <w:start w:val="1"/>
+      <w:numFmt w:val="bullet"/>
+      <w:lvlText w:val=""/>
+      <w:lvlJc w:val="left"/>
+      <w:pPr>
+        <w:tabs>
+          <w:tab w:val="num" w:pos="6480"/>
+        </w:tabs>
+        <w:ind w:left="6480" w:hanging="360"/>
+      </w:pPr>
+      <w:rPr>
+        <w:rFonts w:ascii="Wingdings" w:hAnsi="Wingdings" w:hint="default"/>
+        <w:sz w:val="20"/>
+      </w:rPr>
+    </w:lvl>
+  </w:abstractNum>
+  <w:num w:numId="1" w16cid:durableId="821312873">
+    <w:abstractNumId w:val="9"/>
+  </w:num>
+  <w:num w:numId="2" w16cid:durableId="1414087531">
+    <w:abstractNumId w:val="7"/>
+  </w:num>
+  <w:num w:numId="3" w16cid:durableId="1691374623">
+    <w:abstractNumId w:val="6"/>
+  </w:num>
+  <w:num w:numId="4" w16cid:durableId="664210779">
+    <w:abstractNumId w:val="1"/>
+  </w:num>
+  <w:num w:numId="5" w16cid:durableId="782384122">
+    <w:abstractNumId w:val="2"/>
+  </w:num>
+  <w:num w:numId="6" w16cid:durableId="1366255576">
+    <w:abstractNumId w:val="5"/>
+  </w:num>
+  <w:num w:numId="7" w16cid:durableId="43217361">
+    <w:abstractNumId w:val="3"/>
+  </w:num>
+  <w:num w:numId="8" w16cid:durableId="767775622">
+    <w:abstractNumId w:val="4"/>
+  </w:num>
+  <w:num w:numId="9" w16cid:durableId="424501881">
+    <w:abstractNumId w:val="8"/>
+  </w:num>
+  <w:num w:numId="10" w16cid:durableId="2051688809">
+    <w:abstractNumId w:val="0"/>
+  </w:num>
+</w:numbering>
 </file>
 
 <file path=word/styles.xml><?xml version="1.0" encoding="utf-8"?>
@@ -445,7 +4744,6 @@
     <w:next w:val="Normal"/>
     <w:link w:val="Heading2Char"/>
     <w:uiPriority w:val="9"/>
-    <w:semiHidden/>
     <w:unhideWhenUsed/>
     <w:qFormat/>
     <w:rsid w:val="0066289B"/>
@@ -468,7 +4766,6 @@
     <w:next w:val="Normal"/>
     <w:link w:val="Heading3Char"/>
     <w:uiPriority w:val="9"/>
-    <w:semiHidden/>
     <w:unhideWhenUsed/>
     <w:qFormat/>
     <w:rsid w:val="0066289B"/>
@@ -620,7 +4917,6 @@
   <w:style w:type="character" w:default="1" w:styleId="DefaultParagraphFont">
     <w:name w:val="Default Paragraph Font"/>
     <w:uiPriority w:val="1"/>
-    <w:semiHidden/>
     <w:unhideWhenUsed/>
   </w:style>
   <w:style w:type="table" w:default="1" w:styleId="TableNormal">
@@ -662,7 +4958,6 @@
     <w:basedOn w:val="DefaultParagraphFont"/>
     <w:link w:val="Heading2"/>
     <w:uiPriority w:val="9"/>
-    <w:semiHidden/>
     <w:rsid w:val="0066289B"/>
     <w:rPr>
       <w:rFonts w:asciiTheme="majorHAnsi" w:eastAsiaTheme="majorEastAsia" w:hAnsiTheme="majorHAnsi" w:cstheme="majorBidi"/>
@@ -676,7 +4971,6 @@
     <w:basedOn w:val="DefaultParagraphFont"/>
     <w:link w:val="Heading3"/>
     <w:uiPriority w:val="9"/>
-    <w:semiHidden/>
     <w:rsid w:val="0066289B"/>
     <w:rPr>
       <w:rFonts w:eastAsiaTheme="majorEastAsia" w:cstheme="majorBidi"/>
@@ -932,6 +5226,143 @@
       <w:smallCaps/>
       <w:color w:val="0F4761" w:themeColor="accent1" w:themeShade="BF"/>
       <w:spacing w:val="5"/>
+    </w:rPr>
+  </w:style>
+  <w:style w:type="paragraph" w:styleId="TOCHeading">
+    <w:name w:val="TOC Heading"/>
+    <w:basedOn w:val="Heading1"/>
+    <w:next w:val="Normal"/>
+    <w:uiPriority w:val="39"/>
+    <w:unhideWhenUsed/>
+    <w:qFormat/>
+    <w:rsid w:val="00776B6E"/>
+    <w:pPr>
+      <w:spacing w:before="240" w:after="0"/>
+      <w:outlineLvl w:val="9"/>
+    </w:pPr>
+    <w:rPr>
+      <w:kern w:val="0"/>
+      <w:sz w:val="32"/>
+      <w:szCs w:val="32"/>
+      <w:lang w:eastAsia="en-AU"/>
+      <w14:ligatures w14:val="none"/>
+    </w:rPr>
+  </w:style>
+  <w:style w:type="paragraph" w:styleId="TOC1">
+    <w:name w:val="toc 1"/>
+    <w:basedOn w:val="Normal"/>
+    <w:next w:val="Normal"/>
+    <w:autoRedefine/>
+    <w:uiPriority w:val="39"/>
+    <w:unhideWhenUsed/>
+    <w:rsid w:val="00776B6E"/>
+    <w:pPr>
+      <w:spacing w:after="100"/>
+    </w:pPr>
+  </w:style>
+  <w:style w:type="character" w:styleId="Hyperlink">
+    <w:name w:val="Hyperlink"/>
+    <w:basedOn w:val="DefaultParagraphFont"/>
+    <w:uiPriority w:val="99"/>
+    <w:unhideWhenUsed/>
+    <w:rsid w:val="00776B6E"/>
+    <w:rPr>
+      <w:color w:val="467886" w:themeColor="hyperlink"/>
+      <w:u w:val="single"/>
+    </w:rPr>
+  </w:style>
+  <w:style w:type="paragraph" w:styleId="Header">
+    <w:name w:val="header"/>
+    <w:basedOn w:val="Normal"/>
+    <w:link w:val="HeaderChar"/>
+    <w:uiPriority w:val="99"/>
+    <w:unhideWhenUsed/>
+    <w:rsid w:val="00776B6E"/>
+    <w:pPr>
+      <w:tabs>
+        <w:tab w:val="center" w:pos="4513"/>
+        <w:tab w:val="right" w:pos="9026"/>
+      </w:tabs>
+      <w:spacing w:after="0" w:line="240" w:lineRule="auto"/>
+    </w:pPr>
+  </w:style>
+  <w:style w:type="character" w:customStyle="1" w:styleId="HeaderChar">
+    <w:name w:val="Header Char"/>
+    <w:basedOn w:val="DefaultParagraphFont"/>
+    <w:link w:val="Header"/>
+    <w:uiPriority w:val="99"/>
+    <w:rsid w:val="00776B6E"/>
+  </w:style>
+  <w:style w:type="paragraph" w:styleId="Footer">
+    <w:name w:val="footer"/>
+    <w:basedOn w:val="Normal"/>
+    <w:link w:val="FooterChar"/>
+    <w:uiPriority w:val="99"/>
+    <w:unhideWhenUsed/>
+    <w:rsid w:val="00776B6E"/>
+    <w:pPr>
+      <w:tabs>
+        <w:tab w:val="center" w:pos="4513"/>
+        <w:tab w:val="right" w:pos="9026"/>
+      </w:tabs>
+      <w:spacing w:after="0" w:line="240" w:lineRule="auto"/>
+    </w:pPr>
+  </w:style>
+  <w:style w:type="character" w:customStyle="1" w:styleId="FooterChar">
+    <w:name w:val="Footer Char"/>
+    <w:basedOn w:val="DefaultParagraphFont"/>
+    <w:link w:val="Footer"/>
+    <w:uiPriority w:val="99"/>
+    <w:rsid w:val="00776B6E"/>
+  </w:style>
+  <w:style w:type="paragraph" w:styleId="TOC2">
+    <w:name w:val="toc 2"/>
+    <w:basedOn w:val="Normal"/>
+    <w:next w:val="Normal"/>
+    <w:autoRedefine/>
+    <w:uiPriority w:val="39"/>
+    <w:unhideWhenUsed/>
+    <w:rsid w:val="00776B6E"/>
+    <w:pPr>
+      <w:spacing w:after="100"/>
+      <w:ind w:left="220"/>
+    </w:pPr>
+  </w:style>
+  <w:style w:type="character" w:styleId="SubtleEmphasis">
+    <w:name w:val="Subtle Emphasis"/>
+    <w:basedOn w:val="DefaultParagraphFont"/>
+    <w:uiPriority w:val="19"/>
+    <w:qFormat/>
+    <w:rsid w:val="00FB24C5"/>
+    <w:rPr>
+      <w:i/>
+      <w:iCs/>
+      <w:color w:val="404040" w:themeColor="text1" w:themeTint="BF"/>
+    </w:rPr>
+  </w:style>
+  <w:style w:type="paragraph" w:styleId="TOC3">
+    <w:name w:val="toc 3"/>
+    <w:basedOn w:val="Normal"/>
+    <w:next w:val="Normal"/>
+    <w:autoRedefine/>
+    <w:uiPriority w:val="39"/>
+    <w:unhideWhenUsed/>
+    <w:rsid w:val="000A4950"/>
+    <w:pPr>
+      <w:spacing w:after="100"/>
+      <w:ind w:left="440"/>
+    </w:pPr>
+  </w:style>
+  <w:style w:type="character" w:styleId="UnresolvedMention">
+    <w:name w:val="Unresolved Mention"/>
+    <w:basedOn w:val="DefaultParagraphFont"/>
+    <w:uiPriority w:val="99"/>
+    <w:semiHidden/>
+    <w:unhideWhenUsed/>
+    <w:rsid w:val="000C478B"/>
+    <w:rPr>
+      <w:color w:val="605E5C"/>
+      <w:shd w:val="clear" w:color="auto" w:fill="E1DFDD"/>
     </w:rPr>
   </w:style>
 </w:styles>
@@ -1230,4 +5661,16 @@
     </a:ext>
   </a:extLst>
 </a:theme>
+</file>
+
+<file path=customXml/item1.xml><?xml version="1.0" encoding="utf-8"?>
+<b:Sources xmlns:b="http://schemas.openxmlformats.org/officeDocument/2006/bibliography" xmlns="http://schemas.openxmlformats.org/officeDocument/2006/bibliography" SelectedStyle="\APASixthEditionOfficeOnline.xsl" StyleName="APA" Version="6"/>
+</file>
+
+<file path=customXml/itemProps1.xml><?xml version="1.0" encoding="utf-8"?>
+<ds:datastoreItem xmlns:ds="http://schemas.openxmlformats.org/officeDocument/2006/customXml" ds:itemID="{1F7CAE77-4245-490B-B47F-768035862D45}">
+  <ds:schemaRefs>
+    <ds:schemaRef ds:uri="http://schemas.openxmlformats.org/officeDocument/2006/bibliography"/>
+  </ds:schemaRefs>
+</ds:datastoreItem>
 </file>
</xml_diff>

<commit_message>
Move doxc changes to git
</commit_message>
<xml_diff>
--- a/Assignment 1 Report - Adam Merhi.docx
+++ b/Assignment 1 Report - Adam Merhi.docx
@@ -89,7 +89,7 @@
           <w:r>
             <w:fldChar w:fldCharType="separate"/>
           </w:r>
-          <w:hyperlink w:anchor="_Toc209806782" w:history="1">
+          <w:hyperlink w:anchor="_Toc209888954" w:history="1">
             <w:r>
               <w:rPr>
                 <w:rStyle w:val="Hyperlink"/>
@@ -116,7 +116,7 @@
                 <w:noProof/>
                 <w:webHidden/>
               </w:rPr>
-              <w:instrText xml:space="preserve"> PAGEREF _Toc209806782 \h </w:instrText>
+              <w:instrText xml:space="preserve"> PAGEREF _Toc209888954 \h </w:instrText>
             </w:r>
             <w:r>
               <w:rPr>
@@ -161,7 +161,7 @@
               <w:lang w:eastAsia="en-AU"/>
             </w:rPr>
           </w:pPr>
-          <w:hyperlink w:anchor="_Toc209806783" w:history="1">
+          <w:hyperlink w:anchor="_Toc209888955" w:history="1">
             <w:r>
               <w:rPr>
                 <w:rStyle w:val="Hyperlink"/>
@@ -188,7 +188,7 @@
                 <w:noProof/>
                 <w:webHidden/>
               </w:rPr>
-              <w:instrText xml:space="preserve"> PAGEREF _Toc209806783 \h </w:instrText>
+              <w:instrText xml:space="preserve"> PAGEREF _Toc209888955 \h </w:instrText>
             </w:r>
             <w:r>
               <w:rPr>
@@ -233,7 +233,7 @@
               <w:lang w:eastAsia="en-AU"/>
             </w:rPr>
           </w:pPr>
-          <w:hyperlink w:anchor="_Toc209806784" w:history="1">
+          <w:hyperlink w:anchor="_Toc209888956" w:history="1">
             <w:r>
               <w:rPr>
                 <w:rStyle w:val="Hyperlink"/>
@@ -260,7 +260,7 @@
                 <w:noProof/>
                 <w:webHidden/>
               </w:rPr>
-              <w:instrText xml:space="preserve"> PAGEREF _Toc209806784 \h </w:instrText>
+              <w:instrText xml:space="preserve"> PAGEREF _Toc209888956 \h </w:instrText>
             </w:r>
             <w:r>
               <w:rPr>
@@ -305,7 +305,7 @@
               <w:lang w:eastAsia="en-AU"/>
             </w:rPr>
           </w:pPr>
-          <w:hyperlink w:anchor="_Toc209806785" w:history="1">
+          <w:hyperlink w:anchor="_Toc209888957" w:history="1">
             <w:r>
               <w:rPr>
                 <w:rStyle w:val="Hyperlink"/>
@@ -332,7 +332,7 @@
                 <w:noProof/>
                 <w:webHidden/>
               </w:rPr>
-              <w:instrText xml:space="preserve"> PAGEREF _Toc209806785 \h </w:instrText>
+              <w:instrText xml:space="preserve"> PAGEREF _Toc209888957 \h </w:instrText>
             </w:r>
             <w:r>
               <w:rPr>
@@ -377,7 +377,7 @@
               <w:lang w:eastAsia="en-AU"/>
             </w:rPr>
           </w:pPr>
-          <w:hyperlink w:anchor="_Toc209806786" w:history="1">
+          <w:hyperlink w:anchor="_Toc209888958" w:history="1">
             <w:r>
               <w:rPr>
                 <w:rStyle w:val="Hyperlink"/>
@@ -404,7 +404,7 @@
                 <w:noProof/>
                 <w:webHidden/>
               </w:rPr>
-              <w:instrText xml:space="preserve"> PAGEREF _Toc209806786 \h </w:instrText>
+              <w:instrText xml:space="preserve"> PAGEREF _Toc209888958 \h </w:instrText>
             </w:r>
             <w:r>
               <w:rPr>
@@ -449,7 +449,7 @@
               <w:lang w:eastAsia="en-AU"/>
             </w:rPr>
           </w:pPr>
-          <w:hyperlink w:anchor="_Toc209806787" w:history="1">
+          <w:hyperlink w:anchor="_Toc209888959" w:history="1">
             <w:r>
               <w:rPr>
                 <w:rStyle w:val="Hyperlink"/>
@@ -476,7 +476,7 @@
                 <w:noProof/>
                 <w:webHidden/>
               </w:rPr>
-              <w:instrText xml:space="preserve"> PAGEREF _Toc209806787 \h </w:instrText>
+              <w:instrText xml:space="preserve"> PAGEREF _Toc209888959 \h </w:instrText>
             </w:r>
             <w:r>
               <w:rPr>
@@ -521,7 +521,7 @@
               <w:lang w:eastAsia="en-AU"/>
             </w:rPr>
           </w:pPr>
-          <w:hyperlink w:anchor="_Toc209806788" w:history="1">
+          <w:hyperlink w:anchor="_Toc209888960" w:history="1">
             <w:r>
               <w:rPr>
                 <w:rStyle w:val="Hyperlink"/>
@@ -548,7 +548,7 @@
                 <w:noProof/>
                 <w:webHidden/>
               </w:rPr>
-              <w:instrText xml:space="preserve"> PAGEREF _Toc209806788 \h </w:instrText>
+              <w:instrText xml:space="preserve"> PAGEREF _Toc209888960 \h </w:instrText>
             </w:r>
             <w:r>
               <w:rPr>
@@ -593,7 +593,7 @@
               <w:lang w:eastAsia="en-AU"/>
             </w:rPr>
           </w:pPr>
-          <w:hyperlink w:anchor="_Toc209806789" w:history="1">
+          <w:hyperlink w:anchor="_Toc209888961" w:history="1">
             <w:r>
               <w:rPr>
                 <w:rStyle w:val="Hyperlink"/>
@@ -620,7 +620,7 @@
                 <w:noProof/>
                 <w:webHidden/>
               </w:rPr>
-              <w:instrText xml:space="preserve"> PAGEREF _Toc209806789 \h </w:instrText>
+              <w:instrText xml:space="preserve"> PAGEREF _Toc209888961 \h </w:instrText>
             </w:r>
             <w:r>
               <w:rPr>
@@ -653,7 +653,7 @@
         </w:p>
         <w:p>
           <w:pPr>
-            <w:pStyle w:val="TOC3"/>
+            <w:pStyle w:val="TOC2"/>
             <w:tabs>
               <w:tab w:val="right" w:leader="dot" w:pos="9016"/>
             </w:tabs>
@@ -665,13 +665,13 @@
               <w:lang w:eastAsia="en-AU"/>
             </w:rPr>
           </w:pPr>
-          <w:hyperlink w:anchor="_Toc209806790" w:history="1">
+          <w:hyperlink w:anchor="_Toc209888962" w:history="1">
             <w:r>
               <w:rPr>
                 <w:rStyle w:val="Hyperlink"/>
                 <w:noProof/>
               </w:rPr>
-              <w:t>2.1.4 Graph Databases</w:t>
+              <w:t>2.2 Benefits and Effectiveness of KMP</w:t>
             </w:r>
             <w:r>
               <w:rPr>
@@ -692,79 +692,7 @@
                 <w:noProof/>
                 <w:webHidden/>
               </w:rPr>
-              <w:instrText xml:space="preserve"> PAGEREF _Toc209806790 \h </w:instrText>
-            </w:r>
-            <w:r>
-              <w:rPr>
-                <w:noProof/>
-                <w:webHidden/>
-              </w:rPr>
-            </w:r>
-            <w:r>
-              <w:rPr>
-                <w:noProof/>
-                <w:webHidden/>
-              </w:rPr>
-              <w:fldChar w:fldCharType="separate"/>
-            </w:r>
-            <w:r>
-              <w:rPr>
-                <w:noProof/>
-                <w:webHidden/>
-              </w:rPr>
-              <w:t>5</w:t>
-            </w:r>
-            <w:r>
-              <w:rPr>
-                <w:noProof/>
-                <w:webHidden/>
-              </w:rPr>
-              <w:fldChar w:fldCharType="end"/>
-            </w:r>
-          </w:hyperlink>
-        </w:p>
-        <w:p>
-          <w:pPr>
-            <w:pStyle w:val="TOC3"/>
-            <w:tabs>
-              <w:tab w:val="right" w:leader="dot" w:pos="9016"/>
-            </w:tabs>
-            <w:rPr>
-              <w:rFonts w:eastAsiaTheme="minorEastAsia"/>
-              <w:noProof/>
-              <w:sz w:val="24"/>
-              <w:szCs w:val="24"/>
-              <w:lang w:eastAsia="en-AU"/>
-            </w:rPr>
-          </w:pPr>
-          <w:hyperlink w:anchor="_Toc209806791" w:history="1">
-            <w:r>
-              <w:rPr>
-                <w:rStyle w:val="Hyperlink"/>
-                <w:noProof/>
-              </w:rPr>
-              <w:t>2.2 Benefits and Effectiveness of KMP</w:t>
-            </w:r>
-            <w:r>
-              <w:rPr>
-                <w:noProof/>
-                <w:webHidden/>
-              </w:rPr>
-              <w:tab/>
-            </w:r>
-            <w:r>
-              <w:rPr>
-                <w:noProof/>
-                <w:webHidden/>
-              </w:rPr>
-              <w:fldChar w:fldCharType="begin"/>
-            </w:r>
-            <w:r>
-              <w:rPr>
-                <w:noProof/>
-                <w:webHidden/>
-              </w:rPr>
-              <w:instrText xml:space="preserve"> PAGEREF _Toc209806791 \h </w:instrText>
+              <w:instrText xml:space="preserve"> PAGEREF _Toc209888962 \h </w:instrText>
             </w:r>
             <w:r>
               <w:rPr>
@@ -809,7 +737,7 @@
               <w:lang w:eastAsia="en-AU"/>
             </w:rPr>
           </w:pPr>
-          <w:hyperlink w:anchor="_Toc209806792" w:history="1">
+          <w:hyperlink w:anchor="_Toc209888963" w:history="1">
             <w:r>
               <w:rPr>
                 <w:rStyle w:val="Hyperlink"/>
@@ -836,7 +764,7 @@
                 <w:noProof/>
                 <w:webHidden/>
               </w:rPr>
-              <w:instrText xml:space="preserve"> PAGEREF _Toc209806792 \h </w:instrText>
+              <w:instrText xml:space="preserve"> PAGEREF _Toc209888963 \h </w:instrText>
             </w:r>
             <w:r>
               <w:rPr>
@@ -881,7 +809,7 @@
               <w:lang w:eastAsia="en-AU"/>
             </w:rPr>
           </w:pPr>
-          <w:hyperlink w:anchor="_Toc209806793" w:history="1">
+          <w:hyperlink w:anchor="_Toc209888964" w:history="1">
             <w:r>
               <w:rPr>
                 <w:rStyle w:val="Hyperlink"/>
@@ -908,7 +836,7 @@
                 <w:noProof/>
                 <w:webHidden/>
               </w:rPr>
-              <w:instrText xml:space="preserve"> PAGEREF _Toc209806793 \h </w:instrText>
+              <w:instrText xml:space="preserve"> PAGEREF _Toc209888964 \h </w:instrText>
             </w:r>
             <w:r>
               <w:rPr>
@@ -953,7 +881,7 @@
               <w:lang w:eastAsia="en-AU"/>
             </w:rPr>
           </w:pPr>
-          <w:hyperlink w:anchor="_Toc209806794" w:history="1">
+          <w:hyperlink w:anchor="_Toc209888965" w:history="1">
             <w:r>
               <w:rPr>
                 <w:rStyle w:val="Hyperlink"/>
@@ -980,7 +908,7 @@
                 <w:noProof/>
                 <w:webHidden/>
               </w:rPr>
-              <w:instrText xml:space="preserve"> PAGEREF _Toc209806794 \h </w:instrText>
+              <w:instrText xml:space="preserve"> PAGEREF _Toc209888965 \h </w:instrText>
             </w:r>
             <w:r>
               <w:rPr>
@@ -1000,7 +928,7 @@
                 <w:noProof/>
                 <w:webHidden/>
               </w:rPr>
-              <w:t>5</w:t>
+              <w:t>6</w:t>
             </w:r>
             <w:r>
               <w:rPr>
@@ -1025,7 +953,7 @@
               <w:lang w:eastAsia="en-AU"/>
             </w:rPr>
           </w:pPr>
-          <w:hyperlink w:anchor="_Toc209806795" w:history="1">
+          <w:hyperlink w:anchor="_Toc209888966" w:history="1">
             <w:r>
               <w:rPr>
                 <w:rStyle w:val="Hyperlink"/>
@@ -1052,7 +980,7 @@
                 <w:noProof/>
                 <w:webHidden/>
               </w:rPr>
-              <w:instrText xml:space="preserve"> PAGEREF _Toc209806795 \h </w:instrText>
+              <w:instrText xml:space="preserve"> PAGEREF _Toc209888966 \h </w:instrText>
             </w:r>
             <w:r>
               <w:rPr>
@@ -1072,7 +1000,7 @@
                 <w:noProof/>
                 <w:webHidden/>
               </w:rPr>
-              <w:t>5</w:t>
+              <w:t>6</w:t>
             </w:r>
             <w:r>
               <w:rPr>
@@ -1097,7 +1025,7 @@
               <w:lang w:eastAsia="en-AU"/>
             </w:rPr>
           </w:pPr>
-          <w:hyperlink w:anchor="_Toc209806796" w:history="1">
+          <w:hyperlink w:anchor="_Toc209888967" w:history="1">
             <w:r>
               <w:rPr>
                 <w:rStyle w:val="Hyperlink"/>
@@ -1124,7 +1052,7 @@
                 <w:noProof/>
                 <w:webHidden/>
               </w:rPr>
-              <w:instrText xml:space="preserve"> PAGEREF _Toc209806796 \h </w:instrText>
+              <w:instrText xml:space="preserve"> PAGEREF _Toc209888967 \h </w:instrText>
             </w:r>
             <w:r>
               <w:rPr>
@@ -1144,7 +1072,7 @@
                 <w:noProof/>
                 <w:webHidden/>
               </w:rPr>
-              <w:t>5</w:t>
+              <w:t>6</w:t>
             </w:r>
             <w:r>
               <w:rPr>
@@ -1169,7 +1097,7 @@
               <w:lang w:eastAsia="en-AU"/>
             </w:rPr>
           </w:pPr>
-          <w:hyperlink w:anchor="_Toc209806797" w:history="1">
+          <w:hyperlink w:anchor="_Toc209888968" w:history="1">
             <w:r>
               <w:rPr>
                 <w:rStyle w:val="Hyperlink"/>
@@ -1196,7 +1124,7 @@
                 <w:noProof/>
                 <w:webHidden/>
               </w:rPr>
-              <w:instrText xml:space="preserve"> PAGEREF _Toc209806797 \h </w:instrText>
+              <w:instrText xml:space="preserve"> PAGEREF _Toc209888968 \h </w:instrText>
             </w:r>
             <w:r>
               <w:rPr>
@@ -1216,7 +1144,7 @@
                 <w:noProof/>
                 <w:webHidden/>
               </w:rPr>
-              <w:t>6</w:t>
+              <w:t>7</w:t>
             </w:r>
             <w:r>
               <w:rPr>
@@ -1241,7 +1169,7 @@
               <w:lang w:eastAsia="en-AU"/>
             </w:rPr>
           </w:pPr>
-          <w:hyperlink w:anchor="_Toc209806798" w:history="1">
+          <w:hyperlink w:anchor="_Toc209888969" w:history="1">
             <w:r>
               <w:rPr>
                 <w:rStyle w:val="Hyperlink"/>
@@ -1268,7 +1196,7 @@
                 <w:noProof/>
                 <w:webHidden/>
               </w:rPr>
-              <w:instrText xml:space="preserve"> PAGEREF _Toc209806798 \h </w:instrText>
+              <w:instrText xml:space="preserve"> PAGEREF _Toc209888969 \h </w:instrText>
             </w:r>
             <w:r>
               <w:rPr>
@@ -1288,7 +1216,7 @@
                 <w:noProof/>
                 <w:webHidden/>
               </w:rPr>
-              <w:t>6</w:t>
+              <w:t>7</w:t>
             </w:r>
             <w:r>
               <w:rPr>
@@ -1313,13 +1241,13 @@
               <w:lang w:eastAsia="en-AU"/>
             </w:rPr>
           </w:pPr>
-          <w:hyperlink w:anchor="_Toc209806799" w:history="1">
+          <w:hyperlink w:anchor="_Toc209888970" w:history="1">
             <w:r>
               <w:rPr>
                 <w:rStyle w:val="Hyperlink"/>
                 <w:noProof/>
               </w:rPr>
-              <w:t>5.2 Compromissions and Changes</w:t>
+              <w:t>5.2 Compromises and Changes</w:t>
             </w:r>
             <w:r>
               <w:rPr>
@@ -1340,7 +1268,7 @@
                 <w:noProof/>
                 <w:webHidden/>
               </w:rPr>
-              <w:instrText xml:space="preserve"> PAGEREF _Toc209806799 \h </w:instrText>
+              <w:instrText xml:space="preserve"> PAGEREF _Toc209888970 \h </w:instrText>
             </w:r>
             <w:r>
               <w:rPr>
@@ -1360,7 +1288,7 @@
                 <w:noProof/>
                 <w:webHidden/>
               </w:rPr>
-              <w:t>6</w:t>
+              <w:t>7</w:t>
             </w:r>
             <w:r>
               <w:rPr>
@@ -1385,7 +1313,7 @@
               <w:lang w:eastAsia="en-AU"/>
             </w:rPr>
           </w:pPr>
-          <w:hyperlink w:anchor="_Toc209806800" w:history="1">
+          <w:hyperlink w:anchor="_Toc209888971" w:history="1">
             <w:r>
               <w:rPr>
                 <w:rStyle w:val="Hyperlink"/>
@@ -1412,7 +1340,7 @@
                 <w:noProof/>
                 <w:webHidden/>
               </w:rPr>
-              <w:instrText xml:space="preserve"> PAGEREF _Toc209806800 \h </w:instrText>
+              <w:instrText xml:space="preserve"> PAGEREF _Toc209888971 \h </w:instrText>
             </w:r>
             <w:r>
               <w:rPr>
@@ -1432,7 +1360,7 @@
                 <w:noProof/>
                 <w:webHidden/>
               </w:rPr>
-              <w:t>6</w:t>
+              <w:t>8</w:t>
             </w:r>
             <w:r>
               <w:rPr>
@@ -1457,7 +1385,7 @@
               <w:lang w:eastAsia="en-AU"/>
             </w:rPr>
           </w:pPr>
-          <w:hyperlink w:anchor="_Toc209806801" w:history="1">
+          <w:hyperlink w:anchor="_Toc209888972" w:history="1">
             <w:r>
               <w:rPr>
                 <w:rStyle w:val="Hyperlink"/>
@@ -1484,7 +1412,7 @@
                 <w:noProof/>
                 <w:webHidden/>
               </w:rPr>
-              <w:instrText xml:space="preserve"> PAGEREF _Toc209806801 \h </w:instrText>
+              <w:instrText xml:space="preserve"> PAGEREF _Toc209888972 \h </w:instrText>
             </w:r>
             <w:r>
               <w:rPr>
@@ -1504,7 +1432,7 @@
                 <w:noProof/>
                 <w:webHidden/>
               </w:rPr>
-              <w:t>6</w:t>
+              <w:t>8</w:t>
             </w:r>
             <w:r>
               <w:rPr>
@@ -1529,7 +1457,7 @@
               <w:lang w:eastAsia="en-AU"/>
             </w:rPr>
           </w:pPr>
-          <w:hyperlink w:anchor="_Toc209806802" w:history="1">
+          <w:hyperlink w:anchor="_Toc209888973" w:history="1">
             <w:r>
               <w:rPr>
                 <w:rStyle w:val="Hyperlink"/>
@@ -1556,7 +1484,7 @@
                 <w:noProof/>
                 <w:webHidden/>
               </w:rPr>
-              <w:instrText xml:space="preserve"> PAGEREF _Toc209806802 \h </w:instrText>
+              <w:instrText xml:space="preserve"> PAGEREF _Toc209888973 \h </w:instrText>
             </w:r>
             <w:r>
               <w:rPr>
@@ -1576,7 +1504,7 @@
                 <w:noProof/>
                 <w:webHidden/>
               </w:rPr>
-              <w:t>6</w:t>
+              <w:t>8</w:t>
             </w:r>
             <w:r>
               <w:rPr>
@@ -1601,7 +1529,7 @@
               <w:lang w:eastAsia="en-AU"/>
             </w:rPr>
           </w:pPr>
-          <w:hyperlink w:anchor="_Toc209806803" w:history="1">
+          <w:hyperlink w:anchor="_Toc209888974" w:history="1">
             <w:r>
               <w:rPr>
                 <w:rStyle w:val="Hyperlink"/>
@@ -1628,7 +1556,7 @@
                 <w:noProof/>
                 <w:webHidden/>
               </w:rPr>
-              <w:instrText xml:space="preserve"> PAGEREF _Toc209806803 \h </w:instrText>
+              <w:instrText xml:space="preserve"> PAGEREF _Toc209888974 \h </w:instrText>
             </w:r>
             <w:r>
               <w:rPr>
@@ -1648,7 +1576,7 @@
                 <w:noProof/>
                 <w:webHidden/>
               </w:rPr>
-              <w:t>6</w:t>
+              <w:t>8</w:t>
             </w:r>
             <w:r>
               <w:rPr>
@@ -1673,7 +1601,7 @@
               <w:lang w:eastAsia="en-AU"/>
             </w:rPr>
           </w:pPr>
-          <w:hyperlink w:anchor="_Toc209806804" w:history="1">
+          <w:hyperlink w:anchor="_Toc209888975" w:history="1">
             <w:r>
               <w:rPr>
                 <w:rStyle w:val="Hyperlink"/>
@@ -1700,7 +1628,7 @@
                 <w:noProof/>
                 <w:webHidden/>
               </w:rPr>
-              <w:instrText xml:space="preserve"> PAGEREF _Toc209806804 \h </w:instrText>
+              <w:instrText xml:space="preserve"> PAGEREF _Toc209888975 \h </w:instrText>
             </w:r>
             <w:r>
               <w:rPr>
@@ -1720,7 +1648,7 @@
                 <w:noProof/>
                 <w:webHidden/>
               </w:rPr>
-              <w:t>6</w:t>
+              <w:t>9</w:t>
             </w:r>
             <w:r>
               <w:rPr>
@@ -1841,7 +1769,7 @@
       <w:pPr>
         <w:pStyle w:val="Heading1"/>
       </w:pPr>
-      <w:bookmarkStart w:id="0" w:name="_Toc209806782"/>
+      <w:bookmarkStart w:id="0" w:name="_Toc209888954"/>
       <w:r>
         <w:lastRenderedPageBreak/>
         <w:t xml:space="preserve">1. </w:t>
@@ -1861,7 +1789,7 @@
       <w:pPr>
         <w:pStyle w:val="Heading2"/>
       </w:pPr>
-      <w:bookmarkStart w:id="1" w:name="_Toc209806783"/>
+      <w:bookmarkStart w:id="1" w:name="_Toc209888955"/>
       <w:r>
         <w:t>1.1</w:t>
       </w:r>
@@ -1894,7 +1822,7 @@
       <w:pPr>
         <w:pStyle w:val="Heading2"/>
       </w:pPr>
-      <w:bookmarkStart w:id="2" w:name="_Toc209806784"/>
+      <w:bookmarkStart w:id="2" w:name="_Toc209888956"/>
       <w:r>
         <w:t xml:space="preserve">1.2 </w:t>
       </w:r>
@@ -1981,7 +1909,7 @@
       <w:pPr>
         <w:pStyle w:val="Heading1"/>
       </w:pPr>
-      <w:bookmarkStart w:id="3" w:name="_Toc209806785"/>
+      <w:bookmarkStart w:id="3" w:name="_Toc209888957"/>
       <w:r>
         <w:t xml:space="preserve">2. </w:t>
       </w:r>
@@ -1994,7 +1922,7 @@
       <w:pPr>
         <w:pStyle w:val="Heading2"/>
       </w:pPr>
-      <w:bookmarkStart w:id="4" w:name="_Toc209806786"/>
+      <w:bookmarkStart w:id="4" w:name="_Toc209888958"/>
       <w:r>
         <w:t xml:space="preserve">2.1 </w:t>
       </w:r>
@@ -2041,7 +1969,25 @@
           <w:sz w:val="24"/>
           <w:szCs w:val="24"/>
         </w:rPr>
-        <w:t xml:space="preserve"> intense computation going manually through every single index of a string at worst iterating pattern.size </w:t>
+        <w:t xml:space="preserve"> intense computation going manually through every single index of a string at worst iterating </w:t>
+      </w:r>
+      <w:proofErr w:type="spellStart"/>
+      <w:r>
+        <w:rPr>
+          <w:rFonts w:ascii="Times New Roman" w:hAnsi="Times New Roman" w:cs="Times New Roman"/>
+          <w:sz w:val="24"/>
+          <w:szCs w:val="24"/>
+        </w:rPr>
+        <w:t>pattern.size</w:t>
+      </w:r>
+      <w:proofErr w:type="spellEnd"/>
+      <w:r>
+        <w:rPr>
+          <w:rFonts w:ascii="Times New Roman" w:hAnsi="Times New Roman" w:cs="Times New Roman"/>
+          <w:sz w:val="24"/>
+          <w:szCs w:val="24"/>
+        </w:rPr>
+        <w:t xml:space="preserve"> </w:t>
       </w:r>
       <w:r>
         <w:rPr>
@@ -2080,7 +2026,7 @@
       <w:pPr>
         <w:pStyle w:val="Heading3"/>
       </w:pPr>
-      <w:bookmarkStart w:id="5" w:name="_Toc209806787"/>
+      <w:bookmarkStart w:id="5" w:name="_Toc209888959"/>
       <w:r>
         <w:t>2.1.1 Text and Data Processing</w:t>
       </w:r>
@@ -2124,7 +2070,7 @@
       <w:pPr>
         <w:pStyle w:val="Heading3"/>
       </w:pPr>
-      <w:bookmarkStart w:id="6" w:name="_Toc209806788"/>
+      <w:bookmarkStart w:id="6" w:name="_Toc209888960"/>
       <w:r>
         <w:lastRenderedPageBreak/>
         <w:t>2.1.2 Machine Learning &amp; AI</w:t>
@@ -2224,91 +2170,9 @@
           <w:sz w:val="24"/>
           <w:szCs w:val="24"/>
         </w:rPr>
-        <w:t>While image representation and reconstruction has been the most popular goal of sparse modeling and dictionary learning, other important image science applications are starting to be addressed by this framework, in particular, classification and detection.</w:t>
-      </w:r>
-      <w:r>
-        <w:rPr>
-          <w:rFonts w:ascii="Times New Roman" w:hAnsi="Times New Roman" w:cs="Times New Roman"/>
-          <w:sz w:val="24"/>
-          <w:szCs w:val="24"/>
-        </w:rPr>
-        <w:t>"</w:t>
-      </w:r>
-      <w:r>
-        <w:rPr>
-          <w:rFonts w:ascii="Times New Roman" w:hAnsi="Times New Roman" w:cs="Times New Roman"/>
-          <w:sz w:val="24"/>
-          <w:szCs w:val="24"/>
-        </w:rPr>
-        <w:t xml:space="preserve"> </w:t>
-      </w:r>
-      <w:r>
-        <w:rPr>
-          <w:rFonts w:ascii="Times New Roman" w:hAnsi="Times New Roman" w:cs="Times New Roman"/>
-          <w:sz w:val="24"/>
-          <w:szCs w:val="24"/>
-        </w:rPr>
-        <w:t>(</w:t>
-      </w:r>
-      <w:r>
-        <w:rPr>
-          <w:rFonts w:ascii="Times New Roman" w:hAnsi="Times New Roman" w:cs="Times New Roman"/>
-          <w:sz w:val="24"/>
-          <w:szCs w:val="24"/>
-        </w:rPr>
-        <w:t>Wright et al., 2010</w:t>
-      </w:r>
-      <w:r>
-        <w:rPr>
-          <w:rFonts w:ascii="Times New Roman" w:hAnsi="Times New Roman" w:cs="Times New Roman"/>
-          <w:sz w:val="24"/>
-          <w:szCs w:val="24"/>
-        </w:rPr>
-        <w:t>)</w:t>
-      </w:r>
-      <w:r>
-        <w:rPr>
-          <w:rFonts w:ascii="Times New Roman" w:hAnsi="Times New Roman" w:cs="Times New Roman"/>
-          <w:sz w:val="24"/>
-          <w:szCs w:val="24"/>
-        </w:rPr>
-        <w:t>.</w:t>
-      </w:r>
-    </w:p>
-    <w:p>
-      <w:pPr>
-        <w:pStyle w:val="Heading3"/>
-      </w:pPr>
-      <w:bookmarkStart w:id="7" w:name="_Toc209806789"/>
-      <w:r>
-        <w:t>2.1.3 Bioinformation</w:t>
-      </w:r>
-      <w:bookmarkEnd w:id="7"/>
-    </w:p>
-    <w:p>
-      <w:pPr>
-        <w:rPr>
-          <w:rFonts w:ascii="Times New Roman" w:hAnsi="Times New Roman" w:cs="Times New Roman"/>
-          <w:sz w:val="24"/>
-          <w:szCs w:val="24"/>
-        </w:rPr>
-      </w:pPr>
-      <w:r>
-        <w:rPr>
-          <w:rFonts w:ascii="Times New Roman" w:hAnsi="Times New Roman" w:cs="Times New Roman"/>
-          <w:sz w:val="24"/>
-          <w:szCs w:val="24"/>
-        </w:rPr>
-        <w:t xml:space="preserve">Pattern matching is used in bioinformatics to find sequences like DNA, RNA, and proteins. It is vital to detect mutations align sequences and assemble genomes. This can be seen in this quote from </w:t>
-      </w:r>
-      <w:r>
-        <w:rPr>
-          <w:rFonts w:ascii="Times New Roman" w:hAnsi="Times New Roman" w:cs="Times New Roman"/>
-          <w:sz w:val="24"/>
-          <w:szCs w:val="24"/>
-        </w:rPr>
-        <w:t>a published research paper around pattern matching methods for DNA Sequencing in internet of Medical Things, “</w:t>
-      </w:r>
+        <w:t xml:space="preserve">While image representation and reconstruction has been the most popular goal of sparse </w:t>
+      </w:r>
+      <w:proofErr w:type="spellStart"/>
       <w:r>
         <w:rPr>
           <w:rFonts w:ascii="Times New Roman" w:hAnsi="Times New Roman" w:cs="Times New Roman"/>
@@ -2317,8 +2181,9 @@
           <w:sz w:val="24"/>
           <w:szCs w:val="24"/>
         </w:rPr>
-        <w:t>Read alignment is affected by some sequencing technology parameters, including the read length and error rate.</w:t>
-      </w:r>
+        <w:t>modeling</w:t>
+      </w:r>
+      <w:proofErr w:type="spellEnd"/>
       <w:r>
         <w:rPr>
           <w:rFonts w:ascii="Times New Roman" w:hAnsi="Times New Roman" w:cs="Times New Roman"/>
@@ -2327,7 +2192,90 @@
           <w:sz w:val="24"/>
           <w:szCs w:val="24"/>
         </w:rPr>
+        <w:t xml:space="preserve"> and dictionary learning, other important image science applications are starting to be addressed by this framework, in particular, classification and detection.</w:t>
+      </w:r>
+      <w:r>
+        <w:rPr>
+          <w:rFonts w:ascii="Times New Roman" w:hAnsi="Times New Roman" w:cs="Times New Roman"/>
+          <w:sz w:val="24"/>
+          <w:szCs w:val="24"/>
+        </w:rPr>
+        <w:t>"</w:t>
+      </w:r>
+      <w:r>
+        <w:rPr>
+          <w:rFonts w:ascii="Times New Roman" w:hAnsi="Times New Roman" w:cs="Times New Roman"/>
+          <w:sz w:val="24"/>
+          <w:szCs w:val="24"/>
+        </w:rPr>
         <w:t xml:space="preserve"> </w:t>
+      </w:r>
+      <w:r>
+        <w:rPr>
+          <w:rFonts w:ascii="Times New Roman" w:hAnsi="Times New Roman" w:cs="Times New Roman"/>
+          <w:sz w:val="24"/>
+          <w:szCs w:val="24"/>
+        </w:rPr>
+        <w:t>(</w:t>
+      </w:r>
+      <w:r>
+        <w:rPr>
+          <w:rFonts w:ascii="Times New Roman" w:hAnsi="Times New Roman" w:cs="Times New Roman"/>
+          <w:sz w:val="24"/>
+          <w:szCs w:val="24"/>
+        </w:rPr>
+        <w:t>Wright et al., 2010</w:t>
+      </w:r>
+      <w:r>
+        <w:rPr>
+          <w:rFonts w:ascii="Times New Roman" w:hAnsi="Times New Roman" w:cs="Times New Roman"/>
+          <w:sz w:val="24"/>
+          <w:szCs w:val="24"/>
+        </w:rPr>
+        <w:t>)</w:t>
+      </w:r>
+      <w:r>
+        <w:rPr>
+          <w:rFonts w:ascii="Times New Roman" w:hAnsi="Times New Roman" w:cs="Times New Roman"/>
+          <w:sz w:val="24"/>
+          <w:szCs w:val="24"/>
+        </w:rPr>
+        <w:t>.</w:t>
+      </w:r>
+    </w:p>
+    <w:p>
+      <w:pPr>
+        <w:pStyle w:val="Heading3"/>
+      </w:pPr>
+      <w:bookmarkStart w:id="7" w:name="_Toc209888961"/>
+      <w:r>
+        <w:t>2.1.3 Bioinformation</w:t>
+      </w:r>
+      <w:bookmarkEnd w:id="7"/>
+    </w:p>
+    <w:p>
+      <w:pPr>
+        <w:rPr>
+          <w:rFonts w:ascii="Times New Roman" w:hAnsi="Times New Roman" w:cs="Times New Roman"/>
+          <w:sz w:val="24"/>
+          <w:szCs w:val="24"/>
+        </w:rPr>
+      </w:pPr>
+      <w:r>
+        <w:rPr>
+          <w:rFonts w:ascii="Times New Roman" w:hAnsi="Times New Roman" w:cs="Times New Roman"/>
+          <w:sz w:val="24"/>
+          <w:szCs w:val="24"/>
+        </w:rPr>
+        <w:t xml:space="preserve">Pattern matching is used in bioinformatics to find sequences like DNA, RNA, and proteins. It is vital to detect mutations align sequences and assemble genomes. This can be seen in this quote from </w:t>
+      </w:r>
+      <w:r>
+        <w:rPr>
+          <w:rFonts w:ascii="Times New Roman" w:hAnsi="Times New Roman" w:cs="Times New Roman"/>
+          <w:sz w:val="24"/>
+          <w:szCs w:val="24"/>
+        </w:rPr>
+        <w:t>a published research paper around pattern matching methods for DNA Sequencing in internet of Medical Things, “</w:t>
       </w:r>
       <w:r>
         <w:rPr>
@@ -2337,7 +2285,7 @@
           <w:sz w:val="24"/>
           <w:szCs w:val="24"/>
         </w:rPr>
-        <w:t>It is essential to determine the actual location of each read,</w:t>
+        <w:t>Read alignment is affected by some sequencing technology parameters, including the read length and error rate.</w:t>
       </w:r>
       <w:r>
         <w:rPr>
@@ -2357,7 +2305,7 @@
           <w:sz w:val="24"/>
           <w:szCs w:val="24"/>
         </w:rPr>
-        <w:t xml:space="preserve">according to the reference. </w:t>
+        <w:t>It is essential to determine the actual location of each read,</w:t>
       </w:r>
       <w:r>
         <w:rPr>
@@ -2367,7 +2315,7 @@
           <w:sz w:val="24"/>
           <w:szCs w:val="24"/>
         </w:rPr>
-        <w:t>Th</w:t>
+        <w:t xml:space="preserve"> </w:t>
       </w:r>
       <w:r>
         <w:rPr>
@@ -2377,7 +2325,7 @@
           <w:sz w:val="24"/>
           <w:szCs w:val="24"/>
         </w:rPr>
-        <w:t>e exact location cannot be</w:t>
+        <w:t xml:space="preserve">according to the reference. </w:t>
       </w:r>
       <w:r>
         <w:rPr>
@@ -2387,7 +2335,7 @@
           <w:sz w:val="24"/>
           <w:szCs w:val="24"/>
         </w:rPr>
-        <w:t xml:space="preserve"> </w:t>
+        <w:t>Th</w:t>
       </w:r>
       <w:r>
         <w:rPr>
@@ -2397,7 +2345,7 @@
           <w:sz w:val="24"/>
           <w:szCs w:val="24"/>
         </w:rPr>
-        <w:t xml:space="preserve">determined in advance, so the matching has to be </w:t>
+        <w:t>e exact location cannot be</w:t>
       </w:r>
       <w:r>
         <w:rPr>
@@ -2407,6 +2355,26 @@
           <w:sz w:val="24"/>
           <w:szCs w:val="24"/>
         </w:rPr>
+        <w:t xml:space="preserve"> </w:t>
+      </w:r>
+      <w:r>
+        <w:rPr>
+          <w:rFonts w:ascii="Times New Roman" w:hAnsi="Times New Roman" w:cs="Times New Roman"/>
+          <w:i/>
+          <w:iCs/>
+          <w:sz w:val="24"/>
+          <w:szCs w:val="24"/>
+        </w:rPr>
+        <w:t xml:space="preserve">determined in advance, so the matching has to be </w:t>
+      </w:r>
+      <w:r>
+        <w:rPr>
+          <w:rFonts w:ascii="Times New Roman" w:hAnsi="Times New Roman" w:cs="Times New Roman"/>
+          <w:i/>
+          <w:iCs/>
+          <w:sz w:val="24"/>
+          <w:szCs w:val="24"/>
+        </w:rPr>
         <w:t>done approximately</w:t>
       </w:r>
       <w:r>
@@ -2420,9 +2388,9 @@
     </w:p>
     <w:p>
       <w:pPr>
-        <w:pStyle w:val="Heading3"/>
-      </w:pPr>
-      <w:bookmarkStart w:id="8" w:name="_Toc209806791"/>
+        <w:pStyle w:val="Heading2"/>
+      </w:pPr>
+      <w:bookmarkStart w:id="8" w:name="_Toc209888962"/>
       <w:r>
         <w:t xml:space="preserve">2.2 </w:t>
       </w:r>
@@ -2432,12 +2400,36 @@
       <w:bookmarkEnd w:id="8"/>
     </w:p>
     <w:p>
-      <w:r>
+      <w:pPr>
+        <w:rPr>
+          <w:rFonts w:ascii="Times New Roman" w:hAnsi="Times New Roman" w:cs="Times New Roman"/>
+          <w:sz w:val="24"/>
+          <w:szCs w:val="24"/>
+        </w:rPr>
+      </w:pPr>
+      <w:r>
+        <w:rPr>
+          <w:rFonts w:ascii="Times New Roman" w:hAnsi="Times New Roman" w:cs="Times New Roman"/>
+          <w:sz w:val="24"/>
+          <w:szCs w:val="24"/>
+        </w:rPr>
         <w:t>The benefits of KMP are directly due to the pi table the algorithm creates. This is understood to be a space complexity loss, however, due to the performance of the algorithm compared to naïve approaches, it is a more optimal solution.</w:t>
       </w:r>
     </w:p>
     <w:p>
-      <w:r>
+      <w:pPr>
+        <w:rPr>
+          <w:rFonts w:ascii="Times New Roman" w:hAnsi="Times New Roman" w:cs="Times New Roman"/>
+          <w:sz w:val="24"/>
+          <w:szCs w:val="24"/>
+        </w:rPr>
+      </w:pPr>
+      <w:r>
+        <w:rPr>
+          <w:rFonts w:ascii="Times New Roman" w:hAnsi="Times New Roman" w:cs="Times New Roman"/>
+          <w:sz w:val="24"/>
+          <w:szCs w:val="24"/>
+        </w:rPr>
         <w:t xml:space="preserve">When we look at large data structures, KMP shines as it can at runtime compute overlapping patterns which is crucial in large strings. All of the above use cases mentioned deal with strings with well over one million characters, to find a pattern within these strings would almost not be possible using the naïve method due to how long it would take. KMP makes all that possible. </w:t>
       </w:r>
     </w:p>
@@ -2445,7 +2437,7 @@
       <w:pPr>
         <w:pStyle w:val="Heading1"/>
       </w:pPr>
-      <w:bookmarkStart w:id="9" w:name="_Toc209806792"/>
+      <w:bookmarkStart w:id="9" w:name="_Toc209888963"/>
       <w:r>
         <w:t xml:space="preserve">3. </w:t>
       </w:r>
@@ -2455,12 +2447,54 @@
       <w:bookmarkEnd w:id="9"/>
     </w:p>
     <w:p>
-      <w:r>
-        <w:t>The time complexity for a naïve approach is O(mn). This is due to the fact that at worst case, we need to test every single character within the patter against every single character within the string.</w:t>
-      </w:r>
-    </w:p>
-    <w:p>
-      <w:r>
+      <w:pPr>
+        <w:rPr>
+          <w:rFonts w:ascii="Times New Roman" w:hAnsi="Times New Roman" w:cs="Times New Roman"/>
+          <w:sz w:val="24"/>
+          <w:szCs w:val="24"/>
+        </w:rPr>
+      </w:pPr>
+      <w:r>
+        <w:rPr>
+          <w:rFonts w:ascii="Times New Roman" w:hAnsi="Times New Roman" w:cs="Times New Roman"/>
+          <w:sz w:val="24"/>
+          <w:szCs w:val="24"/>
+        </w:rPr>
+        <w:t>The time complexity for a naïve approach is O(</w:t>
+      </w:r>
+      <w:proofErr w:type="spellStart"/>
+      <w:r>
+        <w:rPr>
+          <w:rFonts w:ascii="Times New Roman" w:hAnsi="Times New Roman" w:cs="Times New Roman"/>
+          <w:sz w:val="24"/>
+          <w:szCs w:val="24"/>
+        </w:rPr>
+        <w:t>mn</w:t>
+      </w:r>
+      <w:proofErr w:type="spellEnd"/>
+      <w:r>
+        <w:rPr>
+          <w:rFonts w:ascii="Times New Roman" w:hAnsi="Times New Roman" w:cs="Times New Roman"/>
+          <w:sz w:val="24"/>
+          <w:szCs w:val="24"/>
+        </w:rPr>
+        <w:t>). This is due to the fact that at worst case, we need to test every single character within the patter against every single character within the string.</w:t>
+      </w:r>
+    </w:p>
+    <w:p>
+      <w:pPr>
+        <w:rPr>
+          <w:rFonts w:ascii="Times New Roman" w:hAnsi="Times New Roman" w:cs="Times New Roman"/>
+          <w:sz w:val="24"/>
+          <w:szCs w:val="24"/>
+        </w:rPr>
+      </w:pPr>
+      <w:r>
+        <w:rPr>
+          <w:rFonts w:ascii="Times New Roman" w:hAnsi="Times New Roman" w:cs="Times New Roman"/>
+          <w:sz w:val="24"/>
+          <w:szCs w:val="24"/>
+        </w:rPr>
         <w:t>Due to the optimisation of the KMP algorithm, we only need to need to iterate through the pattern once and iterate through the string once. Therefore, this solution completes at a time complexity of O(m+n).</w:t>
       </w:r>
     </w:p>
@@ -2468,46 +2502,109 @@
       <w:pPr>
         <w:pStyle w:val="Heading2"/>
       </w:pPr>
-      <w:bookmarkStart w:id="10" w:name="_Toc209806793"/>
+      <w:bookmarkStart w:id="10" w:name="_Toc209888964"/>
       <w:r>
         <w:t>3.1 Processing Steps</w:t>
       </w:r>
       <w:bookmarkEnd w:id="10"/>
     </w:p>
     <w:p>
-      <w:r>
+      <w:pPr>
+        <w:rPr>
+          <w:rFonts w:ascii="Times New Roman" w:hAnsi="Times New Roman" w:cs="Times New Roman"/>
+          <w:sz w:val="24"/>
+          <w:szCs w:val="24"/>
+        </w:rPr>
+      </w:pPr>
+      <w:r>
+        <w:rPr>
+          <w:rFonts w:ascii="Times New Roman" w:hAnsi="Times New Roman" w:cs="Times New Roman"/>
+          <w:sz w:val="24"/>
+          <w:szCs w:val="24"/>
+        </w:rPr>
         <w:t xml:space="preserve">To use KMP, we must have a Pi table to refer to, this is the soul of the algorithm. Therefore, we must begin with some preprocessing before we implement KMPs solution. </w:t>
       </w:r>
     </w:p>
     <w:p>
-      <w:r>
-        <w:t xml:space="preserve">In this step, we iterate through the pattern we are looking for and try find sub patterns/prefixes. This is what we use to fall back on when we step backwards. We search the current index </w:t>
-      </w:r>
-      <w:r>
+      <w:pPr>
+        <w:rPr>
+          <w:rFonts w:ascii="Times New Roman" w:hAnsi="Times New Roman" w:cs="Times New Roman"/>
+          <w:sz w:val="24"/>
+          <w:szCs w:val="24"/>
+        </w:rPr>
+      </w:pPr>
+      <w:r>
+        <w:rPr>
+          <w:rFonts w:ascii="Times New Roman" w:hAnsi="Times New Roman" w:cs="Times New Roman"/>
+          <w:sz w:val="24"/>
+          <w:szCs w:val="24"/>
+        </w:rPr>
         <w:lastRenderedPageBreak/>
-        <w:t xml:space="preserve">matches the longest pattern we have previously found, if so, we </w:t>
-      </w:r>
-      <w:r>
+        <w:t xml:space="preserve">In this step, we iterate through the pattern we are looking for and try find sub patterns/prefixes. This is what we use to fall back on when we step backwards. We search the current index matches the longest pattern we have previously found, if so, we </w:t>
+      </w:r>
+      <w:r>
+        <w:rPr>
+          <w:rFonts w:ascii="Times New Roman" w:hAnsi="Times New Roman" w:cs="Times New Roman"/>
+          <w:sz w:val="24"/>
+          <w:szCs w:val="24"/>
+        </w:rPr>
         <w:t>increment</w:t>
       </w:r>
       <w:r>
+        <w:rPr>
+          <w:rFonts w:ascii="Times New Roman" w:hAnsi="Times New Roman" w:cs="Times New Roman"/>
+          <w:sz w:val="24"/>
+          <w:szCs w:val="24"/>
+        </w:rPr>
         <w:t xml:space="preserve"> the longest found sub pattern, otherwise we </w:t>
       </w:r>
       <w:r>
+        <w:rPr>
+          <w:rFonts w:ascii="Times New Roman" w:hAnsi="Times New Roman" w:cs="Times New Roman"/>
+          <w:sz w:val="24"/>
+          <w:szCs w:val="24"/>
+        </w:rPr>
         <w:t>decrement</w:t>
       </w:r>
       <w:r>
+        <w:rPr>
+          <w:rFonts w:ascii="Times New Roman" w:hAnsi="Times New Roman" w:cs="Times New Roman"/>
+          <w:sz w:val="24"/>
+          <w:szCs w:val="24"/>
+        </w:rPr>
         <w:t xml:space="preserve"> the longest </w:t>
       </w:r>
       <w:r>
+        <w:rPr>
+          <w:rFonts w:ascii="Times New Roman" w:hAnsi="Times New Roman" w:cs="Times New Roman"/>
+          <w:sz w:val="24"/>
+          <w:szCs w:val="24"/>
+        </w:rPr>
         <w:t>found sub pattern</w:t>
       </w:r>
       <w:r>
+        <w:rPr>
+          <w:rFonts w:ascii="Times New Roman" w:hAnsi="Times New Roman" w:cs="Times New Roman"/>
+          <w:sz w:val="24"/>
+          <w:szCs w:val="24"/>
+        </w:rPr>
         <w:t xml:space="preserve">. </w:t>
       </w:r>
     </w:p>
     <w:p>
-      <w:r>
+      <w:pPr>
+        <w:rPr>
+          <w:rFonts w:ascii="Times New Roman" w:hAnsi="Times New Roman" w:cs="Times New Roman"/>
+          <w:sz w:val="24"/>
+          <w:szCs w:val="24"/>
+        </w:rPr>
+      </w:pPr>
+      <w:r>
+        <w:rPr>
+          <w:rFonts w:ascii="Times New Roman" w:hAnsi="Times New Roman" w:cs="Times New Roman"/>
+          <w:sz w:val="24"/>
+          <w:szCs w:val="24"/>
+        </w:rPr>
         <w:t>As this interaction only looks through the pattern once, the time complexity of this step is O(m).</w:t>
       </w:r>
     </w:p>
@@ -2515,19 +2612,43 @@
       <w:pPr>
         <w:pStyle w:val="Heading2"/>
       </w:pPr>
-      <w:bookmarkStart w:id="11" w:name="_Toc209806794"/>
+      <w:bookmarkStart w:id="11" w:name="_Toc209888965"/>
       <w:r>
         <w:t>3.2 Search Phase</w:t>
       </w:r>
       <w:bookmarkEnd w:id="11"/>
     </w:p>
     <w:p>
-      <w:r>
+      <w:pPr>
+        <w:rPr>
+          <w:rFonts w:ascii="Times New Roman" w:hAnsi="Times New Roman" w:cs="Times New Roman"/>
+          <w:sz w:val="24"/>
+          <w:szCs w:val="24"/>
+        </w:rPr>
+      </w:pPr>
+      <w:r>
+        <w:rPr>
+          <w:rFonts w:ascii="Times New Roman" w:hAnsi="Times New Roman" w:cs="Times New Roman"/>
+          <w:sz w:val="24"/>
+          <w:szCs w:val="24"/>
+        </w:rPr>
         <w:t>In this stage, we have already created the pi table which we can refer to and now we begin searching the string using the pi table as reference. As one of the benefits of KMP is that it can look at overlapping patterns, this indicates that KMP does NOT need to look backwards after a mismatch is found. Therefore, we only need to test each character within the string once against the pi table.</w:t>
       </w:r>
     </w:p>
     <w:p>
-      <w:r>
+      <w:pPr>
+        <w:rPr>
+          <w:rFonts w:ascii="Times New Roman" w:hAnsi="Times New Roman" w:cs="Times New Roman"/>
+          <w:sz w:val="24"/>
+          <w:szCs w:val="24"/>
+        </w:rPr>
+      </w:pPr>
+      <w:r>
+        <w:rPr>
+          <w:rFonts w:ascii="Times New Roman" w:hAnsi="Times New Roman" w:cs="Times New Roman"/>
+          <w:sz w:val="24"/>
+          <w:szCs w:val="24"/>
+        </w:rPr>
         <w:t>Due to the fact we iterate through the string at most only once, the time complexity for the search step is O(N)</w:t>
       </w:r>
     </w:p>
@@ -2535,7 +2656,7 @@
       <w:pPr>
         <w:pStyle w:val="Heading1"/>
       </w:pPr>
-      <w:bookmarkStart w:id="12" w:name="_Toc209806795"/>
+      <w:bookmarkStart w:id="12" w:name="_Toc209888966"/>
       <w:r>
         <w:t xml:space="preserve">4. </w:t>
       </w:r>
@@ -2548,132 +2669,780 @@
       <w:pPr>
         <w:pStyle w:val="Heading2"/>
       </w:pPr>
-      <w:bookmarkStart w:id="13" w:name="_Toc209806796"/>
+      <w:bookmarkStart w:id="13" w:name="_Toc209888967"/>
       <w:r>
         <w:t>4.1 Code Breakdown</w:t>
       </w:r>
       <w:bookmarkEnd w:id="13"/>
     </w:p>
     <w:p>
-      <w:r>
+      <w:pPr>
+        <w:rPr>
+          <w:rFonts w:ascii="Times New Roman" w:hAnsi="Times New Roman" w:cs="Times New Roman"/>
+          <w:sz w:val="24"/>
+          <w:szCs w:val="24"/>
+        </w:rPr>
+      </w:pPr>
+      <w:r>
+        <w:rPr>
+          <w:rFonts w:ascii="Times New Roman" w:hAnsi="Times New Roman" w:cs="Times New Roman"/>
+          <w:sz w:val="24"/>
+          <w:szCs w:val="24"/>
+        </w:rPr>
         <w:t xml:space="preserve">For my implementation, I have </w:t>
       </w:r>
       <w:r>
+        <w:rPr>
+          <w:rFonts w:ascii="Times New Roman" w:hAnsi="Times New Roman" w:cs="Times New Roman"/>
+          <w:sz w:val="24"/>
+          <w:szCs w:val="24"/>
+        </w:rPr>
         <w:t>created</w:t>
       </w:r>
       <w:r>
-        <w:t xml:space="preserve"> a vector to hold the pi table, this vector is built by iterating through the pattern pattern.size times, and while j, the length of the longest sub prefix found so far, is larger than 0, we test if the pattern at the index does not match the pattern at the longest sub prefix. If it does not match the previous longest prefix  we know, we jump back to the previous sub longest prefix we previously found. </w:t>
-      </w:r>
-      <w:r>
+        <w:rPr>
+          <w:rFonts w:ascii="Times New Roman" w:hAnsi="Times New Roman" w:cs="Times New Roman"/>
+          <w:sz w:val="24"/>
+          <w:szCs w:val="24"/>
+        </w:rPr>
+        <w:t xml:space="preserve"> a vector to hold the pi table, this vector is built by iterating through the pattern </w:t>
+      </w:r>
+      <w:r>
+        <w:rPr>
+          <w:rFonts w:ascii="Times New Roman" w:hAnsi="Times New Roman" w:cs="Times New Roman"/>
+          <w:sz w:val="24"/>
+          <w:szCs w:val="24"/>
+        </w:rPr>
+        <w:t xml:space="preserve">from index 1 up to </w:t>
+      </w:r>
+      <w:proofErr w:type="spellStart"/>
+      <w:r>
+        <w:rPr>
+          <w:rFonts w:ascii="Times New Roman" w:hAnsi="Times New Roman" w:cs="Times New Roman"/>
+          <w:sz w:val="24"/>
+          <w:szCs w:val="24"/>
+        </w:rPr>
+        <w:t>pattern.size</w:t>
+      </w:r>
+      <w:proofErr w:type="spellEnd"/>
+      <w:r>
+        <w:rPr>
+          <w:rFonts w:ascii="Times New Roman" w:hAnsi="Times New Roman" w:cs="Times New Roman"/>
+          <w:sz w:val="24"/>
+          <w:szCs w:val="24"/>
+        </w:rPr>
+        <w:t xml:space="preserve"> - 1</w:t>
+      </w:r>
+      <w:r>
+        <w:rPr>
+          <w:rFonts w:ascii="Times New Roman" w:hAnsi="Times New Roman" w:cs="Times New Roman"/>
+          <w:sz w:val="24"/>
+          <w:szCs w:val="24"/>
+        </w:rPr>
+        <w:t xml:space="preserve"> times</w:t>
+      </w:r>
+      <w:r>
+        <w:rPr>
+          <w:rFonts w:ascii="Times New Roman" w:hAnsi="Times New Roman" w:cs="Times New Roman"/>
+          <w:sz w:val="24"/>
+          <w:szCs w:val="24"/>
+        </w:rPr>
+        <w:t>.</w:t>
+      </w:r>
+      <w:r>
+        <w:rPr>
+          <w:rFonts w:ascii="Times New Roman" w:hAnsi="Times New Roman" w:cs="Times New Roman"/>
+          <w:sz w:val="24"/>
+          <w:szCs w:val="24"/>
+        </w:rPr>
+        <w:t xml:space="preserve"> and while j, the length of the longest sub prefix found so far, is larger than 0, we test if the pattern at the index does not match the pattern at the longest sub prefix. If it does not match the previous longest prefix we know, we </w:t>
+      </w:r>
+      <w:r>
+        <w:rPr>
+          <w:rFonts w:ascii="Times New Roman" w:hAnsi="Times New Roman" w:cs="Times New Roman"/>
+          <w:sz w:val="24"/>
+          <w:szCs w:val="24"/>
+        </w:rPr>
+        <w:t>fall</w:t>
+      </w:r>
+      <w:r>
+        <w:rPr>
+          <w:rFonts w:ascii="Times New Roman" w:hAnsi="Times New Roman" w:cs="Times New Roman"/>
+          <w:sz w:val="24"/>
+          <w:szCs w:val="24"/>
+        </w:rPr>
+        <w:t xml:space="preserve"> back to the previous sub longest prefix we previously found</w:t>
+      </w:r>
+      <w:r>
+        <w:rPr>
+          <w:rFonts w:ascii="Times New Roman" w:hAnsi="Times New Roman" w:cs="Times New Roman"/>
+          <w:sz w:val="24"/>
+          <w:szCs w:val="24"/>
+        </w:rPr>
+        <w:t>, this fall back can happen multiple times if we still do not find a match</w:t>
+      </w:r>
+      <w:r>
+        <w:rPr>
+          <w:rFonts w:ascii="Times New Roman" w:hAnsi="Times New Roman" w:cs="Times New Roman"/>
+          <w:sz w:val="24"/>
+          <w:szCs w:val="24"/>
+        </w:rPr>
+        <w:t xml:space="preserve">. </w:t>
+      </w:r>
+      <w:r>
+        <w:rPr>
+          <w:rFonts w:ascii="Times New Roman" w:hAnsi="Times New Roman" w:cs="Times New Roman"/>
+          <w:sz w:val="24"/>
+          <w:szCs w:val="24"/>
+        </w:rPr>
         <w:t>E</w:t>
       </w:r>
       <w:r>
-        <w:t>nsuring we are only jumping back the last longest sub prefix instead of reiterating through the entire pattern. If the indexes do match, we then increment j and save the current longest prefix in pi to recall later when we find a mismatch. Lastly, we return the pi table.</w:t>
-      </w:r>
-      <w:r>
+        <w:rPr>
+          <w:rFonts w:ascii="Times New Roman" w:hAnsi="Times New Roman" w:cs="Times New Roman"/>
+          <w:sz w:val="24"/>
+          <w:szCs w:val="24"/>
+        </w:rPr>
+        <w:t xml:space="preserve">nsuring we are only </w:t>
+      </w:r>
+      <w:r>
+        <w:rPr>
+          <w:rFonts w:ascii="Times New Roman" w:hAnsi="Times New Roman" w:cs="Times New Roman"/>
+          <w:sz w:val="24"/>
+          <w:szCs w:val="24"/>
+        </w:rPr>
+        <w:t>falling</w:t>
+      </w:r>
+      <w:r>
+        <w:rPr>
+          <w:rFonts w:ascii="Times New Roman" w:hAnsi="Times New Roman" w:cs="Times New Roman"/>
+          <w:sz w:val="24"/>
+          <w:szCs w:val="24"/>
+        </w:rPr>
+        <w:t xml:space="preserve"> back the last longest sub </w:t>
+      </w:r>
+      <w:r>
+        <w:rPr>
+          <w:rFonts w:ascii="Times New Roman" w:hAnsi="Times New Roman" w:cs="Times New Roman"/>
+          <w:sz w:val="24"/>
+          <w:szCs w:val="24"/>
+        </w:rPr>
+        <w:t>pattern</w:t>
+      </w:r>
+      <w:r>
+        <w:rPr>
+          <w:rFonts w:ascii="Times New Roman" w:hAnsi="Times New Roman" w:cs="Times New Roman"/>
+          <w:sz w:val="24"/>
+          <w:szCs w:val="24"/>
+        </w:rPr>
+        <w:t xml:space="preserve"> instead of reiterating through the entire pattern</w:t>
+      </w:r>
+      <w:r>
+        <w:rPr>
+          <w:rFonts w:ascii="Times New Roman" w:hAnsi="Times New Roman" w:cs="Times New Roman"/>
+          <w:sz w:val="24"/>
+          <w:szCs w:val="24"/>
+        </w:rPr>
+        <w:t xml:space="preserve"> if another sub pattern is found, otherwise we return to 0</w:t>
+      </w:r>
+      <w:r>
+        <w:rPr>
+          <w:rFonts w:ascii="Times New Roman" w:hAnsi="Times New Roman" w:cs="Times New Roman"/>
+          <w:sz w:val="24"/>
+          <w:szCs w:val="24"/>
+        </w:rPr>
+        <w:t>. If the indexes do match, we then increment j and save the current longest prefix in pi to recall later when we find a mismatch. Lastly, we return the pi table.</w:t>
+      </w:r>
+      <w:r>
+        <w:rPr>
+          <w:rFonts w:ascii="Times New Roman" w:hAnsi="Times New Roman" w:cs="Times New Roman"/>
+          <w:sz w:val="24"/>
+          <w:szCs w:val="24"/>
+        </w:rPr>
         <w:t xml:space="preserve"> </w:t>
       </w:r>
     </w:p>
     <w:p>
-      <w:r>
+      <w:pPr>
+        <w:rPr>
+          <w:rFonts w:ascii="Times New Roman" w:hAnsi="Times New Roman" w:cs="Times New Roman"/>
+          <w:sz w:val="24"/>
+          <w:szCs w:val="24"/>
+        </w:rPr>
+      </w:pPr>
+      <w:r>
+        <w:rPr>
+          <w:rFonts w:ascii="Times New Roman" w:hAnsi="Times New Roman" w:cs="Times New Roman"/>
+          <w:sz w:val="24"/>
+          <w:szCs w:val="24"/>
+        </w:rPr>
         <w:t xml:space="preserve">Once the pi table is complete, it will return a set of numbers which recognise the longest sub pattern at this index within the pattern as a reference for the KMP algorithm. Now we can begin searching the string. </w:t>
       </w:r>
     </w:p>
     <w:p>
-      <w:r>
-        <w:t xml:space="preserve">We now create another vector called patterns found to hold the index of the first character of the pattern found within the index. This is because, the return of this algorithm is looking for not just the total of times the pattern was found within the string, but which index there were found on. This does take a high space complexity compared to and int which jus returns the number of times the pattern was found, but it is required to build on this algorithm. We then test if the pattern is empty. If it is empty and it is an empty case, we return the patterns found vector which will return empty and the execution is complete. </w:t>
-      </w:r>
+      <w:pPr>
+        <w:rPr>
+          <w:rFonts w:ascii="Times New Roman" w:hAnsi="Times New Roman" w:cs="Times New Roman"/>
+          <w:sz w:val="24"/>
+          <w:szCs w:val="24"/>
+        </w:rPr>
+      </w:pPr>
+      <w:r>
+        <w:rPr>
+          <w:rFonts w:ascii="Times New Roman" w:hAnsi="Times New Roman" w:cs="Times New Roman"/>
+          <w:sz w:val="24"/>
+          <w:szCs w:val="24"/>
+        </w:rPr>
+        <w:t xml:space="preserve">We now create another vector called patterns found to hold the index of the first character of the pattern found within the </w:t>
+      </w:r>
+      <w:r>
+        <w:rPr>
+          <w:rFonts w:ascii="Times New Roman" w:hAnsi="Times New Roman" w:cs="Times New Roman"/>
+          <w:sz w:val="24"/>
+          <w:szCs w:val="24"/>
+        </w:rPr>
+        <w:t>string</w:t>
+      </w:r>
+      <w:r>
+        <w:rPr>
+          <w:rFonts w:ascii="Times New Roman" w:hAnsi="Times New Roman" w:cs="Times New Roman"/>
+          <w:sz w:val="24"/>
+          <w:szCs w:val="24"/>
+        </w:rPr>
+        <w:t xml:space="preserve">. This is because, the return of this algorithm is looking for not just the total of times the pattern was found within the string, but which index </w:t>
+      </w:r>
+      <w:r>
+        <w:rPr>
+          <w:rFonts w:ascii="Times New Roman" w:hAnsi="Times New Roman" w:cs="Times New Roman"/>
+          <w:sz w:val="24"/>
+          <w:szCs w:val="24"/>
+        </w:rPr>
+        <w:t>they</w:t>
+      </w:r>
+      <w:r>
+        <w:rPr>
+          <w:rFonts w:ascii="Times New Roman" w:hAnsi="Times New Roman" w:cs="Times New Roman"/>
+          <w:sz w:val="24"/>
+          <w:szCs w:val="24"/>
+        </w:rPr>
+        <w:t xml:space="preserve"> were found on. This does take a high</w:t>
+      </w:r>
+      <w:r>
+        <w:rPr>
+          <w:rFonts w:ascii="Times New Roman" w:hAnsi="Times New Roman" w:cs="Times New Roman"/>
+          <w:sz w:val="24"/>
+          <w:szCs w:val="24"/>
+        </w:rPr>
+        <w:t>er</w:t>
+      </w:r>
+      <w:r>
+        <w:rPr>
+          <w:rFonts w:ascii="Times New Roman" w:hAnsi="Times New Roman" w:cs="Times New Roman"/>
+          <w:sz w:val="24"/>
+          <w:szCs w:val="24"/>
+        </w:rPr>
+        <w:t xml:space="preserve"> space complexity compared to an int which jus</w:t>
+      </w:r>
+      <w:r>
+        <w:rPr>
+          <w:rFonts w:ascii="Times New Roman" w:hAnsi="Times New Roman" w:cs="Times New Roman"/>
+          <w:sz w:val="24"/>
+          <w:szCs w:val="24"/>
+        </w:rPr>
+        <w:t>t</w:t>
+      </w:r>
+      <w:r>
+        <w:rPr>
+          <w:rFonts w:ascii="Times New Roman" w:hAnsi="Times New Roman" w:cs="Times New Roman"/>
+          <w:sz w:val="24"/>
+          <w:szCs w:val="24"/>
+        </w:rPr>
+        <w:t xml:space="preserve"> returns the number of times the pattern was found, but it is required to build on this algorithm. We then test if the pattern is empty. If it is empty, we return </w:t>
+      </w:r>
+      <w:r>
+        <w:rPr>
+          <w:rFonts w:ascii="Times New Roman" w:hAnsi="Times New Roman" w:cs="Times New Roman"/>
+          <w:sz w:val="24"/>
+          <w:szCs w:val="24"/>
+        </w:rPr>
+        <w:t xml:space="preserve">an empty string </w:t>
+      </w:r>
+      <w:r>
+        <w:rPr>
+          <w:rFonts w:ascii="Times New Roman" w:hAnsi="Times New Roman" w:cs="Times New Roman"/>
+          <w:sz w:val="24"/>
+          <w:szCs w:val="24"/>
+        </w:rPr>
+        <w:t>vector</w:t>
+      </w:r>
+      <w:r>
+        <w:rPr>
+          <w:rFonts w:ascii="Times New Roman" w:hAnsi="Times New Roman" w:cs="Times New Roman"/>
+          <w:sz w:val="24"/>
+          <w:szCs w:val="24"/>
+        </w:rPr>
+        <w:t>,</w:t>
+      </w:r>
+      <w:r>
+        <w:rPr>
+          <w:rFonts w:ascii="Times New Roman" w:hAnsi="Times New Roman" w:cs="Times New Roman"/>
+          <w:sz w:val="24"/>
+          <w:szCs w:val="24"/>
+        </w:rPr>
+        <w:t xml:space="preserve"> and the execution is complete. </w:t>
+      </w:r>
+    </w:p>
+    <w:p>
+      <w:pPr>
+        <w:rPr>
+          <w:rFonts w:ascii="Times New Roman" w:hAnsi="Times New Roman" w:cs="Times New Roman"/>
+          <w:sz w:val="24"/>
+          <w:szCs w:val="24"/>
+        </w:rPr>
+      </w:pPr>
+      <w:r>
+        <w:rPr>
+          <w:rFonts w:ascii="Times New Roman" w:hAnsi="Times New Roman" w:cs="Times New Roman"/>
+          <w:sz w:val="24"/>
+          <w:szCs w:val="24"/>
+        </w:rPr>
+        <w:lastRenderedPageBreak/>
+        <w:t xml:space="preserve">If the pattern is not empty, we can then begin the for loop which initializes i to 0 and ensures that i is smaller than the strings size. Then we test, while the current length of the matched prefix, j, is bigger than 0 AND the text at index i </w:t>
+      </w:r>
+      <w:r>
+        <w:rPr>
+          <w:rFonts w:ascii="Times New Roman" w:hAnsi="Times New Roman" w:cs="Times New Roman"/>
+          <w:sz w:val="24"/>
+          <w:szCs w:val="24"/>
+        </w:rPr>
+        <w:t xml:space="preserve">does </w:t>
+      </w:r>
+      <w:r>
+        <w:rPr>
+          <w:rFonts w:ascii="Times New Roman" w:hAnsi="Times New Roman" w:cs="Times New Roman"/>
+          <w:sz w:val="24"/>
+          <w:szCs w:val="24"/>
+        </w:rPr>
+        <w:t xml:space="preserve">not </w:t>
+      </w:r>
+      <w:r>
+        <w:rPr>
+          <w:rFonts w:ascii="Times New Roman" w:hAnsi="Times New Roman" w:cs="Times New Roman"/>
+          <w:sz w:val="24"/>
+          <w:szCs w:val="24"/>
+        </w:rPr>
+        <w:t xml:space="preserve">match </w:t>
+      </w:r>
+      <w:r>
+        <w:rPr>
+          <w:rFonts w:ascii="Times New Roman" w:hAnsi="Times New Roman" w:cs="Times New Roman"/>
+          <w:sz w:val="24"/>
+          <w:szCs w:val="24"/>
+        </w:rPr>
+        <w:t>the pattern at index</w:t>
+      </w:r>
+      <w:r>
+        <w:rPr>
+          <w:rFonts w:ascii="Times New Roman" w:hAnsi="Times New Roman" w:cs="Times New Roman"/>
+          <w:sz w:val="24"/>
+          <w:szCs w:val="24"/>
+        </w:rPr>
+        <w:t xml:space="preserve"> j then, </w:t>
+      </w:r>
+      <w:r>
+        <w:rPr>
+          <w:rFonts w:ascii="Times New Roman" w:hAnsi="Times New Roman" w:cs="Times New Roman"/>
+          <w:sz w:val="24"/>
+          <w:szCs w:val="24"/>
+        </w:rPr>
+        <w:t>we assign j to the previous index within the pi table</w:t>
+      </w:r>
+      <w:r>
+        <w:rPr>
+          <w:rFonts w:ascii="Times New Roman" w:hAnsi="Times New Roman" w:cs="Times New Roman"/>
+          <w:sz w:val="24"/>
+          <w:szCs w:val="24"/>
+        </w:rPr>
+        <w:t xml:space="preserve">. This can happen multiple times until a match is found. The </w:t>
+      </w:r>
+      <w:r>
+        <w:rPr>
+          <w:rFonts w:ascii="Times New Roman" w:hAnsi="Times New Roman" w:cs="Times New Roman"/>
+          <w:sz w:val="24"/>
+          <w:szCs w:val="24"/>
+        </w:rPr>
+        <w:t>fall back or push back feature is designed to ensure that the KMP algorithm can search for pattern overlaps.</w:t>
+      </w:r>
+      <w:r>
+        <w:rPr>
+          <w:rFonts w:ascii="Times New Roman" w:hAnsi="Times New Roman" w:cs="Times New Roman"/>
+          <w:sz w:val="24"/>
+          <w:szCs w:val="24"/>
+        </w:rPr>
+        <w:t xml:space="preserve"> </w:t>
+      </w:r>
+      <w:r>
+        <w:rPr>
+          <w:rFonts w:ascii="Times New Roman" w:hAnsi="Times New Roman" w:cs="Times New Roman"/>
+          <w:sz w:val="24"/>
+          <w:szCs w:val="24"/>
+        </w:rPr>
+        <w:t>In this while condition</w:t>
+      </w:r>
+      <w:r>
+        <w:rPr>
+          <w:rFonts w:ascii="Times New Roman" w:hAnsi="Times New Roman" w:cs="Times New Roman"/>
+          <w:sz w:val="24"/>
+          <w:szCs w:val="24"/>
+        </w:rPr>
+        <w:t xml:space="preserve">, we test that j is larger than 0. This is because, if j is = 0, it cannot push back any further and we then have to test the pattern from the beginning instead of looking for the last longest sub pattern from the pi table. </w:t>
+      </w:r>
+    </w:p>
+    <w:p>
+      <w:pPr>
+        <w:rPr>
+          <w:rFonts w:ascii="Times New Roman" w:hAnsi="Times New Roman" w:cs="Times New Roman"/>
+          <w:sz w:val="24"/>
+          <w:szCs w:val="24"/>
+        </w:rPr>
+      </w:pPr>
+      <w:r>
+        <w:rPr>
+          <w:rFonts w:ascii="Times New Roman" w:hAnsi="Times New Roman" w:cs="Times New Roman"/>
+          <w:sz w:val="24"/>
+          <w:szCs w:val="24"/>
+        </w:rPr>
+        <w:t xml:space="preserve">We then test if the pattern does match the string, if so, we increment j to extend the pattern length (reference for the pi table). </w:t>
+      </w:r>
+    </w:p>
+    <w:p>
+      <w:pPr>
+        <w:rPr>
+          <w:rFonts w:ascii="Times New Roman" w:hAnsi="Times New Roman" w:cs="Times New Roman"/>
+          <w:sz w:val="24"/>
+          <w:szCs w:val="24"/>
+        </w:rPr>
+      </w:pPr>
+      <w:r>
+        <w:rPr>
+          <w:rFonts w:ascii="Times New Roman" w:hAnsi="Times New Roman" w:cs="Times New Roman"/>
+          <w:sz w:val="24"/>
+          <w:szCs w:val="24"/>
+        </w:rPr>
+        <w:t xml:space="preserve">If j (the size of the longest current match prefix/pattern) matches the size of the pattern (for example, j = 5, pattern = apple which is 5 characters), we can then confirm a pattern has been found. Therefore, </w:t>
+      </w:r>
+      <w:r>
+        <w:rPr>
+          <w:rFonts w:ascii="Times New Roman" w:hAnsi="Times New Roman" w:cs="Times New Roman"/>
+          <w:sz w:val="24"/>
+          <w:szCs w:val="24"/>
+        </w:rPr>
+        <w:t>to save the index of the starting index within the string of the pattern found, we look at our current position minus the length of the pattern + 1 which should give us the index of where the pattern began (plus 1 because we have not yet in runtime moved to the next index). We then push j back to pi[ j – 1 ] to ensure we allow for overlapping patterns.</w:t>
+      </w:r>
+    </w:p>
+    <w:p>
+      <w:pPr>
+        <w:rPr>
+          <w:rFonts w:ascii="Times New Roman" w:hAnsi="Times New Roman" w:cs="Times New Roman"/>
+          <w:sz w:val="24"/>
+          <w:szCs w:val="24"/>
+        </w:rPr>
+      </w:pPr>
+      <w:r>
+        <w:rPr>
+          <w:rFonts w:ascii="Times New Roman" w:hAnsi="Times New Roman" w:cs="Times New Roman"/>
+          <w:sz w:val="24"/>
+          <w:szCs w:val="24"/>
+        </w:rPr>
+        <w:t>Once this loop is complete, we return the patterns found vector which includes all the indexes of where the pattern was found within the string.</w:t>
+      </w:r>
+    </w:p>
+    <w:p>
+      <w:pPr>
+        <w:pStyle w:val="Heading1"/>
+      </w:pPr>
+      <w:bookmarkStart w:id="14" w:name="_Toc209888968"/>
+      <w:r>
+        <w:t xml:space="preserve">5. </w:t>
+      </w:r>
+      <w:r>
+        <w:t>Any compromises, assumptions or changes you made to the algorithm to allow implementation.</w:t>
+      </w:r>
+      <w:bookmarkEnd w:id="14"/>
+    </w:p>
+    <w:p>
+      <w:pPr>
+        <w:pStyle w:val="Heading2"/>
+      </w:pPr>
+      <w:bookmarkStart w:id="15" w:name="_Toc209888969"/>
+      <w:r>
+        <w:t>5.1 Assumptions</w:t>
+      </w:r>
+      <w:bookmarkEnd w:id="15"/>
+    </w:p>
+    <w:p>
+      <w:pPr>
+        <w:rPr>
+          <w:rFonts w:ascii="Times New Roman" w:hAnsi="Times New Roman" w:cs="Times New Roman"/>
+          <w:sz w:val="24"/>
+          <w:szCs w:val="24"/>
+        </w:rPr>
+      </w:pPr>
+      <w:r>
+        <w:rPr>
+          <w:rFonts w:ascii="Times New Roman" w:hAnsi="Times New Roman" w:cs="Times New Roman"/>
+          <w:sz w:val="24"/>
+          <w:szCs w:val="24"/>
+        </w:rPr>
+        <w:t>In my solution, the assumptions made were that strings and patterns were not empty and that the pattern matching was not case sensitive. For this however, we do test that the pattern is not empty in line 30 (</w:t>
+      </w:r>
+      <w:r>
+        <w:rPr>
+          <w:rFonts w:ascii="Times New Roman" w:hAnsi="Times New Roman" w:cs="Times New Roman"/>
+          <w:sz w:val="24"/>
+          <w:szCs w:val="24"/>
+        </w:rPr>
+        <w:t>if (</w:t>
+      </w:r>
+      <w:proofErr w:type="spellStart"/>
+      <w:r>
+        <w:rPr>
+          <w:rFonts w:ascii="Times New Roman" w:hAnsi="Times New Roman" w:cs="Times New Roman"/>
+          <w:sz w:val="24"/>
+          <w:szCs w:val="24"/>
+        </w:rPr>
+        <w:t>pattern.empty</w:t>
+      </w:r>
+      <w:proofErr w:type="spellEnd"/>
+      <w:r>
+        <w:rPr>
+          <w:rFonts w:ascii="Times New Roman" w:hAnsi="Times New Roman" w:cs="Times New Roman"/>
+          <w:sz w:val="24"/>
+          <w:szCs w:val="24"/>
+        </w:rPr>
+        <w:t xml:space="preserve">()) return </w:t>
+      </w:r>
+      <w:proofErr w:type="spellStart"/>
+      <w:r>
+        <w:rPr>
+          <w:rFonts w:ascii="Times New Roman" w:hAnsi="Times New Roman" w:cs="Times New Roman"/>
+          <w:sz w:val="24"/>
+          <w:szCs w:val="24"/>
+        </w:rPr>
+        <w:t>patternsFound</w:t>
+      </w:r>
+      <w:proofErr w:type="spellEnd"/>
+      <w:r>
+        <w:rPr>
+          <w:rFonts w:ascii="Times New Roman" w:hAnsi="Times New Roman" w:cs="Times New Roman"/>
+          <w:sz w:val="24"/>
+          <w:szCs w:val="24"/>
+        </w:rPr>
+        <w:t>;</w:t>
+      </w:r>
+      <w:r>
+        <w:rPr>
+          <w:rFonts w:ascii="Times New Roman" w:hAnsi="Times New Roman" w:cs="Times New Roman"/>
+          <w:sz w:val="24"/>
+          <w:szCs w:val="24"/>
+        </w:rPr>
+        <w:t>)</w:t>
+      </w:r>
+    </w:p>
+    <w:p>
+      <w:pPr>
+        <w:rPr>
+          <w:rFonts w:ascii="Times New Roman" w:hAnsi="Times New Roman" w:cs="Times New Roman"/>
+          <w:sz w:val="24"/>
+          <w:szCs w:val="24"/>
+        </w:rPr>
+      </w:pPr>
+      <w:r>
+        <w:rPr>
+          <w:rFonts w:ascii="Times New Roman" w:hAnsi="Times New Roman" w:cs="Times New Roman"/>
+          <w:sz w:val="24"/>
+          <w:szCs w:val="24"/>
+        </w:rPr>
+        <w:t>Also, we have unit test cases which ensure that the code does not crash at runtime for an empty pattern or an empty string. Also, we test case sensitivity to ensure that this algorithm differentiates between lower and upper case.</w:t>
+      </w:r>
+    </w:p>
+    <w:p>
+      <w:pPr>
+        <w:pStyle w:val="Heading2"/>
+      </w:pPr>
+      <w:bookmarkStart w:id="16" w:name="_Toc209888970"/>
+      <w:r>
+        <w:t xml:space="preserve">5.2 </w:t>
+      </w:r>
+      <w:r>
+        <w:t>Compromises</w:t>
+      </w:r>
+      <w:r>
+        <w:t xml:space="preserve"> and Changes</w:t>
+      </w:r>
+      <w:bookmarkEnd w:id="16"/>
+    </w:p>
+    <w:p>
+      <w:pPr>
+        <w:rPr>
+          <w:rFonts w:ascii="Times New Roman" w:hAnsi="Times New Roman" w:cs="Times New Roman"/>
+          <w:sz w:val="24"/>
+          <w:szCs w:val="24"/>
+        </w:rPr>
+      </w:pPr>
+      <w:r>
+        <w:rPr>
+          <w:rFonts w:ascii="Times New Roman" w:hAnsi="Times New Roman" w:cs="Times New Roman"/>
+          <w:sz w:val="24"/>
+          <w:szCs w:val="24"/>
+        </w:rPr>
+        <w:t xml:space="preserve">I do not believe I have made any compromises that have altered the overall outcome of the KMP algorithm. </w:t>
+      </w:r>
+    </w:p>
+    <w:p>
+      <w:pPr>
+        <w:rPr>
+          <w:rFonts w:ascii="Times New Roman" w:hAnsi="Times New Roman" w:cs="Times New Roman"/>
+          <w:sz w:val="24"/>
+          <w:szCs w:val="24"/>
+        </w:rPr>
+      </w:pPr>
+      <w:r>
+        <w:rPr>
+          <w:rFonts w:ascii="Times New Roman" w:hAnsi="Times New Roman" w:cs="Times New Roman"/>
+          <w:sz w:val="24"/>
+          <w:szCs w:val="24"/>
+        </w:rPr>
+        <w:t xml:space="preserve">The change which I implemented which was different to research found was that I completed the preprocessing of developing the pi table first in its own method then wrote a separate method for searching the string using the previously created pi table. </w:t>
+      </w:r>
+    </w:p>
+    <w:p>
+      <w:pPr>
+        <w:rPr>
+          <w:rFonts w:ascii="Times New Roman" w:hAnsi="Times New Roman" w:cs="Times New Roman"/>
+          <w:sz w:val="24"/>
+          <w:szCs w:val="24"/>
+        </w:rPr>
+      </w:pPr>
+      <w:r>
+        <w:rPr>
+          <w:rFonts w:ascii="Times New Roman" w:hAnsi="Times New Roman" w:cs="Times New Roman"/>
+          <w:sz w:val="24"/>
+          <w:szCs w:val="24"/>
+        </w:rPr>
+        <w:t>The reason for this was for loose coupling and easier to read and debug code. Logically as I was mapping out this algorithm, I imagined that the pi table did not depend on the string and only the pattern and should therefore compute individually. When this was complete and ready, then the KMP algorithm can begin the search utilizing the pi table.</w:t>
+      </w:r>
+    </w:p>
+    <w:p>
+      <w:pPr>
+        <w:rPr>
+          <w:rFonts w:ascii="Times New Roman" w:hAnsi="Times New Roman" w:cs="Times New Roman"/>
+          <w:sz w:val="24"/>
+          <w:szCs w:val="24"/>
+        </w:rPr>
+      </w:pPr>
+      <w:r>
+        <w:rPr>
+          <w:rFonts w:ascii="Times New Roman" w:hAnsi="Times New Roman" w:cs="Times New Roman"/>
+          <w:sz w:val="24"/>
+          <w:szCs w:val="24"/>
+        </w:rPr>
+        <w:lastRenderedPageBreak/>
+        <w:t xml:space="preserve">I am aware </w:t>
+      </w:r>
+      <w:r>
+        <w:rPr>
+          <w:rFonts w:ascii="Times New Roman" w:hAnsi="Times New Roman" w:cs="Times New Roman"/>
+          <w:sz w:val="24"/>
+          <w:szCs w:val="24"/>
+        </w:rPr>
+        <w:t xml:space="preserve">that in some implementations these two stages are combined into a single </w:t>
+      </w:r>
+      <w:r>
+        <w:rPr>
+          <w:rFonts w:ascii="Times New Roman" w:hAnsi="Times New Roman" w:cs="Times New Roman"/>
+          <w:sz w:val="24"/>
+          <w:szCs w:val="24"/>
+        </w:rPr>
+        <w:t>method</w:t>
+      </w:r>
+      <w:r>
+        <w:rPr>
+          <w:rFonts w:ascii="Times New Roman" w:hAnsi="Times New Roman" w:cs="Times New Roman"/>
+          <w:sz w:val="24"/>
+          <w:szCs w:val="24"/>
+        </w:rPr>
+        <w:t>, which can offer minor space or performance efficiencies. However, both approaches still achieve the same overall time complexity, so separating the functions does not reduce performance or correctness.</w:t>
+      </w:r>
+    </w:p>
+    <w:p>
+      <w:pPr>
+        <w:pStyle w:val="Heading1"/>
+      </w:pPr>
+      <w:bookmarkStart w:id="17" w:name="_Toc209888971"/>
+      <w:r>
+        <w:t xml:space="preserve">6. </w:t>
+      </w:r>
+      <w:r>
+        <w:t>An explanation and justification of the effectiveness of the tests provided in assuring algorithmic correctness.</w:t>
+      </w:r>
+      <w:bookmarkEnd w:id="17"/>
+    </w:p>
+    <w:p>
+      <w:pPr>
+        <w:pStyle w:val="Heading2"/>
+      </w:pPr>
+      <w:bookmarkStart w:id="18" w:name="_Toc209888972"/>
+      <w:r>
+        <w:t>6.1 Unit Test Demonstration</w:t>
+      </w:r>
+      <w:bookmarkEnd w:id="18"/>
+    </w:p>
+    <w:p>
+      <w:pPr>
+        <w:pStyle w:val="Heading2"/>
+      </w:pPr>
+      <w:bookmarkStart w:id="19" w:name="_Toc209888973"/>
+      <w:r>
+        <w:t>6.2 Unit Test Effectiveness</w:t>
+      </w:r>
+      <w:bookmarkEnd w:id="19"/>
+    </w:p>
+    <w:p>
+      <w:pPr>
+        <w:pStyle w:val="Heading1"/>
+      </w:pPr>
+      <w:bookmarkStart w:id="20" w:name="_Toc209888974"/>
+      <w:r>
+        <w:t xml:space="preserve">7. </w:t>
+      </w:r>
+      <w:r>
+        <w:t>Any insights or observations that would help someone else implement the same algorithm.</w:t>
+      </w:r>
+      <w:bookmarkEnd w:id="20"/>
     </w:p>
     <w:p/>
     <w:p>
       <w:pPr>
-        <w:pStyle w:val="Heading1"/>
-      </w:pPr>
-      <w:bookmarkStart w:id="14" w:name="_Toc209806797"/>
-      <w:r>
-        <w:lastRenderedPageBreak/>
-        <w:t xml:space="preserve">5. </w:t>
-      </w:r>
-      <w:r>
-        <w:t>Any compromises, assumptions or changes you made to the algorithm to allow implementation.</w:t>
-      </w:r>
-      <w:bookmarkEnd w:id="14"/>
-    </w:p>
-    <w:p>
-      <w:pPr>
-        <w:pStyle w:val="Heading2"/>
-      </w:pPr>
-      <w:bookmarkStart w:id="15" w:name="_Toc209806798"/>
-      <w:r>
-        <w:t>5.1 Assumptions</w:t>
-      </w:r>
-      <w:bookmarkEnd w:id="15"/>
-    </w:p>
-    <w:p/>
-    <w:p>
-      <w:pPr>
-        <w:pStyle w:val="Heading2"/>
-      </w:pPr>
-      <w:bookmarkStart w:id="16" w:name="_Toc209806799"/>
-      <w:r>
-        <w:t>5.2 Compromissions and Changes</w:t>
-      </w:r>
-      <w:bookmarkEnd w:id="16"/>
-    </w:p>
-    <w:p>
-      <w:pPr>
-        <w:pStyle w:val="Heading1"/>
-      </w:pPr>
-      <w:bookmarkStart w:id="17" w:name="_Toc209806800"/>
-      <w:r>
-        <w:t xml:space="preserve">6. </w:t>
-      </w:r>
-      <w:r>
-        <w:t>An explanation and justification of the effectiveness of the tests provided in assuring algorithmic correctness.</w:t>
-      </w:r>
-      <w:bookmarkEnd w:id="17"/>
-    </w:p>
-    <w:p>
-      <w:pPr>
-        <w:pStyle w:val="Heading2"/>
-      </w:pPr>
-      <w:bookmarkStart w:id="18" w:name="_Toc209806801"/>
-      <w:r>
-        <w:t>6.1 Unit Test Demonstration</w:t>
-      </w:r>
-      <w:bookmarkEnd w:id="18"/>
-    </w:p>
-    <w:p>
-      <w:pPr>
-        <w:pStyle w:val="Heading2"/>
-      </w:pPr>
-      <w:bookmarkStart w:id="19" w:name="_Toc209806802"/>
-      <w:r>
-        <w:t>6.2 Unit Test Effectiveness</w:t>
-      </w:r>
-      <w:bookmarkEnd w:id="19"/>
-    </w:p>
-    <w:p>
-      <w:pPr>
-        <w:pStyle w:val="Heading1"/>
-      </w:pPr>
-      <w:bookmarkStart w:id="20" w:name="_Toc209806803"/>
-      <w:r>
-        <w:t xml:space="preserve">7. </w:t>
-      </w:r>
-      <w:r>
-        <w:t>Any insights or observations that would help someone else implement the same algorithm.</w:t>
-      </w:r>
-      <w:bookmarkEnd w:id="20"/>
-    </w:p>
-    <w:p/>
+        <w:rPr>
+          <w:rFonts w:asciiTheme="majorHAnsi" w:eastAsiaTheme="majorEastAsia" w:hAnsiTheme="majorHAnsi" w:cstheme="majorBidi"/>
+          <w:color w:val="0F4761" w:themeColor="accent1" w:themeShade="BF"/>
+          <w:sz w:val="40"/>
+          <w:szCs w:val="40"/>
+        </w:rPr>
+      </w:pPr>
+      <w:r>
+        <w:br w:type="page"/>
+      </w:r>
+    </w:p>
     <w:p>
       <w:pPr>
         <w:pStyle w:val="Heading1"/>
         <w:jc w:val="center"/>
       </w:pPr>
-      <w:bookmarkStart w:id="21" w:name="_Toc209806804"/>
-      <w:r>
+      <w:bookmarkStart w:id="21" w:name="_Toc209888975"/>
+      <w:r>
+        <w:lastRenderedPageBreak/>
         <w:t>References</w:t>
       </w:r>
       <w:bookmarkEnd w:id="21"/>
@@ -2746,7 +3515,15 @@
     </w:p>
     <w:p>
       <w:r>
-        <w:t>Rexie, J. A. M., Raimond, K., Murugaaboopathy, M., Brindha, D., &amp; Mulugeta, H. (2022). Lightweight Pattern Matching Method for DNA Sequencing in Internet of Medical Things. </w:t>
+        <w:t xml:space="preserve">Rexie, J. A. M., Raimond, K., </w:t>
+      </w:r>
+      <w:proofErr w:type="spellStart"/>
+      <w:r>
+        <w:t>Murugaaboopathy</w:t>
+      </w:r>
+      <w:proofErr w:type="spellEnd"/>
+      <w:r>
+        <w:t>, M., Brindha, D., &amp; Mulugeta, H. (2022). Lightweight Pattern Matching Method for DNA Sequencing in Internet of Medical Things. </w:t>
       </w:r>
       <w:r>
         <w:rPr>

</xml_diff>

<commit_message>
this should be the first final draft. Code is complete and report is complete. Anything beyond this point will just be cleaning up the report or adding onto it
</commit_message>
<xml_diff>
--- a/Assignment 1 Report - Adam Merhi.docx
+++ b/Assignment 1 Report - Adam Merhi.docx
@@ -33,7 +33,13 @@
     <w:sdt>
       <w:sdtPr>
         <w:rPr>
-          <w:lang w:val="en-GB"/>
+          <w:rFonts w:asciiTheme="minorHAnsi" w:eastAsiaTheme="minorHAnsi" w:hAnsiTheme="minorHAnsi" w:cstheme="minorBidi"/>
+          <w:color w:val="auto"/>
+          <w:kern w:val="2"/>
+          <w:sz w:val="22"/>
+          <w:szCs w:val="22"/>
+          <w:lang w:val="en-GB" w:eastAsia="en-US"/>
+          <w14:ligatures w14:val="standardContextual"/>
         </w:rPr>
         <w:id w:val="-1470130234"/>
         <w:docPartObj>
@@ -43,15 +49,8 @@
       </w:sdtPr>
       <w:sdtEndPr>
         <w:rPr>
-          <w:rFonts w:asciiTheme="minorHAnsi" w:eastAsiaTheme="minorHAnsi" w:hAnsiTheme="minorHAnsi" w:cstheme="minorBidi"/>
           <w:b/>
           <w:bCs/>
-          <w:color w:val="auto"/>
-          <w:kern w:val="2"/>
-          <w:sz w:val="22"/>
-          <w:szCs w:val="22"/>
-          <w:lang w:eastAsia="en-US"/>
-          <w14:ligatures w14:val="standardContextual"/>
         </w:rPr>
       </w:sdtEndPr>
       <w:sdtContent>
@@ -1700,47 +1699,79 @@
           <w:sz w:val="24"/>
           <w:szCs w:val="24"/>
         </w:rPr>
-        <w:t xml:space="preserve">This report is an outline of project 1 for Advanced Algorithms. We explore the solution proposed for </w:t>
-      </w:r>
-      <w:r>
-        <w:rPr>
-          <w:rFonts w:ascii="Times New Roman" w:hAnsi="Times New Roman" w:cs="Times New Roman"/>
-          <w:sz w:val="24"/>
-          <w:szCs w:val="24"/>
-        </w:rPr>
-        <w:t>Knuth-Morris-Pratt Algorithm</w:t>
-      </w:r>
-      <w:r>
-        <w:rPr>
-          <w:rFonts w:ascii="Times New Roman" w:hAnsi="Times New Roman" w:cs="Times New Roman"/>
-          <w:sz w:val="24"/>
-          <w:szCs w:val="24"/>
-        </w:rPr>
-        <w:t xml:space="preserve"> (KMP). The exploration is segmented into different stages which follows the same logic of the proposed solution computes. We first understand all the preprocessing</w:t>
-      </w:r>
-      <w:r>
-        <w:rPr>
-          <w:rFonts w:ascii="Times New Roman" w:hAnsi="Times New Roman" w:cs="Times New Roman"/>
-          <w:sz w:val="24"/>
-          <w:szCs w:val="24"/>
-        </w:rPr>
-        <w:t xml:space="preserve"> phase where we construct the prefix table</w:t>
-      </w:r>
-      <w:r>
-        <w:rPr>
-          <w:rFonts w:ascii="Times New Roman" w:hAnsi="Times New Roman" w:cs="Times New Roman"/>
-          <w:sz w:val="24"/>
-          <w:szCs w:val="24"/>
-        </w:rPr>
-        <w:t xml:space="preserve"> before we build the algorithm. We understand how the algorithm works and its significance</w:t>
-      </w:r>
-      <w:r>
-        <w:rPr>
-          <w:rFonts w:ascii="Times New Roman" w:hAnsi="Times New Roman" w:cs="Times New Roman"/>
-          <w:sz w:val="24"/>
-          <w:szCs w:val="24"/>
-        </w:rPr>
-        <w:t xml:space="preserve"> and superiority over a naïve algorithm which directly correlate with its time complexity. We follow this by justifying my method and how I tested this method to prove the significance of KMP algorithm is present.</w:t>
+        <w:t xml:space="preserve">This report is an outline of project 1 for Advanced Algorithms. We explore the solution proposed for Knuth-Morris-Pratt Algorithm (KMP). The exploration is segmented into different stages which follows the same logic of </w:t>
+      </w:r>
+      <w:r>
+        <w:rPr>
+          <w:rFonts w:ascii="Times New Roman" w:hAnsi="Times New Roman" w:cs="Times New Roman"/>
+          <w:sz w:val="24"/>
+          <w:szCs w:val="24"/>
+        </w:rPr>
+        <w:t xml:space="preserve">how </w:t>
+      </w:r>
+      <w:r>
+        <w:rPr>
+          <w:rFonts w:ascii="Times New Roman" w:hAnsi="Times New Roman" w:cs="Times New Roman"/>
+          <w:sz w:val="24"/>
+          <w:szCs w:val="24"/>
+        </w:rPr>
+        <w:t xml:space="preserve">the proposed solution computes. We first understand all the preprocessing phase where we construct the prefix table before we build the </w:t>
+      </w:r>
+      <w:r>
+        <w:rPr>
+          <w:rFonts w:ascii="Times New Roman" w:hAnsi="Times New Roman" w:cs="Times New Roman"/>
+          <w:sz w:val="24"/>
+          <w:szCs w:val="24"/>
+        </w:rPr>
+        <w:t xml:space="preserve">searching </w:t>
+      </w:r>
+      <w:r>
+        <w:rPr>
+          <w:rFonts w:ascii="Times New Roman" w:hAnsi="Times New Roman" w:cs="Times New Roman"/>
+          <w:sz w:val="24"/>
+          <w:szCs w:val="24"/>
+        </w:rPr>
+        <w:t>algorithm. We understand how the algorithm works and its significance and superiority over a naïve algorithm which directly correlate with its time complexity. We follow this by justifying my method and how I tested this method to prove the significance of KMP algorith</w:t>
+      </w:r>
+      <w:r>
+        <w:rPr>
+          <w:rFonts w:ascii="Times New Roman" w:hAnsi="Times New Roman" w:cs="Times New Roman"/>
+          <w:sz w:val="24"/>
+          <w:szCs w:val="24"/>
+        </w:rPr>
+        <w:t>m</w:t>
+      </w:r>
+      <w:r>
+        <w:rPr>
+          <w:rFonts w:ascii="Times New Roman" w:hAnsi="Times New Roman" w:cs="Times New Roman"/>
+          <w:sz w:val="24"/>
+          <w:szCs w:val="24"/>
+        </w:rPr>
+        <w:t>.</w:t>
+      </w:r>
+      <w:r>
+        <w:rPr>
+          <w:rFonts w:ascii="Times New Roman" w:hAnsi="Times New Roman" w:cs="Times New Roman"/>
+          <w:sz w:val="24"/>
+          <w:szCs w:val="24"/>
+        </w:rPr>
+        <w:t xml:space="preserve"> This report does switch between the </w:t>
+      </w:r>
+      <w:r>
+        <w:rPr>
+          <w:rFonts w:ascii="Times New Roman" w:hAnsi="Times New Roman" w:cs="Times New Roman"/>
+          <w:sz w:val="24"/>
+          <w:szCs w:val="24"/>
+        </w:rPr>
+        <w:t>term’s</w:t>
+      </w:r>
+      <w:r>
+        <w:rPr>
+          <w:rFonts w:ascii="Times New Roman" w:hAnsi="Times New Roman" w:cs="Times New Roman"/>
+          <w:sz w:val="24"/>
+          <w:szCs w:val="24"/>
+        </w:rPr>
+        <w:t xml:space="preserve"> “prefix” and “sub pattern”, both words in this report are referring to the same thing which can also be referred to as the prefix suffix. This was not intentional but while reading research and writing this report I mistakenly interchanged the words.</w:t>
       </w:r>
     </w:p>
     <w:p>
@@ -1775,13 +1806,7 @@
         <w:t xml:space="preserve">1. </w:t>
       </w:r>
       <w:r>
-        <w:t xml:space="preserve">A </w:t>
-      </w:r>
-      <w:r>
-        <w:t>high-level</w:t>
-      </w:r>
-      <w:r>
-        <w:t xml:space="preserve"> outline of the algorithm</w:t>
+        <w:t>A high-level outline of the algorithm</w:t>
       </w:r>
       <w:bookmarkEnd w:id="0"/>
     </w:p>
@@ -1845,15 +1870,7 @@
           <w:sz w:val="24"/>
           <w:szCs w:val="24"/>
         </w:rPr>
-        <w:t xml:space="preserve">In a naïve approach, we check if the first letter of the pattern matches the first letter of the </w:t>
-      </w:r>
-      <w:r>
-        <w:rPr>
-          <w:rFonts w:ascii="Times New Roman" w:hAnsi="Times New Roman" w:cs="Times New Roman"/>
-          <w:sz w:val="24"/>
-          <w:szCs w:val="24"/>
-        </w:rPr>
-        <w:t>string. If not, we move forward</w:t>
+        <w:t>In a naïve approach, we check if the first letter of the pattern matches the first letter of the string. If not, we move forward</w:t>
       </w:r>
       <w:r>
         <w:rPr>
@@ -2152,15 +2169,7 @@
           <w:sz w:val="24"/>
           <w:szCs w:val="24"/>
         </w:rPr>
-        <w:t xml:space="preserve">Through CNN, Computer vision also utilizes pattern matching and pattern recognition to function. First patterns are put into ‘Sparse’ and then used for image classification. This is seen in a study by Wright, et.al, </w:t>
-      </w:r>
-      <w:r>
-        <w:rPr>
-          <w:rFonts w:ascii="Times New Roman" w:hAnsi="Times New Roman" w:cs="Times New Roman"/>
-          <w:sz w:val="24"/>
-          <w:szCs w:val="24"/>
-        </w:rPr>
-        <w:t>"</w:t>
+        <w:t>Through CNN, Computer vision also utilizes pattern matching and pattern recognition to function. First patterns are put into ‘Sparse’ and then used for image classification. This is seen in a study by Wright, et.al, "</w:t>
       </w:r>
       <w:r>
         <w:rPr>
@@ -2285,97 +2294,7 @@
           <w:sz w:val="24"/>
           <w:szCs w:val="24"/>
         </w:rPr>
-        <w:t>Read alignment is affected by some sequencing technology parameters, including the read length and error rate.</w:t>
-      </w:r>
-      <w:r>
-        <w:rPr>
-          <w:rFonts w:ascii="Times New Roman" w:hAnsi="Times New Roman" w:cs="Times New Roman"/>
-          <w:i/>
-          <w:iCs/>
-          <w:sz w:val="24"/>
-          <w:szCs w:val="24"/>
-        </w:rPr>
-        <w:t xml:space="preserve"> </w:t>
-      </w:r>
-      <w:r>
-        <w:rPr>
-          <w:rFonts w:ascii="Times New Roman" w:hAnsi="Times New Roman" w:cs="Times New Roman"/>
-          <w:i/>
-          <w:iCs/>
-          <w:sz w:val="24"/>
-          <w:szCs w:val="24"/>
-        </w:rPr>
-        <w:t>It is essential to determine the actual location of each read,</w:t>
-      </w:r>
-      <w:r>
-        <w:rPr>
-          <w:rFonts w:ascii="Times New Roman" w:hAnsi="Times New Roman" w:cs="Times New Roman"/>
-          <w:i/>
-          <w:iCs/>
-          <w:sz w:val="24"/>
-          <w:szCs w:val="24"/>
-        </w:rPr>
-        <w:t xml:space="preserve"> </w:t>
-      </w:r>
-      <w:r>
-        <w:rPr>
-          <w:rFonts w:ascii="Times New Roman" w:hAnsi="Times New Roman" w:cs="Times New Roman"/>
-          <w:i/>
-          <w:iCs/>
-          <w:sz w:val="24"/>
-          <w:szCs w:val="24"/>
-        </w:rPr>
-        <w:t xml:space="preserve">according to the reference. </w:t>
-      </w:r>
-      <w:r>
-        <w:rPr>
-          <w:rFonts w:ascii="Times New Roman" w:hAnsi="Times New Roman" w:cs="Times New Roman"/>
-          <w:i/>
-          <w:iCs/>
-          <w:sz w:val="24"/>
-          <w:szCs w:val="24"/>
-        </w:rPr>
-        <w:t>Th</w:t>
-      </w:r>
-      <w:r>
-        <w:rPr>
-          <w:rFonts w:ascii="Times New Roman" w:hAnsi="Times New Roman" w:cs="Times New Roman"/>
-          <w:i/>
-          <w:iCs/>
-          <w:sz w:val="24"/>
-          <w:szCs w:val="24"/>
-        </w:rPr>
-        <w:t>e exact location cannot be</w:t>
-      </w:r>
-      <w:r>
-        <w:rPr>
-          <w:rFonts w:ascii="Times New Roman" w:hAnsi="Times New Roman" w:cs="Times New Roman"/>
-          <w:i/>
-          <w:iCs/>
-          <w:sz w:val="24"/>
-          <w:szCs w:val="24"/>
-        </w:rPr>
-        <w:t xml:space="preserve"> </w:t>
-      </w:r>
-      <w:r>
-        <w:rPr>
-          <w:rFonts w:ascii="Times New Roman" w:hAnsi="Times New Roman" w:cs="Times New Roman"/>
-          <w:i/>
-          <w:iCs/>
-          <w:sz w:val="24"/>
-          <w:szCs w:val="24"/>
-        </w:rPr>
-        <w:t xml:space="preserve">determined in advance, so the matching has to be </w:t>
-      </w:r>
-      <w:r>
-        <w:rPr>
-          <w:rFonts w:ascii="Times New Roman" w:hAnsi="Times New Roman" w:cs="Times New Roman"/>
-          <w:i/>
-          <w:iCs/>
-          <w:sz w:val="24"/>
-          <w:szCs w:val="24"/>
-        </w:rPr>
-        <w:t>done approximately</w:t>
+        <w:t>Read alignment is affected by some sequencing technology parameters, including the read length and error rate. It is essential to determine the actual location of each read, according to the reference. The exact location cannot be determined in advance, so the matching has to be done approximately</w:t>
       </w:r>
       <w:r>
         <w:rPr>
@@ -2580,15 +2499,7 @@
           <w:sz w:val="24"/>
           <w:szCs w:val="24"/>
         </w:rPr>
-        <w:t>found sub pattern</w:t>
-      </w:r>
-      <w:r>
-        <w:rPr>
-          <w:rFonts w:ascii="Times New Roman" w:hAnsi="Times New Roman" w:cs="Times New Roman"/>
-          <w:sz w:val="24"/>
-          <w:szCs w:val="24"/>
-        </w:rPr>
-        <w:t xml:space="preserve">. </w:t>
+        <w:t xml:space="preserve">found sub pattern. </w:t>
       </w:r>
     </w:p>
     <w:p>
@@ -3047,15 +2958,7 @@
           <w:sz w:val="24"/>
           <w:szCs w:val="24"/>
         </w:rPr>
-        <w:t xml:space="preserve"> j then, </w:t>
-      </w:r>
-      <w:r>
-        <w:rPr>
-          <w:rFonts w:ascii="Times New Roman" w:hAnsi="Times New Roman" w:cs="Times New Roman"/>
-          <w:sz w:val="24"/>
-          <w:szCs w:val="24"/>
-        </w:rPr>
-        <w:t>we assign j to the previous index within the pi table</w:t>
+        <w:t xml:space="preserve"> j then, we assign j to the previous index within the pi table</w:t>
       </w:r>
       <w:r>
         <w:rPr>
@@ -3194,15 +3097,7 @@
           <w:sz w:val="24"/>
           <w:szCs w:val="24"/>
         </w:rPr>
-        <w:t>In my solution, the assumptions made were that strings and patterns were not empty and that the pattern matching was not case sensitive. For this however, we do test that the pattern is not empty in line 30 (</w:t>
-      </w:r>
-      <w:r>
-        <w:rPr>
-          <w:rFonts w:ascii="Times New Roman" w:hAnsi="Times New Roman" w:cs="Times New Roman"/>
-          <w:sz w:val="24"/>
-          <w:szCs w:val="24"/>
-        </w:rPr>
-        <w:t>if (</w:t>
+        <w:t>In my solution, the assumptions made were that strings and patterns were not empty and that the pattern matching was not case sensitive. For this however, we do test that the pattern is not empty in line 30 (if (</w:t>
       </w:r>
       <w:proofErr w:type="spellStart"/>
       <w:r>
@@ -3238,15 +3133,7 @@
           <w:sz w:val="24"/>
           <w:szCs w:val="24"/>
         </w:rPr>
-        <w:t>;</w:t>
-      </w:r>
-      <w:r>
-        <w:rPr>
-          <w:rFonts w:ascii="Times New Roman" w:hAnsi="Times New Roman" w:cs="Times New Roman"/>
-          <w:sz w:val="24"/>
-          <w:szCs w:val="24"/>
-        </w:rPr>
-        <w:t>)</w:t>
+        <w:t>;)</w:t>
       </w:r>
     </w:p>
     <w:p>
@@ -3348,31 +3235,7 @@
           <w:szCs w:val="24"/>
         </w:rPr>
         <w:lastRenderedPageBreak/>
-        <w:t xml:space="preserve">I am aware </w:t>
-      </w:r>
-      <w:r>
-        <w:rPr>
-          <w:rFonts w:ascii="Times New Roman" w:hAnsi="Times New Roman" w:cs="Times New Roman"/>
-          <w:sz w:val="24"/>
-          <w:szCs w:val="24"/>
-        </w:rPr>
-        <w:t xml:space="preserve">that in some implementations these two stages are combined into a single </w:t>
-      </w:r>
-      <w:r>
-        <w:rPr>
-          <w:rFonts w:ascii="Times New Roman" w:hAnsi="Times New Roman" w:cs="Times New Roman"/>
-          <w:sz w:val="24"/>
-          <w:szCs w:val="24"/>
-        </w:rPr>
-        <w:t>method</w:t>
-      </w:r>
-      <w:r>
-        <w:rPr>
-          <w:rFonts w:ascii="Times New Roman" w:hAnsi="Times New Roman" w:cs="Times New Roman"/>
-          <w:sz w:val="24"/>
-          <w:szCs w:val="24"/>
-        </w:rPr>
-        <w:t>, which can offer minor space or performance efficiencies. However, both approaches still achieve the same overall time complexity, so separating the functions does not reduce performance or correctness.</w:t>
+        <w:t>I am aware that in some implementations these two stages are combined into a single method, which can offer minor space or performance efficiencies. However, both approaches still achieve the same overall time complexity, so separating the functions does not reduce performance or correctness.</w:t>
       </w:r>
     </w:p>
     <w:p>
@@ -3400,28 +3263,426 @@
     </w:p>
     <w:p>
       <w:pPr>
+        <w:rPr>
+          <w:rFonts w:ascii="Times New Roman" w:hAnsi="Times New Roman" w:cs="Times New Roman"/>
+          <w:sz w:val="24"/>
+          <w:szCs w:val="24"/>
+        </w:rPr>
+      </w:pPr>
+      <w:r>
+        <w:rPr>
+          <w:rFonts w:ascii="Times New Roman" w:hAnsi="Times New Roman" w:cs="Times New Roman"/>
+          <w:sz w:val="24"/>
+          <w:szCs w:val="24"/>
+        </w:rPr>
+        <w:t>My testing to ensure my implementation is correct has been split into 2 sections. One section which verifies the pi table is working correctly, and the second ensures the search part of KMP is working correctly. If either part of these does not function as it should, the result will be incorrect.</w:t>
+      </w:r>
+    </w:p>
+    <w:p>
+      <w:pPr>
+        <w:rPr>
+          <w:rFonts w:ascii="Times New Roman" w:hAnsi="Times New Roman" w:cs="Times New Roman"/>
+          <w:sz w:val="24"/>
+          <w:szCs w:val="24"/>
+        </w:rPr>
+      </w:pPr>
+      <w:r>
+        <w:rPr>
+          <w:rFonts w:ascii="Times New Roman" w:hAnsi="Times New Roman" w:cs="Times New Roman"/>
+          <w:sz w:val="24"/>
+          <w:szCs w:val="24"/>
+        </w:rPr>
+        <w:t xml:space="preserve">There are three helper functions which support the unit tests and follow object orientated principles for method reuse. </w:t>
+      </w:r>
+    </w:p>
+    <w:p>
+      <w:pPr>
+        <w:pStyle w:val="Heading3"/>
+      </w:pPr>
+      <w:bookmarkStart w:id="19" w:name="_Toc209901570"/>
+      <w:r>
+        <w:t>6.1.1 Helper functions</w:t>
+      </w:r>
+      <w:bookmarkEnd w:id="19"/>
+      <w:r>
+        <w:t xml:space="preserve"> </w:t>
+      </w:r>
+    </w:p>
+    <w:p>
+      <w:pPr>
+        <w:rPr>
+          <w:rFonts w:ascii="Times New Roman" w:hAnsi="Times New Roman" w:cs="Times New Roman"/>
+          <w:sz w:val="24"/>
+          <w:szCs w:val="24"/>
+        </w:rPr>
+      </w:pPr>
+      <w:proofErr w:type="spellStart"/>
+      <w:r>
+        <w:rPr>
+          <w:rFonts w:ascii="Times New Roman" w:hAnsi="Times New Roman" w:cs="Times New Roman"/>
+          <w:sz w:val="24"/>
+          <w:szCs w:val="24"/>
+        </w:rPr>
+        <w:t>VecCompare</w:t>
+      </w:r>
+      <w:proofErr w:type="spellEnd"/>
+      <w:r>
+        <w:rPr>
+          <w:rFonts w:ascii="Times New Roman" w:hAnsi="Times New Roman" w:cs="Times New Roman"/>
+          <w:sz w:val="24"/>
+          <w:szCs w:val="24"/>
+        </w:rPr>
+        <w:t xml:space="preserve"> is a helper function which looks at the expected vector and tests it against the output from the </w:t>
+      </w:r>
+      <w:proofErr w:type="spellStart"/>
+      <w:r>
+        <w:rPr>
+          <w:rFonts w:ascii="Times New Roman" w:hAnsi="Times New Roman" w:cs="Times New Roman"/>
+          <w:sz w:val="24"/>
+          <w:szCs w:val="24"/>
+        </w:rPr>
+        <w:t>kmpSearch</w:t>
+      </w:r>
+      <w:proofErr w:type="spellEnd"/>
+      <w:r>
+        <w:rPr>
+          <w:rFonts w:ascii="Times New Roman" w:hAnsi="Times New Roman" w:cs="Times New Roman"/>
+          <w:sz w:val="24"/>
+          <w:szCs w:val="24"/>
+        </w:rPr>
+        <w:t xml:space="preserve"> method. If the two vectors match, that means the unit test has passed, otherwise it has failed.</w:t>
+      </w:r>
+    </w:p>
+    <w:p>
+      <w:pPr>
+        <w:rPr>
+          <w:rFonts w:ascii="Times New Roman" w:hAnsi="Times New Roman" w:cs="Times New Roman"/>
+          <w:sz w:val="24"/>
+          <w:szCs w:val="24"/>
+        </w:rPr>
+      </w:pPr>
+      <w:r>
+        <w:rPr>
+          <w:rFonts w:ascii="Times New Roman" w:hAnsi="Times New Roman" w:cs="Times New Roman"/>
+          <w:sz w:val="24"/>
+          <w:szCs w:val="24"/>
+        </w:rPr>
+        <w:t xml:space="preserve">The purpose of this method is to stop rewriting the same code for every single </w:t>
+      </w:r>
+      <w:proofErr w:type="spellStart"/>
+      <w:r>
+        <w:rPr>
+          <w:rFonts w:ascii="Times New Roman" w:hAnsi="Times New Roman" w:cs="Times New Roman"/>
+          <w:sz w:val="24"/>
+          <w:szCs w:val="24"/>
+        </w:rPr>
+        <w:t>kmpSearch</w:t>
+      </w:r>
+      <w:proofErr w:type="spellEnd"/>
+      <w:r>
+        <w:rPr>
+          <w:rFonts w:ascii="Times New Roman" w:hAnsi="Times New Roman" w:cs="Times New Roman"/>
+          <w:sz w:val="24"/>
+          <w:szCs w:val="24"/>
+        </w:rPr>
+        <w:t xml:space="preserve"> unit test </w:t>
+      </w:r>
+      <w:r>
+        <w:rPr>
+          <w:rFonts w:ascii="Times New Roman" w:hAnsi="Times New Roman" w:cs="Times New Roman"/>
+          <w:sz w:val="24"/>
+          <w:szCs w:val="24"/>
+        </w:rPr>
+        <w:t>a</w:t>
+      </w:r>
+      <w:r>
+        <w:rPr>
+          <w:rFonts w:ascii="Times New Roman" w:hAnsi="Times New Roman" w:cs="Times New Roman"/>
+          <w:sz w:val="24"/>
+          <w:szCs w:val="24"/>
+        </w:rPr>
+        <w:t xml:space="preserve"> rather just recall that method.</w:t>
+      </w:r>
+    </w:p>
+    <w:p>
+      <w:pPr>
+        <w:rPr>
+          <w:rFonts w:ascii="Times New Roman" w:hAnsi="Times New Roman" w:cs="Times New Roman"/>
+          <w:sz w:val="24"/>
+          <w:szCs w:val="24"/>
+        </w:rPr>
+      </w:pPr>
+      <w:proofErr w:type="spellStart"/>
+      <w:r>
+        <w:rPr>
+          <w:rFonts w:ascii="Times New Roman" w:hAnsi="Times New Roman" w:cs="Times New Roman"/>
+          <w:sz w:val="24"/>
+          <w:szCs w:val="24"/>
+        </w:rPr>
+        <w:t>PrintVector</w:t>
+      </w:r>
+      <w:proofErr w:type="spellEnd"/>
+      <w:r>
+        <w:rPr>
+          <w:rFonts w:ascii="Times New Roman" w:hAnsi="Times New Roman" w:cs="Times New Roman"/>
+          <w:sz w:val="24"/>
+          <w:szCs w:val="24"/>
+        </w:rPr>
+        <w:t xml:space="preserve"> is another helper function which prints the vector in the terminal for testing. This method simply looks through the vector and prints every index. This is used for when a test fails, it shows the user what the return is compared to what it should’ve been for testing and debugging. Again, this method ensures that I don’t have to rewrite the code within every unit test.</w:t>
+      </w:r>
+    </w:p>
+    <w:p>
+      <w:r>
+        <w:rPr>
+          <w:rFonts w:ascii="Times New Roman" w:hAnsi="Times New Roman" w:cs="Times New Roman"/>
+          <w:sz w:val="24"/>
+          <w:szCs w:val="24"/>
+        </w:rPr>
+        <w:t xml:space="preserve">Finally, </w:t>
+      </w:r>
+      <w:proofErr w:type="spellStart"/>
+      <w:r>
+        <w:rPr>
+          <w:rFonts w:ascii="Times New Roman" w:hAnsi="Times New Roman" w:cs="Times New Roman"/>
+          <w:sz w:val="24"/>
+          <w:szCs w:val="24"/>
+        </w:rPr>
+        <w:t>runKmpTest</w:t>
+      </w:r>
+      <w:proofErr w:type="spellEnd"/>
+      <w:r>
+        <w:rPr>
+          <w:rFonts w:ascii="Times New Roman" w:hAnsi="Times New Roman" w:cs="Times New Roman"/>
+          <w:sz w:val="24"/>
+          <w:szCs w:val="24"/>
+        </w:rPr>
+        <w:t xml:space="preserve"> is the last helper function which first looks at </w:t>
+      </w:r>
+      <w:proofErr w:type="spellStart"/>
+      <w:r>
+        <w:rPr>
+          <w:rFonts w:ascii="Times New Roman" w:hAnsi="Times New Roman" w:cs="Times New Roman"/>
+          <w:sz w:val="24"/>
+          <w:szCs w:val="24"/>
+        </w:rPr>
+        <w:t>VecCompare</w:t>
+      </w:r>
+      <w:proofErr w:type="spellEnd"/>
+      <w:r>
+        <w:rPr>
+          <w:rFonts w:ascii="Times New Roman" w:hAnsi="Times New Roman" w:cs="Times New Roman"/>
+          <w:sz w:val="24"/>
+          <w:szCs w:val="24"/>
+        </w:rPr>
+        <w:t xml:space="preserve"> to see if the vectors match. If so, it returns the test name concatenated with “ PASS”. If the vectors do not match, this returns the test name contented with “ FAIL” and then calls </w:t>
+      </w:r>
+      <w:proofErr w:type="spellStart"/>
+      <w:r>
+        <w:rPr>
+          <w:rFonts w:ascii="Times New Roman" w:hAnsi="Times New Roman" w:cs="Times New Roman"/>
+          <w:sz w:val="24"/>
+          <w:szCs w:val="24"/>
+        </w:rPr>
+        <w:t>PrintVector</w:t>
+      </w:r>
+      <w:proofErr w:type="spellEnd"/>
+      <w:r>
+        <w:rPr>
+          <w:rFonts w:ascii="Times New Roman" w:hAnsi="Times New Roman" w:cs="Times New Roman"/>
+          <w:sz w:val="24"/>
+          <w:szCs w:val="24"/>
+        </w:rPr>
+        <w:t xml:space="preserve"> to print the</w:t>
+      </w:r>
+      <w:r>
+        <w:rPr>
+          <w:sz w:val="24"/>
+          <w:szCs w:val="24"/>
+        </w:rPr>
+        <w:t xml:space="preserve"> </w:t>
+      </w:r>
+      <w:r>
+        <w:t>expected vector and the returned vector.</w:t>
+      </w:r>
+    </w:p>
+    <w:p>
+      <w:pPr>
         <w:pStyle w:val="Heading2"/>
       </w:pPr>
-      <w:bookmarkStart w:id="19" w:name="_Toc209888973"/>
+      <w:bookmarkStart w:id="20" w:name="_Toc209888973"/>
       <w:r>
         <w:t>6.2 Unit Test Effectiveness</w:t>
       </w:r>
-      <w:bookmarkEnd w:id="19"/>
+      <w:bookmarkEnd w:id="20"/>
+    </w:p>
+    <w:p>
+      <w:pPr>
+        <w:rPr>
+          <w:rFonts w:ascii="Times New Roman" w:hAnsi="Times New Roman" w:cs="Times New Roman"/>
+          <w:sz w:val="24"/>
+          <w:szCs w:val="24"/>
+        </w:rPr>
+      </w:pPr>
+      <w:r>
+        <w:rPr>
+          <w:rFonts w:ascii="Times New Roman" w:hAnsi="Times New Roman" w:cs="Times New Roman"/>
+          <w:sz w:val="24"/>
+          <w:szCs w:val="24"/>
+        </w:rPr>
+        <w:t xml:space="preserve">Out of the </w:t>
+      </w:r>
+      <w:proofErr w:type="gramStart"/>
+      <w:r>
+        <w:rPr>
+          <w:rFonts w:ascii="Times New Roman" w:hAnsi="Times New Roman" w:cs="Times New Roman"/>
+          <w:sz w:val="24"/>
+          <w:szCs w:val="24"/>
+        </w:rPr>
+        <w:t>10 unit</w:t>
+      </w:r>
+      <w:proofErr w:type="gramEnd"/>
+      <w:r>
+        <w:rPr>
+          <w:rFonts w:ascii="Times New Roman" w:hAnsi="Times New Roman" w:cs="Times New Roman"/>
+          <w:sz w:val="24"/>
+          <w:szCs w:val="24"/>
+        </w:rPr>
+        <w:t xml:space="preserve"> tests, 2 test verify that the pi table is working, this includes overlapping sub patterns in the second test. 7 tests then verify that the searching part of the algorithm works. The last test benchmarks a naïve method against my implemented KMP algorithm to test the time complexity improvement.</w:t>
+      </w:r>
+    </w:p>
+    <w:p>
+      <w:pPr>
+        <w:rPr>
+          <w:rFonts w:ascii="Times New Roman" w:hAnsi="Times New Roman" w:cs="Times New Roman"/>
+          <w:sz w:val="24"/>
+          <w:szCs w:val="24"/>
+        </w:rPr>
+      </w:pPr>
+      <w:r>
+        <w:rPr>
+          <w:rFonts w:ascii="Times New Roman" w:hAnsi="Times New Roman" w:cs="Times New Roman"/>
+          <w:sz w:val="24"/>
+          <w:szCs w:val="24"/>
+        </w:rPr>
+        <w:t xml:space="preserve">My unit tests for the overall solution test 3 different scenarios where the pattern match can be tricky, including overlapping pattern matching to ensure it is being detected at runtime. </w:t>
+      </w:r>
+    </w:p>
+    <w:p>
+      <w:pPr>
+        <w:rPr>
+          <w:rFonts w:ascii="Times New Roman" w:hAnsi="Times New Roman" w:cs="Times New Roman"/>
+          <w:sz w:val="24"/>
+          <w:szCs w:val="24"/>
+        </w:rPr>
+      </w:pPr>
+      <w:r>
+        <w:rPr>
+          <w:rFonts w:ascii="Times New Roman" w:hAnsi="Times New Roman" w:cs="Times New Roman"/>
+          <w:sz w:val="24"/>
+          <w:szCs w:val="24"/>
+        </w:rPr>
+        <w:lastRenderedPageBreak/>
+        <w:t xml:space="preserve">The next unit test looks at what happens when there is no pattern found in the string. This unit test passes successfully. Following, we look at the cases where there are patterns, however the case is different (upper case and lower case). This is important as this method is case sensitive. </w:t>
+      </w:r>
+    </w:p>
+    <w:p>
+      <w:pPr>
+        <w:rPr>
+          <w:rFonts w:ascii="Times New Roman" w:hAnsi="Times New Roman" w:cs="Times New Roman"/>
+          <w:sz w:val="24"/>
+          <w:szCs w:val="24"/>
+        </w:rPr>
+      </w:pPr>
+      <w:r>
+        <w:rPr>
+          <w:rFonts w:ascii="Times New Roman" w:hAnsi="Times New Roman" w:cs="Times New Roman"/>
+          <w:sz w:val="24"/>
+          <w:szCs w:val="24"/>
+        </w:rPr>
+        <w:t xml:space="preserve">The next two tests look to ensure there is no crash at runtime when either the pattern or string is empty. This is important because there is validation within the method to ensure that in these cases there is a return value. </w:t>
+      </w:r>
+    </w:p>
+    <w:p>
+      <w:pPr>
+        <w:rPr>
+          <w:rFonts w:ascii="Times New Roman" w:hAnsi="Times New Roman" w:cs="Times New Roman"/>
+          <w:sz w:val="24"/>
+          <w:szCs w:val="24"/>
+        </w:rPr>
+      </w:pPr>
+      <w:r>
+        <w:rPr>
+          <w:rFonts w:ascii="Times New Roman" w:hAnsi="Times New Roman" w:cs="Times New Roman"/>
+          <w:sz w:val="24"/>
+          <w:szCs w:val="24"/>
+        </w:rPr>
+        <w:t>Lastly, we test the KMP algorithm against a naïve approach. In this, we use the Chrono package to capture the time it takes for each solution to execute. This then returns both the times in microseconds. This is a benchmark test to confirm my implemented KMP algorithm solution is working and is optimised compared to a naïve approach.</w:t>
+      </w:r>
     </w:p>
     <w:p>
       <w:pPr>
         <w:pStyle w:val="Heading1"/>
       </w:pPr>
-      <w:bookmarkStart w:id="20" w:name="_Toc209888974"/>
+      <w:bookmarkStart w:id="21" w:name="_Toc209888974"/>
       <w:r>
         <w:t xml:space="preserve">7. </w:t>
       </w:r>
       <w:r>
         <w:t>Any insights or observations that would help someone else implement the same algorithm.</w:t>
       </w:r>
-      <w:bookmarkEnd w:id="20"/>
-    </w:p>
-    <w:p/>
+      <w:bookmarkEnd w:id="21"/>
+    </w:p>
+    <w:p>
+      <w:pPr>
+        <w:rPr>
+          <w:rFonts w:ascii="Times New Roman" w:hAnsi="Times New Roman" w:cs="Times New Roman"/>
+          <w:sz w:val="24"/>
+          <w:szCs w:val="24"/>
+        </w:rPr>
+      </w:pPr>
+      <w:r>
+        <w:rPr>
+          <w:rFonts w:ascii="Times New Roman" w:hAnsi="Times New Roman" w:cs="Times New Roman"/>
+          <w:sz w:val="24"/>
+          <w:szCs w:val="24"/>
+        </w:rPr>
+        <w:t>KMP algorithm is extremely useful, especially when dealing with large data sets. The understanding of the algorithm really comes around the pi table. Once a solid understanding around how the pi table is built and referenced, then it is very simple to implement the KMP searching part of the algorithm.</w:t>
+      </w:r>
+    </w:p>
+    <w:p>
+      <w:pPr>
+        <w:rPr>
+          <w:rFonts w:ascii="Times New Roman" w:hAnsi="Times New Roman" w:cs="Times New Roman"/>
+          <w:sz w:val="24"/>
+          <w:szCs w:val="24"/>
+        </w:rPr>
+      </w:pPr>
+      <w:r>
+        <w:rPr>
+          <w:rFonts w:ascii="Times New Roman" w:hAnsi="Times New Roman" w:cs="Times New Roman"/>
+          <w:sz w:val="24"/>
+          <w:szCs w:val="24"/>
+        </w:rPr>
+        <w:t xml:space="preserve">Another thing I picked up was fragmenting the methods. This made debugging the pi table much easier as at worst case I can just print out the pi table to understand why and where the pi table has failed. This can be seen in my unit tests. </w:t>
+      </w:r>
+    </w:p>
+    <w:p>
+      <w:pPr>
+        <w:rPr>
+          <w:rFonts w:ascii="Times New Roman" w:hAnsi="Times New Roman" w:cs="Times New Roman"/>
+          <w:sz w:val="24"/>
+          <w:szCs w:val="24"/>
+        </w:rPr>
+      </w:pPr>
+      <w:r>
+        <w:rPr>
+          <w:rFonts w:ascii="Times New Roman" w:hAnsi="Times New Roman" w:cs="Times New Roman"/>
+          <w:sz w:val="24"/>
+          <w:szCs w:val="24"/>
+        </w:rPr>
+        <w:t>For someone trying to learn KMP algorithm, I would suggest they attempt to build a pattern matching algorithm in a naïve way. From there, they can truly understand why the pi table works and how it can recognise pattern overlapping.</w:t>
+      </w:r>
+    </w:p>
     <w:p>
       <w:pPr>
         <w:rPr>
@@ -3440,14 +3701,17 @@
         <w:pStyle w:val="Heading1"/>
         <w:jc w:val="center"/>
       </w:pPr>
-      <w:bookmarkStart w:id="21" w:name="_Toc209888975"/>
+      <w:bookmarkStart w:id="22" w:name="_Toc209888975"/>
       <w:r>
         <w:lastRenderedPageBreak/>
         <w:t>References</w:t>
       </w:r>
-      <w:bookmarkEnd w:id="21"/>
-    </w:p>
-    <w:p>
+      <w:bookmarkEnd w:id="22"/>
+    </w:p>
+    <w:p>
+      <w:pPr>
+        <w:ind w:left="284" w:hanging="284"/>
+      </w:pPr>
       <w:r>
         <w:t xml:space="preserve">Bot Penguin. (n.d.). </w:t>
       </w:r>
@@ -3470,6 +3734,9 @@
       </w:hyperlink>
     </w:p>
     <w:p>
+      <w:pPr>
+        <w:ind w:left="284" w:hanging="284"/>
+      </w:pPr>
       <w:r>
         <w:t xml:space="preserve">Geeks for Geeks. (2025, July 12). </w:t>
       </w:r>
@@ -3477,13 +3744,7 @@
         <w:t>Applications of Pattern Recognition</w:t>
       </w:r>
       <w:r>
-        <w:t xml:space="preserve">. </w:t>
-      </w:r>
-      <w:r>
-        <w:t>Geeks for Geeks</w:t>
-      </w:r>
-      <w:r>
-        <w:t>.</w:t>
+        <w:t>. Geeks for Geeks.</w:t>
       </w:r>
       <w:r>
         <w:br/>
@@ -3498,13 +3759,60 @@
       </w:hyperlink>
     </w:p>
     <w:p>
+      <w:pPr>
+        <w:ind w:left="284" w:hanging="284"/>
+      </w:pPr>
+      <w:r>
+        <w:t xml:space="preserve">Rexie, J. A. M., Raimond, K., </w:t>
+      </w:r>
+      <w:proofErr w:type="spellStart"/>
+      <w:r>
+        <w:t>Murugaaboopathy</w:t>
+      </w:r>
+      <w:proofErr w:type="spellEnd"/>
+      <w:r>
+        <w:t>, M., Brindha, D., &amp; Mulugeta, H. (2022). Lightweight Pattern Matching Method for DNA Sequencing in Internet of Medical Things. </w:t>
+      </w:r>
+      <w:r>
+        <w:rPr>
+          <w:i/>
+          <w:iCs/>
+        </w:rPr>
+        <w:t>Computational intelligence and neuroscience</w:t>
+      </w:r>
+      <w:r>
+        <w:t>, </w:t>
+      </w:r>
+      <w:r>
+        <w:rPr>
+          <w:i/>
+          <w:iCs/>
+        </w:rPr>
+        <w:t>2022</w:t>
+      </w:r>
+      <w:r>
+        <w:t xml:space="preserve">, 6980335. </w:t>
+      </w:r>
+      <w:hyperlink r:id="rId10" w:history="1">
+        <w:r>
+          <w:rPr>
+            <w:rStyle w:val="Hyperlink"/>
+          </w:rPr>
+          <w:t>https://doi.org/10.1155/2022/6980335</w:t>
+        </w:r>
+      </w:hyperlink>
+    </w:p>
+    <w:p>
+      <w:pPr>
+        <w:ind w:left="284" w:hanging="284"/>
+      </w:pPr>
       <w:r>
         <w:t>Wright, John, et al. "Sparse representation for computer vision and pattern recognition." Proceedings of the IEEE 98.6 (2010): 1031-1044.</w:t>
       </w:r>
       <w:r>
         <w:br/>
       </w:r>
-      <w:hyperlink r:id="rId10" w:history="1">
+      <w:hyperlink r:id="rId11" w:history="1">
         <w:r>
           <w:rPr>
             <w:rStyle w:val="Hyperlink"/>
@@ -3513,48 +3821,6 @@
         </w:r>
       </w:hyperlink>
     </w:p>
-    <w:p>
-      <w:r>
-        <w:t xml:space="preserve">Rexie, J. A. M., Raimond, K., </w:t>
-      </w:r>
-      <w:proofErr w:type="spellStart"/>
-      <w:r>
-        <w:t>Murugaaboopathy</w:t>
-      </w:r>
-      <w:proofErr w:type="spellEnd"/>
-      <w:r>
-        <w:t>, M., Brindha, D., &amp; Mulugeta, H. (2022). Lightweight Pattern Matching Method for DNA Sequencing in Internet of Medical Things. </w:t>
-      </w:r>
-      <w:r>
-        <w:rPr>
-          <w:i/>
-          <w:iCs/>
-        </w:rPr>
-        <w:t>Computational intelligence and neuroscience</w:t>
-      </w:r>
-      <w:r>
-        <w:t>, </w:t>
-      </w:r>
-      <w:r>
-        <w:rPr>
-          <w:i/>
-          <w:iCs/>
-        </w:rPr>
-        <w:t>2022</w:t>
-      </w:r>
-      <w:r>
-        <w:t xml:space="preserve">, 6980335. </w:t>
-      </w:r>
-      <w:hyperlink r:id="rId11" w:history="1">
-        <w:r>
-          <w:rPr>
-            <w:rStyle w:val="Hyperlink"/>
-          </w:rPr>
-          <w:t>https://doi.org/10.1155/2022/6980335</w:t>
-        </w:r>
-      </w:hyperlink>
-    </w:p>
-    <w:p/>
     <w:sectPr>
       <w:footerReference w:type="default" r:id="rId12"/>
       <w:pgSz w:w="11906" w:h="16838"/>
@@ -5694,6 +5960,7 @@
   <w:style w:type="character" w:default="1" w:styleId="DefaultParagraphFont">
     <w:name w:val="Default Paragraph Font"/>
     <w:uiPriority w:val="1"/>
+    <w:semiHidden/>
     <w:unhideWhenUsed/>
   </w:style>
   <w:style w:type="table" w:default="1" w:styleId="TableNormal">

</xml_diff>

<commit_message>
fixed the table of content
</commit_message>
<xml_diff>
--- a/Assignment 1 Report - Adam Merhi.docx
+++ b/Assignment 1 Report - Adam Merhi.docx
@@ -88,7 +88,7 @@
           <w:r>
             <w:fldChar w:fldCharType="separate"/>
           </w:r>
-          <w:hyperlink w:anchor="_Toc209888954" w:history="1">
+          <w:hyperlink w:anchor="_Toc209902260" w:history="1">
             <w:r>
               <w:rPr>
                 <w:rStyle w:val="Hyperlink"/>
@@ -115,7 +115,7 @@
                 <w:noProof/>
                 <w:webHidden/>
               </w:rPr>
-              <w:instrText xml:space="preserve"> PAGEREF _Toc209888954 \h </w:instrText>
+              <w:instrText xml:space="preserve"> PAGEREF _Toc209902260 \h </w:instrText>
             </w:r>
             <w:r>
               <w:rPr>
@@ -160,7 +160,7 @@
               <w:lang w:eastAsia="en-AU"/>
             </w:rPr>
           </w:pPr>
-          <w:hyperlink w:anchor="_Toc209888955" w:history="1">
+          <w:hyperlink w:anchor="_Toc209902261" w:history="1">
             <w:r>
               <w:rPr>
                 <w:rStyle w:val="Hyperlink"/>
@@ -187,7 +187,7 @@
                 <w:noProof/>
                 <w:webHidden/>
               </w:rPr>
-              <w:instrText xml:space="preserve"> PAGEREF _Toc209888955 \h </w:instrText>
+              <w:instrText xml:space="preserve"> PAGEREF _Toc209902261 \h </w:instrText>
             </w:r>
             <w:r>
               <w:rPr>
@@ -232,7 +232,7 @@
               <w:lang w:eastAsia="en-AU"/>
             </w:rPr>
           </w:pPr>
-          <w:hyperlink w:anchor="_Toc209888956" w:history="1">
+          <w:hyperlink w:anchor="_Toc209902262" w:history="1">
             <w:r>
               <w:rPr>
                 <w:rStyle w:val="Hyperlink"/>
@@ -259,7 +259,7 @@
                 <w:noProof/>
                 <w:webHidden/>
               </w:rPr>
-              <w:instrText xml:space="preserve"> PAGEREF _Toc209888956 \h </w:instrText>
+              <w:instrText xml:space="preserve"> PAGEREF _Toc209902262 \h </w:instrText>
             </w:r>
             <w:r>
               <w:rPr>
@@ -304,7 +304,7 @@
               <w:lang w:eastAsia="en-AU"/>
             </w:rPr>
           </w:pPr>
-          <w:hyperlink w:anchor="_Toc209888957" w:history="1">
+          <w:hyperlink w:anchor="_Toc209902263" w:history="1">
             <w:r>
               <w:rPr>
                 <w:rStyle w:val="Hyperlink"/>
@@ -331,7 +331,7 @@
                 <w:noProof/>
                 <w:webHidden/>
               </w:rPr>
-              <w:instrText xml:space="preserve"> PAGEREF _Toc209888957 \h </w:instrText>
+              <w:instrText xml:space="preserve"> PAGEREF _Toc209902263 \h </w:instrText>
             </w:r>
             <w:r>
               <w:rPr>
@@ -376,7 +376,7 @@
               <w:lang w:eastAsia="en-AU"/>
             </w:rPr>
           </w:pPr>
-          <w:hyperlink w:anchor="_Toc209888958" w:history="1">
+          <w:hyperlink w:anchor="_Toc209902264" w:history="1">
             <w:r>
               <w:rPr>
                 <w:rStyle w:val="Hyperlink"/>
@@ -403,7 +403,7 @@
                 <w:noProof/>
                 <w:webHidden/>
               </w:rPr>
-              <w:instrText xml:space="preserve"> PAGEREF _Toc209888958 \h </w:instrText>
+              <w:instrText xml:space="preserve"> PAGEREF _Toc209902264 \h </w:instrText>
             </w:r>
             <w:r>
               <w:rPr>
@@ -448,7 +448,7 @@
               <w:lang w:eastAsia="en-AU"/>
             </w:rPr>
           </w:pPr>
-          <w:hyperlink w:anchor="_Toc209888959" w:history="1">
+          <w:hyperlink w:anchor="_Toc209902265" w:history="1">
             <w:r>
               <w:rPr>
                 <w:rStyle w:val="Hyperlink"/>
@@ -475,7 +475,7 @@
                 <w:noProof/>
                 <w:webHidden/>
               </w:rPr>
-              <w:instrText xml:space="preserve"> PAGEREF _Toc209888959 \h </w:instrText>
+              <w:instrText xml:space="preserve"> PAGEREF _Toc209902265 \h </w:instrText>
             </w:r>
             <w:r>
               <w:rPr>
@@ -520,7 +520,7 @@
               <w:lang w:eastAsia="en-AU"/>
             </w:rPr>
           </w:pPr>
-          <w:hyperlink w:anchor="_Toc209888960" w:history="1">
+          <w:hyperlink w:anchor="_Toc209902266" w:history="1">
             <w:r>
               <w:rPr>
                 <w:rStyle w:val="Hyperlink"/>
@@ -547,7 +547,7 @@
                 <w:noProof/>
                 <w:webHidden/>
               </w:rPr>
-              <w:instrText xml:space="preserve"> PAGEREF _Toc209888960 \h </w:instrText>
+              <w:instrText xml:space="preserve"> PAGEREF _Toc209902266 \h </w:instrText>
             </w:r>
             <w:r>
               <w:rPr>
@@ -592,7 +592,7 @@
               <w:lang w:eastAsia="en-AU"/>
             </w:rPr>
           </w:pPr>
-          <w:hyperlink w:anchor="_Toc209888961" w:history="1">
+          <w:hyperlink w:anchor="_Toc209902267" w:history="1">
             <w:r>
               <w:rPr>
                 <w:rStyle w:val="Hyperlink"/>
@@ -619,7 +619,7 @@
                 <w:noProof/>
                 <w:webHidden/>
               </w:rPr>
-              <w:instrText xml:space="preserve"> PAGEREF _Toc209888961 \h </w:instrText>
+              <w:instrText xml:space="preserve"> PAGEREF _Toc209902267 \h </w:instrText>
             </w:r>
             <w:r>
               <w:rPr>
@@ -664,7 +664,7 @@
               <w:lang w:eastAsia="en-AU"/>
             </w:rPr>
           </w:pPr>
-          <w:hyperlink w:anchor="_Toc209888962" w:history="1">
+          <w:hyperlink w:anchor="_Toc209902268" w:history="1">
             <w:r>
               <w:rPr>
                 <w:rStyle w:val="Hyperlink"/>
@@ -691,7 +691,7 @@
                 <w:noProof/>
                 <w:webHidden/>
               </w:rPr>
-              <w:instrText xml:space="preserve"> PAGEREF _Toc209888962 \h </w:instrText>
+              <w:instrText xml:space="preserve"> PAGEREF _Toc209902268 \h </w:instrText>
             </w:r>
             <w:r>
               <w:rPr>
@@ -736,7 +736,7 @@
               <w:lang w:eastAsia="en-AU"/>
             </w:rPr>
           </w:pPr>
-          <w:hyperlink w:anchor="_Toc209888963" w:history="1">
+          <w:hyperlink w:anchor="_Toc209902269" w:history="1">
             <w:r>
               <w:rPr>
                 <w:rStyle w:val="Hyperlink"/>
@@ -763,7 +763,7 @@
                 <w:noProof/>
                 <w:webHidden/>
               </w:rPr>
-              <w:instrText xml:space="preserve"> PAGEREF _Toc209888963 \h </w:instrText>
+              <w:instrText xml:space="preserve"> PAGEREF _Toc209902269 \h </w:instrText>
             </w:r>
             <w:r>
               <w:rPr>
@@ -808,7 +808,7 @@
               <w:lang w:eastAsia="en-AU"/>
             </w:rPr>
           </w:pPr>
-          <w:hyperlink w:anchor="_Toc209888964" w:history="1">
+          <w:hyperlink w:anchor="_Toc209902270" w:history="1">
             <w:r>
               <w:rPr>
                 <w:rStyle w:val="Hyperlink"/>
@@ -835,7 +835,7 @@
                 <w:noProof/>
                 <w:webHidden/>
               </w:rPr>
-              <w:instrText xml:space="preserve"> PAGEREF _Toc209888964 \h </w:instrText>
+              <w:instrText xml:space="preserve"> PAGEREF _Toc209902270 \h </w:instrText>
             </w:r>
             <w:r>
               <w:rPr>
@@ -880,7 +880,7 @@
               <w:lang w:eastAsia="en-AU"/>
             </w:rPr>
           </w:pPr>
-          <w:hyperlink w:anchor="_Toc209888965" w:history="1">
+          <w:hyperlink w:anchor="_Toc209902271" w:history="1">
             <w:r>
               <w:rPr>
                 <w:rStyle w:val="Hyperlink"/>
@@ -907,7 +907,7 @@
                 <w:noProof/>
                 <w:webHidden/>
               </w:rPr>
-              <w:instrText xml:space="preserve"> PAGEREF _Toc209888965 \h </w:instrText>
+              <w:instrText xml:space="preserve"> PAGEREF _Toc209902271 \h </w:instrText>
             </w:r>
             <w:r>
               <w:rPr>
@@ -952,7 +952,7 @@
               <w:lang w:eastAsia="en-AU"/>
             </w:rPr>
           </w:pPr>
-          <w:hyperlink w:anchor="_Toc209888966" w:history="1">
+          <w:hyperlink w:anchor="_Toc209902272" w:history="1">
             <w:r>
               <w:rPr>
                 <w:rStyle w:val="Hyperlink"/>
@@ -979,7 +979,7 @@
                 <w:noProof/>
                 <w:webHidden/>
               </w:rPr>
-              <w:instrText xml:space="preserve"> PAGEREF _Toc209888966 \h </w:instrText>
+              <w:instrText xml:space="preserve"> PAGEREF _Toc209902272 \h </w:instrText>
             </w:r>
             <w:r>
               <w:rPr>
@@ -1024,7 +1024,7 @@
               <w:lang w:eastAsia="en-AU"/>
             </w:rPr>
           </w:pPr>
-          <w:hyperlink w:anchor="_Toc209888967" w:history="1">
+          <w:hyperlink w:anchor="_Toc209902273" w:history="1">
             <w:r>
               <w:rPr>
                 <w:rStyle w:val="Hyperlink"/>
@@ -1051,7 +1051,7 @@
                 <w:noProof/>
                 <w:webHidden/>
               </w:rPr>
-              <w:instrText xml:space="preserve"> PAGEREF _Toc209888967 \h </w:instrText>
+              <w:instrText xml:space="preserve"> PAGEREF _Toc209902273 \h </w:instrText>
             </w:r>
             <w:r>
               <w:rPr>
@@ -1096,7 +1096,7 @@
               <w:lang w:eastAsia="en-AU"/>
             </w:rPr>
           </w:pPr>
-          <w:hyperlink w:anchor="_Toc209888968" w:history="1">
+          <w:hyperlink w:anchor="_Toc209902274" w:history="1">
             <w:r>
               <w:rPr>
                 <w:rStyle w:val="Hyperlink"/>
@@ -1123,7 +1123,7 @@
                 <w:noProof/>
                 <w:webHidden/>
               </w:rPr>
-              <w:instrText xml:space="preserve"> PAGEREF _Toc209888968 \h </w:instrText>
+              <w:instrText xml:space="preserve"> PAGEREF _Toc209902274 \h </w:instrText>
             </w:r>
             <w:r>
               <w:rPr>
@@ -1168,7 +1168,7 @@
               <w:lang w:eastAsia="en-AU"/>
             </w:rPr>
           </w:pPr>
-          <w:hyperlink w:anchor="_Toc209888969" w:history="1">
+          <w:hyperlink w:anchor="_Toc209902275" w:history="1">
             <w:r>
               <w:rPr>
                 <w:rStyle w:val="Hyperlink"/>
@@ -1195,7 +1195,7 @@
                 <w:noProof/>
                 <w:webHidden/>
               </w:rPr>
-              <w:instrText xml:space="preserve"> PAGEREF _Toc209888969 \h </w:instrText>
+              <w:instrText xml:space="preserve"> PAGEREF _Toc209902275 \h </w:instrText>
             </w:r>
             <w:r>
               <w:rPr>
@@ -1240,7 +1240,7 @@
               <w:lang w:eastAsia="en-AU"/>
             </w:rPr>
           </w:pPr>
-          <w:hyperlink w:anchor="_Toc209888970" w:history="1">
+          <w:hyperlink w:anchor="_Toc209902276" w:history="1">
             <w:r>
               <w:rPr>
                 <w:rStyle w:val="Hyperlink"/>
@@ -1267,7 +1267,7 @@
                 <w:noProof/>
                 <w:webHidden/>
               </w:rPr>
-              <w:instrText xml:space="preserve"> PAGEREF _Toc209888970 \h </w:instrText>
+              <w:instrText xml:space="preserve"> PAGEREF _Toc209902276 \h </w:instrText>
             </w:r>
             <w:r>
               <w:rPr>
@@ -1312,7 +1312,7 @@
               <w:lang w:eastAsia="en-AU"/>
             </w:rPr>
           </w:pPr>
-          <w:hyperlink w:anchor="_Toc209888971" w:history="1">
+          <w:hyperlink w:anchor="_Toc209902277" w:history="1">
             <w:r>
               <w:rPr>
                 <w:rStyle w:val="Hyperlink"/>
@@ -1339,7 +1339,7 @@
                 <w:noProof/>
                 <w:webHidden/>
               </w:rPr>
-              <w:instrText xml:space="preserve"> PAGEREF _Toc209888971 \h </w:instrText>
+              <w:instrText xml:space="preserve"> PAGEREF _Toc209902277 \h </w:instrText>
             </w:r>
             <w:r>
               <w:rPr>
@@ -1384,7 +1384,7 @@
               <w:lang w:eastAsia="en-AU"/>
             </w:rPr>
           </w:pPr>
-          <w:hyperlink w:anchor="_Toc209888972" w:history="1">
+          <w:hyperlink w:anchor="_Toc209902278" w:history="1">
             <w:r>
               <w:rPr>
                 <w:rStyle w:val="Hyperlink"/>
@@ -1411,7 +1411,79 @@
                 <w:noProof/>
                 <w:webHidden/>
               </w:rPr>
-              <w:instrText xml:space="preserve"> PAGEREF _Toc209888972 \h </w:instrText>
+              <w:instrText xml:space="preserve"> PAGEREF _Toc209902278 \h </w:instrText>
+            </w:r>
+            <w:r>
+              <w:rPr>
+                <w:noProof/>
+                <w:webHidden/>
+              </w:rPr>
+            </w:r>
+            <w:r>
+              <w:rPr>
+                <w:noProof/>
+                <w:webHidden/>
+              </w:rPr>
+              <w:fldChar w:fldCharType="separate"/>
+            </w:r>
+            <w:r>
+              <w:rPr>
+                <w:noProof/>
+                <w:webHidden/>
+              </w:rPr>
+              <w:t>8</w:t>
+            </w:r>
+            <w:r>
+              <w:rPr>
+                <w:noProof/>
+                <w:webHidden/>
+              </w:rPr>
+              <w:fldChar w:fldCharType="end"/>
+            </w:r>
+          </w:hyperlink>
+        </w:p>
+        <w:p>
+          <w:pPr>
+            <w:pStyle w:val="TOC3"/>
+            <w:tabs>
+              <w:tab w:val="right" w:leader="dot" w:pos="9016"/>
+            </w:tabs>
+            <w:rPr>
+              <w:rFonts w:eastAsiaTheme="minorEastAsia"/>
+              <w:noProof/>
+              <w:sz w:val="24"/>
+              <w:szCs w:val="24"/>
+              <w:lang w:eastAsia="en-AU"/>
+            </w:rPr>
+          </w:pPr>
+          <w:hyperlink w:anchor="_Toc209902279" w:history="1">
+            <w:r>
+              <w:rPr>
+                <w:rStyle w:val="Hyperlink"/>
+                <w:noProof/>
+              </w:rPr>
+              <w:t>6.1.1 Helper functions</w:t>
+            </w:r>
+            <w:r>
+              <w:rPr>
+                <w:noProof/>
+                <w:webHidden/>
+              </w:rPr>
+              <w:tab/>
+            </w:r>
+            <w:r>
+              <w:rPr>
+                <w:noProof/>
+                <w:webHidden/>
+              </w:rPr>
+              <w:fldChar w:fldCharType="begin"/>
+            </w:r>
+            <w:r>
+              <w:rPr>
+                <w:noProof/>
+                <w:webHidden/>
+              </w:rPr>
+              <w:instrText xml:space="preserve"> PAGEREF _Toc209902279 \h </w:instrText>
             </w:r>
             <w:r>
               <w:rPr>
@@ -1456,7 +1528,7 @@
               <w:lang w:eastAsia="en-AU"/>
             </w:rPr>
           </w:pPr>
-          <w:hyperlink w:anchor="_Toc209888973" w:history="1">
+          <w:hyperlink w:anchor="_Toc209902280" w:history="1">
             <w:r>
               <w:rPr>
                 <w:rStyle w:val="Hyperlink"/>
@@ -1483,7 +1555,7 @@
                 <w:noProof/>
                 <w:webHidden/>
               </w:rPr>
-              <w:instrText xml:space="preserve"> PAGEREF _Toc209888973 \h </w:instrText>
+              <w:instrText xml:space="preserve"> PAGEREF _Toc209902280 \h </w:instrText>
             </w:r>
             <w:r>
               <w:rPr>
@@ -1528,7 +1600,7 @@
               <w:lang w:eastAsia="en-AU"/>
             </w:rPr>
           </w:pPr>
-          <w:hyperlink w:anchor="_Toc209888974" w:history="1">
+          <w:hyperlink w:anchor="_Toc209902281" w:history="1">
             <w:r>
               <w:rPr>
                 <w:rStyle w:val="Hyperlink"/>
@@ -1555,7 +1627,7 @@
                 <w:noProof/>
                 <w:webHidden/>
               </w:rPr>
-              <w:instrText xml:space="preserve"> PAGEREF _Toc209888974 \h </w:instrText>
+              <w:instrText xml:space="preserve"> PAGEREF _Toc209902281 \h </w:instrText>
             </w:r>
             <w:r>
               <w:rPr>
@@ -1575,7 +1647,7 @@
                 <w:noProof/>
                 <w:webHidden/>
               </w:rPr>
-              <w:t>8</w:t>
+              <w:t>9</w:t>
             </w:r>
             <w:r>
               <w:rPr>
@@ -1600,7 +1672,7 @@
               <w:lang w:eastAsia="en-AU"/>
             </w:rPr>
           </w:pPr>
-          <w:hyperlink w:anchor="_Toc209888975" w:history="1">
+          <w:hyperlink w:anchor="_Toc209902282" w:history="1">
             <w:r>
               <w:rPr>
                 <w:rStyle w:val="Hyperlink"/>
@@ -1627,7 +1699,7 @@
                 <w:noProof/>
                 <w:webHidden/>
               </w:rPr>
-              <w:instrText xml:space="preserve"> PAGEREF _Toc209888975 \h </w:instrText>
+              <w:instrText xml:space="preserve"> PAGEREF _Toc209902282 \h </w:instrText>
             </w:r>
             <w:r>
               <w:rPr>
@@ -1647,7 +1719,7 @@
                 <w:noProof/>
                 <w:webHidden/>
               </w:rPr>
-              <w:t>9</w:t>
+              <w:t>10</w:t>
             </w:r>
             <w:r>
               <w:rPr>
@@ -1755,23 +1827,7 @@
           <w:sz w:val="24"/>
           <w:szCs w:val="24"/>
         </w:rPr>
-        <w:t xml:space="preserve"> This report does switch between the </w:t>
-      </w:r>
-      <w:r>
-        <w:rPr>
-          <w:rFonts w:ascii="Times New Roman" w:hAnsi="Times New Roman" w:cs="Times New Roman"/>
-          <w:sz w:val="24"/>
-          <w:szCs w:val="24"/>
-        </w:rPr>
-        <w:t>term’s</w:t>
-      </w:r>
-      <w:r>
-        <w:rPr>
-          <w:rFonts w:ascii="Times New Roman" w:hAnsi="Times New Roman" w:cs="Times New Roman"/>
-          <w:sz w:val="24"/>
-          <w:szCs w:val="24"/>
-        </w:rPr>
-        <w:t xml:space="preserve"> “prefix” and “sub pattern”, both words in this report are referring to the same thing which can also be referred to as the prefix suffix. This was not intentional but while reading research and writing this report I mistakenly interchanged the words.</w:t>
+        <w:t xml:space="preserve"> This report does switch between the term’s “prefix” and “sub pattern”, both words in this report are referring to the same thing which can also be referred to as the prefix suffix. This was not intentional but while reading research and writing this report I mistakenly interchanged the words.</w:t>
       </w:r>
     </w:p>
     <w:p>
@@ -1800,7 +1856,7 @@
       <w:pPr>
         <w:pStyle w:val="Heading1"/>
       </w:pPr>
-      <w:bookmarkStart w:id="0" w:name="_Toc209888954"/>
+      <w:bookmarkStart w:id="0" w:name="_Toc209902260"/>
       <w:r>
         <w:lastRenderedPageBreak/>
         <w:t xml:space="preserve">1. </w:t>
@@ -1814,7 +1870,7 @@
       <w:pPr>
         <w:pStyle w:val="Heading2"/>
       </w:pPr>
-      <w:bookmarkStart w:id="1" w:name="_Toc209888955"/>
+      <w:bookmarkStart w:id="1" w:name="_Toc209902261"/>
       <w:r>
         <w:t>1.1</w:t>
       </w:r>
@@ -1847,7 +1903,7 @@
       <w:pPr>
         <w:pStyle w:val="Heading2"/>
       </w:pPr>
-      <w:bookmarkStart w:id="2" w:name="_Toc209888956"/>
+      <w:bookmarkStart w:id="2" w:name="_Toc209902262"/>
       <w:r>
         <w:t xml:space="preserve">1.2 </w:t>
       </w:r>
@@ -1926,7 +1982,7 @@
       <w:pPr>
         <w:pStyle w:val="Heading1"/>
       </w:pPr>
-      <w:bookmarkStart w:id="3" w:name="_Toc209888957"/>
+      <w:bookmarkStart w:id="3" w:name="_Toc209902263"/>
       <w:r>
         <w:t xml:space="preserve">2. </w:t>
       </w:r>
@@ -1939,7 +1995,7 @@
       <w:pPr>
         <w:pStyle w:val="Heading2"/>
       </w:pPr>
-      <w:bookmarkStart w:id="4" w:name="_Toc209888958"/>
+      <w:bookmarkStart w:id="4" w:name="_Toc209902264"/>
       <w:r>
         <w:t xml:space="preserve">2.1 </w:t>
       </w:r>
@@ -1986,25 +2042,7 @@
           <w:sz w:val="24"/>
           <w:szCs w:val="24"/>
         </w:rPr>
-        <w:t xml:space="preserve"> intense computation going manually through every single index of a string at worst iterating </w:t>
-      </w:r>
-      <w:proofErr w:type="spellStart"/>
-      <w:r>
-        <w:rPr>
-          <w:rFonts w:ascii="Times New Roman" w:hAnsi="Times New Roman" w:cs="Times New Roman"/>
-          <w:sz w:val="24"/>
-          <w:szCs w:val="24"/>
-        </w:rPr>
-        <w:t>pattern.size</w:t>
-      </w:r>
-      <w:proofErr w:type="spellEnd"/>
-      <w:r>
-        <w:rPr>
-          <w:rFonts w:ascii="Times New Roman" w:hAnsi="Times New Roman" w:cs="Times New Roman"/>
-          <w:sz w:val="24"/>
-          <w:szCs w:val="24"/>
-        </w:rPr>
-        <w:t xml:space="preserve"> </w:t>
+        <w:t xml:space="preserve"> intense computation going manually through every single index of a string at worst iterating pattern.size </w:t>
       </w:r>
       <w:r>
         <w:rPr>
@@ -2043,7 +2081,7 @@
       <w:pPr>
         <w:pStyle w:val="Heading3"/>
       </w:pPr>
-      <w:bookmarkStart w:id="5" w:name="_Toc209888959"/>
+      <w:bookmarkStart w:id="5" w:name="_Toc209902265"/>
       <w:r>
         <w:t>2.1.1 Text and Data Processing</w:t>
       </w:r>
@@ -2087,7 +2125,7 @@
       <w:pPr>
         <w:pStyle w:val="Heading3"/>
       </w:pPr>
-      <w:bookmarkStart w:id="6" w:name="_Toc209888960"/>
+      <w:bookmarkStart w:id="6" w:name="_Toc209902266"/>
       <w:r>
         <w:lastRenderedPageBreak/>
         <w:t>2.1.2 Machine Learning &amp; AI</w:t>
@@ -2179,9 +2217,91 @@
           <w:sz w:val="24"/>
           <w:szCs w:val="24"/>
         </w:rPr>
-        <w:t xml:space="preserve">While image representation and reconstruction has been the most popular goal of sparse </w:t>
-      </w:r>
-      <w:proofErr w:type="spellStart"/>
+        <w:t>While image representation and reconstruction has been the most popular goal of sparse modeling and dictionary learning, other important image science applications are starting to be addressed by this framework, in particular, classification and detection.</w:t>
+      </w:r>
+      <w:r>
+        <w:rPr>
+          <w:rFonts w:ascii="Times New Roman" w:hAnsi="Times New Roman" w:cs="Times New Roman"/>
+          <w:sz w:val="24"/>
+          <w:szCs w:val="24"/>
+        </w:rPr>
+        <w:t>"</w:t>
+      </w:r>
+      <w:r>
+        <w:rPr>
+          <w:rFonts w:ascii="Times New Roman" w:hAnsi="Times New Roman" w:cs="Times New Roman"/>
+          <w:sz w:val="24"/>
+          <w:szCs w:val="24"/>
+        </w:rPr>
+        <w:t xml:space="preserve"> </w:t>
+      </w:r>
+      <w:r>
+        <w:rPr>
+          <w:rFonts w:ascii="Times New Roman" w:hAnsi="Times New Roman" w:cs="Times New Roman"/>
+          <w:sz w:val="24"/>
+          <w:szCs w:val="24"/>
+        </w:rPr>
+        <w:t>(</w:t>
+      </w:r>
+      <w:r>
+        <w:rPr>
+          <w:rFonts w:ascii="Times New Roman" w:hAnsi="Times New Roman" w:cs="Times New Roman"/>
+          <w:sz w:val="24"/>
+          <w:szCs w:val="24"/>
+        </w:rPr>
+        <w:t>Wright et al., 2010</w:t>
+      </w:r>
+      <w:r>
+        <w:rPr>
+          <w:rFonts w:ascii="Times New Roman" w:hAnsi="Times New Roman" w:cs="Times New Roman"/>
+          <w:sz w:val="24"/>
+          <w:szCs w:val="24"/>
+        </w:rPr>
+        <w:t>)</w:t>
+      </w:r>
+      <w:r>
+        <w:rPr>
+          <w:rFonts w:ascii="Times New Roman" w:hAnsi="Times New Roman" w:cs="Times New Roman"/>
+          <w:sz w:val="24"/>
+          <w:szCs w:val="24"/>
+        </w:rPr>
+        <w:t>.</w:t>
+      </w:r>
+    </w:p>
+    <w:p>
+      <w:pPr>
+        <w:pStyle w:val="Heading3"/>
+      </w:pPr>
+      <w:bookmarkStart w:id="7" w:name="_Toc209902267"/>
+      <w:r>
+        <w:t>2.1.3 Bioinformation</w:t>
+      </w:r>
+      <w:bookmarkEnd w:id="7"/>
+    </w:p>
+    <w:p>
+      <w:pPr>
+        <w:rPr>
+          <w:rFonts w:ascii="Times New Roman" w:hAnsi="Times New Roman" w:cs="Times New Roman"/>
+          <w:sz w:val="24"/>
+          <w:szCs w:val="24"/>
+        </w:rPr>
+      </w:pPr>
+      <w:r>
+        <w:rPr>
+          <w:rFonts w:ascii="Times New Roman" w:hAnsi="Times New Roman" w:cs="Times New Roman"/>
+          <w:sz w:val="24"/>
+          <w:szCs w:val="24"/>
+        </w:rPr>
+        <w:t xml:space="preserve">Pattern matching is used in bioinformatics to find sequences like DNA, RNA, and proteins. It is vital to detect mutations align sequences and assemble genomes. This can be seen in this quote from </w:t>
+      </w:r>
+      <w:r>
+        <w:rPr>
+          <w:rFonts w:ascii="Times New Roman" w:hAnsi="Times New Roman" w:cs="Times New Roman"/>
+          <w:sz w:val="24"/>
+          <w:szCs w:val="24"/>
+        </w:rPr>
+        <w:t>a published research paper around pattern matching methods for DNA Sequencing in internet of Medical Things, “</w:t>
+      </w:r>
       <w:r>
         <w:rPr>
           <w:rFonts w:ascii="Times New Roman" w:hAnsi="Times New Roman" w:cs="Times New Roman"/>
@@ -2190,110 +2310,6 @@
           <w:sz w:val="24"/>
           <w:szCs w:val="24"/>
         </w:rPr>
-        <w:t>modeling</w:t>
-      </w:r>
-      <w:proofErr w:type="spellEnd"/>
-      <w:r>
-        <w:rPr>
-          <w:rFonts w:ascii="Times New Roman" w:hAnsi="Times New Roman" w:cs="Times New Roman"/>
-          <w:i/>
-          <w:iCs/>
-          <w:sz w:val="24"/>
-          <w:szCs w:val="24"/>
-        </w:rPr>
-        <w:t xml:space="preserve"> and dictionary learning, other important image science applications are starting to be addressed by this framework, in particular, classification and detection.</w:t>
-      </w:r>
-      <w:r>
-        <w:rPr>
-          <w:rFonts w:ascii="Times New Roman" w:hAnsi="Times New Roman" w:cs="Times New Roman"/>
-          <w:sz w:val="24"/>
-          <w:szCs w:val="24"/>
-        </w:rPr>
-        <w:t>"</w:t>
-      </w:r>
-      <w:r>
-        <w:rPr>
-          <w:rFonts w:ascii="Times New Roman" w:hAnsi="Times New Roman" w:cs="Times New Roman"/>
-          <w:sz w:val="24"/>
-          <w:szCs w:val="24"/>
-        </w:rPr>
-        <w:t xml:space="preserve"> </w:t>
-      </w:r>
-      <w:r>
-        <w:rPr>
-          <w:rFonts w:ascii="Times New Roman" w:hAnsi="Times New Roman" w:cs="Times New Roman"/>
-          <w:sz w:val="24"/>
-          <w:szCs w:val="24"/>
-        </w:rPr>
-        <w:t>(</w:t>
-      </w:r>
-      <w:r>
-        <w:rPr>
-          <w:rFonts w:ascii="Times New Roman" w:hAnsi="Times New Roman" w:cs="Times New Roman"/>
-          <w:sz w:val="24"/>
-          <w:szCs w:val="24"/>
-        </w:rPr>
-        <w:t>Wright et al., 2010</w:t>
-      </w:r>
-      <w:r>
-        <w:rPr>
-          <w:rFonts w:ascii="Times New Roman" w:hAnsi="Times New Roman" w:cs="Times New Roman"/>
-          <w:sz w:val="24"/>
-          <w:szCs w:val="24"/>
-        </w:rPr>
-        <w:t>)</w:t>
-      </w:r>
-      <w:r>
-        <w:rPr>
-          <w:rFonts w:ascii="Times New Roman" w:hAnsi="Times New Roman" w:cs="Times New Roman"/>
-          <w:sz w:val="24"/>
-          <w:szCs w:val="24"/>
-        </w:rPr>
-        <w:t>.</w:t>
-      </w:r>
-    </w:p>
-    <w:p>
-      <w:pPr>
-        <w:pStyle w:val="Heading3"/>
-      </w:pPr>
-      <w:bookmarkStart w:id="7" w:name="_Toc209888961"/>
-      <w:r>
-        <w:t>2.1.3 Bioinformation</w:t>
-      </w:r>
-      <w:bookmarkEnd w:id="7"/>
-    </w:p>
-    <w:p>
-      <w:pPr>
-        <w:rPr>
-          <w:rFonts w:ascii="Times New Roman" w:hAnsi="Times New Roman" w:cs="Times New Roman"/>
-          <w:sz w:val="24"/>
-          <w:szCs w:val="24"/>
-        </w:rPr>
-      </w:pPr>
-      <w:r>
-        <w:rPr>
-          <w:rFonts w:ascii="Times New Roman" w:hAnsi="Times New Roman" w:cs="Times New Roman"/>
-          <w:sz w:val="24"/>
-          <w:szCs w:val="24"/>
-        </w:rPr>
-        <w:t xml:space="preserve">Pattern matching is used in bioinformatics to find sequences like DNA, RNA, and proteins. It is vital to detect mutations align sequences and assemble genomes. This can be seen in this quote from </w:t>
-      </w:r>
-      <w:r>
-        <w:rPr>
-          <w:rFonts w:ascii="Times New Roman" w:hAnsi="Times New Roman" w:cs="Times New Roman"/>
-          <w:sz w:val="24"/>
-          <w:szCs w:val="24"/>
-        </w:rPr>
-        <w:t>a published research paper around pattern matching methods for DNA Sequencing in internet of Medical Things, “</w:t>
-      </w:r>
-      <w:r>
-        <w:rPr>
-          <w:rFonts w:ascii="Times New Roman" w:hAnsi="Times New Roman" w:cs="Times New Roman"/>
-          <w:i/>
-          <w:iCs/>
-          <w:sz w:val="24"/>
-          <w:szCs w:val="24"/>
-        </w:rPr>
         <w:t>Read alignment is affected by some sequencing technology parameters, including the read length and error rate. It is essential to determine the actual location of each read, according to the reference. The exact location cannot be determined in advance, so the matching has to be done approximately</w:t>
       </w:r>
       <w:r>
@@ -2309,7 +2325,7 @@
       <w:pPr>
         <w:pStyle w:val="Heading2"/>
       </w:pPr>
-      <w:bookmarkStart w:id="8" w:name="_Toc209888962"/>
+      <w:bookmarkStart w:id="8" w:name="_Toc209902268"/>
       <w:r>
         <w:t xml:space="preserve">2.2 </w:t>
       </w:r>
@@ -2356,7 +2372,7 @@
       <w:pPr>
         <w:pStyle w:val="Heading1"/>
       </w:pPr>
-      <w:bookmarkStart w:id="9" w:name="_Toc209888963"/>
+      <w:bookmarkStart w:id="9" w:name="_Toc209902269"/>
       <w:r>
         <w:t xml:space="preserve">3. </w:t>
       </w:r>
@@ -2379,25 +2395,7 @@
           <w:sz w:val="24"/>
           <w:szCs w:val="24"/>
         </w:rPr>
-        <w:t>The time complexity for a naïve approach is O(</w:t>
-      </w:r>
-      <w:proofErr w:type="spellStart"/>
-      <w:r>
-        <w:rPr>
-          <w:rFonts w:ascii="Times New Roman" w:hAnsi="Times New Roman" w:cs="Times New Roman"/>
-          <w:sz w:val="24"/>
-          <w:szCs w:val="24"/>
-        </w:rPr>
-        <w:t>mn</w:t>
-      </w:r>
-      <w:proofErr w:type="spellEnd"/>
-      <w:r>
-        <w:rPr>
-          <w:rFonts w:ascii="Times New Roman" w:hAnsi="Times New Roman" w:cs="Times New Roman"/>
-          <w:sz w:val="24"/>
-          <w:szCs w:val="24"/>
-        </w:rPr>
-        <w:t>). This is due to the fact that at worst case, we need to test every single character within the patter against every single character within the string.</w:t>
+        <w:t>The time complexity for a naïve approach is O(mn). This is due to the fact that at worst case, we need to test every single character within the patter against every single character within the string.</w:t>
       </w:r>
     </w:p>
     <w:p>
@@ -2421,7 +2419,7 @@
       <w:pPr>
         <w:pStyle w:val="Heading2"/>
       </w:pPr>
-      <w:bookmarkStart w:id="10" w:name="_Toc209888964"/>
+      <w:bookmarkStart w:id="10" w:name="_Toc209902270"/>
       <w:r>
         <w:t>3.1 Processing Steps</w:t>
       </w:r>
@@ -2523,7 +2521,7 @@
       <w:pPr>
         <w:pStyle w:val="Heading2"/>
       </w:pPr>
-      <w:bookmarkStart w:id="11" w:name="_Toc209888965"/>
+      <w:bookmarkStart w:id="11" w:name="_Toc209902271"/>
       <w:r>
         <w:t>3.2 Search Phase</w:t>
       </w:r>
@@ -2567,7 +2565,7 @@
       <w:pPr>
         <w:pStyle w:val="Heading1"/>
       </w:pPr>
-      <w:bookmarkStart w:id="12" w:name="_Toc209888966"/>
+      <w:bookmarkStart w:id="12" w:name="_Toc209902272"/>
       <w:r>
         <w:t xml:space="preserve">4. </w:t>
       </w:r>
@@ -2580,7 +2578,7 @@
       <w:pPr>
         <w:pStyle w:val="Heading2"/>
       </w:pPr>
-      <w:bookmarkStart w:id="13" w:name="_Toc209888967"/>
+      <w:bookmarkStart w:id="13" w:name="_Toc209902273"/>
       <w:r>
         <w:t>4.1 Code Breakdown</w:t>
       </w:r>
@@ -2626,7 +2624,6 @@
         </w:rPr>
         <w:t xml:space="preserve">from index 1 up to </w:t>
       </w:r>
-      <w:proofErr w:type="spellStart"/>
       <w:r>
         <w:rPr>
           <w:rFonts w:ascii="Times New Roman" w:hAnsi="Times New Roman" w:cs="Times New Roman"/>
@@ -2635,7 +2632,6 @@
         </w:rPr>
         <w:t>pattern.size</w:t>
       </w:r>
-      <w:proofErr w:type="spellEnd"/>
       <w:r>
         <w:rPr>
           <w:rFonts w:ascii="Times New Roman" w:hAnsi="Times New Roman" w:cs="Times New Roman"/>
@@ -3064,7 +3060,7 @@
       <w:pPr>
         <w:pStyle w:val="Heading1"/>
       </w:pPr>
-      <w:bookmarkStart w:id="14" w:name="_Toc209888968"/>
+      <w:bookmarkStart w:id="14" w:name="_Toc209902274"/>
       <w:r>
         <w:t xml:space="preserve">5. </w:t>
       </w:r>
@@ -3077,7 +3073,7 @@
       <w:pPr>
         <w:pStyle w:val="Heading2"/>
       </w:pPr>
-      <w:bookmarkStart w:id="15" w:name="_Toc209888969"/>
+      <w:bookmarkStart w:id="15" w:name="_Toc209902275"/>
       <w:r>
         <w:t>5.1 Assumptions</w:t>
       </w:r>
@@ -3097,43 +3093,7 @@
           <w:sz w:val="24"/>
           <w:szCs w:val="24"/>
         </w:rPr>
-        <w:t>In my solution, the assumptions made were that strings and patterns were not empty and that the pattern matching was not case sensitive. For this however, we do test that the pattern is not empty in line 30 (if (</w:t>
-      </w:r>
-      <w:proofErr w:type="spellStart"/>
-      <w:r>
-        <w:rPr>
-          <w:rFonts w:ascii="Times New Roman" w:hAnsi="Times New Roman" w:cs="Times New Roman"/>
-          <w:sz w:val="24"/>
-          <w:szCs w:val="24"/>
-        </w:rPr>
-        <w:t>pattern.empty</w:t>
-      </w:r>
-      <w:proofErr w:type="spellEnd"/>
-      <w:r>
-        <w:rPr>
-          <w:rFonts w:ascii="Times New Roman" w:hAnsi="Times New Roman" w:cs="Times New Roman"/>
-          <w:sz w:val="24"/>
-          <w:szCs w:val="24"/>
-        </w:rPr>
-        <w:t xml:space="preserve">()) return </w:t>
-      </w:r>
-      <w:proofErr w:type="spellStart"/>
-      <w:r>
-        <w:rPr>
-          <w:rFonts w:ascii="Times New Roman" w:hAnsi="Times New Roman" w:cs="Times New Roman"/>
-          <w:sz w:val="24"/>
-          <w:szCs w:val="24"/>
-        </w:rPr>
-        <w:t>patternsFound</w:t>
-      </w:r>
-      <w:proofErr w:type="spellEnd"/>
-      <w:r>
-        <w:rPr>
-          <w:rFonts w:ascii="Times New Roman" w:hAnsi="Times New Roman" w:cs="Times New Roman"/>
-          <w:sz w:val="24"/>
-          <w:szCs w:val="24"/>
-        </w:rPr>
-        <w:t>;)</w:t>
+        <w:t>In my solution, the assumptions made were that strings and patterns were not empty and that the pattern matching was not case sensitive. For this however, we do test that the pattern is not empty in line 30 (if (pattern.empty()) return patternsFound;)</w:t>
       </w:r>
     </w:p>
     <w:p>
@@ -3157,7 +3117,7 @@
       <w:pPr>
         <w:pStyle w:val="Heading2"/>
       </w:pPr>
-      <w:bookmarkStart w:id="16" w:name="_Toc209888970"/>
+      <w:bookmarkStart w:id="16" w:name="_Toc209902276"/>
       <w:r>
         <w:t xml:space="preserve">5.2 </w:t>
       </w:r>
@@ -3242,7 +3202,7 @@
       <w:pPr>
         <w:pStyle w:val="Heading1"/>
       </w:pPr>
-      <w:bookmarkStart w:id="17" w:name="_Toc209888971"/>
+      <w:bookmarkStart w:id="17" w:name="_Toc209902277"/>
       <w:r>
         <w:t xml:space="preserve">6. </w:t>
       </w:r>
@@ -3255,7 +3215,7 @@
       <w:pPr>
         <w:pStyle w:val="Heading2"/>
       </w:pPr>
-      <w:bookmarkStart w:id="18" w:name="_Toc209888972"/>
+      <w:bookmarkStart w:id="18" w:name="_Toc209902278"/>
       <w:r>
         <w:t>6.1 Unit Test Demonstration</w:t>
       </w:r>
@@ -3300,10 +3260,12 @@
         <w:pStyle w:val="Heading3"/>
       </w:pPr>
       <w:bookmarkStart w:id="19" w:name="_Toc209901570"/>
+      <w:bookmarkStart w:id="20" w:name="_Toc209902279"/>
       <w:r>
         <w:t>6.1.1 Helper functions</w:t>
       </w:r>
       <w:bookmarkEnd w:id="19"/>
+      <w:bookmarkEnd w:id="20"/>
       <w:r>
         <w:t xml:space="preserve"> </w:t>
       </w:r>
@@ -3316,76 +3278,30 @@
           <w:szCs w:val="24"/>
         </w:rPr>
       </w:pPr>
-      <w:proofErr w:type="spellStart"/>
-      <w:r>
-        <w:rPr>
-          <w:rFonts w:ascii="Times New Roman" w:hAnsi="Times New Roman" w:cs="Times New Roman"/>
-          <w:sz w:val="24"/>
-          <w:szCs w:val="24"/>
-        </w:rPr>
-        <w:t>VecCompare</w:t>
-      </w:r>
-      <w:proofErr w:type="spellEnd"/>
-      <w:r>
-        <w:rPr>
-          <w:rFonts w:ascii="Times New Roman" w:hAnsi="Times New Roman" w:cs="Times New Roman"/>
-          <w:sz w:val="24"/>
-          <w:szCs w:val="24"/>
-        </w:rPr>
-        <w:t xml:space="preserve"> is a helper function which looks at the expected vector and tests it against the output from the </w:t>
-      </w:r>
-      <w:proofErr w:type="spellStart"/>
-      <w:r>
-        <w:rPr>
-          <w:rFonts w:ascii="Times New Roman" w:hAnsi="Times New Roman" w:cs="Times New Roman"/>
-          <w:sz w:val="24"/>
-          <w:szCs w:val="24"/>
-        </w:rPr>
-        <w:t>kmpSearch</w:t>
-      </w:r>
-      <w:proofErr w:type="spellEnd"/>
-      <w:r>
-        <w:rPr>
-          <w:rFonts w:ascii="Times New Roman" w:hAnsi="Times New Roman" w:cs="Times New Roman"/>
-          <w:sz w:val="24"/>
-          <w:szCs w:val="24"/>
-        </w:rPr>
-        <w:t xml:space="preserve"> method. If the two vectors match, that means the unit test has passed, otherwise it has failed.</w:t>
-      </w:r>
-    </w:p>
-    <w:p>
-      <w:pPr>
-        <w:rPr>
-          <w:rFonts w:ascii="Times New Roman" w:hAnsi="Times New Roman" w:cs="Times New Roman"/>
-          <w:sz w:val="24"/>
-          <w:szCs w:val="24"/>
-        </w:rPr>
-      </w:pPr>
-      <w:r>
-        <w:rPr>
-          <w:rFonts w:ascii="Times New Roman" w:hAnsi="Times New Roman" w:cs="Times New Roman"/>
-          <w:sz w:val="24"/>
-          <w:szCs w:val="24"/>
-        </w:rPr>
-        <w:t xml:space="preserve">The purpose of this method is to stop rewriting the same code for every single </w:t>
-      </w:r>
-      <w:proofErr w:type="spellStart"/>
-      <w:r>
-        <w:rPr>
-          <w:rFonts w:ascii="Times New Roman" w:hAnsi="Times New Roman" w:cs="Times New Roman"/>
-          <w:sz w:val="24"/>
-          <w:szCs w:val="24"/>
-        </w:rPr>
-        <w:t>kmpSearch</w:t>
-      </w:r>
-      <w:proofErr w:type="spellEnd"/>
-      <w:r>
-        <w:rPr>
-          <w:rFonts w:ascii="Times New Roman" w:hAnsi="Times New Roman" w:cs="Times New Roman"/>
-          <w:sz w:val="24"/>
-          <w:szCs w:val="24"/>
-        </w:rPr>
-        <w:t xml:space="preserve"> unit test </w:t>
+      <w:r>
+        <w:rPr>
+          <w:rFonts w:ascii="Times New Roman" w:hAnsi="Times New Roman" w:cs="Times New Roman"/>
+          <w:sz w:val="24"/>
+          <w:szCs w:val="24"/>
+        </w:rPr>
+        <w:t>VecCompare is a helper function which looks at the expected vector and tests it against the output from the kmpSearch method. If the two vectors match, that means the unit test has passed, otherwise it has failed.</w:t>
+      </w:r>
+    </w:p>
+    <w:p>
+      <w:pPr>
+        <w:rPr>
+          <w:rFonts w:ascii="Times New Roman" w:hAnsi="Times New Roman" w:cs="Times New Roman"/>
+          <w:sz w:val="24"/>
+          <w:szCs w:val="24"/>
+        </w:rPr>
+      </w:pPr>
+      <w:r>
+        <w:rPr>
+          <w:rFonts w:ascii="Times New Roman" w:hAnsi="Times New Roman" w:cs="Times New Roman"/>
+          <w:sz w:val="24"/>
+          <w:szCs w:val="24"/>
+        </w:rPr>
+        <w:t xml:space="preserve">The purpose of this method is to stop rewriting the same code for every single kmpSearch unit test </w:t>
       </w:r>
       <w:r>
         <w:rPr>
@@ -3412,87 +3328,23 @@
           <w:szCs w:val="24"/>
         </w:rPr>
       </w:pPr>
-      <w:proofErr w:type="spellStart"/>
-      <w:r>
-        <w:rPr>
-          <w:rFonts w:ascii="Times New Roman" w:hAnsi="Times New Roman" w:cs="Times New Roman"/>
-          <w:sz w:val="24"/>
-          <w:szCs w:val="24"/>
-        </w:rPr>
-        <w:t>PrintVector</w:t>
-      </w:r>
-      <w:proofErr w:type="spellEnd"/>
-      <w:r>
-        <w:rPr>
-          <w:rFonts w:ascii="Times New Roman" w:hAnsi="Times New Roman" w:cs="Times New Roman"/>
-          <w:sz w:val="24"/>
-          <w:szCs w:val="24"/>
-        </w:rPr>
-        <w:t xml:space="preserve"> is another helper function which prints the vector in the terminal for testing. This method simply looks through the vector and prints every index. This is used for when a test fails, it shows the user what the return is compared to what it should’ve been for testing and debugging. Again, this method ensures that I don’t have to rewrite the code within every unit test.</w:t>
-      </w:r>
-    </w:p>
-    <w:p>
-      <w:r>
-        <w:rPr>
-          <w:rFonts w:ascii="Times New Roman" w:hAnsi="Times New Roman" w:cs="Times New Roman"/>
-          <w:sz w:val="24"/>
-          <w:szCs w:val="24"/>
-        </w:rPr>
-        <w:t xml:space="preserve">Finally, </w:t>
-      </w:r>
-      <w:proofErr w:type="spellStart"/>
-      <w:r>
-        <w:rPr>
-          <w:rFonts w:ascii="Times New Roman" w:hAnsi="Times New Roman" w:cs="Times New Roman"/>
-          <w:sz w:val="24"/>
-          <w:szCs w:val="24"/>
-        </w:rPr>
-        <w:t>runKmpTest</w:t>
-      </w:r>
-      <w:proofErr w:type="spellEnd"/>
-      <w:r>
-        <w:rPr>
-          <w:rFonts w:ascii="Times New Roman" w:hAnsi="Times New Roman" w:cs="Times New Roman"/>
-          <w:sz w:val="24"/>
-          <w:szCs w:val="24"/>
-        </w:rPr>
-        <w:t xml:space="preserve"> is the last helper function which first looks at </w:t>
-      </w:r>
-      <w:proofErr w:type="spellStart"/>
-      <w:r>
-        <w:rPr>
-          <w:rFonts w:ascii="Times New Roman" w:hAnsi="Times New Roman" w:cs="Times New Roman"/>
-          <w:sz w:val="24"/>
-          <w:szCs w:val="24"/>
-        </w:rPr>
-        <w:t>VecCompare</w:t>
-      </w:r>
-      <w:proofErr w:type="spellEnd"/>
-      <w:r>
-        <w:rPr>
-          <w:rFonts w:ascii="Times New Roman" w:hAnsi="Times New Roman" w:cs="Times New Roman"/>
-          <w:sz w:val="24"/>
-          <w:szCs w:val="24"/>
-        </w:rPr>
-        <w:t xml:space="preserve"> to see if the vectors match. If so, it returns the test name concatenated with “ PASS”. If the vectors do not match, this returns the test name contented with “ FAIL” and then calls </w:t>
-      </w:r>
-      <w:proofErr w:type="spellStart"/>
-      <w:r>
-        <w:rPr>
-          <w:rFonts w:ascii="Times New Roman" w:hAnsi="Times New Roman" w:cs="Times New Roman"/>
-          <w:sz w:val="24"/>
-          <w:szCs w:val="24"/>
-        </w:rPr>
-        <w:t>PrintVector</w:t>
-      </w:r>
-      <w:proofErr w:type="spellEnd"/>
-      <w:r>
-        <w:rPr>
-          <w:rFonts w:ascii="Times New Roman" w:hAnsi="Times New Roman" w:cs="Times New Roman"/>
-          <w:sz w:val="24"/>
-          <w:szCs w:val="24"/>
-        </w:rPr>
-        <w:t xml:space="preserve"> to print the</w:t>
+      <w:r>
+        <w:rPr>
+          <w:rFonts w:ascii="Times New Roman" w:hAnsi="Times New Roman" w:cs="Times New Roman"/>
+          <w:sz w:val="24"/>
+          <w:szCs w:val="24"/>
+        </w:rPr>
+        <w:t>PrintVector is another helper function which prints the vector in the terminal for testing. This method simply looks through the vector and prints every index. This is used for when a test fails, it shows the user what the return is compared to what it should’ve been for testing and debugging. Again, this method ensures that I don’t have to rewrite the code within every unit test.</w:t>
+      </w:r>
+    </w:p>
+    <w:p>
+      <w:r>
+        <w:rPr>
+          <w:rFonts w:ascii="Times New Roman" w:hAnsi="Times New Roman" w:cs="Times New Roman"/>
+          <w:sz w:val="24"/>
+          <w:szCs w:val="24"/>
+        </w:rPr>
+        <w:t>Finally, runKmpTest is the last helper function which first looks at VecCompare to see if the vectors match. If so, it returns the test name concatenated with “ PASS”. If the vectors do not match, this returns the test name contented with “ FAIL” and then calls PrintVector to print the</w:t>
       </w:r>
       <w:r>
         <w:rPr>
@@ -3509,45 +3361,27 @@
       <w:pPr>
         <w:pStyle w:val="Heading2"/>
       </w:pPr>
-      <w:bookmarkStart w:id="20" w:name="_Toc209888973"/>
+      <w:bookmarkStart w:id="21" w:name="_Toc209902280"/>
       <w:r>
         <w:t>6.2 Unit Test Effectiveness</w:t>
       </w:r>
-      <w:bookmarkEnd w:id="20"/>
-    </w:p>
-    <w:p>
-      <w:pPr>
-        <w:rPr>
-          <w:rFonts w:ascii="Times New Roman" w:hAnsi="Times New Roman" w:cs="Times New Roman"/>
-          <w:sz w:val="24"/>
-          <w:szCs w:val="24"/>
-        </w:rPr>
-      </w:pPr>
-      <w:r>
-        <w:rPr>
-          <w:rFonts w:ascii="Times New Roman" w:hAnsi="Times New Roman" w:cs="Times New Roman"/>
-          <w:sz w:val="24"/>
-          <w:szCs w:val="24"/>
-        </w:rPr>
-        <w:t xml:space="preserve">Out of the </w:t>
-      </w:r>
-      <w:proofErr w:type="gramStart"/>
-      <w:r>
-        <w:rPr>
-          <w:rFonts w:ascii="Times New Roman" w:hAnsi="Times New Roman" w:cs="Times New Roman"/>
-          <w:sz w:val="24"/>
-          <w:szCs w:val="24"/>
-        </w:rPr>
-        <w:t>10 unit</w:t>
-      </w:r>
-      <w:proofErr w:type="gramEnd"/>
-      <w:r>
-        <w:rPr>
-          <w:rFonts w:ascii="Times New Roman" w:hAnsi="Times New Roman" w:cs="Times New Roman"/>
-          <w:sz w:val="24"/>
-          <w:szCs w:val="24"/>
-        </w:rPr>
-        <w:t xml:space="preserve"> tests, 2 test verify that the pi table is working, this includes overlapping sub patterns in the second test. 7 tests then verify that the searching part of the algorithm works. The last test benchmarks a naïve method against my implemented KMP algorithm to test the time complexity improvement.</w:t>
+      <w:bookmarkEnd w:id="21"/>
+    </w:p>
+    <w:p>
+      <w:pPr>
+        <w:rPr>
+          <w:rFonts w:ascii="Times New Roman" w:hAnsi="Times New Roman" w:cs="Times New Roman"/>
+          <w:sz w:val="24"/>
+          <w:szCs w:val="24"/>
+        </w:rPr>
+      </w:pPr>
+      <w:r>
+        <w:rPr>
+          <w:rFonts w:ascii="Times New Roman" w:hAnsi="Times New Roman" w:cs="Times New Roman"/>
+          <w:sz w:val="24"/>
+          <w:szCs w:val="24"/>
+        </w:rPr>
+        <w:t>Out of the 10 unit tests, 2 test verify that the pi table is working, this includes overlapping sub patterns in the second test. 7 tests then verify that the searching part of the algorithm works. The last test benchmarks a naïve method against my implemented KMP algorithm to test the time complexity improvement.</w:t>
       </w:r>
     </w:p>
     <w:p>
@@ -3623,14 +3457,14 @@
       <w:pPr>
         <w:pStyle w:val="Heading1"/>
       </w:pPr>
-      <w:bookmarkStart w:id="21" w:name="_Toc209888974"/>
+      <w:bookmarkStart w:id="22" w:name="_Toc209902281"/>
       <w:r>
         <w:t xml:space="preserve">7. </w:t>
       </w:r>
       <w:r>
         <w:t>Any insights or observations that would help someone else implement the same algorithm.</w:t>
       </w:r>
-      <w:bookmarkEnd w:id="21"/>
+      <w:bookmarkEnd w:id="22"/>
     </w:p>
     <w:p>
       <w:pPr>
@@ -3701,12 +3535,12 @@
         <w:pStyle w:val="Heading1"/>
         <w:jc w:val="center"/>
       </w:pPr>
-      <w:bookmarkStart w:id="22" w:name="_Toc209888975"/>
+      <w:bookmarkStart w:id="23" w:name="_Toc209902282"/>
       <w:r>
         <w:lastRenderedPageBreak/>
         <w:t>References</w:t>
       </w:r>
-      <w:bookmarkEnd w:id="22"/>
+      <w:bookmarkEnd w:id="23"/>
     </w:p>
     <w:p>
       <w:pPr>
@@ -3763,15 +3597,7 @@
         <w:ind w:left="284" w:hanging="284"/>
       </w:pPr>
       <w:r>
-        <w:t xml:space="preserve">Rexie, J. A. M., Raimond, K., </w:t>
-      </w:r>
-      <w:proofErr w:type="spellStart"/>
-      <w:r>
-        <w:t>Murugaaboopathy</w:t>
-      </w:r>
-      <w:proofErr w:type="spellEnd"/>
-      <w:r>
-        <w:t>, M., Brindha, D., &amp; Mulugeta, H. (2022). Lightweight Pattern Matching Method for DNA Sequencing in Internet of Medical Things. </w:t>
+        <w:t>Rexie, J. A. M., Raimond, K., Murugaaboopathy, M., Brindha, D., &amp; Mulugeta, H. (2022). Lightweight Pattern Matching Method for DNA Sequencing in Internet of Medical Things. </w:t>
       </w:r>
       <w:r>
         <w:rPr>

</xml_diff>

<commit_message>
last draft, just changed a few words and sentences in the report
</commit_message>
<xml_diff>
--- a/Assignment 1 Report - Adam Merhi.docx
+++ b/Assignment 1 Report - Adam Merhi.docx
@@ -1787,7 +1787,7 @@
           <w:sz w:val="24"/>
           <w:szCs w:val="24"/>
         </w:rPr>
-        <w:t xml:space="preserve">the proposed solution computes. We first understand all the preprocessing phase where we construct the prefix table before we build the </w:t>
+        <w:t xml:space="preserve">the proposed solution computes. We first understand the preprocessing phase where we construct the prefix table before we build the </w:t>
       </w:r>
       <w:r>
         <w:rPr>
@@ -1803,7 +1803,23 @@
           <w:sz w:val="24"/>
           <w:szCs w:val="24"/>
         </w:rPr>
-        <w:t>algorithm. We understand how the algorithm works and its significance and superiority over a naïve algorithm which directly correlate with its time complexity. We follow this by justifying my method and how I tested this method to prove the significance of KMP algorith</w:t>
+        <w:t xml:space="preserve">algorithm. We understand how the algorithm works and its significance and superiority over a naïve algorithm which directly correlate with its time complexity. We </w:t>
+      </w:r>
+      <w:r>
+        <w:rPr>
+          <w:rFonts w:ascii="Times New Roman" w:hAnsi="Times New Roman" w:cs="Times New Roman"/>
+          <w:sz w:val="24"/>
+          <w:szCs w:val="24"/>
+        </w:rPr>
+        <w:t xml:space="preserve">use this to justify </w:t>
+      </w:r>
+      <w:r>
+        <w:rPr>
+          <w:rFonts w:ascii="Times New Roman" w:hAnsi="Times New Roman" w:cs="Times New Roman"/>
+          <w:sz w:val="24"/>
+          <w:szCs w:val="24"/>
+        </w:rPr>
+        <w:t>my method and how I tested this method to prove the significance of KMP algorith</w:t>
       </w:r>
       <w:r>
         <w:rPr>
@@ -1827,7 +1843,25 @@
           <w:sz w:val="24"/>
           <w:szCs w:val="24"/>
         </w:rPr>
-        <w:t xml:space="preserve"> This report does switch between the term’s “prefix” and “sub pattern”, both words in this report are referring to the same thing which can also be referred to as the prefix suffix. This was not intentional but while reading research and writing this report I mistakenly interchanged the words.</w:t>
+        <w:t xml:space="preserve"> </w:t>
+      </w:r>
+    </w:p>
+    <w:p>
+      <w:pPr>
+        <w:pStyle w:val="Subtitle"/>
+        <w:rPr>
+          <w:rFonts w:ascii="Times New Roman" w:hAnsi="Times New Roman" w:cs="Times New Roman"/>
+          <w:sz w:val="24"/>
+          <w:szCs w:val="24"/>
+        </w:rPr>
+      </w:pPr>
+      <w:r>
+        <w:rPr>
+          <w:rFonts w:ascii="Times New Roman" w:hAnsi="Times New Roman" w:cs="Times New Roman"/>
+          <w:sz w:val="24"/>
+          <w:szCs w:val="24"/>
+        </w:rPr>
+        <w:t>This report does switch between the term’s “prefix” and “sub pattern”, both words in this report are referring to the same thing which can also be referred to as the prefix suffix. This was not intentional but while reading research and writing this report I mistakenly interchanged the words.</w:t>
       </w:r>
     </w:p>
     <w:p>
@@ -1896,7 +1930,23 @@
           <w:sz w:val="24"/>
           <w:szCs w:val="24"/>
         </w:rPr>
-        <w:t>KMP Algorithm works by creating a pi table (also known as a prefix table) to hold values of recurrence within the pattern. This represents the longest sub-patterns or prefixes within the pattern. It ensures that when we search for patterns, we can reuse these sub-prefixes instead of restarting from the beginning each time. If a sub-prefix is not found, rather than restarting the search at the next character, we use the last matching sub-prefix as a starting point. This is why the pi table is so important and why it is constructed before the algorithm runs.</w:t>
+        <w:t>KMP Algorithm works by creating a pi table (also known as a prefix table) to hold values of recurrence within the pattern. This represents the longest sub-patterns or prefixes within the pattern. It ensures that when we search for patterns, we can reuse these sub</w:t>
+      </w:r>
+      <w:r>
+        <w:rPr>
+          <w:rFonts w:ascii="Times New Roman" w:hAnsi="Times New Roman" w:cs="Times New Roman"/>
+          <w:sz w:val="24"/>
+          <w:szCs w:val="24"/>
+        </w:rPr>
+        <w:t xml:space="preserve"> patterns</w:t>
+      </w:r>
+      <w:r>
+        <w:rPr>
+          <w:rFonts w:ascii="Times New Roman" w:hAnsi="Times New Roman" w:cs="Times New Roman"/>
+          <w:sz w:val="24"/>
+          <w:szCs w:val="24"/>
+        </w:rPr>
+        <w:t xml:space="preserve"> instead of restarting from the beginning each time. </w:t>
       </w:r>
     </w:p>
     <w:p>
@@ -1975,7 +2025,87 @@
           <w:sz w:val="24"/>
           <w:szCs w:val="24"/>
         </w:rPr>
-        <w:t>In KMP, we look at sub prefixes instead. If we find a match while iterating through the string, which is followed by a mismatch, instead of jumping to where the first match was found, we instead look for where the last matching prefix was found. From there we test if the next index matches the next sub prefix. If it does, great, we avoided jumping to the start, if not, we push back once again until either we have a match or have gone to the end of the pattern were. This however now means we do not need to jump to he first match as we tested all the matches between the first mismatch and all the sub prefixes and means we can continue searching for the next matching index in the string from the current index and only reset the pattern index.</w:t>
+        <w:t xml:space="preserve">In KMP, we look at sub </w:t>
+      </w:r>
+      <w:r>
+        <w:rPr>
+          <w:rFonts w:ascii="Times New Roman" w:hAnsi="Times New Roman" w:cs="Times New Roman"/>
+          <w:sz w:val="24"/>
+          <w:szCs w:val="24"/>
+        </w:rPr>
+        <w:t>patterns</w:t>
+      </w:r>
+      <w:r>
+        <w:rPr>
+          <w:rFonts w:ascii="Times New Roman" w:hAnsi="Times New Roman" w:cs="Times New Roman"/>
+          <w:sz w:val="24"/>
+          <w:szCs w:val="24"/>
+        </w:rPr>
+        <w:t xml:space="preserve"> instead. If we find a match while iterating through the string, which is followed by a mismatch, instead of jumping to where the first match was found, we instead look for where the last matching prefix was found. From there we test if the next index matches the next sub prefix. If it does, great, we avoided jumping to the start, if not, we push back once again until either we have a match or have gone to the </w:t>
+      </w:r>
+      <w:r>
+        <w:rPr>
+          <w:rFonts w:ascii="Times New Roman" w:hAnsi="Times New Roman" w:cs="Times New Roman"/>
+          <w:sz w:val="24"/>
+          <w:szCs w:val="24"/>
+        </w:rPr>
+        <w:t>start</w:t>
+      </w:r>
+      <w:r>
+        <w:rPr>
+          <w:rFonts w:ascii="Times New Roman" w:hAnsi="Times New Roman" w:cs="Times New Roman"/>
+          <w:sz w:val="24"/>
+          <w:szCs w:val="24"/>
+        </w:rPr>
+        <w:t xml:space="preserve"> of the pattern. This however now means we do not need to jump to </w:t>
+      </w:r>
+      <w:r>
+        <w:rPr>
+          <w:rFonts w:ascii="Times New Roman" w:hAnsi="Times New Roman" w:cs="Times New Roman"/>
+          <w:sz w:val="24"/>
+          <w:szCs w:val="24"/>
+        </w:rPr>
+        <w:t>t</w:t>
+      </w:r>
+      <w:r>
+        <w:rPr>
+          <w:rFonts w:ascii="Times New Roman" w:hAnsi="Times New Roman" w:cs="Times New Roman"/>
+          <w:sz w:val="24"/>
+          <w:szCs w:val="24"/>
+        </w:rPr>
+        <w:t>he first match</w:t>
+      </w:r>
+      <w:r>
+        <w:rPr>
+          <w:rFonts w:ascii="Times New Roman" w:hAnsi="Times New Roman" w:cs="Times New Roman"/>
+          <w:sz w:val="24"/>
+          <w:szCs w:val="24"/>
+        </w:rPr>
+        <w:t xml:space="preserve">ed index plus one </w:t>
+      </w:r>
+      <w:r>
+        <w:rPr>
+          <w:rFonts w:ascii="Times New Roman" w:hAnsi="Times New Roman" w:cs="Times New Roman"/>
+          <w:sz w:val="24"/>
+          <w:szCs w:val="24"/>
+        </w:rPr>
+        <w:t xml:space="preserve">as we tested all the matches between the first mismatch and all the sub </w:t>
+      </w:r>
+      <w:r>
+        <w:rPr>
+          <w:rFonts w:ascii="Times New Roman" w:hAnsi="Times New Roman" w:cs="Times New Roman"/>
+          <w:sz w:val="24"/>
+          <w:szCs w:val="24"/>
+        </w:rPr>
+        <w:t>patterns indicating</w:t>
+      </w:r>
+      <w:r>
+        <w:rPr>
+          <w:rFonts w:ascii="Times New Roman" w:hAnsi="Times New Roman" w:cs="Times New Roman"/>
+          <w:sz w:val="24"/>
+          <w:szCs w:val="24"/>
+        </w:rPr>
+        <w:t xml:space="preserve"> we can continue searching for the next matching index in the string from the current index and only reset the pattern index.</w:t>
       </w:r>
     </w:p>
     <w:p>
@@ -2042,7 +2172,39 @@
           <w:sz w:val="24"/>
           <w:szCs w:val="24"/>
         </w:rPr>
-        <w:t xml:space="preserve"> intense computation going manually through every single index of a string at worst iterating pattern.size </w:t>
+        <w:t xml:space="preserve"> intense computation going manually through every single </w:t>
+      </w:r>
+      <w:r>
+        <w:rPr>
+          <w:rFonts w:ascii="Times New Roman" w:hAnsi="Times New Roman" w:cs="Times New Roman"/>
+          <w:sz w:val="24"/>
+          <w:szCs w:val="24"/>
+        </w:rPr>
+        <w:t xml:space="preserve">character </w:t>
+      </w:r>
+      <w:r>
+        <w:rPr>
+          <w:rFonts w:ascii="Times New Roman" w:hAnsi="Times New Roman" w:cs="Times New Roman"/>
+          <w:sz w:val="24"/>
+          <w:szCs w:val="24"/>
+        </w:rPr>
+        <w:t xml:space="preserve">of a string </w:t>
+      </w:r>
+      <w:r>
+        <w:rPr>
+          <w:rFonts w:ascii="Times New Roman" w:hAnsi="Times New Roman" w:cs="Times New Roman"/>
+          <w:sz w:val="24"/>
+          <w:szCs w:val="24"/>
+        </w:rPr>
+        <w:t xml:space="preserve">where we iterate </w:t>
+      </w:r>
+      <w:r>
+        <w:rPr>
+          <w:rFonts w:ascii="Times New Roman" w:hAnsi="Times New Roman" w:cs="Times New Roman"/>
+          <w:sz w:val="24"/>
+          <w:szCs w:val="24"/>
+        </w:rPr>
+        <w:t xml:space="preserve">the length of the string </w:t>
       </w:r>
       <w:r>
         <w:rPr>
@@ -2074,7 +2236,65 @@
           <w:sz w:val="24"/>
           <w:szCs w:val="24"/>
         </w:rPr>
-        <w:t>have to go through every single index m times.</w:t>
+        <w:t xml:space="preserve">have to go through every single </w:t>
+      </w:r>
+      <w:r>
+        <w:rPr>
+          <w:rFonts w:ascii="Times New Roman" w:hAnsi="Times New Roman" w:cs="Times New Roman"/>
+          <w:sz w:val="24"/>
+          <w:szCs w:val="24"/>
+        </w:rPr>
+        <w:t>character</w:t>
+      </w:r>
+      <w:r>
+        <w:rPr>
+          <w:rFonts w:ascii="Times New Roman" w:hAnsi="Times New Roman" w:cs="Times New Roman"/>
+          <w:sz w:val="24"/>
+          <w:szCs w:val="24"/>
+        </w:rPr>
+        <w:t xml:space="preserve"> m </w:t>
+      </w:r>
+      <w:r>
+        <w:rPr>
+          <w:rFonts w:ascii="Times New Roman" w:hAnsi="Times New Roman" w:cs="Times New Roman"/>
+          <w:sz w:val="24"/>
+          <w:szCs w:val="24"/>
+        </w:rPr>
+        <w:t>time</w:t>
+      </w:r>
+      <w:r>
+        <w:rPr>
+          <w:rFonts w:ascii="Times New Roman" w:hAnsi="Times New Roman" w:cs="Times New Roman"/>
+          <w:sz w:val="24"/>
+          <w:szCs w:val="24"/>
+        </w:rPr>
+        <w:t>s,</w:t>
+      </w:r>
+      <w:r>
+        <w:rPr>
+          <w:rFonts w:ascii="Times New Roman" w:hAnsi="Times New Roman" w:cs="Times New Roman"/>
+          <w:sz w:val="24"/>
+          <w:szCs w:val="24"/>
+        </w:rPr>
+        <w:t xml:space="preserve"> where m symbolises the </w:t>
+      </w:r>
+      <w:proofErr w:type="spellStart"/>
+      <w:r>
+        <w:rPr>
+          <w:rFonts w:ascii="Times New Roman" w:hAnsi="Times New Roman" w:cs="Times New Roman"/>
+          <w:sz w:val="24"/>
+          <w:szCs w:val="24"/>
+        </w:rPr>
+        <w:t>pattern.size</w:t>
+      </w:r>
+      <w:proofErr w:type="spellEnd"/>
+      <w:r>
+        <w:rPr>
+          <w:rFonts w:ascii="Times New Roman" w:hAnsi="Times New Roman" w:cs="Times New Roman"/>
+          <w:sz w:val="24"/>
+          <w:szCs w:val="24"/>
+        </w:rPr>
+        <w:t>.</w:t>
       </w:r>
     </w:p>
     <w:p>
@@ -2118,7 +2338,7 @@
           <w:sz w:val="24"/>
           <w:szCs w:val="24"/>
         </w:rPr>
-        <w:t>We can also use pattern matching for data validation for phone numbers and emails as to ensure data integrity. This can include tokenization.</w:t>
+        <w:t>We can also use pattern matching for data validation for phone numbers and emails to ensure data integrity. This can include tokenization.</w:t>
       </w:r>
     </w:p>
     <w:p>
@@ -2217,91 +2437,9 @@
           <w:sz w:val="24"/>
           <w:szCs w:val="24"/>
         </w:rPr>
-        <w:t>While image representation and reconstruction has been the most popular goal of sparse modeling and dictionary learning, other important image science applications are starting to be addressed by this framework, in particular, classification and detection.</w:t>
-      </w:r>
-      <w:r>
-        <w:rPr>
-          <w:rFonts w:ascii="Times New Roman" w:hAnsi="Times New Roman" w:cs="Times New Roman"/>
-          <w:sz w:val="24"/>
-          <w:szCs w:val="24"/>
-        </w:rPr>
-        <w:t>"</w:t>
-      </w:r>
-      <w:r>
-        <w:rPr>
-          <w:rFonts w:ascii="Times New Roman" w:hAnsi="Times New Roman" w:cs="Times New Roman"/>
-          <w:sz w:val="24"/>
-          <w:szCs w:val="24"/>
-        </w:rPr>
-        <w:t xml:space="preserve"> </w:t>
-      </w:r>
-      <w:r>
-        <w:rPr>
-          <w:rFonts w:ascii="Times New Roman" w:hAnsi="Times New Roman" w:cs="Times New Roman"/>
-          <w:sz w:val="24"/>
-          <w:szCs w:val="24"/>
-        </w:rPr>
-        <w:t>(</w:t>
-      </w:r>
-      <w:r>
-        <w:rPr>
-          <w:rFonts w:ascii="Times New Roman" w:hAnsi="Times New Roman" w:cs="Times New Roman"/>
-          <w:sz w:val="24"/>
-          <w:szCs w:val="24"/>
-        </w:rPr>
-        <w:t>Wright et al., 2010</w:t>
-      </w:r>
-      <w:r>
-        <w:rPr>
-          <w:rFonts w:ascii="Times New Roman" w:hAnsi="Times New Roman" w:cs="Times New Roman"/>
-          <w:sz w:val="24"/>
-          <w:szCs w:val="24"/>
-        </w:rPr>
-        <w:t>)</w:t>
-      </w:r>
-      <w:r>
-        <w:rPr>
-          <w:rFonts w:ascii="Times New Roman" w:hAnsi="Times New Roman" w:cs="Times New Roman"/>
-          <w:sz w:val="24"/>
-          <w:szCs w:val="24"/>
-        </w:rPr>
-        <w:t>.</w:t>
-      </w:r>
-    </w:p>
-    <w:p>
-      <w:pPr>
-        <w:pStyle w:val="Heading3"/>
-      </w:pPr>
-      <w:bookmarkStart w:id="7" w:name="_Toc209902267"/>
-      <w:r>
-        <w:t>2.1.3 Bioinformation</w:t>
-      </w:r>
-      <w:bookmarkEnd w:id="7"/>
-    </w:p>
-    <w:p>
-      <w:pPr>
-        <w:rPr>
-          <w:rFonts w:ascii="Times New Roman" w:hAnsi="Times New Roman" w:cs="Times New Roman"/>
-          <w:sz w:val="24"/>
-          <w:szCs w:val="24"/>
-        </w:rPr>
-      </w:pPr>
-      <w:r>
-        <w:rPr>
-          <w:rFonts w:ascii="Times New Roman" w:hAnsi="Times New Roman" w:cs="Times New Roman"/>
-          <w:sz w:val="24"/>
-          <w:szCs w:val="24"/>
-        </w:rPr>
-        <w:t xml:space="preserve">Pattern matching is used in bioinformatics to find sequences like DNA, RNA, and proteins. It is vital to detect mutations align sequences and assemble genomes. This can be seen in this quote from </w:t>
-      </w:r>
-      <w:r>
-        <w:rPr>
-          <w:rFonts w:ascii="Times New Roman" w:hAnsi="Times New Roman" w:cs="Times New Roman"/>
-          <w:sz w:val="24"/>
-          <w:szCs w:val="24"/>
-        </w:rPr>
-        <w:t>a published research paper around pattern matching methods for DNA Sequencing in internet of Medical Things, “</w:t>
-      </w:r>
+        <w:t xml:space="preserve">While image representation and reconstruction has been the most popular goal of sparse </w:t>
+      </w:r>
+      <w:proofErr w:type="spellStart"/>
       <w:r>
         <w:rPr>
           <w:rFonts w:ascii="Times New Roman" w:hAnsi="Times New Roman" w:cs="Times New Roman"/>
@@ -2310,6 +2448,110 @@
           <w:sz w:val="24"/>
           <w:szCs w:val="24"/>
         </w:rPr>
+        <w:t>modeling</w:t>
+      </w:r>
+      <w:proofErr w:type="spellEnd"/>
+      <w:r>
+        <w:rPr>
+          <w:rFonts w:ascii="Times New Roman" w:hAnsi="Times New Roman" w:cs="Times New Roman"/>
+          <w:i/>
+          <w:iCs/>
+          <w:sz w:val="24"/>
+          <w:szCs w:val="24"/>
+        </w:rPr>
+        <w:t xml:space="preserve"> and dictionary learning, other important image science applications are starting to be addressed by this framework, in particular, classification and detection.</w:t>
+      </w:r>
+      <w:r>
+        <w:rPr>
+          <w:rFonts w:ascii="Times New Roman" w:hAnsi="Times New Roman" w:cs="Times New Roman"/>
+          <w:sz w:val="24"/>
+          <w:szCs w:val="24"/>
+        </w:rPr>
+        <w:t>"</w:t>
+      </w:r>
+      <w:r>
+        <w:rPr>
+          <w:rFonts w:ascii="Times New Roman" w:hAnsi="Times New Roman" w:cs="Times New Roman"/>
+          <w:sz w:val="24"/>
+          <w:szCs w:val="24"/>
+        </w:rPr>
+        <w:t xml:space="preserve"> </w:t>
+      </w:r>
+      <w:r>
+        <w:rPr>
+          <w:rFonts w:ascii="Times New Roman" w:hAnsi="Times New Roman" w:cs="Times New Roman"/>
+          <w:sz w:val="24"/>
+          <w:szCs w:val="24"/>
+        </w:rPr>
+        <w:t>(</w:t>
+      </w:r>
+      <w:r>
+        <w:rPr>
+          <w:rFonts w:ascii="Times New Roman" w:hAnsi="Times New Roman" w:cs="Times New Roman"/>
+          <w:sz w:val="24"/>
+          <w:szCs w:val="24"/>
+        </w:rPr>
+        <w:t>Wright et al., 2010</w:t>
+      </w:r>
+      <w:r>
+        <w:rPr>
+          <w:rFonts w:ascii="Times New Roman" w:hAnsi="Times New Roman" w:cs="Times New Roman"/>
+          <w:sz w:val="24"/>
+          <w:szCs w:val="24"/>
+        </w:rPr>
+        <w:t>)</w:t>
+      </w:r>
+      <w:r>
+        <w:rPr>
+          <w:rFonts w:ascii="Times New Roman" w:hAnsi="Times New Roman" w:cs="Times New Roman"/>
+          <w:sz w:val="24"/>
+          <w:szCs w:val="24"/>
+        </w:rPr>
+        <w:t>.</w:t>
+      </w:r>
+    </w:p>
+    <w:p>
+      <w:pPr>
+        <w:pStyle w:val="Heading3"/>
+      </w:pPr>
+      <w:bookmarkStart w:id="7" w:name="_Toc209902267"/>
+      <w:r>
+        <w:t>2.1.3 Bioinformation</w:t>
+      </w:r>
+      <w:bookmarkEnd w:id="7"/>
+    </w:p>
+    <w:p>
+      <w:pPr>
+        <w:rPr>
+          <w:rFonts w:ascii="Times New Roman" w:hAnsi="Times New Roman" w:cs="Times New Roman"/>
+          <w:sz w:val="24"/>
+          <w:szCs w:val="24"/>
+        </w:rPr>
+      </w:pPr>
+      <w:r>
+        <w:rPr>
+          <w:rFonts w:ascii="Times New Roman" w:hAnsi="Times New Roman" w:cs="Times New Roman"/>
+          <w:sz w:val="24"/>
+          <w:szCs w:val="24"/>
+        </w:rPr>
+        <w:t xml:space="preserve">Pattern matching is used in bioinformatics to find sequences like DNA, RNA, and proteins. It is vital to detect mutations align sequences and assemble genomes. This can be seen in this quote from </w:t>
+      </w:r>
+      <w:r>
+        <w:rPr>
+          <w:rFonts w:ascii="Times New Roman" w:hAnsi="Times New Roman" w:cs="Times New Roman"/>
+          <w:sz w:val="24"/>
+          <w:szCs w:val="24"/>
+        </w:rPr>
+        <w:t>a published research paper around pattern matching methods for DNA Sequencing in internet of Medical Things, “</w:t>
+      </w:r>
+      <w:r>
+        <w:rPr>
+          <w:rFonts w:ascii="Times New Roman" w:hAnsi="Times New Roman" w:cs="Times New Roman"/>
+          <w:i/>
+          <w:iCs/>
+          <w:sz w:val="24"/>
+          <w:szCs w:val="24"/>
+        </w:rPr>
         <w:t>Read alignment is affected by some sequencing technology parameters, including the read length and error rate. It is essential to determine the actual location of each read, according to the reference. The exact location cannot be determined in advance, so the matching has to be done approximately</w:t>
       </w:r>
       <w:r>
@@ -2365,7 +2607,23 @@
           <w:sz w:val="24"/>
           <w:szCs w:val="24"/>
         </w:rPr>
-        <w:t xml:space="preserve">When we look at large data structures, KMP shines as it can at runtime compute overlapping patterns which is crucial in large strings. All of the above use cases mentioned deal with strings with well over one million characters, to find a pattern within these strings would almost not be possible using the naïve method due to how long it would take. KMP makes all that possible. </w:t>
+        <w:t>When we look at large data structures, KMP shines as it can at runtime compute overlapping patterns which is crucial in large strings. All of the above use cases mentioned deal with strings with well over one million characters, to find a pattern within these strings would almost not be possible</w:t>
+      </w:r>
+      <w:r>
+        <w:rPr>
+          <w:rFonts w:ascii="Times New Roman" w:hAnsi="Times New Roman" w:cs="Times New Roman"/>
+          <w:sz w:val="24"/>
+          <w:szCs w:val="24"/>
+        </w:rPr>
+        <w:t xml:space="preserve"> on average hardware</w:t>
+      </w:r>
+      <w:r>
+        <w:rPr>
+          <w:rFonts w:ascii="Times New Roman" w:hAnsi="Times New Roman" w:cs="Times New Roman"/>
+          <w:sz w:val="24"/>
+          <w:szCs w:val="24"/>
+        </w:rPr>
+        <w:t xml:space="preserve"> using the naïve method due to how long it would take. KMP makes all that possible. </w:t>
       </w:r>
     </w:p>
     <w:p>
@@ -2395,24 +2653,60 @@
           <w:sz w:val="24"/>
           <w:szCs w:val="24"/>
         </w:rPr>
-        <w:t>The time complexity for a naïve approach is O(mn). This is due to the fact that at worst case, we need to test every single character within the patter against every single character within the string.</w:t>
-      </w:r>
-    </w:p>
-    <w:p>
-      <w:pPr>
-        <w:rPr>
-          <w:rFonts w:ascii="Times New Roman" w:hAnsi="Times New Roman" w:cs="Times New Roman"/>
-          <w:sz w:val="24"/>
-          <w:szCs w:val="24"/>
-        </w:rPr>
-      </w:pPr>
-      <w:r>
-        <w:rPr>
-          <w:rFonts w:ascii="Times New Roman" w:hAnsi="Times New Roman" w:cs="Times New Roman"/>
-          <w:sz w:val="24"/>
-          <w:szCs w:val="24"/>
-        </w:rPr>
-        <w:t>Due to the optimisation of the KMP algorithm, we only need to need to iterate through the pattern once and iterate through the string once. Therefore, this solution completes at a time complexity of O(m+n).</w:t>
+        <w:t>The time complexity for a naïve approach is O(</w:t>
+      </w:r>
+      <w:proofErr w:type="spellStart"/>
+      <w:r>
+        <w:rPr>
+          <w:rFonts w:ascii="Times New Roman" w:hAnsi="Times New Roman" w:cs="Times New Roman"/>
+          <w:sz w:val="24"/>
+          <w:szCs w:val="24"/>
+        </w:rPr>
+        <w:t>mn</w:t>
+      </w:r>
+      <w:proofErr w:type="spellEnd"/>
+      <w:r>
+        <w:rPr>
+          <w:rFonts w:ascii="Times New Roman" w:hAnsi="Times New Roman" w:cs="Times New Roman"/>
+          <w:sz w:val="24"/>
+          <w:szCs w:val="24"/>
+        </w:rPr>
+        <w:t>). This is due to the fact that at worst case, we need to test every single character within the patter against every single character within the string.</w:t>
+      </w:r>
+    </w:p>
+    <w:p>
+      <w:pPr>
+        <w:rPr>
+          <w:rFonts w:ascii="Times New Roman" w:hAnsi="Times New Roman" w:cs="Times New Roman"/>
+          <w:sz w:val="24"/>
+          <w:szCs w:val="24"/>
+        </w:rPr>
+      </w:pPr>
+      <w:r>
+        <w:rPr>
+          <w:rFonts w:ascii="Times New Roman" w:hAnsi="Times New Roman" w:cs="Times New Roman"/>
+          <w:sz w:val="24"/>
+          <w:szCs w:val="24"/>
+        </w:rPr>
+        <w:t>Due to the optimisation of the KMP algorithm, we only need to need to iterate through the pattern once and iterate through the string once. Therefore, this solution completes at a time complexity of O(</w:t>
+      </w:r>
+      <w:proofErr w:type="spellStart"/>
+      <w:r>
+        <w:rPr>
+          <w:rFonts w:ascii="Times New Roman" w:hAnsi="Times New Roman" w:cs="Times New Roman"/>
+          <w:sz w:val="24"/>
+          <w:szCs w:val="24"/>
+        </w:rPr>
+        <w:t>m+n</w:t>
+      </w:r>
+      <w:proofErr w:type="spellEnd"/>
+      <w:r>
+        <w:rPr>
+          <w:rFonts w:ascii="Times New Roman" w:hAnsi="Times New Roman" w:cs="Times New Roman"/>
+          <w:sz w:val="24"/>
+          <w:szCs w:val="24"/>
+        </w:rPr>
+        <w:t>).</w:t>
       </w:r>
     </w:p>
     <w:p>
@@ -2457,7 +2751,55 @@
           <w:szCs w:val="24"/>
         </w:rPr>
         <w:lastRenderedPageBreak/>
-        <w:t xml:space="preserve">In this step, we iterate through the pattern we are looking for and try find sub patterns/prefixes. This is what we use to fall back on when we step backwards. We search the current index matches the longest pattern we have previously found, if so, we </w:t>
+        <w:t xml:space="preserve">In this step, we iterate through the pattern </w:t>
+      </w:r>
+      <w:r>
+        <w:rPr>
+          <w:rFonts w:ascii="Times New Roman" w:hAnsi="Times New Roman" w:cs="Times New Roman"/>
+          <w:sz w:val="24"/>
+          <w:szCs w:val="24"/>
+        </w:rPr>
+        <w:t>to</w:t>
+      </w:r>
+      <w:r>
+        <w:rPr>
+          <w:rFonts w:ascii="Times New Roman" w:hAnsi="Times New Roman" w:cs="Times New Roman"/>
+          <w:sz w:val="24"/>
+          <w:szCs w:val="24"/>
+        </w:rPr>
+        <w:t xml:space="preserve"> try find</w:t>
+      </w:r>
+      <w:r>
+        <w:rPr>
+          <w:rFonts w:ascii="Times New Roman" w:hAnsi="Times New Roman" w:cs="Times New Roman"/>
+          <w:sz w:val="24"/>
+          <w:szCs w:val="24"/>
+        </w:rPr>
+        <w:t>ing</w:t>
+      </w:r>
+      <w:r>
+        <w:rPr>
+          <w:rFonts w:ascii="Times New Roman" w:hAnsi="Times New Roman" w:cs="Times New Roman"/>
+          <w:sz w:val="24"/>
+          <w:szCs w:val="24"/>
+        </w:rPr>
+        <w:t xml:space="preserve"> sub patterns/prefixes. This is what we use to fall back on when we step backwards. We search </w:t>
+      </w:r>
+      <w:r>
+        <w:rPr>
+          <w:rFonts w:ascii="Times New Roman" w:hAnsi="Times New Roman" w:cs="Times New Roman"/>
+          <w:sz w:val="24"/>
+          <w:szCs w:val="24"/>
+        </w:rPr>
+        <w:t xml:space="preserve">if </w:t>
+      </w:r>
+      <w:r>
+        <w:rPr>
+          <w:rFonts w:ascii="Times New Roman" w:hAnsi="Times New Roman" w:cs="Times New Roman"/>
+          <w:sz w:val="24"/>
+          <w:szCs w:val="24"/>
+        </w:rPr>
+        <w:t xml:space="preserve">the current index matches the longest pattern we have previously found, if so, we </w:t>
       </w:r>
       <w:r>
         <w:rPr>
@@ -2473,48 +2815,56 @@
           <w:sz w:val="24"/>
           <w:szCs w:val="24"/>
         </w:rPr>
-        <w:t xml:space="preserve"> the longest found sub pattern, otherwise we </w:t>
-      </w:r>
-      <w:r>
-        <w:rPr>
-          <w:rFonts w:ascii="Times New Roman" w:hAnsi="Times New Roman" w:cs="Times New Roman"/>
-          <w:sz w:val="24"/>
-          <w:szCs w:val="24"/>
-        </w:rPr>
-        <w:t>decrement</w:t>
-      </w:r>
-      <w:r>
-        <w:rPr>
-          <w:rFonts w:ascii="Times New Roman" w:hAnsi="Times New Roman" w:cs="Times New Roman"/>
-          <w:sz w:val="24"/>
-          <w:szCs w:val="24"/>
-        </w:rPr>
-        <w:t xml:space="preserve"> the longest </w:t>
-      </w:r>
-      <w:r>
-        <w:rPr>
-          <w:rFonts w:ascii="Times New Roman" w:hAnsi="Times New Roman" w:cs="Times New Roman"/>
-          <w:sz w:val="24"/>
-          <w:szCs w:val="24"/>
-        </w:rPr>
-        <w:t xml:space="preserve">found sub pattern. </w:t>
-      </w:r>
-    </w:p>
-    <w:p>
-      <w:pPr>
-        <w:rPr>
-          <w:rFonts w:ascii="Times New Roman" w:hAnsi="Times New Roman" w:cs="Times New Roman"/>
-          <w:sz w:val="24"/>
-          <w:szCs w:val="24"/>
-        </w:rPr>
-      </w:pPr>
-      <w:r>
-        <w:rPr>
-          <w:rFonts w:ascii="Times New Roman" w:hAnsi="Times New Roman" w:cs="Times New Roman"/>
-          <w:sz w:val="24"/>
-          <w:szCs w:val="24"/>
-        </w:rPr>
-        <w:t>As this interaction only looks through the pattern once, the time complexity of this step is O(m).</w:t>
+        <w:t xml:space="preserve"> the longest found sub pattern, otherwise </w:t>
+      </w:r>
+      <w:r>
+        <w:rPr>
+          <w:rFonts w:ascii="Times New Roman" w:hAnsi="Times New Roman" w:cs="Times New Roman"/>
+          <w:sz w:val="24"/>
+          <w:szCs w:val="24"/>
+        </w:rPr>
+        <w:t>we test if this matches any other previous sub patterns</w:t>
+      </w:r>
+      <w:r>
+        <w:rPr>
+          <w:rFonts w:ascii="Times New Roman" w:hAnsi="Times New Roman" w:cs="Times New Roman"/>
+          <w:sz w:val="24"/>
+          <w:szCs w:val="24"/>
+        </w:rPr>
+        <w:t xml:space="preserve">. </w:t>
+      </w:r>
+    </w:p>
+    <w:p>
+      <w:pPr>
+        <w:rPr>
+          <w:rFonts w:ascii="Times New Roman" w:hAnsi="Times New Roman" w:cs="Times New Roman"/>
+          <w:sz w:val="24"/>
+          <w:szCs w:val="24"/>
+        </w:rPr>
+      </w:pPr>
+      <w:r>
+        <w:rPr>
+          <w:rFonts w:ascii="Times New Roman" w:hAnsi="Times New Roman" w:cs="Times New Roman"/>
+          <w:sz w:val="24"/>
+          <w:szCs w:val="24"/>
+        </w:rPr>
+        <w:t xml:space="preserve">As this </w:t>
+      </w:r>
+      <w:r>
+        <w:rPr>
+          <w:rFonts w:ascii="Times New Roman" w:hAnsi="Times New Roman" w:cs="Times New Roman"/>
+          <w:sz w:val="24"/>
+          <w:szCs w:val="24"/>
+        </w:rPr>
+        <w:t>function</w:t>
+      </w:r>
+      <w:r>
+        <w:rPr>
+          <w:rFonts w:ascii="Times New Roman" w:hAnsi="Times New Roman" w:cs="Times New Roman"/>
+          <w:sz w:val="24"/>
+          <w:szCs w:val="24"/>
+        </w:rPr>
+        <w:t xml:space="preserve"> only looks through the pattern once, the time complexity of this step is O(m).</w:t>
       </w:r>
     </w:p>
     <w:p>
@@ -2624,6 +2974,7 @@
         </w:rPr>
         <w:t xml:space="preserve">from index 1 up to </w:t>
       </w:r>
+      <w:proofErr w:type="spellStart"/>
       <w:r>
         <w:rPr>
           <w:rFonts w:ascii="Times New Roman" w:hAnsi="Times New Roman" w:cs="Times New Roman"/>
@@ -2632,6 +2983,7 @@
         </w:rPr>
         <w:t>pattern.size</w:t>
       </w:r>
+      <w:proofErr w:type="spellEnd"/>
       <w:r>
         <w:rPr>
           <w:rFonts w:ascii="Times New Roman" w:hAnsi="Times New Roman" w:cs="Times New Roman"/>
@@ -3093,7 +3445,59 @@
           <w:sz w:val="24"/>
           <w:szCs w:val="24"/>
         </w:rPr>
-        <w:t>In my solution, the assumptions made were that strings and patterns were not empty and that the pattern matching was not case sensitive. For this however, we do test that the pattern is not empty in line 30 (if (pattern.empty()) return patternsFound;)</w:t>
+        <w:t xml:space="preserve">In my solution, the assumptions made were that strings and patterns were not empty and that the pattern matching was not case sensitive. For this however, we do </w:t>
+      </w:r>
+      <w:r>
+        <w:rPr>
+          <w:rFonts w:ascii="Times New Roman" w:hAnsi="Times New Roman" w:cs="Times New Roman"/>
+          <w:sz w:val="24"/>
+          <w:szCs w:val="24"/>
+        </w:rPr>
+        <w:t>validate</w:t>
+      </w:r>
+      <w:r>
+        <w:rPr>
+          <w:rFonts w:ascii="Times New Roman" w:hAnsi="Times New Roman" w:cs="Times New Roman"/>
+          <w:sz w:val="24"/>
+          <w:szCs w:val="24"/>
+        </w:rPr>
+        <w:t xml:space="preserve"> that the pattern is not empty in line 30 (if (</w:t>
+      </w:r>
+      <w:proofErr w:type="spellStart"/>
+      <w:r>
+        <w:rPr>
+          <w:rFonts w:ascii="Times New Roman" w:hAnsi="Times New Roman" w:cs="Times New Roman"/>
+          <w:sz w:val="24"/>
+          <w:szCs w:val="24"/>
+        </w:rPr>
+        <w:t>pattern.empty</w:t>
+      </w:r>
+      <w:proofErr w:type="spellEnd"/>
+      <w:r>
+        <w:rPr>
+          <w:rFonts w:ascii="Times New Roman" w:hAnsi="Times New Roman" w:cs="Times New Roman"/>
+          <w:sz w:val="24"/>
+          <w:szCs w:val="24"/>
+        </w:rPr>
+        <w:t xml:space="preserve">()) return </w:t>
+      </w:r>
+      <w:proofErr w:type="spellStart"/>
+      <w:r>
+        <w:rPr>
+          <w:rFonts w:ascii="Times New Roman" w:hAnsi="Times New Roman" w:cs="Times New Roman"/>
+          <w:sz w:val="24"/>
+          <w:szCs w:val="24"/>
+        </w:rPr>
+        <w:t>patternsFound</w:t>
+      </w:r>
+      <w:proofErr w:type="spellEnd"/>
+      <w:r>
+        <w:rPr>
+          <w:rFonts w:ascii="Times New Roman" w:hAnsi="Times New Roman" w:cs="Times New Roman"/>
+          <w:sz w:val="24"/>
+          <w:szCs w:val="24"/>
+        </w:rPr>
+        <w:t>;)</w:t>
       </w:r>
     </w:p>
     <w:p>
@@ -3160,7 +3564,39 @@
           <w:sz w:val="24"/>
           <w:szCs w:val="24"/>
         </w:rPr>
-        <w:t xml:space="preserve">The change which I implemented which was different to research found was that I completed the preprocessing of developing the pi table first in its own method then wrote a separate method for searching the string using the previously created pi table. </w:t>
+        <w:t xml:space="preserve">The change which I implemented which was different to research found was that I completed the preprocessing </w:t>
+      </w:r>
+      <w:r>
+        <w:rPr>
+          <w:rFonts w:ascii="Times New Roman" w:hAnsi="Times New Roman" w:cs="Times New Roman"/>
+          <w:sz w:val="24"/>
+          <w:szCs w:val="24"/>
+        </w:rPr>
+        <w:t>and</w:t>
+      </w:r>
+      <w:r>
+        <w:rPr>
+          <w:rFonts w:ascii="Times New Roman" w:hAnsi="Times New Roman" w:cs="Times New Roman"/>
+          <w:sz w:val="24"/>
+          <w:szCs w:val="24"/>
+        </w:rPr>
+        <w:t xml:space="preserve"> </w:t>
+      </w:r>
+      <w:r>
+        <w:rPr>
+          <w:rFonts w:ascii="Times New Roman" w:hAnsi="Times New Roman" w:cs="Times New Roman"/>
+          <w:sz w:val="24"/>
+          <w:szCs w:val="24"/>
+        </w:rPr>
+        <w:t xml:space="preserve">construction of </w:t>
+      </w:r>
+      <w:r>
+        <w:rPr>
+          <w:rFonts w:ascii="Times New Roman" w:hAnsi="Times New Roman" w:cs="Times New Roman"/>
+          <w:sz w:val="24"/>
+          <w:szCs w:val="24"/>
+        </w:rPr>
+        <w:t xml:space="preserve">the pi table first in its own method then wrote a separate method for searching the string using the previously created pi table. </w:t>
       </w:r>
     </w:p>
     <w:p>
@@ -3235,7 +3671,71 @@
           <w:sz w:val="24"/>
           <w:szCs w:val="24"/>
         </w:rPr>
-        <w:t>My testing to ensure my implementation is correct has been split into 2 sections. One section which verifies the pi table is working correctly, and the second ensures the search part of KMP is working correctly. If either part of these does not function as it should, the result will be incorrect.</w:t>
+        <w:t>My testing to ensure my implementation is correct has been split into 2 sections. One section</w:t>
+      </w:r>
+      <w:r>
+        <w:rPr>
+          <w:rFonts w:ascii="Times New Roman" w:hAnsi="Times New Roman" w:cs="Times New Roman"/>
+          <w:sz w:val="24"/>
+          <w:szCs w:val="24"/>
+        </w:rPr>
+        <w:t xml:space="preserve"> </w:t>
+      </w:r>
+      <w:r>
+        <w:rPr>
+          <w:rFonts w:ascii="Times New Roman" w:hAnsi="Times New Roman" w:cs="Times New Roman"/>
+          <w:sz w:val="24"/>
+          <w:szCs w:val="24"/>
+        </w:rPr>
+        <w:t>verifies the pi table is working correctly, and the second ensures the search part of KMP is working correctly. If either part of these</w:t>
+      </w:r>
+      <w:r>
+        <w:rPr>
+          <w:rFonts w:ascii="Times New Roman" w:hAnsi="Times New Roman" w:cs="Times New Roman"/>
+          <w:sz w:val="24"/>
+          <w:szCs w:val="24"/>
+        </w:rPr>
+        <w:t xml:space="preserve"> parts</w:t>
+      </w:r>
+      <w:r>
+        <w:rPr>
+          <w:rFonts w:ascii="Times New Roman" w:hAnsi="Times New Roman" w:cs="Times New Roman"/>
+          <w:sz w:val="24"/>
+          <w:szCs w:val="24"/>
+        </w:rPr>
+        <w:t xml:space="preserve"> </w:t>
+      </w:r>
+      <w:r>
+        <w:rPr>
+          <w:rFonts w:ascii="Times New Roman" w:hAnsi="Times New Roman" w:cs="Times New Roman"/>
+          <w:sz w:val="24"/>
+          <w:szCs w:val="24"/>
+        </w:rPr>
+        <w:t xml:space="preserve">do </w:t>
+      </w:r>
+      <w:r>
+        <w:rPr>
+          <w:rFonts w:ascii="Times New Roman" w:hAnsi="Times New Roman" w:cs="Times New Roman"/>
+          <w:sz w:val="24"/>
+          <w:szCs w:val="24"/>
+        </w:rPr>
+        <w:t xml:space="preserve">not function as </w:t>
+      </w:r>
+      <w:r>
+        <w:rPr>
+          <w:rFonts w:ascii="Times New Roman" w:hAnsi="Times New Roman" w:cs="Times New Roman"/>
+          <w:sz w:val="24"/>
+          <w:szCs w:val="24"/>
+        </w:rPr>
+        <w:t xml:space="preserve">they </w:t>
+      </w:r>
+      <w:r>
+        <w:rPr>
+          <w:rFonts w:ascii="Times New Roman" w:hAnsi="Times New Roman" w:cs="Times New Roman"/>
+          <w:sz w:val="24"/>
+          <w:szCs w:val="24"/>
+        </w:rPr>
+        <w:t>should, the result will be incorrect.</w:t>
       </w:r>
     </w:p>
     <w:p>
@@ -3278,30 +3778,76 @@
           <w:szCs w:val="24"/>
         </w:rPr>
       </w:pPr>
-      <w:r>
-        <w:rPr>
-          <w:rFonts w:ascii="Times New Roman" w:hAnsi="Times New Roman" w:cs="Times New Roman"/>
-          <w:sz w:val="24"/>
-          <w:szCs w:val="24"/>
-        </w:rPr>
-        <w:t>VecCompare is a helper function which looks at the expected vector and tests it against the output from the kmpSearch method. If the two vectors match, that means the unit test has passed, otherwise it has failed.</w:t>
-      </w:r>
-    </w:p>
-    <w:p>
-      <w:pPr>
-        <w:rPr>
-          <w:rFonts w:ascii="Times New Roman" w:hAnsi="Times New Roman" w:cs="Times New Roman"/>
-          <w:sz w:val="24"/>
-          <w:szCs w:val="24"/>
-        </w:rPr>
-      </w:pPr>
-      <w:r>
-        <w:rPr>
-          <w:rFonts w:ascii="Times New Roman" w:hAnsi="Times New Roman" w:cs="Times New Roman"/>
-          <w:sz w:val="24"/>
-          <w:szCs w:val="24"/>
-        </w:rPr>
-        <w:t xml:space="preserve">The purpose of this method is to stop rewriting the same code for every single kmpSearch unit test </w:t>
+      <w:proofErr w:type="spellStart"/>
+      <w:r>
+        <w:rPr>
+          <w:rFonts w:ascii="Times New Roman" w:hAnsi="Times New Roman" w:cs="Times New Roman"/>
+          <w:sz w:val="24"/>
+          <w:szCs w:val="24"/>
+        </w:rPr>
+        <w:t>VecCompare</w:t>
+      </w:r>
+      <w:proofErr w:type="spellEnd"/>
+      <w:r>
+        <w:rPr>
+          <w:rFonts w:ascii="Times New Roman" w:hAnsi="Times New Roman" w:cs="Times New Roman"/>
+          <w:sz w:val="24"/>
+          <w:szCs w:val="24"/>
+        </w:rPr>
+        <w:t xml:space="preserve"> is a helper function which looks at the expected vector and tests it against the output from the </w:t>
+      </w:r>
+      <w:proofErr w:type="spellStart"/>
+      <w:r>
+        <w:rPr>
+          <w:rFonts w:ascii="Times New Roman" w:hAnsi="Times New Roman" w:cs="Times New Roman"/>
+          <w:sz w:val="24"/>
+          <w:szCs w:val="24"/>
+        </w:rPr>
+        <w:t>kmpSearch</w:t>
+      </w:r>
+      <w:proofErr w:type="spellEnd"/>
+      <w:r>
+        <w:rPr>
+          <w:rFonts w:ascii="Times New Roman" w:hAnsi="Times New Roman" w:cs="Times New Roman"/>
+          <w:sz w:val="24"/>
+          <w:szCs w:val="24"/>
+        </w:rPr>
+        <w:t xml:space="preserve"> method. If the two vectors match, that means the unit test has passed, otherwise it has failed.</w:t>
+      </w:r>
+    </w:p>
+    <w:p>
+      <w:pPr>
+        <w:rPr>
+          <w:rFonts w:ascii="Times New Roman" w:hAnsi="Times New Roman" w:cs="Times New Roman"/>
+          <w:sz w:val="24"/>
+          <w:szCs w:val="24"/>
+        </w:rPr>
+      </w:pPr>
+      <w:r>
+        <w:rPr>
+          <w:rFonts w:ascii="Times New Roman" w:hAnsi="Times New Roman" w:cs="Times New Roman"/>
+          <w:sz w:val="24"/>
+          <w:szCs w:val="24"/>
+        </w:rPr>
+        <w:t xml:space="preserve">The purpose of this method is to stop rewriting the same code for every single </w:t>
+      </w:r>
+      <w:proofErr w:type="spellStart"/>
+      <w:r>
+        <w:rPr>
+          <w:rFonts w:ascii="Times New Roman" w:hAnsi="Times New Roman" w:cs="Times New Roman"/>
+          <w:sz w:val="24"/>
+          <w:szCs w:val="24"/>
+        </w:rPr>
+        <w:t>kmpSearch</w:t>
+      </w:r>
+      <w:proofErr w:type="spellEnd"/>
+      <w:r>
+        <w:rPr>
+          <w:rFonts w:ascii="Times New Roman" w:hAnsi="Times New Roman" w:cs="Times New Roman"/>
+          <w:sz w:val="24"/>
+          <w:szCs w:val="24"/>
+        </w:rPr>
+        <w:t xml:space="preserve"> unit test </w:t>
       </w:r>
       <w:r>
         <w:rPr>
@@ -3317,34 +3863,122 @@
           <w:sz w:val="24"/>
           <w:szCs w:val="24"/>
         </w:rPr>
-        <w:t xml:space="preserve"> rather just recall that method.</w:t>
-      </w:r>
-    </w:p>
-    <w:p>
-      <w:pPr>
-        <w:rPr>
-          <w:rFonts w:ascii="Times New Roman" w:hAnsi="Times New Roman" w:cs="Times New Roman"/>
-          <w:sz w:val="24"/>
-          <w:szCs w:val="24"/>
-        </w:rPr>
-      </w:pPr>
-      <w:r>
-        <w:rPr>
-          <w:rFonts w:ascii="Times New Roman" w:hAnsi="Times New Roman" w:cs="Times New Roman"/>
-          <w:sz w:val="24"/>
-          <w:szCs w:val="24"/>
-        </w:rPr>
-        <w:t>PrintVector is another helper function which prints the vector in the terminal for testing. This method simply looks through the vector and prints every index. This is used for when a test fails, it shows the user what the return is compared to what it should’ve been for testing and debugging. Again, this method ensures that I don’t have to rewrite the code within every unit test.</w:t>
-      </w:r>
-    </w:p>
-    <w:p>
-      <w:r>
-        <w:rPr>
-          <w:rFonts w:ascii="Times New Roman" w:hAnsi="Times New Roman" w:cs="Times New Roman"/>
-          <w:sz w:val="24"/>
-          <w:szCs w:val="24"/>
-        </w:rPr>
-        <w:t>Finally, runKmpTest is the last helper function which first looks at VecCompare to see if the vectors match. If so, it returns the test name concatenated with “ PASS”. If the vectors do not match, this returns the test name contented with “ FAIL” and then calls PrintVector to print the</w:t>
+        <w:t xml:space="preserve">nd </w:t>
+      </w:r>
+      <w:r>
+        <w:rPr>
+          <w:rFonts w:ascii="Times New Roman" w:hAnsi="Times New Roman" w:cs="Times New Roman"/>
+          <w:sz w:val="24"/>
+          <w:szCs w:val="24"/>
+        </w:rPr>
+        <w:t>just recall that method</w:t>
+      </w:r>
+      <w:r>
+        <w:rPr>
+          <w:rFonts w:ascii="Times New Roman" w:hAnsi="Times New Roman" w:cs="Times New Roman"/>
+          <w:sz w:val="24"/>
+          <w:szCs w:val="24"/>
+        </w:rPr>
+        <w:t xml:space="preserve"> instead</w:t>
+      </w:r>
+      <w:r>
+        <w:rPr>
+          <w:rFonts w:ascii="Times New Roman" w:hAnsi="Times New Roman" w:cs="Times New Roman"/>
+          <w:sz w:val="24"/>
+          <w:szCs w:val="24"/>
+        </w:rPr>
+        <w:t>.</w:t>
+      </w:r>
+    </w:p>
+    <w:p>
+      <w:pPr>
+        <w:rPr>
+          <w:rFonts w:ascii="Times New Roman" w:hAnsi="Times New Roman" w:cs="Times New Roman"/>
+          <w:sz w:val="24"/>
+          <w:szCs w:val="24"/>
+        </w:rPr>
+      </w:pPr>
+      <w:proofErr w:type="spellStart"/>
+      <w:r>
+        <w:rPr>
+          <w:rFonts w:ascii="Times New Roman" w:hAnsi="Times New Roman" w:cs="Times New Roman"/>
+          <w:sz w:val="24"/>
+          <w:szCs w:val="24"/>
+        </w:rPr>
+        <w:t>PrintVector</w:t>
+      </w:r>
+      <w:proofErr w:type="spellEnd"/>
+      <w:r>
+        <w:rPr>
+          <w:rFonts w:ascii="Times New Roman" w:hAnsi="Times New Roman" w:cs="Times New Roman"/>
+          <w:sz w:val="24"/>
+          <w:szCs w:val="24"/>
+        </w:rPr>
+        <w:t xml:space="preserve"> is another helper function which prints the vector in the terminal for testing. This method simply looks through the vector and prints every index. This is used for when a test fails, it shows the user what the return is compared to what it should’ve been for testing and debugging. Again, this method ensures that I don’t have to rewrite the code within every unit test.</w:t>
+      </w:r>
+    </w:p>
+    <w:p>
+      <w:r>
+        <w:rPr>
+          <w:rFonts w:ascii="Times New Roman" w:hAnsi="Times New Roman" w:cs="Times New Roman"/>
+          <w:sz w:val="24"/>
+          <w:szCs w:val="24"/>
+        </w:rPr>
+        <w:t xml:space="preserve">Finally, </w:t>
+      </w:r>
+      <w:proofErr w:type="spellStart"/>
+      <w:r>
+        <w:rPr>
+          <w:rFonts w:ascii="Times New Roman" w:hAnsi="Times New Roman" w:cs="Times New Roman"/>
+          <w:sz w:val="24"/>
+          <w:szCs w:val="24"/>
+        </w:rPr>
+        <w:t>runKmpTest</w:t>
+      </w:r>
+      <w:proofErr w:type="spellEnd"/>
+      <w:r>
+        <w:rPr>
+          <w:rFonts w:ascii="Times New Roman" w:hAnsi="Times New Roman" w:cs="Times New Roman"/>
+          <w:sz w:val="24"/>
+          <w:szCs w:val="24"/>
+        </w:rPr>
+        <w:t xml:space="preserve"> is the last helper function which first looks at </w:t>
+      </w:r>
+      <w:proofErr w:type="spellStart"/>
+      <w:r>
+        <w:rPr>
+          <w:rFonts w:ascii="Times New Roman" w:hAnsi="Times New Roman" w:cs="Times New Roman"/>
+          <w:sz w:val="24"/>
+          <w:szCs w:val="24"/>
+        </w:rPr>
+        <w:t>VecCompare</w:t>
+      </w:r>
+      <w:proofErr w:type="spellEnd"/>
+      <w:r>
+        <w:rPr>
+          <w:rFonts w:ascii="Times New Roman" w:hAnsi="Times New Roman" w:cs="Times New Roman"/>
+          <w:sz w:val="24"/>
+          <w:szCs w:val="24"/>
+        </w:rPr>
+        <w:t xml:space="preserve"> to see if the vectors match. If so, it returns the test name concatenated with “ PASS”. If the vectors do not match, this returns the test name contented with “ FAIL” and then calls </w:t>
+      </w:r>
+      <w:proofErr w:type="spellStart"/>
+      <w:r>
+        <w:rPr>
+          <w:rFonts w:ascii="Times New Roman" w:hAnsi="Times New Roman" w:cs="Times New Roman"/>
+          <w:sz w:val="24"/>
+          <w:szCs w:val="24"/>
+        </w:rPr>
+        <w:t>PrintVector</w:t>
+      </w:r>
+      <w:proofErr w:type="spellEnd"/>
+      <w:r>
+        <w:rPr>
+          <w:rFonts w:ascii="Times New Roman" w:hAnsi="Times New Roman" w:cs="Times New Roman"/>
+          <w:sz w:val="24"/>
+          <w:szCs w:val="24"/>
+        </w:rPr>
+        <w:t xml:space="preserve"> to print the</w:t>
       </w:r>
       <w:r>
         <w:rPr>
@@ -3398,7 +4032,39 @@
           <w:sz w:val="24"/>
           <w:szCs w:val="24"/>
         </w:rPr>
-        <w:t xml:space="preserve">My unit tests for the overall solution test 3 different scenarios where the pattern match can be tricky, including overlapping pattern matching to ensure it is being detected at runtime. </w:t>
+        <w:t xml:space="preserve">My unit tests for the overall </w:t>
+      </w:r>
+      <w:r>
+        <w:rPr>
+          <w:rFonts w:ascii="Times New Roman" w:hAnsi="Times New Roman" w:cs="Times New Roman"/>
+          <w:sz w:val="24"/>
+          <w:szCs w:val="24"/>
+        </w:rPr>
+        <w:t xml:space="preserve">KMP algorithm </w:t>
+      </w:r>
+      <w:r>
+        <w:rPr>
+          <w:rFonts w:ascii="Times New Roman" w:hAnsi="Times New Roman" w:cs="Times New Roman"/>
+          <w:sz w:val="24"/>
+          <w:szCs w:val="24"/>
+        </w:rPr>
+        <w:t>solution test 3 different scenarios where the pattern match</w:t>
+      </w:r>
+      <w:r>
+        <w:rPr>
+          <w:rFonts w:ascii="Times New Roman" w:hAnsi="Times New Roman" w:cs="Times New Roman"/>
+          <w:sz w:val="24"/>
+          <w:szCs w:val="24"/>
+        </w:rPr>
+        <w:t xml:space="preserve">ing </w:t>
+      </w:r>
+      <w:r>
+        <w:rPr>
+          <w:rFonts w:ascii="Times New Roman" w:hAnsi="Times New Roman" w:cs="Times New Roman"/>
+          <w:sz w:val="24"/>
+          <w:szCs w:val="24"/>
+        </w:rPr>
+        <w:t xml:space="preserve">can be tricky, including overlapping pattern matching to ensure it is being detected at runtime. </w:t>
       </w:r>
     </w:p>
     <w:p>
@@ -3416,7 +4082,23 @@
           <w:szCs w:val="24"/>
         </w:rPr>
         <w:lastRenderedPageBreak/>
-        <w:t xml:space="preserve">The next unit test looks at what happens when there is no pattern found in the string. This unit test passes successfully. Following, we look at the cases where there are patterns, however the case is different (upper case and lower case). This is important as this method is case sensitive. </w:t>
+        <w:t xml:space="preserve">The next unit test looks at what happens when there is no pattern found in the string. This unit test passes successfully. Following, we look at the cases where </w:t>
+      </w:r>
+      <w:r>
+        <w:rPr>
+          <w:rFonts w:ascii="Times New Roman" w:hAnsi="Times New Roman" w:cs="Times New Roman"/>
+          <w:sz w:val="24"/>
+          <w:szCs w:val="24"/>
+        </w:rPr>
+        <w:t>patterns match</w:t>
+      </w:r>
+      <w:r>
+        <w:rPr>
+          <w:rFonts w:ascii="Times New Roman" w:hAnsi="Times New Roman" w:cs="Times New Roman"/>
+          <w:sz w:val="24"/>
+          <w:szCs w:val="24"/>
+        </w:rPr>
+        <w:t xml:space="preserve">, however the case is different (upper and lower case). This is important as this method is case sensitive. </w:t>
       </w:r>
     </w:p>
     <w:p>
@@ -3480,7 +4162,23 @@
           <w:sz w:val="24"/>
           <w:szCs w:val="24"/>
         </w:rPr>
-        <w:t>KMP algorithm is extremely useful, especially when dealing with large data sets. The understanding of the algorithm really comes around the pi table. Once a solid understanding around how the pi table is built and referenced, then it is very simple to implement the KMP searching part of the algorithm.</w:t>
+        <w:t xml:space="preserve">KMP algorithm is extremely useful, especially when dealing with large data sets. The understanding of the algorithm really comes around the pi table. Once a solid understanding around how the pi table is </w:t>
+      </w:r>
+      <w:r>
+        <w:rPr>
+          <w:rFonts w:ascii="Times New Roman" w:hAnsi="Times New Roman" w:cs="Times New Roman"/>
+          <w:sz w:val="24"/>
+          <w:szCs w:val="24"/>
+        </w:rPr>
+        <w:t>constructed</w:t>
+      </w:r>
+      <w:r>
+        <w:rPr>
+          <w:rFonts w:ascii="Times New Roman" w:hAnsi="Times New Roman" w:cs="Times New Roman"/>
+          <w:sz w:val="24"/>
+          <w:szCs w:val="24"/>
+        </w:rPr>
+        <w:t xml:space="preserve"> and referenced, then it is very simple to implement the KMP searching part of the algorithm.</w:t>
       </w:r>
     </w:p>
     <w:p>
@@ -3597,7 +4295,15 @@
         <w:ind w:left="284" w:hanging="284"/>
       </w:pPr>
       <w:r>
-        <w:t>Rexie, J. A. M., Raimond, K., Murugaaboopathy, M., Brindha, D., &amp; Mulugeta, H. (2022). Lightweight Pattern Matching Method for DNA Sequencing in Internet of Medical Things. </w:t>
+        <w:t xml:space="preserve">Rexie, J. A. M., Raimond, K., </w:t>
+      </w:r>
+      <w:proofErr w:type="spellStart"/>
+      <w:r>
+        <w:t>Murugaaboopathy</w:t>
+      </w:r>
+      <w:proofErr w:type="spellEnd"/>
+      <w:r>
+        <w:t>, M., Brindha, D., &amp; Mulugeta, H. (2022). Lightweight Pattern Matching Method for DNA Sequencing in Internet of Medical Things. </w:t>
       </w:r>
       <w:r>
         <w:rPr>

</xml_diff>